<commit_message>
chore: update regulation hub 2026-05-14
</commit_message>
<xml_diff>
--- a/reg-hub/regulation_fortnightly_brief.docx
+++ b/reg-hub/regulation_fortnightly_brief.docx
@@ -2,6 +2,45 @@
 <file path=word/document.xml><?xml version="1.0" encoding="utf-8"?>
 <w:document xmlns:wpc="http://schemas.microsoft.com/office/word/2010/wordprocessingCanvas" xmlns:mo="http://schemas.microsoft.com/office/mac/office/2008/main" xmlns:mc="http://schemas.openxmlformats.org/markup-compatibility/2006" xmlns:mv="urn:schemas-microsoft-com:mac:vml" xmlns:o="urn:schemas-microsoft-com:office:office" xmlns:r="http://schemas.openxmlformats.org/officeDocument/2006/relationships" xmlns:m="http://schemas.openxmlformats.org/officeDocument/2006/math" xmlns:v="urn:schemas-microsoft-com:vml" xmlns:wp14="http://schemas.microsoft.com/office/word/2010/wordprocessingDrawing" xmlns:wp="http://schemas.openxmlformats.org/drawingml/2006/wordprocessingDrawing" xmlns:w10="urn:schemas-microsoft-com:office:word" xmlns:w="http://schemas.openxmlformats.org/wordprocessingml/2006/main" xmlns:w14="http://schemas.microsoft.com/office/word/2010/wordml" xmlns:wpg="http://schemas.microsoft.com/office/word/2010/wordprocessingGroup" xmlns:wpi="http://schemas.microsoft.com/office/word/2010/wordprocessingInk" xmlns:wne="http://schemas.microsoft.com/office/word/2006/wordml" xmlns:wps="http://schemas.microsoft.com/office/word/2010/wordprocessingShape" mc:Ignorable="w14 wp14">
   <w:body>
+    <w:p>
+      <w:pPr>
+        <w:spacing w:after="120"/>
+      </w:pPr>
+      <w:r>
+        <w:drawing>
+          <wp:inline xmlns:a="http://schemas.openxmlformats.org/drawingml/2006/main" xmlns:pic="http://schemas.openxmlformats.org/drawingml/2006/picture">
+            <wp:extent cx="4615200" cy="2120400"/>
+            <wp:docPr id="1" name="Picture 1"/>
+            <wp:cNvGraphicFramePr>
+              <a:graphicFrameLocks noChangeAspect="1"/>
+            </wp:cNvGraphicFramePr>
+            <a:graphic>
+              <a:graphicData uri="http://schemas.openxmlformats.org/drawingml/2006/picture">
+                <pic:pic>
+                  <pic:nvPicPr>
+                    <pic:cNvPr id="0" name="hero-banner.png"/>
+                    <pic:cNvPicPr/>
+                  </pic:nvPicPr>
+                  <pic:blipFill>
+                    <a:blip r:embed="rId9"/>
+                    <a:stretch>
+                      <a:fillRect/>
+                    </a:stretch>
+                  </pic:blipFill>
+                  <pic:spPr>
+                    <a:xfrm>
+                      <a:off x="0" y="0"/>
+                      <a:ext cx="4615200" cy="2120400"/>
+                    </a:xfrm>
+                    <a:prstGeom prst="rect"/>
+                  </pic:spPr>
+                </pic:pic>
+              </a:graphicData>
+            </a:graphic>
+          </wp:inline>
+        </w:drawing>
+      </w:r>
+    </w:p>
     <w:p>
       <w:pPr>
         <w:pStyle w:val="Heading1"/>
@@ -116,7 +155,7 @@
         </w:rPr>
         <w:t xml:space="preserve"> (</w:t>
       </w:r>
-      <w:hyperlink r:id="rId9">
+      <w:hyperlink r:id="rId10">
         <w:r>
           <w:rPr>
             <w:rFonts w:ascii="Arial" w:hAnsi="Arial" w:cs="Arial"/>
@@ -174,7 +213,7 @@
         </w:rPr>
         <w:t xml:space="preserve"> (</w:t>
       </w:r>
-      <w:hyperlink r:id="rId10">
+      <w:hyperlink r:id="rId11">
         <w:r>
           <w:rPr>
             <w:rFonts w:ascii="Arial" w:hAnsi="Arial" w:cs="Arial"/>
@@ -232,7 +271,7 @@
         </w:rPr>
         <w:t xml:space="preserve"> (</w:t>
       </w:r>
-      <w:hyperlink r:id="rId11">
+      <w:hyperlink r:id="rId12">
         <w:r>
           <w:rPr>
             <w:rFonts w:ascii="Arial" w:hAnsi="Arial" w:cs="Arial"/>
@@ -290,7 +329,7 @@
         </w:rPr>
         <w:t xml:space="preserve"> (</w:t>
       </w:r>
-      <w:hyperlink r:id="rId12">
+      <w:hyperlink r:id="rId13">
         <w:r>
           <w:rPr>
             <w:rFonts w:ascii="Arial" w:hAnsi="Arial" w:cs="Arial"/>
@@ -348,7 +387,7 @@
         </w:rPr>
         <w:t xml:space="preserve"> (</w:t>
       </w:r>
-      <w:hyperlink r:id="rId13">
+      <w:hyperlink r:id="rId14">
         <w:r>
           <w:rPr>
             <w:rFonts w:ascii="Arial" w:hAnsi="Arial" w:cs="Arial"/>
@@ -406,7 +445,7 @@
         </w:rPr>
         <w:t xml:space="preserve"> (</w:t>
       </w:r>
-      <w:hyperlink r:id="rId14">
+      <w:hyperlink r:id="rId15">
         <w:r>
           <w:rPr>
             <w:rFonts w:ascii="Arial" w:hAnsi="Arial" w:cs="Arial"/>
@@ -464,7 +503,7 @@
         </w:rPr>
         <w:t xml:space="preserve"> (</w:t>
       </w:r>
-      <w:hyperlink r:id="rId15">
+      <w:hyperlink r:id="rId16">
         <w:r>
           <w:rPr>
             <w:rFonts w:ascii="Arial" w:hAnsi="Arial" w:cs="Arial"/>
@@ -522,7 +561,7 @@
         </w:rPr>
         <w:t xml:space="preserve"> (</w:t>
       </w:r>
-      <w:hyperlink r:id="rId16">
+      <w:hyperlink r:id="rId17">
         <w:r>
           <w:rPr>
             <w:rFonts w:ascii="Arial" w:hAnsi="Arial" w:cs="Arial"/>
@@ -580,7 +619,7 @@
         </w:rPr>
         <w:t xml:space="preserve"> (</w:t>
       </w:r>
-      <w:hyperlink r:id="rId17">
+      <w:hyperlink r:id="rId18">
         <w:r>
           <w:rPr>
             <w:rFonts w:ascii="Arial" w:hAnsi="Arial" w:cs="Arial"/>
@@ -638,7 +677,7 @@
         </w:rPr>
         <w:t xml:space="preserve"> (</w:t>
       </w:r>
-      <w:hyperlink r:id="rId18">
+      <w:hyperlink r:id="rId19">
         <w:r>
           <w:rPr>
             <w:rFonts w:ascii="Arial" w:hAnsi="Arial" w:cs="Arial"/>
@@ -696,7 +735,7 @@
         </w:rPr>
         <w:t xml:space="preserve"> (</w:t>
       </w:r>
-      <w:hyperlink r:id="rId19">
+      <w:hyperlink r:id="rId20">
         <w:r>
           <w:rPr>
             <w:rFonts w:ascii="Arial" w:hAnsi="Arial" w:cs="Arial"/>
@@ -754,7 +793,7 @@
         </w:rPr>
         <w:t xml:space="preserve"> (</w:t>
       </w:r>
-      <w:hyperlink r:id="rId20">
+      <w:hyperlink r:id="rId21">
         <w:r>
           <w:rPr>
             <w:rFonts w:ascii="Arial" w:hAnsi="Arial" w:cs="Arial"/>
@@ -840,7 +879,7 @@
         </w:rPr>
         <w:t xml:space="preserve"> (</w:t>
       </w:r>
-      <w:hyperlink r:id="rId21">
+      <w:hyperlink r:id="rId22">
         <w:r>
           <w:rPr>
             <w:rFonts w:ascii="Arial" w:hAnsi="Arial" w:cs="Arial"/>
@@ -898,7 +937,7 @@
         </w:rPr>
         <w:t xml:space="preserve"> (</w:t>
       </w:r>
-      <w:hyperlink r:id="rId22">
+      <w:hyperlink r:id="rId23">
         <w:r>
           <w:rPr>
             <w:rFonts w:ascii="Arial" w:hAnsi="Arial" w:cs="Arial"/>
@@ -956,7 +995,7 @@
         </w:rPr>
         <w:t xml:space="preserve"> (</w:t>
       </w:r>
-      <w:hyperlink r:id="rId23">
+      <w:hyperlink r:id="rId24">
         <w:r>
           <w:rPr>
             <w:rFonts w:ascii="Arial" w:hAnsi="Arial" w:cs="Arial"/>
@@ -1028,7 +1067,7 @@
         </w:rPr>
         <w:t xml:space="preserve"> (</w:t>
       </w:r>
-      <w:hyperlink r:id="rId24">
+      <w:hyperlink r:id="rId25">
         <w:r>
           <w:rPr>
             <w:rFonts w:ascii="Arial" w:hAnsi="Arial" w:cs="Arial"/>
@@ -1086,7 +1125,7 @@
         </w:rPr>
         <w:t xml:space="preserve"> (</w:t>
       </w:r>
-      <w:hyperlink r:id="rId25">
+      <w:hyperlink r:id="rId26">
         <w:r>
           <w:rPr>
             <w:rFonts w:ascii="Arial" w:hAnsi="Arial" w:cs="Arial"/>
@@ -1144,7 +1183,7 @@
         </w:rPr>
         <w:t xml:space="preserve"> (</w:t>
       </w:r>
-      <w:hyperlink r:id="rId26">
+      <w:hyperlink r:id="rId27">
         <w:r>
           <w:rPr>
             <w:rFonts w:ascii="Arial" w:hAnsi="Arial" w:cs="Arial"/>
@@ -1216,7 +1255,7 @@
         </w:rPr>
         <w:t xml:space="preserve"> (</w:t>
       </w:r>
-      <w:hyperlink r:id="rId27">
+      <w:hyperlink r:id="rId28">
         <w:r>
           <w:rPr>
             <w:rFonts w:ascii="Arial" w:hAnsi="Arial" w:cs="Arial"/>
@@ -1274,7 +1313,7 @@
         </w:rPr>
         <w:t xml:space="preserve"> (</w:t>
       </w:r>
-      <w:hyperlink r:id="rId28">
+      <w:hyperlink r:id="rId29">
         <w:r>
           <w:rPr>
             <w:rFonts w:ascii="Arial" w:hAnsi="Arial" w:cs="Arial"/>
@@ -1416,7 +1455,7 @@
         </w:rPr>
         <w:t xml:space="preserve"> (</w:t>
       </w:r>
-      <w:hyperlink r:id="rId29">
+      <w:hyperlink r:id="rId30">
         <w:r>
           <w:rPr>
             <w:rFonts w:ascii="Arial" w:hAnsi="Arial" w:cs="Arial"/>
@@ -1474,7 +1513,7 @@
         </w:rPr>
         <w:t xml:space="preserve"> (</w:t>
       </w:r>
-      <w:hyperlink r:id="rId30">
+      <w:hyperlink r:id="rId31">
         <w:r>
           <w:rPr>
             <w:rFonts w:ascii="Arial" w:hAnsi="Arial" w:cs="Arial"/>
@@ -1532,7 +1571,7 @@
         </w:rPr>
         <w:t xml:space="preserve"> (</w:t>
       </w:r>
-      <w:hyperlink r:id="rId31">
+      <w:hyperlink r:id="rId32">
         <w:r>
           <w:rPr>
             <w:rFonts w:ascii="Arial" w:hAnsi="Arial" w:cs="Arial"/>
@@ -1590,7 +1629,7 @@
         </w:rPr>
         <w:t xml:space="preserve"> (</w:t>
       </w:r>
-      <w:hyperlink r:id="rId32">
+      <w:hyperlink r:id="rId33">
         <w:r>
           <w:rPr>
             <w:rFonts w:ascii="Arial" w:hAnsi="Arial" w:cs="Arial"/>
@@ -1662,7 +1701,7 @@
         </w:rPr>
         <w:t xml:space="preserve"> (</w:t>
       </w:r>
-      <w:hyperlink r:id="rId33">
+      <w:hyperlink r:id="rId34">
         <w:r>
           <w:rPr>
             <w:rFonts w:ascii="Arial" w:hAnsi="Arial" w:cs="Arial"/>
@@ -1720,7 +1759,7 @@
         </w:rPr>
         <w:t xml:space="preserve"> (</w:t>
       </w:r>
-      <w:hyperlink r:id="rId34">
+      <w:hyperlink r:id="rId35">
         <w:r>
           <w:rPr>
             <w:rFonts w:ascii="Arial" w:hAnsi="Arial" w:cs="Arial"/>
@@ -1778,7 +1817,7 @@
         </w:rPr>
         <w:t xml:space="preserve"> (</w:t>
       </w:r>
-      <w:hyperlink r:id="rId35">
+      <w:hyperlink r:id="rId36">
         <w:r>
           <w:rPr>
             <w:rFonts w:ascii="Arial" w:hAnsi="Arial" w:cs="Arial"/>
@@ -1850,7 +1889,7 @@
         </w:rPr>
         <w:t xml:space="preserve"> (</w:t>
       </w:r>
-      <w:hyperlink r:id="rId36">
+      <w:hyperlink r:id="rId37">
         <w:r>
           <w:rPr>
             <w:rFonts w:ascii="Arial" w:hAnsi="Arial" w:cs="Arial"/>
@@ -1908,7 +1947,7 @@
         </w:rPr>
         <w:t xml:space="preserve"> (</w:t>
       </w:r>
-      <w:hyperlink r:id="rId37">
+      <w:hyperlink r:id="rId38">
         <w:r>
           <w:rPr>
             <w:rFonts w:ascii="Arial" w:hAnsi="Arial" w:cs="Arial"/>
@@ -1966,7 +2005,7 @@
         </w:rPr>
         <w:t xml:space="preserve"> (</w:t>
       </w:r>
-      <w:hyperlink r:id="rId38">
+      <w:hyperlink r:id="rId39">
         <w:r>
           <w:rPr>
             <w:rFonts w:ascii="Arial" w:hAnsi="Arial" w:cs="Arial"/>
@@ -2038,7 +2077,7 @@
         </w:rPr>
         <w:t xml:space="preserve"> (</w:t>
       </w:r>
-      <w:hyperlink r:id="rId39">
+      <w:hyperlink r:id="rId40">
         <w:r>
           <w:rPr>
             <w:rFonts w:ascii="Arial" w:hAnsi="Arial" w:cs="Arial"/>
@@ -2096,7 +2135,7 @@
         </w:rPr>
         <w:t xml:space="preserve"> (</w:t>
       </w:r>
-      <w:hyperlink r:id="rId40">
+      <w:hyperlink r:id="rId41">
         <w:r>
           <w:rPr>
             <w:rFonts w:ascii="Arial" w:hAnsi="Arial" w:cs="Arial"/>
@@ -2154,7 +2193,7 @@
         </w:rPr>
         <w:t xml:space="preserve"> (</w:t>
       </w:r>
-      <w:hyperlink r:id="rId41">
+      <w:hyperlink r:id="rId42">
         <w:r>
           <w:rPr>
             <w:rFonts w:ascii="Arial" w:hAnsi="Arial" w:cs="Arial"/>
@@ -2175,47 +2214,117 @@
         <w:t>)</w:t>
       </w:r>
     </w:p>
-    <w:p>
-      <w:pPr>
-        <w:spacing w:after="0" w:line="240" w:lineRule="auto"/>
-      </w:pPr>
-      <w:r>
-        <w:rPr>
-          <w:rFonts w:ascii="Arial" w:hAnsi="Arial"/>
-          <w:b/>
-          <w:color w:val="000000"/>
-          <w:sz w:val="20"/>
-        </w:rPr>
-        <w:t>Adam Mason-Jefferies</w:t>
-      </w:r>
-    </w:p>
-    <w:p>
-      <w:pPr>
-        <w:spacing w:after="0" w:line="240" w:lineRule="auto"/>
-      </w:pPr>
-      <w:r>
-        <w:rPr>
-          <w:rFonts w:ascii="Arial" w:hAnsi="Arial"/>
-          <w:i/>
-          <w:color w:val="666666"/>
-          <w:sz w:val="18"/>
-        </w:rPr>
-        <w:t>Director</w:t>
-      </w:r>
-    </w:p>
-    <w:p>
-      <w:pPr>
-        <w:spacing w:after="0" w:line="240" w:lineRule="auto"/>
-      </w:pPr>
-      <w:r>
-        <w:rPr>
-          <w:rFonts w:ascii="Arial" w:hAnsi="Arial"/>
-          <w:color w:val="666666"/>
-          <w:sz w:val="18"/>
-        </w:rPr>
-        <w:t>Regulatory Transformation Community of Practice</w:t>
-      </w:r>
-    </w:p>
+    <w:tbl>
+      <w:tblPr>
+        <w:tblW w:type="auto" w:w="0"/>
+        <w:tblLayout w:type="fixed"/>
+        <w:tblLook w:firstColumn="1" w:firstRow="1" w:lastColumn="0" w:lastRow="0" w:noHBand="0" w:noVBand="1" w:val="04A0"/>
+        <w:tblBorders>
+          <w:top w:val="nil"/>
+          <w:left w:val="nil"/>
+          <w:bottom w:val="nil"/>
+          <w:right w:val="nil"/>
+          <w:insideH w:val="nil"/>
+          <w:insideV w:val="nil"/>
+        </w:tblBorders>
+      </w:tblPr>
+      <w:tblGrid>
+        <w:gridCol w:w="1417"/>
+        <w:gridCol w:w="7937"/>
+      </w:tblGrid>
+      <w:tr>
+        <w:tc>
+          <w:tcPr>
+            <w:tcW w:type="dxa" w:w="1417"/>
+          </w:tcPr>
+          <w:p>
+            <w:pPr>
+              <w:spacing w:after="0"/>
+            </w:pPr>
+            <w:r>
+              <w:drawing>
+                <wp:inline xmlns:a="http://schemas.openxmlformats.org/drawingml/2006/main" xmlns:pic="http://schemas.openxmlformats.org/drawingml/2006/picture">
+                  <wp:extent cx="619200" cy="760494"/>
+                  <wp:docPr id="2" name="Picture 2"/>
+                  <wp:cNvGraphicFramePr>
+                    <a:graphicFrameLocks noChangeAspect="1"/>
+                  </wp:cNvGraphicFramePr>
+                  <a:graphic>
+                    <a:graphicData uri="http://schemas.openxmlformats.org/drawingml/2006/picture">
+                      <pic:pic>
+                        <pic:nvPicPr>
+                          <pic:cNvPr id="0" name="signature-adam.png"/>
+                          <pic:cNvPicPr/>
+                        </pic:nvPicPr>
+                        <pic:blipFill>
+                          <a:blip r:embed="rId43"/>
+                          <a:stretch>
+                            <a:fillRect/>
+                          </a:stretch>
+                        </pic:blipFill>
+                        <pic:spPr>
+                          <a:xfrm>
+                            <a:off x="0" y="0"/>
+                            <a:ext cx="619200" cy="760494"/>
+                          </a:xfrm>
+                          <a:prstGeom prst="rect"/>
+                        </pic:spPr>
+                      </pic:pic>
+                    </a:graphicData>
+                  </a:graphic>
+                </wp:inline>
+              </w:drawing>
+            </w:r>
+          </w:p>
+        </w:tc>
+        <w:tc>
+          <w:tcPr>
+            <w:tcW w:type="dxa" w:w="7937"/>
+          </w:tcPr>
+          <w:p>
+            <w:pPr>
+              <w:spacing w:after="0" w:line="240" w:lineRule="auto"/>
+            </w:pPr>
+            <w:r>
+              <w:rPr>
+                <w:rFonts w:ascii="Arial" w:hAnsi="Arial"/>
+                <w:b/>
+                <w:color w:val="000000"/>
+                <w:sz w:val="20"/>
+              </w:rPr>
+              <w:t>Adam Mason-Jefferies</w:t>
+            </w:r>
+          </w:p>
+          <w:p>
+            <w:pPr>
+              <w:spacing w:after="0" w:line="240" w:lineRule="auto"/>
+            </w:pPr>
+            <w:r>
+              <w:rPr>
+                <w:rFonts w:ascii="Arial" w:hAnsi="Arial"/>
+                <w:i/>
+                <w:color w:val="666666"/>
+                <w:sz w:val="18"/>
+              </w:rPr>
+              <w:t>Director</w:t>
+            </w:r>
+          </w:p>
+          <w:p>
+            <w:pPr>
+              <w:spacing w:after="0" w:line="240" w:lineRule="auto"/>
+            </w:pPr>
+            <w:r>
+              <w:rPr>
+                <w:rFonts w:ascii="Arial" w:hAnsi="Arial"/>
+                <w:color w:val="666666"/>
+                <w:sz w:val="18"/>
+              </w:rPr>
+              <w:t>Regulatory Transformation Community of Practice</w:t>
+            </w:r>
+          </w:p>
+        </w:tc>
+      </w:tr>
+    </w:tbl>
     <w:p>
       <w:pPr>
         <w:spacing w:after="0" w:line="240" w:lineRule="auto"/>

</xml_diff>

<commit_message>
chore: update regulation hub 2026-05-15
</commit_message>
<xml_diff>
--- a/reg-hub/regulation_fortnightly_brief.docx
+++ b/reg-hub/regulation_fortnightly_brief.docx
@@ -46,7 +46,7 @@
         <w:pStyle w:val="Heading1"/>
       </w:pPr>
       <w:r>
-        <w:t>KPMG Regulatory Transformation Fortnightly Brief — 1–14 May 2026</w:t>
+        <w:t>KPMG Regulatory Transformation Fortnightly Brief — 3–16 May 2026</w:t>
       </w:r>
     </w:p>
     <w:p>
@@ -73,7 +73,7 @@
           <w:color w:val="666666"/>
           <w:sz w:val="19"/>
         </w:rPr>
-        <w:t>14 May 2026</w:t>
+        <w:t>16 May 2026</w:t>
       </w:r>
     </w:p>
     <w:p>
@@ -97,11 +97,11 @@
       <w:r>
         <w:rPr>
           <w:rFonts w:ascii="Arial" w:hAnsi="Arial"/>
-          <w:b w:val="0"/>
-          <w:color w:val="000000"/>
+          <w:i/>
+          <w:color w:val="666666"/>
           <w:sz w:val="19"/>
         </w:rPr>
-        <w:t>This fortnight regulators have leaned harder into enforcement capability and market oversight — antitrust funding has been topped up, energy regulators have stepped up scrutiny of gas market performance and network pricing proposals, and environmental and planning settings are being recalibrated through the Budget, landfill levy litigation and faster renewable approvals — while the AI adoption and burden-reduction agendas continue to mature in the background. The opportunity that matters most for our advisory practice is helping regulators translate this enforcement and pricing intensity into defensible, data-driven decision-making, because fragmented systems and limited analytical depth remain the binding constraint on credible regulatory action. Convene our energy, competition and environmental regulatory leads in the next fortnight to shape a joint point of view on evidence-led enforcement and pricing oversight, and brief priority regulator clients on how we can stand up the data, AI governance and operating-model uplift required to deliver it.</w:t>
+        <w:t>[edit before send] — Adam's 3-sentence key messages will prefill from the dashboard synthesis on the next fortnightly run. Type your replacement here.</w:t>
       </w:r>
     </w:p>
     <w:p>
@@ -120,698 +120,16 @@
     </w:p>
     <w:p>
       <w:pPr>
-        <w:pStyle w:val="ListBullet"/>
+        <w:pStyle w:val="body_letter"/>
       </w:pPr>
       <w:r>
         <w:rPr>
           <w:rFonts w:ascii="Arial" w:hAnsi="Arial"/>
-          <w:b/>
-          <w:color w:val="000000"/>
+          <w:i/>
+          <w:color w:val="666666"/>
           <w:sz w:val="19"/>
         </w:rPr>
-        <w:t>Australian Prudential Regulation Authority</w:t>
-      </w:r>
-      <w:r>
-        <w:rPr>
-          <w:rFonts w:ascii="Arial" w:hAnsi="Arial"/>
-          <w:color w:val="000000"/>
-          <w:sz w:val="19"/>
-        </w:rPr>
-        <w:t xml:space="preserve"> — </w:t>
-      </w:r>
-      <w:r>
-        <w:rPr>
-          <w:rFonts w:ascii="Arial" w:hAnsi="Arial"/>
-          <w:color w:val="000000"/>
-          <w:sz w:val="19"/>
-        </w:rPr>
-        <w:t>APRA issued an industry letter setting prudential expectations for the management and governance of AI risks across regulated financial institutions.</w:t>
-      </w:r>
-      <w:r>
-        <w:rPr>
-          <w:rFonts w:ascii="Arial" w:hAnsi="Arial"/>
-          <w:color w:val="000000"/>
-          <w:sz w:val="19"/>
-        </w:rPr>
-        <w:t xml:space="preserve"> (</w:t>
-      </w:r>
-      <w:hyperlink r:id="rId10">
-        <w:r>
-          <w:rPr>
-            <w:rFonts w:ascii="Arial" w:hAnsi="Arial" w:cs="Arial"/>
-            <w:color w:val="0000FF"/>
-            <w:sz w:val="19"/>
-            <w:szCs w:val="19"/>
-            <w:u w:val="single"/>
-          </w:rPr>
-          <w:t xml:space="preserve">Read more</w:t>
-        </w:r>
-      </w:hyperlink>
-      <w:r>
-        <w:rPr>
-          <w:rFonts w:ascii="Arial" w:hAnsi="Arial"/>
-          <w:color w:val="000000"/>
-          <w:sz w:val="19"/>
-        </w:rPr>
-        <w:t>)</w:t>
-      </w:r>
-    </w:p>
-    <w:p>
-      <w:pPr>
-        <w:pStyle w:val="ListBullet"/>
-      </w:pPr>
-      <w:r>
-        <w:rPr>
-          <w:rFonts w:ascii="Arial" w:hAnsi="Arial"/>
-          <w:b/>
-          <w:color w:val="000000"/>
-          <w:sz w:val="19"/>
-        </w:rPr>
-        <w:t>National Disability Insurance Agency</w:t>
-      </w:r>
-      <w:r>
-        <w:rPr>
-          <w:rFonts w:ascii="Arial" w:hAnsi="Arial"/>
-          <w:color w:val="000000"/>
-          <w:sz w:val="19"/>
-        </w:rPr>
-        <w:t xml:space="preserve"> — </w:t>
-      </w:r>
-      <w:r>
-        <w:rPr>
-          <w:rFonts w:ascii="Arial" w:hAnsi="Arial"/>
-          <w:color w:val="000000"/>
-          <w:sz w:val="19"/>
-        </w:rPr>
-        <w:t>The NDIA is advancing proposed access rules that would require participants to exhaust all appropriate treatment options before becoming eligible for scheme supports.</w:t>
-      </w:r>
-      <w:r>
-        <w:rPr>
-          <w:rFonts w:ascii="Arial" w:hAnsi="Arial"/>
-          <w:color w:val="000000"/>
-          <w:sz w:val="19"/>
-        </w:rPr>
-        <w:t xml:space="preserve"> (</w:t>
-      </w:r>
-      <w:hyperlink r:id="rId11">
-        <w:r>
-          <w:rPr>
-            <w:rFonts w:ascii="Arial" w:hAnsi="Arial" w:cs="Arial"/>
-            <w:color w:val="0000FF"/>
-            <w:sz w:val="19"/>
-            <w:szCs w:val="19"/>
-            <w:u w:val="single"/>
-          </w:rPr>
-          <w:t xml:space="preserve">Read more</w:t>
-        </w:r>
-      </w:hyperlink>
-      <w:r>
-        <w:rPr>
-          <w:rFonts w:ascii="Arial" w:hAnsi="Arial"/>
-          <w:color w:val="000000"/>
-          <w:sz w:val="19"/>
-        </w:rPr>
-        <w:t>)</w:t>
-      </w:r>
-    </w:p>
-    <w:p>
-      <w:pPr>
-        <w:pStyle w:val="ListBullet"/>
-      </w:pPr>
-      <w:r>
-        <w:rPr>
-          <w:rFonts w:ascii="Arial" w:hAnsi="Arial"/>
-          <w:b/>
-          <w:color w:val="000000"/>
-          <w:sz w:val="19"/>
-        </w:rPr>
-        <w:t>Tertiary Education Quality and Standards Agency</w:t>
-      </w:r>
-      <w:r>
-        <w:rPr>
-          <w:rFonts w:ascii="Arial" w:hAnsi="Arial"/>
-          <w:color w:val="000000"/>
-          <w:sz w:val="19"/>
-        </w:rPr>
-        <w:t xml:space="preserve"> — </w:t>
-      </w:r>
-      <w:r>
-        <w:rPr>
-          <w:rFonts w:ascii="Arial" w:hAnsi="Arial"/>
-          <w:color w:val="000000"/>
-          <w:sz w:val="19"/>
-        </w:rPr>
-        <w:t>TEQSA has been publicly warned over the scope and conduct of its regulatory intervention at the Australian National University.</w:t>
-      </w:r>
-      <w:r>
-        <w:rPr>
-          <w:rFonts w:ascii="Arial" w:hAnsi="Arial"/>
-          <w:color w:val="000000"/>
-          <w:sz w:val="19"/>
-        </w:rPr>
-        <w:t xml:space="preserve"> (</w:t>
-      </w:r>
-      <w:hyperlink r:id="rId12">
-        <w:r>
-          <w:rPr>
-            <w:rFonts w:ascii="Arial" w:hAnsi="Arial" w:cs="Arial"/>
-            <w:color w:val="0000FF"/>
-            <w:sz w:val="19"/>
-            <w:szCs w:val="19"/>
-            <w:u w:val="single"/>
-          </w:rPr>
-          <w:t xml:space="preserve">Read more</w:t>
-        </w:r>
-      </w:hyperlink>
-      <w:r>
-        <w:rPr>
-          <w:rFonts w:ascii="Arial" w:hAnsi="Arial"/>
-          <w:color w:val="000000"/>
-          <w:sz w:val="19"/>
-        </w:rPr>
-        <w:t>)</w:t>
-      </w:r>
-    </w:p>
-    <w:p>
-      <w:pPr>
-        <w:pStyle w:val="ListBullet"/>
-      </w:pPr>
-      <w:r>
-        <w:rPr>
-          <w:rFonts w:ascii="Arial" w:hAnsi="Arial"/>
-          <w:b/>
-          <w:color w:val="000000"/>
-          <w:sz w:val="19"/>
-        </w:rPr>
-        <w:t>Australian Competition and Consumer Commission</w:t>
-      </w:r>
-      <w:r>
-        <w:rPr>
-          <w:rFonts w:ascii="Arial" w:hAnsi="Arial"/>
-          <w:color w:val="000000"/>
-          <w:sz w:val="19"/>
-        </w:rPr>
-        <w:t xml:space="preserve"> — </w:t>
-      </w:r>
-      <w:r>
-        <w:rPr>
-          <w:rFonts w:ascii="Arial" w:hAnsi="Arial"/>
-          <w:color w:val="000000"/>
-          <w:sz w:val="19"/>
-        </w:rPr>
-        <w:t>The ACCC welcomed an additional $67.7 million in Budget funding to expand enforcement and pursue more consumer law breaches.</w:t>
-      </w:r>
-      <w:r>
-        <w:rPr>
-          <w:rFonts w:ascii="Arial" w:hAnsi="Arial"/>
-          <w:color w:val="000000"/>
-          <w:sz w:val="19"/>
-        </w:rPr>
-        <w:t xml:space="preserve"> (</w:t>
-      </w:r>
-      <w:hyperlink r:id="rId13">
-        <w:r>
-          <w:rPr>
-            <w:rFonts w:ascii="Arial" w:hAnsi="Arial" w:cs="Arial"/>
-            <w:color w:val="0000FF"/>
-            <w:sz w:val="19"/>
-            <w:szCs w:val="19"/>
-            <w:u w:val="single"/>
-          </w:rPr>
-          <w:t xml:space="preserve">Read more</w:t>
-        </w:r>
-      </w:hyperlink>
-      <w:r>
-        <w:rPr>
-          <w:rFonts w:ascii="Arial" w:hAnsi="Arial"/>
-          <w:color w:val="000000"/>
-          <w:sz w:val="19"/>
-        </w:rPr>
-        <w:t>)</w:t>
-      </w:r>
-    </w:p>
-    <w:p>
-      <w:pPr>
-        <w:pStyle w:val="ListBullet"/>
-      </w:pPr>
-      <w:r>
-        <w:rPr>
-          <w:rFonts w:ascii="Arial" w:hAnsi="Arial"/>
-          <w:b/>
-          <w:color w:val="000000"/>
-          <w:sz w:val="19"/>
-        </w:rPr>
-        <w:t>Environment Protection Authority Victoria</w:t>
-      </w:r>
-      <w:r>
-        <w:rPr>
-          <w:rFonts w:ascii="Arial" w:hAnsi="Arial"/>
-          <w:color w:val="000000"/>
-          <w:sz w:val="19"/>
-        </w:rPr>
-        <w:t xml:space="preserve"> — </w:t>
-      </w:r>
-      <w:r>
-        <w:rPr>
-          <w:rFonts w:ascii="Arial" w:hAnsi="Arial"/>
-          <w:color w:val="000000"/>
-          <w:sz w:val="19"/>
-        </w:rPr>
-        <w:t>EPA Victoria convened community engagement on the multi-million dollar Veolia enforcement payout to affected residents.</w:t>
-      </w:r>
-      <w:r>
-        <w:rPr>
-          <w:rFonts w:ascii="Arial" w:hAnsi="Arial"/>
-          <w:color w:val="000000"/>
-          <w:sz w:val="19"/>
-        </w:rPr>
-        <w:t xml:space="preserve"> (</w:t>
-      </w:r>
-      <w:hyperlink r:id="rId14">
-        <w:r>
-          <w:rPr>
-            <w:rFonts w:ascii="Arial" w:hAnsi="Arial" w:cs="Arial"/>
-            <w:color w:val="0000FF"/>
-            <w:sz w:val="19"/>
-            <w:szCs w:val="19"/>
-            <w:u w:val="single"/>
-          </w:rPr>
-          <w:t xml:space="preserve">Read more</w:t>
-        </w:r>
-      </w:hyperlink>
-      <w:r>
-        <w:rPr>
-          <w:rFonts w:ascii="Arial" w:hAnsi="Arial"/>
-          <w:color w:val="000000"/>
-          <w:sz w:val="19"/>
-        </w:rPr>
-        <w:t>)</w:t>
-      </w:r>
-    </w:p>
-    <w:p>
-      <w:pPr>
-        <w:pStyle w:val="ListBullet"/>
-      </w:pPr>
-      <w:r>
-        <w:rPr>
-          <w:rFonts w:ascii="Arial" w:hAnsi="Arial"/>
-          <w:b/>
-          <w:color w:val="000000"/>
-          <w:sz w:val="19"/>
-        </w:rPr>
-        <w:t>Department of Defence</w:t>
-      </w:r>
-      <w:r>
-        <w:rPr>
-          <w:rFonts w:ascii="Arial" w:hAnsi="Arial"/>
-          <w:color w:val="000000"/>
-          <w:sz w:val="19"/>
-        </w:rPr>
-        <w:t xml:space="preserve"> — </w:t>
-      </w:r>
-      <w:r>
-        <w:rPr>
-          <w:rFonts w:ascii="Arial" w:hAnsi="Arial"/>
-          <w:color w:val="000000"/>
-          <w:sz w:val="19"/>
-        </w:rPr>
-        <w:t>Defence's 2026 Budget leaves $17.4 billion of programmed spending uplift unallocated, signalling further capability decisions still to come.</w:t>
-      </w:r>
-      <w:r>
-        <w:rPr>
-          <w:rFonts w:ascii="Arial" w:hAnsi="Arial"/>
-          <w:color w:val="000000"/>
-          <w:sz w:val="19"/>
-        </w:rPr>
-        <w:t xml:space="preserve"> (</w:t>
-      </w:r>
-      <w:hyperlink r:id="rId15">
-        <w:r>
-          <w:rPr>
-            <w:rFonts w:ascii="Arial" w:hAnsi="Arial" w:cs="Arial"/>
-            <w:color w:val="0000FF"/>
-            <w:sz w:val="19"/>
-            <w:szCs w:val="19"/>
-            <w:u w:val="single"/>
-          </w:rPr>
-          <w:t xml:space="preserve">Read more</w:t>
-        </w:r>
-      </w:hyperlink>
-      <w:r>
-        <w:rPr>
-          <w:rFonts w:ascii="Arial" w:hAnsi="Arial"/>
-          <w:color w:val="000000"/>
-          <w:sz w:val="19"/>
-        </w:rPr>
-        <w:t>)</w:t>
-      </w:r>
-    </w:p>
-    <w:p>
-      <w:pPr>
-        <w:pStyle w:val="ListBullet"/>
-      </w:pPr>
-      <w:r>
-        <w:rPr>
-          <w:rFonts w:ascii="Arial" w:hAnsi="Arial"/>
-          <w:b/>
-          <w:color w:val="000000"/>
-          <w:sz w:val="19"/>
-        </w:rPr>
-        <w:t>Australian Transport Safety Bureau</w:t>
-      </w:r>
-      <w:r>
-        <w:rPr>
-          <w:rFonts w:ascii="Arial" w:hAnsi="Arial"/>
-          <w:color w:val="000000"/>
-          <w:sz w:val="19"/>
-        </w:rPr>
-        <w:t xml:space="preserve"> — </w:t>
-      </w:r>
-      <w:r>
-        <w:rPr>
-          <w:rFonts w:ascii="Arial" w:hAnsi="Arial"/>
-          <w:color w:val="000000"/>
-          <w:sz w:val="19"/>
-        </w:rPr>
-        <w:t>The ATSB published analysis of interviews with Australian aerial firefighting agencies and operators on aviation safety risks.</w:t>
-      </w:r>
-      <w:r>
-        <w:rPr>
-          <w:rFonts w:ascii="Arial" w:hAnsi="Arial"/>
-          <w:color w:val="000000"/>
-          <w:sz w:val="19"/>
-        </w:rPr>
-        <w:t xml:space="preserve"> (</w:t>
-      </w:r>
-      <w:hyperlink r:id="rId16">
-        <w:r>
-          <w:rPr>
-            <w:rFonts w:ascii="Arial" w:hAnsi="Arial" w:cs="Arial"/>
-            <w:color w:val="0000FF"/>
-            <w:sz w:val="19"/>
-            <w:szCs w:val="19"/>
-            <w:u w:val="single"/>
-          </w:rPr>
-          <w:t xml:space="preserve">Read more</w:t>
-        </w:r>
-      </w:hyperlink>
-      <w:r>
-        <w:rPr>
-          <w:rFonts w:ascii="Arial" w:hAnsi="Arial"/>
-          <w:color w:val="000000"/>
-          <w:sz w:val="19"/>
-        </w:rPr>
-        <w:t>)</w:t>
-      </w:r>
-    </w:p>
-    <w:p>
-      <w:pPr>
-        <w:pStyle w:val="ListBullet"/>
-      </w:pPr>
-      <w:r>
-        <w:rPr>
-          <w:rFonts w:ascii="Arial" w:hAnsi="Arial"/>
-          <w:b/>
-          <w:color w:val="000000"/>
-          <w:sz w:val="19"/>
-        </w:rPr>
-        <w:t>Australian Transaction Reports and Analysis Centre</w:t>
-      </w:r>
-      <w:r>
-        <w:rPr>
-          <w:rFonts w:ascii="Arial" w:hAnsi="Arial"/>
-          <w:color w:val="000000"/>
-          <w:sz w:val="19"/>
-        </w:rPr>
-        <w:t xml:space="preserve"> — </w:t>
-      </w:r>
-      <w:r>
-        <w:rPr>
-          <w:rFonts w:ascii="Arial" w:hAnsi="Arial"/>
-          <w:color w:val="000000"/>
-          <w:sz w:val="19"/>
-        </w:rPr>
-        <w:t>AUSTRAC released registration questions and guidance for virtual asset service providers ahead of expanded AML/CTF obligations.</w:t>
-      </w:r>
-      <w:r>
-        <w:rPr>
-          <w:rFonts w:ascii="Arial" w:hAnsi="Arial"/>
-          <w:color w:val="000000"/>
-          <w:sz w:val="19"/>
-        </w:rPr>
-        <w:t xml:space="preserve"> (</w:t>
-      </w:r>
-      <w:hyperlink r:id="rId17">
-        <w:r>
-          <w:rPr>
-            <w:rFonts w:ascii="Arial" w:hAnsi="Arial" w:cs="Arial"/>
-            <w:color w:val="0000FF"/>
-            <w:sz w:val="19"/>
-            <w:szCs w:val="19"/>
-            <w:u w:val="single"/>
-          </w:rPr>
-          <w:t xml:space="preserve">Read more</w:t>
-        </w:r>
-      </w:hyperlink>
-      <w:r>
-        <w:rPr>
-          <w:rFonts w:ascii="Arial" w:hAnsi="Arial"/>
-          <w:color w:val="000000"/>
-          <w:sz w:val="19"/>
-        </w:rPr>
-        <w:t>)</w:t>
-      </w:r>
-    </w:p>
-    <w:p>
-      <w:pPr>
-        <w:pStyle w:val="ListBullet"/>
-      </w:pPr>
-      <w:r>
-        <w:rPr>
-          <w:rFonts w:ascii="Arial" w:hAnsi="Arial"/>
-          <w:b/>
-          <w:color w:val="000000"/>
-          <w:sz w:val="19"/>
-        </w:rPr>
-        <w:t>Australian Taxation Office</w:t>
-      </w:r>
-      <w:r>
-        <w:rPr>
-          <w:rFonts w:ascii="Arial" w:hAnsi="Arial"/>
-          <w:color w:val="000000"/>
-          <w:sz w:val="19"/>
-        </w:rPr>
-        <w:t xml:space="preserve"> — </w:t>
-      </w:r>
-      <w:r>
-        <w:rPr>
-          <w:rFonts w:ascii="Arial" w:hAnsi="Arial"/>
-          <w:color w:val="000000"/>
-          <w:sz w:val="19"/>
-        </w:rPr>
-        <w:t>The ATO flagged tax reform introducing a minimum tax on discretionary trusts, signalling tighter integrity settings for private wealth structures.</w:t>
-      </w:r>
-      <w:r>
-        <w:rPr>
-          <w:rFonts w:ascii="Arial" w:hAnsi="Arial"/>
-          <w:color w:val="000000"/>
-          <w:sz w:val="19"/>
-        </w:rPr>
-        <w:t xml:space="preserve"> (</w:t>
-      </w:r>
-      <w:hyperlink r:id="rId18">
-        <w:r>
-          <w:rPr>
-            <w:rFonts w:ascii="Arial" w:hAnsi="Arial" w:cs="Arial"/>
-            <w:color w:val="0000FF"/>
-            <w:sz w:val="19"/>
-            <w:szCs w:val="19"/>
-            <w:u w:val="single"/>
-          </w:rPr>
-          <w:t xml:space="preserve">Read more</w:t>
-        </w:r>
-      </w:hyperlink>
-      <w:r>
-        <w:rPr>
-          <w:rFonts w:ascii="Arial" w:hAnsi="Arial"/>
-          <w:color w:val="000000"/>
-          <w:sz w:val="19"/>
-        </w:rPr>
-        <w:t>)</w:t>
-      </w:r>
-    </w:p>
-    <w:p>
-      <w:pPr>
-        <w:pStyle w:val="ListBullet"/>
-      </w:pPr>
-      <w:r>
-        <w:rPr>
-          <w:rFonts w:ascii="Arial" w:hAnsi="Arial"/>
-          <w:b/>
-          <w:color w:val="000000"/>
-          <w:sz w:val="19"/>
-        </w:rPr>
-        <w:t>Department of the Treasury</w:t>
-      </w:r>
-      <w:r>
-        <w:rPr>
-          <w:rFonts w:ascii="Arial" w:hAnsi="Arial"/>
-          <w:color w:val="000000"/>
-          <w:sz w:val="19"/>
-        </w:rPr>
-        <w:t xml:space="preserve"> — </w:t>
-      </w:r>
-      <w:r>
-        <w:rPr>
-          <w:rFonts w:ascii="Arial" w:hAnsi="Arial"/>
-          <w:color w:val="000000"/>
-          <w:sz w:val="19"/>
-        </w:rPr>
-        <w:t>Treasury is progressing payments system modernisation reforms, setting out readiness expectations for licensed payment service providers.</w:t>
-      </w:r>
-      <w:r>
-        <w:rPr>
-          <w:rFonts w:ascii="Arial" w:hAnsi="Arial"/>
-          <w:color w:val="000000"/>
-          <w:sz w:val="19"/>
-        </w:rPr>
-        <w:t xml:space="preserve"> (</w:t>
-      </w:r>
-      <w:hyperlink r:id="rId19">
-        <w:r>
-          <w:rPr>
-            <w:rFonts w:ascii="Arial" w:hAnsi="Arial" w:cs="Arial"/>
-            <w:color w:val="0000FF"/>
-            <w:sz w:val="19"/>
-            <w:szCs w:val="19"/>
-            <w:u w:val="single"/>
-          </w:rPr>
-          <w:t xml:space="preserve">Read more</w:t>
-        </w:r>
-      </w:hyperlink>
-      <w:r>
-        <w:rPr>
-          <w:rFonts w:ascii="Arial" w:hAnsi="Arial"/>
-          <w:color w:val="000000"/>
-          <w:sz w:val="19"/>
-        </w:rPr>
-        <w:t>)</w:t>
-      </w:r>
-    </w:p>
-    <w:p>
-      <w:pPr>
-        <w:pStyle w:val="ListBullet"/>
-      </w:pPr>
-      <w:r>
-        <w:rPr>
-          <w:rFonts w:ascii="Arial" w:hAnsi="Arial"/>
-          <w:b/>
-          <w:color w:val="000000"/>
-          <w:sz w:val="19"/>
-        </w:rPr>
-        <w:t>Australian Securities and Investments Commission</w:t>
-      </w:r>
-      <w:r>
-        <w:rPr>
-          <w:rFonts w:ascii="Arial" w:hAnsi="Arial"/>
-          <w:color w:val="000000"/>
-          <w:sz w:val="19"/>
-        </w:rPr>
-        <w:t xml:space="preserve"> — </w:t>
-      </w:r>
-      <w:r>
-        <w:rPr>
-          <w:rFonts w:ascii="Arial" w:hAnsi="Arial"/>
-          <w:color w:val="000000"/>
-          <w:sz w:val="19"/>
-        </w:rPr>
-        <w:t>ASIC is investigating DroneShield over continuous disclosure compliance and share trading by insiders.</w:t>
-      </w:r>
-      <w:r>
-        <w:rPr>
-          <w:rFonts w:ascii="Arial" w:hAnsi="Arial"/>
-          <w:color w:val="000000"/>
-          <w:sz w:val="19"/>
-        </w:rPr>
-        <w:t xml:space="preserve"> (</w:t>
-      </w:r>
-      <w:hyperlink r:id="rId20">
-        <w:r>
-          <w:rPr>
-            <w:rFonts w:ascii="Arial" w:hAnsi="Arial" w:cs="Arial"/>
-            <w:color w:val="0000FF"/>
-            <w:sz w:val="19"/>
-            <w:szCs w:val="19"/>
-            <w:u w:val="single"/>
-          </w:rPr>
-          <w:t xml:space="preserve">Read more</w:t>
-        </w:r>
-      </w:hyperlink>
-      <w:r>
-        <w:rPr>
-          <w:rFonts w:ascii="Arial" w:hAnsi="Arial"/>
-          <w:color w:val="000000"/>
-          <w:sz w:val="19"/>
-        </w:rPr>
-        <w:t>)</w:t>
-      </w:r>
-    </w:p>
-    <w:p>
-      <w:pPr>
-        <w:pStyle w:val="ListBullet"/>
-      </w:pPr>
-      <w:r>
-        <w:rPr>
-          <w:rFonts w:ascii="Arial" w:hAnsi="Arial"/>
-          <w:b/>
-          <w:color w:val="000000"/>
-          <w:sz w:val="19"/>
-        </w:rPr>
-        <w:t>Australian Transaction Reports and Analysis Centre</w:t>
-      </w:r>
-      <w:r>
-        <w:rPr>
-          <w:rFonts w:ascii="Arial" w:hAnsi="Arial"/>
-          <w:color w:val="000000"/>
-          <w:sz w:val="19"/>
-        </w:rPr>
-        <w:t xml:space="preserve"> — </w:t>
-      </w:r>
-      <w:r>
-        <w:rPr>
-          <w:rFonts w:ascii="Arial" w:hAnsi="Arial"/>
-          <w:color w:val="000000"/>
-          <w:sz w:val="19"/>
-        </w:rPr>
-        <w:t>AUSTRAC published its Money Laundering Update 2026, refreshing typologies and supervisory priorities for reporting entities.</w:t>
-      </w:r>
-      <w:r>
-        <w:rPr>
-          <w:rFonts w:ascii="Arial" w:hAnsi="Arial"/>
-          <w:color w:val="000000"/>
-          <w:sz w:val="19"/>
-        </w:rPr>
-        <w:t xml:space="preserve"> (</w:t>
-      </w:r>
-      <w:hyperlink r:id="rId21">
-        <w:r>
-          <w:rPr>
-            <w:rFonts w:ascii="Arial" w:hAnsi="Arial" w:cs="Arial"/>
-            <w:color w:val="0000FF"/>
-            <w:sz w:val="19"/>
-            <w:szCs w:val="19"/>
-            <w:u w:val="single"/>
-          </w:rPr>
-          <w:t xml:space="preserve">Read more</w:t>
-        </w:r>
-      </w:hyperlink>
-      <w:r>
-        <w:rPr>
-          <w:rFonts w:ascii="Arial" w:hAnsi="Arial"/>
-          <w:color w:val="000000"/>
-          <w:sz w:val="19"/>
-        </w:rPr>
-        <w:t>)</w:t>
+        <w:t>No regulator-in-news signal this fortnight — see Themes below.</w:t>
       </w:r>
     </w:p>
     <w:p>
@@ -835,307 +153,11 @@
       <w:r>
         <w:rPr>
           <w:rFonts w:ascii="Arial" w:hAnsi="Arial"/>
-          <w:b/>
-          <w:color w:val="000000"/>
+          <w:i/>
+          <w:color w:val="666666"/>
           <w:sz w:val="19"/>
         </w:rPr>
-        <w:t>Victoria</w:t>
-      </w:r>
-    </w:p>
-    <w:p>
-      <w:pPr>
-        <w:pStyle w:val="ListBullet"/>
-      </w:pPr>
-      <w:r>
-        <w:rPr>
-          <w:rFonts w:ascii="Arial" w:hAnsi="Arial"/>
-          <w:b/>
-          <w:color w:val="000000"/>
-          <w:sz w:val="19"/>
-        </w:rPr>
-        <w:t>Environment Protection Authority Victoria</w:t>
-      </w:r>
-      <w:r>
-        <w:rPr>
-          <w:rFonts w:ascii="Arial" w:hAnsi="Arial"/>
-          <w:color w:val="000000"/>
-          <w:sz w:val="19"/>
-        </w:rPr>
-        <w:t xml:space="preserve"> — </w:t>
-      </w:r>
-      <w:r>
-        <w:rPr>
-          <w:rFonts w:ascii="Arial" w:hAnsi="Arial"/>
-          <w:color w:val="000000"/>
-          <w:sz w:val="19"/>
-        </w:rPr>
-        <w:t>EPA wins Supreme Court appeal on Landfill Levy</w:t>
-      </w:r>
-    </w:p>
-    <w:p>
-      <w:pPr>
-        <w:pStyle w:val="ListBullet"/>
-      </w:pPr>
-      <w:r>
-        <w:rPr>
-          <w:rFonts w:ascii="Arial" w:hAnsi="Arial"/>
-          <w:b/>
-          <w:color w:val="000000"/>
-          <w:sz w:val="19"/>
-        </w:rPr>
-        <w:t>Environment Protection Authority Victoria</w:t>
-      </w:r>
-      <w:r>
-        <w:rPr>
-          <w:rFonts w:ascii="Arial" w:hAnsi="Arial"/>
-          <w:color w:val="000000"/>
-          <w:sz w:val="19"/>
-        </w:rPr>
-        <w:t xml:space="preserve"> — </w:t>
-      </w:r>
-      <w:r>
-        <w:rPr>
-          <w:rFonts w:ascii="Arial" w:hAnsi="Arial"/>
-          <w:color w:val="000000"/>
-          <w:sz w:val="19"/>
-        </w:rPr>
-        <w:t>EPA blitz on rogue skip bin operators</w:t>
-      </w:r>
-    </w:p>
-    <w:p>
-      <w:pPr>
-        <w:pStyle w:val="ListBullet"/>
-      </w:pPr>
-      <w:r>
-        <w:rPr>
-          <w:rFonts w:ascii="Arial" w:hAnsi="Arial"/>
-          <w:b/>
-          <w:color w:val="000000"/>
-          <w:sz w:val="19"/>
-        </w:rPr>
-        <w:t>Victorian Building Authority</w:t>
-      </w:r>
-      <w:r>
-        <w:rPr>
-          <w:rFonts w:ascii="Arial" w:hAnsi="Arial"/>
-          <w:color w:val="000000"/>
-          <w:sz w:val="19"/>
-        </w:rPr>
-        <w:t xml:space="preserve"> — </w:t>
-      </w:r>
-      <w:r>
-        <w:rPr>
-          <w:rFonts w:ascii="Arial" w:hAnsi="Arial"/>
-          <w:color w:val="000000"/>
-          <w:sz w:val="19"/>
-        </w:rPr>
-        <w:t>VBA publishes NCC 2025 amended variations</w:t>
-      </w:r>
-    </w:p>
-    <w:p>
-      <w:pPr>
-        <w:pStyle w:val="body_letter"/>
-      </w:pPr>
-      <w:r>
-        <w:rPr>
-          <w:rFonts w:ascii="Arial" w:hAnsi="Arial"/>
-          <w:b/>
-          <w:color w:val="000000"/>
-          <w:sz w:val="19"/>
-        </w:rPr>
-        <w:t>Commonwealth</w:t>
-      </w:r>
-    </w:p>
-    <w:p>
-      <w:pPr>
-        <w:pStyle w:val="ListBullet"/>
-      </w:pPr>
-      <w:r>
-        <w:rPr>
-          <w:rFonts w:ascii="Arial" w:hAnsi="Arial"/>
-          <w:b/>
-          <w:color w:val="000000"/>
-          <w:sz w:val="19"/>
-        </w:rPr>
-        <w:t>Australian Competition and Consumer Commission</w:t>
-      </w:r>
-      <w:r>
-        <w:rPr>
-          <w:rFonts w:ascii="Arial" w:hAnsi="Arial"/>
-          <w:color w:val="000000"/>
-          <w:sz w:val="19"/>
-        </w:rPr>
-        <w:t xml:space="preserve"> — </w:t>
-      </w:r>
-      <w:r>
-        <w:rPr>
-          <w:rFonts w:ascii="Arial" w:hAnsi="Arial"/>
-          <w:color w:val="000000"/>
-          <w:sz w:val="19"/>
-        </w:rPr>
-        <w:t>ACCC welcomes A$67.7m enforcement funding boost</w:t>
-      </w:r>
-    </w:p>
-    <w:p>
-      <w:pPr>
-        <w:pStyle w:val="ListBullet"/>
-      </w:pPr>
-      <w:r>
-        <w:rPr>
-          <w:rFonts w:ascii="Arial" w:hAnsi="Arial"/>
-          <w:b/>
-          <w:color w:val="000000"/>
-          <w:sz w:val="19"/>
-        </w:rPr>
-        <w:t>Australian Energy Regulator</w:t>
-      </w:r>
-      <w:r>
-        <w:rPr>
-          <w:rFonts w:ascii="Arial" w:hAnsi="Arial"/>
-          <w:color w:val="000000"/>
-          <w:sz w:val="19"/>
-        </w:rPr>
-        <w:t xml:space="preserve"> — </w:t>
-      </w:r>
-      <w:r>
-        <w:rPr>
-          <w:rFonts w:ascii="Arial" w:hAnsi="Arial"/>
-          <w:color w:val="000000"/>
-          <w:sz w:val="19"/>
-        </w:rPr>
-        <w:t>AER releases inaugural wholesale gas market performance report</w:t>
-      </w:r>
-      <w:r>
-        <w:rPr>
-          <w:rFonts w:ascii="Arial" w:hAnsi="Arial"/>
-          <w:color w:val="000000"/>
-          <w:sz w:val="19"/>
-        </w:rPr>
-        <w:t xml:space="preserve"> (</w:t>
-      </w:r>
-      <w:hyperlink r:id="rId22">
-        <w:r>
-          <w:rPr>
-            <w:rFonts w:ascii="Arial" w:hAnsi="Arial" w:cs="Arial"/>
-            <w:color w:val="0000FF"/>
-            <w:sz w:val="19"/>
-            <w:szCs w:val="19"/>
-            <w:u w:val="single"/>
-          </w:rPr>
-          <w:t xml:space="preserve">Read more</w:t>
-        </w:r>
-      </w:hyperlink>
-      <w:r>
-        <w:rPr>
-          <w:rFonts w:ascii="Arial" w:hAnsi="Arial"/>
-          <w:color w:val="000000"/>
-          <w:sz w:val="19"/>
-        </w:rPr>
-        <w:t>)</w:t>
-      </w:r>
-    </w:p>
-    <w:p>
-      <w:pPr>
-        <w:pStyle w:val="ListBullet"/>
-      </w:pPr>
-      <w:r>
-        <w:rPr>
-          <w:rFonts w:ascii="Arial" w:hAnsi="Arial"/>
-          <w:b/>
-          <w:color w:val="000000"/>
-          <w:sz w:val="19"/>
-        </w:rPr>
-        <w:t>National Disability Insurance Agency</w:t>
-      </w:r>
-      <w:r>
-        <w:rPr>
-          <w:rFonts w:ascii="Arial" w:hAnsi="Arial"/>
-          <w:color w:val="000000"/>
-          <w:sz w:val="19"/>
-        </w:rPr>
-        <w:t xml:space="preserve"> — </w:t>
-      </w:r>
-      <w:r>
-        <w:rPr>
-          <w:rFonts w:ascii="Arial" w:hAnsi="Arial"/>
-          <w:color w:val="000000"/>
-          <w:sz w:val="19"/>
-        </w:rPr>
-        <w:t>Proposed NDIS rules require exhausting 'all appropriate' treatments</w:t>
-      </w:r>
-    </w:p>
-    <w:p>
-      <w:pPr>
-        <w:pStyle w:val="body_letter"/>
-      </w:pPr>
-      <w:r>
-        <w:rPr>
-          <w:rFonts w:ascii="Arial" w:hAnsi="Arial"/>
-          <w:b/>
-          <w:color w:val="000000"/>
-          <w:sz w:val="19"/>
-        </w:rPr>
-        <w:t>New South Wales</w:t>
-      </w:r>
-    </w:p>
-    <w:p>
-      <w:pPr>
-        <w:pStyle w:val="ListBullet"/>
-      </w:pPr>
-      <w:r>
-        <w:rPr>
-          <w:rFonts w:ascii="Arial" w:hAnsi="Arial"/>
-          <w:b/>
-          <w:color w:val="000000"/>
-          <w:sz w:val="19"/>
-        </w:rPr>
-        <w:t>State Insurance Regulatory Authority</w:t>
-      </w:r>
-      <w:r>
-        <w:rPr>
-          <w:rFonts w:ascii="Arial" w:hAnsi="Arial"/>
-          <w:color w:val="000000"/>
-          <w:sz w:val="19"/>
-        </w:rPr>
-        <w:t xml:space="preserve"> — </w:t>
-      </w:r>
-      <w:r>
-        <w:rPr>
-          <w:rFonts w:ascii="Arial" w:hAnsi="Arial"/>
-          <w:color w:val="000000"/>
-          <w:sz w:val="19"/>
-        </w:rPr>
-        <w:t>SIRA sets two-year timeline to reshape injury health provider rules</w:t>
-      </w:r>
-    </w:p>
-    <w:p>
-      <w:pPr>
-        <w:pStyle w:val="ListBullet"/>
-      </w:pPr>
-      <w:r>
-        <w:rPr>
-          <w:rFonts w:ascii="Arial" w:hAnsi="Arial"/>
-          <w:b/>
-          <w:color w:val="000000"/>
-          <w:sz w:val="19"/>
-        </w:rPr>
-        <w:t>Independent Commission Against Corruption</w:t>
-      </w:r>
-      <w:r>
-        <w:rPr>
-          <w:rFonts w:ascii="Arial" w:hAnsi="Arial"/>
-          <w:color w:val="000000"/>
-          <w:sz w:val="19"/>
-        </w:rPr>
-        <w:t xml:space="preserve"> — </w:t>
-      </w:r>
-      <w:r>
-        <w:rPr>
-          <w:rFonts w:ascii="Arial" w:hAnsi="Arial"/>
-          <w:color w:val="000000"/>
-          <w:sz w:val="19"/>
-        </w:rPr>
-        <w:t>ICAC opens 'Pink Ops' public hearings</w:t>
+        <w:t>No client-in-news signal this fortnight across any jurisdiction.</w:t>
       </w:r>
     </w:p>
     <w:p>
@@ -1224,206 +246,16 @@
     </w:p>
     <w:p>
       <w:pPr>
-        <w:pStyle w:val="ListBullet"/>
+        <w:pStyle w:val="body_letter"/>
       </w:pPr>
       <w:r>
         <w:rPr>
           <w:rFonts w:ascii="Arial" w:hAnsi="Arial"/>
-          <w:b/>
-          <w:color w:val="000000"/>
+          <w:i/>
+          <w:color w:val="666666"/>
           <w:sz w:val="19"/>
         </w:rPr>
-        <w:t>AER flags wholesale gas market performance concerns</w:t>
-      </w:r>
-      <w:r>
-        <w:rPr>
-          <w:rFonts w:ascii="Arial" w:hAnsi="Arial"/>
-          <w:color w:val="000000"/>
-          <w:sz w:val="19"/>
-        </w:rPr>
-        <w:t xml:space="preserve"> — </w:t>
-      </w:r>
-      <w:r>
-        <w:rPr>
-          <w:rFonts w:ascii="Arial" w:hAnsi="Arial"/>
-          <w:color w:val="000000"/>
-          <w:sz w:val="19"/>
-        </w:rPr>
-        <w:t>The Australian Energy Regulator has released its inaugural report into wholesale gas market performance, signalling closer scrutiny of pricing, supply tightness and conduct as the east coast market…</w:t>
-      </w:r>
-    </w:p>
-    <w:p>
-      <w:pPr>
-        <w:pStyle w:val="ListBullet"/>
-      </w:pPr>
-      <w:r>
-        <w:rPr>
-          <w:rFonts w:ascii="Arial" w:hAnsi="Arial"/>
-          <w:b/>
-          <w:color w:val="000000"/>
-          <w:sz w:val="19"/>
-        </w:rPr>
-        <w:t>AMCS warns proposed National Environmental Standards will fail</w:t>
-      </w:r>
-      <w:r>
-        <w:rPr>
-          <w:rFonts w:ascii="Arial" w:hAnsi="Arial"/>
-          <w:color w:val="000000"/>
-          <w:sz w:val="19"/>
-        </w:rPr>
-        <w:t xml:space="preserve"> — </w:t>
-      </w:r>
-      <w:r>
-        <w:rPr>
-          <w:rFonts w:ascii="Arial" w:hAnsi="Arial"/>
-          <w:color w:val="000000"/>
-          <w:sz w:val="19"/>
-        </w:rPr>
-        <w:t>The Australian Marine Conservation Society has flagged that the Federal Government's proposed National Environmental Standards will fail to deliver intended biodiversity and climate protections,…</w:t>
-      </w:r>
-      <w:r>
-        <w:rPr>
-          <w:rFonts w:ascii="Arial" w:hAnsi="Arial"/>
-          <w:color w:val="000000"/>
-          <w:sz w:val="19"/>
-        </w:rPr>
-        <w:t xml:space="preserve"> (</w:t>
-      </w:r>
-      <w:hyperlink r:id="rId23">
-        <w:r>
-          <w:rPr>
-            <w:rFonts w:ascii="Arial" w:hAnsi="Arial" w:cs="Arial"/>
-            <w:color w:val="0000FF"/>
-            <w:sz w:val="19"/>
-            <w:szCs w:val="19"/>
-            <w:u w:val="single"/>
-          </w:rPr>
-          <w:t xml:space="preserve">Read more</w:t>
-        </w:r>
-      </w:hyperlink>
-      <w:r>
-        <w:rPr>
-          <w:rFonts w:ascii="Arial" w:hAnsi="Arial"/>
-          <w:color w:val="000000"/>
-          <w:sz w:val="19"/>
-        </w:rPr>
-        <w:t>)</w:t>
-      </w:r>
-    </w:p>
-    <w:p>
-      <w:pPr>
-        <w:pStyle w:val="ListBullet"/>
-      </w:pPr>
-      <w:r>
-        <w:rPr>
-          <w:rFonts w:ascii="Arial" w:hAnsi="Arial"/>
-          <w:b/>
-          <w:color w:val="000000"/>
-          <w:sz w:val="19"/>
-        </w:rPr>
-        <w:t>Ahpra targets racism and discrimination in healthcare</w:t>
-      </w:r>
-      <w:r>
-        <w:rPr>
-          <w:rFonts w:ascii="Arial" w:hAnsi="Arial"/>
-          <w:color w:val="000000"/>
-          <w:sz w:val="19"/>
-        </w:rPr>
-        <w:t xml:space="preserve"> — </w:t>
-      </w:r>
-      <w:r>
-        <w:rPr>
-          <w:rFonts w:ascii="Arial" w:hAnsi="Arial"/>
-          <w:color w:val="000000"/>
-          <w:sz w:val="19"/>
-        </w:rPr>
-        <w:t>The Australian Health Practitioner Regulation Agency has set out new expectations on eliminating racism and discrimination from healthcare, signalling a cultural-safety lens across registration,…</w:t>
-      </w:r>
-      <w:r>
-        <w:rPr>
-          <w:rFonts w:ascii="Arial" w:hAnsi="Arial"/>
-          <w:color w:val="000000"/>
-          <w:sz w:val="19"/>
-        </w:rPr>
-        <w:t xml:space="preserve"> (</w:t>
-      </w:r>
-      <w:hyperlink r:id="rId24">
-        <w:r>
-          <w:rPr>
-            <w:rFonts w:ascii="Arial" w:hAnsi="Arial" w:cs="Arial"/>
-            <w:color w:val="0000FF"/>
-            <w:sz w:val="19"/>
-            <w:szCs w:val="19"/>
-            <w:u w:val="single"/>
-          </w:rPr>
-          <w:t xml:space="preserve">Read more</w:t>
-        </w:r>
-      </w:hyperlink>
-      <w:r>
-        <w:rPr>
-          <w:rFonts w:ascii="Arial" w:hAnsi="Arial"/>
-          <w:color w:val="000000"/>
-          <w:sz w:val="19"/>
-        </w:rPr>
-        <w:t>)</w:t>
-      </w:r>
-    </w:p>
-    <w:p>
-      <w:pPr>
-        <w:pStyle w:val="ListBullet"/>
-      </w:pPr>
-      <w:r>
-        <w:rPr>
-          <w:rFonts w:ascii="Arial" w:hAnsi="Arial"/>
-          <w:b/>
-          <w:color w:val="000000"/>
-          <w:sz w:val="19"/>
-        </w:rPr>
-        <w:t>Inspector-General of Aged Care resigns</w:t>
-      </w:r>
-      <w:r>
-        <w:rPr>
-          <w:rFonts w:ascii="Arial" w:hAnsi="Arial"/>
-          <w:color w:val="000000"/>
-          <w:sz w:val="19"/>
-        </w:rPr>
-        <w:t xml:space="preserve"> — </w:t>
-      </w:r>
-      <w:r>
-        <w:rPr>
-          <w:rFonts w:ascii="Arial" w:hAnsi="Arial"/>
-          <w:color w:val="000000"/>
-          <w:sz w:val="19"/>
-        </w:rPr>
-        <w:t>The resignation of the Inspector-General of Aged Care raises immediate oversight and continuity risks for families and providers as the new Aged Care Act bedding-in continues.</w:t>
-      </w:r>
-      <w:r>
-        <w:rPr>
-          <w:rFonts w:ascii="Arial" w:hAnsi="Arial"/>
-          <w:color w:val="000000"/>
-          <w:sz w:val="19"/>
-        </w:rPr>
-        <w:t xml:space="preserve"> (</w:t>
-      </w:r>
-      <w:hyperlink r:id="rId25">
-        <w:r>
-          <w:rPr>
-            <w:rFonts w:ascii="Arial" w:hAnsi="Arial" w:cs="Arial"/>
-            <w:color w:val="0000FF"/>
-            <w:sz w:val="19"/>
-            <w:szCs w:val="19"/>
-            <w:u w:val="single"/>
-          </w:rPr>
-          <w:t xml:space="preserve">Read more</w:t>
-        </w:r>
-      </w:hyperlink>
-      <w:r>
-        <w:rPr>
-          <w:rFonts w:ascii="Arial" w:hAnsi="Arial"/>
-          <w:color w:val="000000"/>
-          <w:sz w:val="19"/>
-        </w:rPr>
-        <w:t>)</w:t>
+        <w:t>No emerging risks signal this fortnight.</w:t>
       </w:r>
     </w:p>
     <w:p>
@@ -1442,176 +274,16 @@
     </w:p>
     <w:p>
       <w:pPr>
-        <w:pStyle w:val="ListBullet"/>
+        <w:pStyle w:val="body_letter"/>
       </w:pPr>
       <w:r>
         <w:rPr>
           <w:rFonts w:ascii="Arial" w:hAnsi="Arial"/>
-          <w:b/>
-          <w:color w:val="000000"/>
+          <w:i/>
+          <w:color w:val="666666"/>
           <w:sz w:val="19"/>
         </w:rPr>
-        <w:t>ASIC calls for urgent cyber uplift as AI accelerates threats</w:t>
-      </w:r>
-      <w:r>
-        <w:rPr>
-          <w:rFonts w:ascii="Arial" w:hAnsi="Arial"/>
-          <w:color w:val="000000"/>
-          <w:sz w:val="19"/>
-        </w:rPr>
-        <w:t xml:space="preserve"> — </w:t>
-      </w:r>
-      <w:r>
-        <w:rPr>
-          <w:rFonts w:ascii="Arial" w:hAnsi="Arial"/>
-          <w:color w:val="000000"/>
-          <w:sz w:val="19"/>
-        </w:rPr>
-        <w:t>ASIC has called on AFS licensees and market participants to urgently uplift cyber resilience as generative AI accelerates the scale, speed and sophistication of cyber attacks on the financial system.</w:t>
-      </w:r>
-      <w:r>
-        <w:rPr>
-          <w:rFonts w:ascii="Arial" w:hAnsi="Arial"/>
-          <w:color w:val="000000"/>
-          <w:sz w:val="19"/>
-        </w:rPr>
-        <w:t xml:space="preserve"> (</w:t>
-      </w:r>
-      <w:hyperlink r:id="rId26">
-        <w:r>
-          <w:rPr>
-            <w:rFonts w:ascii="Arial" w:hAnsi="Arial" w:cs="Arial"/>
-            <w:color w:val="0000FF"/>
-            <w:sz w:val="19"/>
-            <w:szCs w:val="19"/>
-            <w:u w:val="single"/>
-          </w:rPr>
-          <w:t xml:space="preserve">Read more</w:t>
-        </w:r>
-      </w:hyperlink>
-      <w:r>
-        <w:rPr>
-          <w:rFonts w:ascii="Arial" w:hAnsi="Arial"/>
-          <w:color w:val="000000"/>
-          <w:sz w:val="19"/>
-        </w:rPr>
-        <w:t>)</w:t>
-      </w:r>
-    </w:p>
-    <w:p>
-      <w:pPr>
-        <w:pStyle w:val="ListBullet"/>
-      </w:pPr>
-      <w:r>
-        <w:rPr>
-          <w:rFonts w:ascii="Arial" w:hAnsi="Arial"/>
-          <w:b/>
-          <w:color w:val="000000"/>
-          <w:sz w:val="19"/>
-        </w:rPr>
-        <w:t>APRA warns banks frontier AI could supercharge cyber attacks</w:t>
-      </w:r>
-      <w:r>
-        <w:rPr>
-          <w:rFonts w:ascii="Arial" w:hAnsi="Arial"/>
-          <w:color w:val="000000"/>
-          <w:sz w:val="19"/>
-        </w:rPr>
-        <w:t xml:space="preserve"> — </w:t>
-      </w:r>
-      <w:r>
-        <w:rPr>
-          <w:rFonts w:ascii="Arial" w:hAnsi="Arial"/>
-          <w:color w:val="000000"/>
-          <w:sz w:val="19"/>
-        </w:rPr>
-        <w:t>Australian banks have been warned that frontier AI could create larger and faster cyber attacks, prompting regulators to push for stronger board-level governance, model risk controls and incident…</w:t>
-      </w:r>
-      <w:r>
-        <w:rPr>
-          <w:rFonts w:ascii="Arial" w:hAnsi="Arial"/>
-          <w:color w:val="000000"/>
-          <w:sz w:val="19"/>
-        </w:rPr>
-        <w:t xml:space="preserve"> (</w:t>
-      </w:r>
-      <w:hyperlink r:id="rId27">
-        <w:r>
-          <w:rPr>
-            <w:rFonts w:ascii="Arial" w:hAnsi="Arial" w:cs="Arial"/>
-            <w:color w:val="0000FF"/>
-            <w:sz w:val="19"/>
-            <w:szCs w:val="19"/>
-            <w:u w:val="single"/>
-          </w:rPr>
-          <w:t xml:space="preserve">Read more</w:t>
-        </w:r>
-      </w:hyperlink>
-      <w:r>
-        <w:rPr>
-          <w:rFonts w:ascii="Arial" w:hAnsi="Arial"/>
-          <w:color w:val="000000"/>
-          <w:sz w:val="19"/>
-        </w:rPr>
-        <w:t>)</w:t>
-      </w:r>
-    </w:p>
-    <w:p>
-      <w:pPr>
-        <w:pStyle w:val="ListBullet"/>
-      </w:pPr>
-      <w:r>
-        <w:rPr>
-          <w:rFonts w:ascii="Arial" w:hAnsi="Arial"/>
-          <w:b/>
-          <w:color w:val="000000"/>
-          <w:sz w:val="19"/>
-        </w:rPr>
-        <w:t>TEQSA releases updated academic integrity resources for AI era</w:t>
-      </w:r>
-      <w:r>
-        <w:rPr>
-          <w:rFonts w:ascii="Arial" w:hAnsi="Arial"/>
-          <w:color w:val="000000"/>
-          <w:sz w:val="19"/>
-        </w:rPr>
-        <w:t xml:space="preserve"> — </w:t>
-      </w:r>
-      <w:r>
-        <w:rPr>
-          <w:rFonts w:ascii="Arial" w:hAnsi="Arial"/>
-          <w:color w:val="000000"/>
-          <w:sz w:val="19"/>
-        </w:rPr>
-        <w:t>TEQSA has released new and updated academic integrity resources to help higher education providers respond to generative AI risks in assessment, contract cheating and investigations.</w:t>
-      </w:r>
-      <w:r>
-        <w:rPr>
-          <w:rFonts w:ascii="Arial" w:hAnsi="Arial"/>
-          <w:color w:val="000000"/>
-          <w:sz w:val="19"/>
-        </w:rPr>
-        <w:t xml:space="preserve"> (</w:t>
-      </w:r>
-      <w:hyperlink r:id="rId28">
-        <w:r>
-          <w:rPr>
-            <w:rFonts w:ascii="Arial" w:hAnsi="Arial" w:cs="Arial"/>
-            <w:color w:val="0000FF"/>
-            <w:sz w:val="19"/>
-            <w:szCs w:val="19"/>
-            <w:u w:val="single"/>
-          </w:rPr>
-          <w:t xml:space="preserve">Read more</w:t>
-        </w:r>
-      </w:hyperlink>
-      <w:r>
-        <w:rPr>
-          <w:rFonts w:ascii="Arial" w:hAnsi="Arial"/>
-          <w:color w:val="000000"/>
-          <w:sz w:val="19"/>
-        </w:rPr>
-        <w:t>)</w:t>
+        <w:t>No ai adoption signal this fortnight.</w:t>
       </w:r>
     </w:p>
     <w:p>
@@ -1630,176 +302,16 @@
     </w:p>
     <w:p>
       <w:pPr>
-        <w:pStyle w:val="ListBullet"/>
+        <w:pStyle w:val="body_letter"/>
       </w:pPr>
       <w:r>
         <w:rPr>
           <w:rFonts w:ascii="Arial" w:hAnsi="Arial"/>
-          <w:b/>
-          <w:color w:val="000000"/>
+          <w:i/>
+          <w:color w:val="666666"/>
           <w:sz w:val="19"/>
         </w:rPr>
-        <w:t>Federal Budget targets $13b productivity boost</w:t>
-      </w:r>
-      <w:r>
-        <w:rPr>
-          <w:rFonts w:ascii="Arial" w:hAnsi="Arial"/>
-          <w:color w:val="000000"/>
-          <w:sz w:val="19"/>
-        </w:rPr>
-        <w:t xml:space="preserve"> — </w:t>
-      </w:r>
-      <w:r>
-        <w:rPr>
-          <w:rFonts w:ascii="Arial" w:hAnsi="Arial"/>
-          <w:color w:val="000000"/>
-          <w:sz w:val="19"/>
-        </w:rPr>
-        <w:t>The Federal Budget's productivity package targets a $13 billion economic boost through regulatory simplification, faster approvals and consolidated regulator effort across infrastructure, housing…</w:t>
-      </w:r>
-      <w:r>
-        <w:rPr>
-          <w:rFonts w:ascii="Arial" w:hAnsi="Arial"/>
-          <w:color w:val="000000"/>
-          <w:sz w:val="19"/>
-        </w:rPr>
-        <w:t xml:space="preserve"> (</w:t>
-      </w:r>
-      <w:hyperlink r:id="rId29">
-        <w:r>
-          <w:rPr>
-            <w:rFonts w:ascii="Arial" w:hAnsi="Arial" w:cs="Arial"/>
-            <w:color w:val="0000FF"/>
-            <w:sz w:val="19"/>
-            <w:szCs w:val="19"/>
-            <w:u w:val="single"/>
-          </w:rPr>
-          <w:t xml:space="preserve">Read more</w:t>
-        </w:r>
-      </w:hyperlink>
-      <w:r>
-        <w:rPr>
-          <w:rFonts w:ascii="Arial" w:hAnsi="Arial"/>
-          <w:color w:val="000000"/>
-          <w:sz w:val="19"/>
-        </w:rPr>
-        <w:t>)</w:t>
-      </w:r>
-    </w:p>
-    <w:p>
-      <w:pPr>
-        <w:pStyle w:val="ListBullet"/>
-      </w:pPr>
-      <w:r>
-        <w:rPr>
-          <w:rFonts w:ascii="Arial" w:hAnsi="Arial"/>
-          <w:b/>
-          <w:color w:val="000000"/>
-          <w:sz w:val="19"/>
-        </w:rPr>
-        <w:t>Australia moves to slash renewable energy approval times</w:t>
-      </w:r>
-      <w:r>
-        <w:rPr>
-          <w:rFonts w:ascii="Arial" w:hAnsi="Arial"/>
-          <w:color w:val="000000"/>
-          <w:sz w:val="19"/>
-        </w:rPr>
-        <w:t xml:space="preserve"> — </w:t>
-      </w:r>
-      <w:r>
-        <w:rPr>
-          <w:rFonts w:ascii="Arial" w:hAnsi="Arial"/>
-          <w:color w:val="000000"/>
-          <w:sz w:val="19"/>
-        </w:rPr>
-        <w:t>The Federal Government is moving to slash renewable energy project approval times, signalling pipeline acceleration across environmental, planning and grid-connection regulators.</w:t>
-      </w:r>
-      <w:r>
-        <w:rPr>
-          <w:rFonts w:ascii="Arial" w:hAnsi="Arial"/>
-          <w:color w:val="000000"/>
-          <w:sz w:val="19"/>
-        </w:rPr>
-        <w:t xml:space="preserve"> (</w:t>
-      </w:r>
-      <w:hyperlink r:id="rId30">
-        <w:r>
-          <w:rPr>
-            <w:rFonts w:ascii="Arial" w:hAnsi="Arial" w:cs="Arial"/>
-            <w:color w:val="0000FF"/>
-            <w:sz w:val="19"/>
-            <w:szCs w:val="19"/>
-            <w:u w:val="single"/>
-          </w:rPr>
-          <w:t xml:space="preserve">Read more</w:t>
-        </w:r>
-      </w:hyperlink>
-      <w:r>
-        <w:rPr>
-          <w:rFonts w:ascii="Arial" w:hAnsi="Arial"/>
-          <w:color w:val="000000"/>
-          <w:sz w:val="19"/>
-        </w:rPr>
-        <w:t>)</w:t>
-      </w:r>
-    </w:p>
-    <w:p>
-      <w:pPr>
-        <w:pStyle w:val="ListBullet"/>
-      </w:pPr>
-      <w:r>
-        <w:rPr>
-          <w:rFonts w:ascii="Arial" w:hAnsi="Arial"/>
-          <w:b/>
-          <w:color w:val="000000"/>
-          <w:sz w:val="19"/>
-        </w:rPr>
-        <w:t>NSW overhauls building laws for modern construction methods</w:t>
-      </w:r>
-      <w:r>
-        <w:rPr>
-          <w:rFonts w:ascii="Arial" w:hAnsi="Arial"/>
-          <w:color w:val="000000"/>
-          <w:sz w:val="19"/>
-        </w:rPr>
-        <w:t xml:space="preserve"> — </w:t>
-      </w:r>
-      <w:r>
-        <w:rPr>
-          <w:rFonts w:ascii="Arial" w:hAnsi="Arial"/>
-          <w:color w:val="000000"/>
-          <w:sz w:val="19"/>
-        </w:rPr>
-        <w:t>The NSW Government has introduced new building laws to enable a new era of approvals and modern methods of construction, recasting regulator roles around prefabrication, certification and…</w:t>
-      </w:r>
-      <w:r>
-        <w:rPr>
-          <w:rFonts w:ascii="Arial" w:hAnsi="Arial"/>
-          <w:color w:val="000000"/>
-          <w:sz w:val="19"/>
-        </w:rPr>
-        <w:t xml:space="preserve"> (</w:t>
-      </w:r>
-      <w:hyperlink r:id="rId31">
-        <w:r>
-          <w:rPr>
-            <w:rFonts w:ascii="Arial" w:hAnsi="Arial" w:cs="Arial"/>
-            <w:color w:val="0000FF"/>
-            <w:sz w:val="19"/>
-            <w:szCs w:val="19"/>
-            <w:u w:val="single"/>
-          </w:rPr>
-          <w:t xml:space="preserve">Read more</w:t>
-        </w:r>
-      </w:hyperlink>
-      <w:r>
-        <w:rPr>
-          <w:rFonts w:ascii="Arial" w:hAnsi="Arial"/>
-          <w:color w:val="000000"/>
-          <w:sz w:val="19"/>
-        </w:rPr>
-        <w:t>)</w:t>
+        <w:t>No regulatory burden signal this fortnight.</w:t>
       </w:r>
     </w:p>
     <w:p>
@@ -1883,7 +395,7 @@
         </w:rPr>
         <w:t xml:space="preserve"> (</w:t>
       </w:r>
-      <w:hyperlink r:id="rId32">
+      <w:hyperlink r:id="rId10">
         <w:r>
           <w:rPr>
             <w:rFonts w:ascii="Arial" w:hAnsi="Arial" w:cs="Arial"/>
@@ -1934,6 +446,36 @@
         <w:t>04 Jun 2026 — Office of the Victorian Information Commissioner · Melbourne</w:t>
       </w:r>
     </w:p>
+    <w:p>
+      <w:pPr>
+        <w:pStyle w:val="ListBullet"/>
+      </w:pPr>
+      <w:r>
+        <w:rPr>
+          <w:rFonts w:ascii="Arial" w:hAnsi="Arial"/>
+          <w:b/>
+          <w:color w:val="000000"/>
+          <w:sz w:val="19"/>
+        </w:rPr>
+        <w:t>APRA Financial Risk &amp; Resilience Practitioners Roundtable — Q3</w:t>
+      </w:r>
+      <w:r>
+        <w:rPr>
+          <w:rFonts w:ascii="Arial" w:hAnsi="Arial"/>
+          <w:color w:val="000000"/>
+          <w:sz w:val="19"/>
+        </w:rPr>
+        <w:t xml:space="preserve"> — </w:t>
+      </w:r>
+      <w:r>
+        <w:rPr>
+          <w:rFonts w:ascii="Arial" w:hAnsi="Arial"/>
+          <w:color w:val="000000"/>
+          <w:sz w:val="19"/>
+        </w:rPr>
+        <w:t>12 Jun 2026 — APRA · Online</w:t>
+      </w:r>
+    </w:p>
     <w:tbl>
       <w:tblPr>
         <w:tblW w:type="auto" w:w="0"/>
@@ -1977,7 +519,7 @@
                           <pic:cNvPicPr/>
                         </pic:nvPicPr>
                         <pic:blipFill>
-                          <a:blip r:embed="rId33"/>
+                          <a:blip r:embed="rId11"/>
                           <a:stretch>
                             <a:fillRect/>
                           </a:stretch>

</xml_diff>

<commit_message>
chore: update regulation hub 2026-05-20
</commit_message>
<xml_diff>
--- a/reg-hub/regulation_fortnightly_brief.docx
+++ b/reg-hub/regulation_fortnightly_brief.docx
@@ -46,7 +46,7 @@
         <w:pStyle w:val="Heading1"/>
       </w:pPr>
       <w:r>
-        <w:t>KPMG Regulatory Transformation Fortnightly Brief — 3–16 May 2026</w:t>
+        <w:t>KPMG Regulatory Transformation Fortnightly Brief — 7–20 May 2026</w:t>
       </w:r>
     </w:p>
     <w:p>
@@ -73,7 +73,7 @@
           <w:color w:val="666666"/>
           <w:sz w:val="19"/>
         </w:rPr>
-        <w:t>16 May 2026</w:t>
+        <w:t>20 May 2026</w:t>
       </w:r>
     </w:p>
     <w:p>
@@ -97,11 +97,11 @@
       <w:r>
         <w:rPr>
           <w:rFonts w:ascii="Arial" w:hAnsi="Arial"/>
-          <w:i/>
-          <w:color w:val="666666"/>
+          <w:b w:val="0"/>
+          <w:color w:val="000000"/>
           <w:sz w:val="19"/>
         </w:rPr>
-        <w:t>[edit before send] — Adam's 3-sentence key messages will prefill from the dashboard synthesis on the next fortnightly run. Type your replacement here.</w:t>
+        <w:t>This fortnight regulators are squarely focused on burden reduction and integrity, with the NDIS reform package moving through the Senate alongside fresh provider crackdowns, while governance failures at the RACP and TGA prescribing updates underline the pressure on professional and therapeutic regulators to lift transparency. The pivotal opportunity for our advisory practice sits in the NDIS reform pipeline, where tighter access tests, anti-fraud measures and the 2026-27 Budget settings will force providers, scheme administrators and oversight bodies to rebuild assurance, data and decision-making operating models at pace. Convene our Health, Ageing and Human Services leads with PEPI and Forensic this fortnight to land a single NDIS integrity and reform-readiness proposition, and brief priority portfolio agencies and provider boards before the legislation clears the Senate.</w:t>
       </w:r>
     </w:p>
     <w:p>
@@ -120,16 +120,698 @@
     </w:p>
     <w:p>
       <w:pPr>
-        <w:pStyle w:val="body_letter"/>
+        <w:pStyle w:val="ListBullet"/>
       </w:pPr>
       <w:r>
         <w:rPr>
           <w:rFonts w:ascii="Arial" w:hAnsi="Arial"/>
-          <w:i/>
-          <w:color w:val="666666"/>
+          <w:b/>
+          <w:color w:val="000000"/>
           <w:sz w:val="19"/>
         </w:rPr>
-        <w:t>No regulator-in-news signal this fortnight — see Themes below.</w:t>
+        <w:t>eSafety Commissioner</w:t>
+      </w:r>
+      <w:r>
+        <w:rPr>
+          <w:rFonts w:ascii="Arial" w:hAnsi="Arial"/>
+          <w:color w:val="000000"/>
+          <w:sz w:val="19"/>
+        </w:rPr>
+        <w:t xml:space="preserve"> — </w:t>
+      </w:r>
+      <w:r>
+        <w:rPr>
+          <w:rFonts w:ascii="Arial" w:hAnsi="Arial"/>
+          <w:color w:val="000000"/>
+          <w:sz w:val="19"/>
+        </w:rPr>
+        <w:t>eSafety issued enforcement action against another major 'nudify' service for failing to protect Australian children under the Online Safety Act.</w:t>
+      </w:r>
+      <w:r>
+        <w:rPr>
+          <w:rFonts w:ascii="Arial" w:hAnsi="Arial"/>
+          <w:color w:val="000000"/>
+          <w:sz w:val="19"/>
+        </w:rPr>
+        <w:t xml:space="preserve"> (</w:t>
+      </w:r>
+      <w:hyperlink r:id="rId10">
+        <w:r>
+          <w:rPr>
+            <w:rFonts w:ascii="Arial" w:hAnsi="Arial" w:cs="Arial"/>
+            <w:color w:val="0000FF"/>
+            <w:sz w:val="19"/>
+            <w:szCs w:val="19"/>
+            <w:u w:val="single"/>
+          </w:rPr>
+          <w:t xml:space="preserve">Read more</w:t>
+        </w:r>
+      </w:hyperlink>
+      <w:r>
+        <w:rPr>
+          <w:rFonts w:ascii="Arial" w:hAnsi="Arial"/>
+          <w:color w:val="000000"/>
+          <w:sz w:val="19"/>
+        </w:rPr>
+        <w:t>)</w:t>
+      </w:r>
+    </w:p>
+    <w:p>
+      <w:pPr>
+        <w:pStyle w:val="ListBullet"/>
+      </w:pPr>
+      <w:r>
+        <w:rPr>
+          <w:rFonts w:ascii="Arial" w:hAnsi="Arial"/>
+          <w:b/>
+          <w:color w:val="000000"/>
+          <w:sz w:val="19"/>
+        </w:rPr>
+        <w:t>Australian Prudential Regulation Authority</w:t>
+      </w:r>
+      <w:r>
+        <w:rPr>
+          <w:rFonts w:ascii="Arial" w:hAnsi="Arial"/>
+          <w:color w:val="000000"/>
+          <w:sz w:val="19"/>
+        </w:rPr>
+        <w:t xml:space="preserve"> — </w:t>
+      </w:r>
+      <w:r>
+        <w:rPr>
+          <w:rFonts w:ascii="Arial" w:hAnsi="Arial"/>
+          <w:color w:val="000000"/>
+          <w:sz w:val="19"/>
+        </w:rPr>
+        <w:t>APRA disqualified the former Xinja Bank chair for six years over undisclosed investor agreements that breached fit-and-proper obligations.</w:t>
+      </w:r>
+      <w:r>
+        <w:rPr>
+          <w:rFonts w:ascii="Arial" w:hAnsi="Arial"/>
+          <w:color w:val="000000"/>
+          <w:sz w:val="19"/>
+        </w:rPr>
+        <w:t xml:space="preserve"> (</w:t>
+      </w:r>
+      <w:hyperlink r:id="rId11">
+        <w:r>
+          <w:rPr>
+            <w:rFonts w:ascii="Arial" w:hAnsi="Arial" w:cs="Arial"/>
+            <w:color w:val="0000FF"/>
+            <w:sz w:val="19"/>
+            <w:szCs w:val="19"/>
+            <w:u w:val="single"/>
+          </w:rPr>
+          <w:t xml:space="preserve">Read more</w:t>
+        </w:r>
+      </w:hyperlink>
+      <w:r>
+        <w:rPr>
+          <w:rFonts w:ascii="Arial" w:hAnsi="Arial"/>
+          <w:color w:val="000000"/>
+          <w:sz w:val="19"/>
+        </w:rPr>
+        <w:t>)</w:t>
+      </w:r>
+    </w:p>
+    <w:p>
+      <w:pPr>
+        <w:pStyle w:val="ListBullet"/>
+      </w:pPr>
+      <w:r>
+        <w:rPr>
+          <w:rFonts w:ascii="Arial" w:hAnsi="Arial"/>
+          <w:b/>
+          <w:color w:val="000000"/>
+          <w:sz w:val="19"/>
+        </w:rPr>
+        <w:t>Australian Charities and Not-for-profits Commission</w:t>
+      </w:r>
+      <w:r>
+        <w:rPr>
+          <w:rFonts w:ascii="Arial" w:hAnsi="Arial"/>
+          <w:color w:val="000000"/>
+          <w:sz w:val="19"/>
+        </w:rPr>
+        <w:t xml:space="preserve"> — </w:t>
+      </w:r>
+      <w:r>
+        <w:rPr>
+          <w:rFonts w:ascii="Arial" w:hAnsi="Arial"/>
+          <w:color w:val="000000"/>
+          <w:sz w:val="19"/>
+        </w:rPr>
+        <w:t>ACNC suspended the RACP president-elect from her board role amid governance and safety concerns at the medical college.</w:t>
+      </w:r>
+      <w:r>
+        <w:rPr>
+          <w:rFonts w:ascii="Arial" w:hAnsi="Arial"/>
+          <w:color w:val="000000"/>
+          <w:sz w:val="19"/>
+        </w:rPr>
+        <w:t xml:space="preserve"> (</w:t>
+      </w:r>
+      <w:hyperlink r:id="rId12">
+        <w:r>
+          <w:rPr>
+            <w:rFonts w:ascii="Arial" w:hAnsi="Arial" w:cs="Arial"/>
+            <w:color w:val="0000FF"/>
+            <w:sz w:val="19"/>
+            <w:szCs w:val="19"/>
+            <w:u w:val="single"/>
+          </w:rPr>
+          <w:t xml:space="preserve">Read more</w:t>
+        </w:r>
+      </w:hyperlink>
+      <w:r>
+        <w:rPr>
+          <w:rFonts w:ascii="Arial" w:hAnsi="Arial"/>
+          <w:color w:val="000000"/>
+          <w:sz w:val="19"/>
+        </w:rPr>
+        <w:t>)</w:t>
+      </w:r>
+    </w:p>
+    <w:p>
+      <w:pPr>
+        <w:pStyle w:val="ListBullet"/>
+      </w:pPr>
+      <w:r>
+        <w:rPr>
+          <w:rFonts w:ascii="Arial" w:hAnsi="Arial"/>
+          <w:b/>
+          <w:color w:val="000000"/>
+          <w:sz w:val="19"/>
+        </w:rPr>
+        <w:t>National Disability Insurance Agency</w:t>
+      </w:r>
+      <w:r>
+        <w:rPr>
+          <w:rFonts w:ascii="Arial" w:hAnsi="Arial"/>
+          <w:color w:val="000000"/>
+          <w:sz w:val="19"/>
+        </w:rPr>
+        <w:t xml:space="preserve"> — </w:t>
+      </w:r>
+      <w:r>
+        <w:rPr>
+          <w:rFonts w:ascii="Arial" w:hAnsi="Arial"/>
+          <w:color w:val="000000"/>
+          <w:sz w:val="19"/>
+        </w:rPr>
+        <w:t>The NDIA's own analysis indicates proposed NDIS scheme reforms will disproportionately reduce supports for participants with Down syndrome and other lifelong conditions.</w:t>
+      </w:r>
+      <w:r>
+        <w:rPr>
+          <w:rFonts w:ascii="Arial" w:hAnsi="Arial"/>
+          <w:color w:val="000000"/>
+          <w:sz w:val="19"/>
+        </w:rPr>
+        <w:t xml:space="preserve"> (</w:t>
+      </w:r>
+      <w:hyperlink r:id="rId13">
+        <w:r>
+          <w:rPr>
+            <w:rFonts w:ascii="Arial" w:hAnsi="Arial" w:cs="Arial"/>
+            <w:color w:val="0000FF"/>
+            <w:sz w:val="19"/>
+            <w:szCs w:val="19"/>
+            <w:u w:val="single"/>
+          </w:rPr>
+          <w:t xml:space="preserve">Read more</w:t>
+        </w:r>
+      </w:hyperlink>
+      <w:r>
+        <w:rPr>
+          <w:rFonts w:ascii="Arial" w:hAnsi="Arial"/>
+          <w:color w:val="000000"/>
+          <w:sz w:val="19"/>
+        </w:rPr>
+        <w:t>)</w:t>
+      </w:r>
+    </w:p>
+    <w:p>
+      <w:pPr>
+        <w:pStyle w:val="ListBullet"/>
+      </w:pPr>
+      <w:r>
+        <w:rPr>
+          <w:rFonts w:ascii="Arial" w:hAnsi="Arial"/>
+          <w:b/>
+          <w:color w:val="000000"/>
+          <w:sz w:val="19"/>
+        </w:rPr>
+        <w:t>Australian Federal Police</w:t>
+      </w:r>
+      <w:r>
+        <w:rPr>
+          <w:rFonts w:ascii="Arial" w:hAnsi="Arial"/>
+          <w:color w:val="000000"/>
+          <w:sz w:val="19"/>
+        </w:rPr>
+        <w:t xml:space="preserve"> — </w:t>
+      </w:r>
+      <w:r>
+        <w:rPr>
+          <w:rFonts w:ascii="Arial" w:hAnsi="Arial"/>
+          <w:color w:val="000000"/>
+          <w:sz w:val="19"/>
+        </w:rPr>
+        <w:t>The AFP co-opened a Pacific-focused law enforcement summit with Fiji Police to coordinate disruption of transnational crime syndicates targeting the region.</w:t>
+      </w:r>
+      <w:r>
+        <w:rPr>
+          <w:rFonts w:ascii="Arial" w:hAnsi="Arial"/>
+          <w:color w:val="000000"/>
+          <w:sz w:val="19"/>
+        </w:rPr>
+        <w:t xml:space="preserve"> (</w:t>
+      </w:r>
+      <w:hyperlink r:id="rId14">
+        <w:r>
+          <w:rPr>
+            <w:rFonts w:ascii="Arial" w:hAnsi="Arial" w:cs="Arial"/>
+            <w:color w:val="0000FF"/>
+            <w:sz w:val="19"/>
+            <w:szCs w:val="19"/>
+            <w:u w:val="single"/>
+          </w:rPr>
+          <w:t xml:space="preserve">Read more</w:t>
+        </w:r>
+      </w:hyperlink>
+      <w:r>
+        <w:rPr>
+          <w:rFonts w:ascii="Arial" w:hAnsi="Arial"/>
+          <w:color w:val="000000"/>
+          <w:sz w:val="19"/>
+        </w:rPr>
+        <w:t>)</w:t>
+      </w:r>
+    </w:p>
+    <w:p>
+      <w:pPr>
+        <w:pStyle w:val="ListBullet"/>
+      </w:pPr>
+      <w:r>
+        <w:rPr>
+          <w:rFonts w:ascii="Arial" w:hAnsi="Arial"/>
+          <w:b/>
+          <w:color w:val="000000"/>
+          <w:sz w:val="19"/>
+        </w:rPr>
+        <w:t>Department of Education</w:t>
+      </w:r>
+      <w:r>
+        <w:rPr>
+          <w:rFonts w:ascii="Arial" w:hAnsi="Arial"/>
+          <w:color w:val="000000"/>
+          <w:sz w:val="19"/>
+        </w:rPr>
+        <w:t xml:space="preserve"> — </w:t>
+      </w:r>
+      <w:r>
+        <w:rPr>
+          <w:rFonts w:ascii="Arial" w:hAnsi="Arial"/>
+          <w:color w:val="000000"/>
+          <w:sz w:val="19"/>
+        </w:rPr>
+        <w:t>The Department of Education suspended new private college course and provider registrations for international students for 12 months pending integrity reforms.</w:t>
+      </w:r>
+      <w:r>
+        <w:rPr>
+          <w:rFonts w:ascii="Arial" w:hAnsi="Arial"/>
+          <w:color w:val="000000"/>
+          <w:sz w:val="19"/>
+        </w:rPr>
+        <w:t xml:space="preserve"> (</w:t>
+      </w:r>
+      <w:hyperlink r:id="rId15">
+        <w:r>
+          <w:rPr>
+            <w:rFonts w:ascii="Arial" w:hAnsi="Arial" w:cs="Arial"/>
+            <w:color w:val="0000FF"/>
+            <w:sz w:val="19"/>
+            <w:szCs w:val="19"/>
+            <w:u w:val="single"/>
+          </w:rPr>
+          <w:t xml:space="preserve">Read more</w:t>
+        </w:r>
+      </w:hyperlink>
+      <w:r>
+        <w:rPr>
+          <w:rFonts w:ascii="Arial" w:hAnsi="Arial"/>
+          <w:color w:val="000000"/>
+          <w:sz w:val="19"/>
+        </w:rPr>
+        <w:t>)</w:t>
+      </w:r>
+    </w:p>
+    <w:p>
+      <w:pPr>
+        <w:pStyle w:val="ListBullet"/>
+      </w:pPr>
+      <w:r>
+        <w:rPr>
+          <w:rFonts w:ascii="Arial" w:hAnsi="Arial"/>
+          <w:b/>
+          <w:color w:val="000000"/>
+          <w:sz w:val="19"/>
+        </w:rPr>
+        <w:t>Australian Securities and Investments Commission</w:t>
+      </w:r>
+      <w:r>
+        <w:rPr>
+          <w:rFonts w:ascii="Arial" w:hAnsi="Arial"/>
+          <w:color w:val="000000"/>
+          <w:sz w:val="19"/>
+        </w:rPr>
+        <w:t xml:space="preserve"> — </w:t>
+      </w:r>
+      <w:r>
+        <w:rPr>
+          <w:rFonts w:ascii="Arial" w:hAnsi="Arial"/>
+          <w:color w:val="000000"/>
+          <w:sz w:val="19"/>
+        </w:rPr>
+        <w:t>ASIC published REP 830 setting out its regulatory simplification program targeting digital guidance, instrument consolidation and reduced compliance clutter.</w:t>
+      </w:r>
+      <w:r>
+        <w:rPr>
+          <w:rFonts w:ascii="Arial" w:hAnsi="Arial"/>
+          <w:color w:val="000000"/>
+          <w:sz w:val="19"/>
+        </w:rPr>
+        <w:t xml:space="preserve"> (</w:t>
+      </w:r>
+      <w:hyperlink r:id="rId16">
+        <w:r>
+          <w:rPr>
+            <w:rFonts w:ascii="Arial" w:hAnsi="Arial" w:cs="Arial"/>
+            <w:color w:val="0000FF"/>
+            <w:sz w:val="19"/>
+            <w:szCs w:val="19"/>
+            <w:u w:val="single"/>
+          </w:rPr>
+          <w:t xml:space="preserve">Read more</w:t>
+        </w:r>
+      </w:hyperlink>
+      <w:r>
+        <w:rPr>
+          <w:rFonts w:ascii="Arial" w:hAnsi="Arial"/>
+          <w:color w:val="000000"/>
+          <w:sz w:val="19"/>
+        </w:rPr>
+        <w:t>)</w:t>
+      </w:r>
+    </w:p>
+    <w:p>
+      <w:pPr>
+        <w:pStyle w:val="ListBullet"/>
+      </w:pPr>
+      <w:r>
+        <w:rPr>
+          <w:rFonts w:ascii="Arial" w:hAnsi="Arial"/>
+          <w:b/>
+          <w:color w:val="000000"/>
+          <w:sz w:val="19"/>
+        </w:rPr>
+        <w:t>eSafety Commissioner</w:t>
+      </w:r>
+      <w:r>
+        <w:rPr>
+          <w:rFonts w:ascii="Arial" w:hAnsi="Arial"/>
+          <w:color w:val="000000"/>
+          <w:sz w:val="19"/>
+        </w:rPr>
+        <w:t xml:space="preserve"> — </w:t>
+      </w:r>
+      <w:r>
+        <w:rPr>
+          <w:rFonts w:ascii="Arial" w:hAnsi="Arial"/>
+          <w:color w:val="000000"/>
+          <w:sz w:val="19"/>
+        </w:rPr>
+        <w:t>eSafety convened national sporting code leaders to coordinate action on cyberbullying and online hate directed at athletes, officials and children in sport.</w:t>
+      </w:r>
+      <w:r>
+        <w:rPr>
+          <w:rFonts w:ascii="Arial" w:hAnsi="Arial"/>
+          <w:color w:val="000000"/>
+          <w:sz w:val="19"/>
+        </w:rPr>
+        <w:t xml:space="preserve"> (</w:t>
+      </w:r>
+      <w:hyperlink r:id="rId17">
+        <w:r>
+          <w:rPr>
+            <w:rFonts w:ascii="Arial" w:hAnsi="Arial" w:cs="Arial"/>
+            <w:color w:val="0000FF"/>
+            <w:sz w:val="19"/>
+            <w:szCs w:val="19"/>
+            <w:u w:val="single"/>
+          </w:rPr>
+          <w:t xml:space="preserve">Read more</w:t>
+        </w:r>
+      </w:hyperlink>
+      <w:r>
+        <w:rPr>
+          <w:rFonts w:ascii="Arial" w:hAnsi="Arial"/>
+          <w:color w:val="000000"/>
+          <w:sz w:val="19"/>
+        </w:rPr>
+        <w:t>)</w:t>
+      </w:r>
+    </w:p>
+    <w:p>
+      <w:pPr>
+        <w:pStyle w:val="ListBullet"/>
+      </w:pPr>
+      <w:r>
+        <w:rPr>
+          <w:rFonts w:ascii="Arial" w:hAnsi="Arial"/>
+          <w:b/>
+          <w:color w:val="000000"/>
+          <w:sz w:val="19"/>
+        </w:rPr>
+        <w:t>Office of the Australian Information Commissioner</w:t>
+      </w:r>
+      <w:r>
+        <w:rPr>
+          <w:rFonts w:ascii="Arial" w:hAnsi="Arial"/>
+          <w:color w:val="000000"/>
+          <w:sz w:val="19"/>
+        </w:rPr>
+        <w:t xml:space="preserve"> — </w:t>
+      </w:r>
+      <w:r>
+        <w:rPr>
+          <w:rFonts w:ascii="Arial" w:hAnsi="Arial"/>
+          <w:color w:val="000000"/>
+          <w:sz w:val="19"/>
+        </w:rPr>
+        <w:t>The OAIC issued updated Australian Privacy Principles guidance signalling tighter expectations on personal information collection practices.</w:t>
+      </w:r>
+      <w:r>
+        <w:rPr>
+          <w:rFonts w:ascii="Arial" w:hAnsi="Arial"/>
+          <w:color w:val="000000"/>
+          <w:sz w:val="19"/>
+        </w:rPr>
+        <w:t xml:space="preserve"> (</w:t>
+      </w:r>
+      <w:hyperlink r:id="rId18">
+        <w:r>
+          <w:rPr>
+            <w:rFonts w:ascii="Arial" w:hAnsi="Arial" w:cs="Arial"/>
+            <w:color w:val="0000FF"/>
+            <w:sz w:val="19"/>
+            <w:szCs w:val="19"/>
+            <w:u w:val="single"/>
+          </w:rPr>
+          <w:t xml:space="preserve">Read more</w:t>
+        </w:r>
+      </w:hyperlink>
+      <w:r>
+        <w:rPr>
+          <w:rFonts w:ascii="Arial" w:hAnsi="Arial"/>
+          <w:color w:val="000000"/>
+          <w:sz w:val="19"/>
+        </w:rPr>
+        <w:t>)</w:t>
+      </w:r>
+    </w:p>
+    <w:p>
+      <w:pPr>
+        <w:pStyle w:val="ListBullet"/>
+      </w:pPr>
+      <w:r>
+        <w:rPr>
+          <w:rFonts w:ascii="Arial" w:hAnsi="Arial"/>
+          <w:b/>
+          <w:color w:val="000000"/>
+          <w:sz w:val="19"/>
+        </w:rPr>
+        <w:t>Australian Securities and Investments Commission</w:t>
+      </w:r>
+      <w:r>
+        <w:rPr>
+          <w:rFonts w:ascii="Arial" w:hAnsi="Arial"/>
+          <w:color w:val="000000"/>
+          <w:sz w:val="19"/>
+        </w:rPr>
+        <w:t xml:space="preserve"> — </w:t>
+      </w:r>
+      <w:r>
+        <w:rPr>
+          <w:rFonts w:ascii="Arial" w:hAnsi="Arial"/>
+          <w:color w:val="000000"/>
+          <w:sz w:val="19"/>
+        </w:rPr>
+        <w:t>ASIC escalated its surveillance of registered company auditors' annual statements, flagging further enforcement where lodgement and quality obligations are not met.</w:t>
+      </w:r>
+      <w:r>
+        <w:rPr>
+          <w:rFonts w:ascii="Arial" w:hAnsi="Arial"/>
+          <w:color w:val="000000"/>
+          <w:sz w:val="19"/>
+        </w:rPr>
+        <w:t xml:space="preserve"> (</w:t>
+      </w:r>
+      <w:hyperlink r:id="rId19">
+        <w:r>
+          <w:rPr>
+            <w:rFonts w:ascii="Arial" w:hAnsi="Arial" w:cs="Arial"/>
+            <w:color w:val="0000FF"/>
+            <w:sz w:val="19"/>
+            <w:szCs w:val="19"/>
+            <w:u w:val="single"/>
+          </w:rPr>
+          <w:t xml:space="preserve">Read more</w:t>
+        </w:r>
+      </w:hyperlink>
+      <w:r>
+        <w:rPr>
+          <w:rFonts w:ascii="Arial" w:hAnsi="Arial"/>
+          <w:color w:val="000000"/>
+          <w:sz w:val="19"/>
+        </w:rPr>
+        <w:t>)</w:t>
+      </w:r>
+    </w:p>
+    <w:p>
+      <w:pPr>
+        <w:pStyle w:val="ListBullet"/>
+      </w:pPr>
+      <w:r>
+        <w:rPr>
+          <w:rFonts w:ascii="Arial" w:hAnsi="Arial"/>
+          <w:b/>
+          <w:color w:val="000000"/>
+          <w:sz w:val="19"/>
+        </w:rPr>
+        <w:t>Victorian Auditor-General's Office</w:t>
+      </w:r>
+      <w:r>
+        <w:rPr>
+          <w:rFonts w:ascii="Arial" w:hAnsi="Arial"/>
+          <w:color w:val="000000"/>
+          <w:sz w:val="19"/>
+        </w:rPr>
+        <w:t xml:space="preserve"> — </w:t>
+      </w:r>
+      <w:r>
+        <w:rPr>
+          <w:rFonts w:ascii="Arial" w:hAnsi="Arial"/>
+          <w:color w:val="000000"/>
+          <w:sz w:val="19"/>
+        </w:rPr>
+        <w:t>VAGO opened a performance audit into Victoria's 40-year lottery licensing deal, scrutinising probity and value-for-money in the long-dated arrangement.</w:t>
+      </w:r>
+      <w:r>
+        <w:rPr>
+          <w:rFonts w:ascii="Arial" w:hAnsi="Arial"/>
+          <w:color w:val="000000"/>
+          <w:sz w:val="19"/>
+        </w:rPr>
+        <w:t xml:space="preserve"> (</w:t>
+      </w:r>
+      <w:hyperlink r:id="rId20">
+        <w:r>
+          <w:rPr>
+            <w:rFonts w:ascii="Arial" w:hAnsi="Arial" w:cs="Arial"/>
+            <w:color w:val="0000FF"/>
+            <w:sz w:val="19"/>
+            <w:szCs w:val="19"/>
+            <w:u w:val="single"/>
+          </w:rPr>
+          <w:t xml:space="preserve">Read more</w:t>
+        </w:r>
+      </w:hyperlink>
+      <w:r>
+        <w:rPr>
+          <w:rFonts w:ascii="Arial" w:hAnsi="Arial"/>
+          <w:color w:val="000000"/>
+          <w:sz w:val="19"/>
+        </w:rPr>
+        <w:t>)</w:t>
+      </w:r>
+    </w:p>
+    <w:p>
+      <w:pPr>
+        <w:pStyle w:val="ListBullet"/>
+      </w:pPr>
+      <w:r>
+        <w:rPr>
+          <w:rFonts w:ascii="Arial" w:hAnsi="Arial"/>
+          <w:b/>
+          <w:color w:val="000000"/>
+          <w:sz w:val="19"/>
+        </w:rPr>
+        <w:t>Australian Communications and Media Authority</w:t>
+      </w:r>
+      <w:r>
+        <w:rPr>
+          <w:rFonts w:ascii="Arial" w:hAnsi="Arial"/>
+          <w:color w:val="000000"/>
+          <w:sz w:val="19"/>
+        </w:rPr>
+        <w:t xml:space="preserve"> — </w:t>
+      </w:r>
+      <w:r>
+        <w:rPr>
+          <w:rFonts w:ascii="Arial" w:hAnsi="Arial"/>
+          <w:color w:val="000000"/>
+          <w:sz w:val="19"/>
+        </w:rPr>
+        <w:t>ACMA released new consumer and advocate resources reinforcing telco obligations on complaints handling, financial hardship and customer protections.</w:t>
+      </w:r>
+      <w:r>
+        <w:rPr>
+          <w:rFonts w:ascii="Arial" w:hAnsi="Arial"/>
+          <w:color w:val="000000"/>
+          <w:sz w:val="19"/>
+        </w:rPr>
+        <w:t xml:space="preserve"> (</w:t>
+      </w:r>
+      <w:hyperlink r:id="rId21">
+        <w:r>
+          <w:rPr>
+            <w:rFonts w:ascii="Arial" w:hAnsi="Arial" w:cs="Arial"/>
+            <w:color w:val="0000FF"/>
+            <w:sz w:val="19"/>
+            <w:szCs w:val="19"/>
+            <w:u w:val="single"/>
+          </w:rPr>
+          <w:t xml:space="preserve">Read more</w:t>
+        </w:r>
+      </w:hyperlink>
+      <w:r>
+        <w:rPr>
+          <w:rFonts w:ascii="Arial" w:hAnsi="Arial"/>
+          <w:color w:val="000000"/>
+          <w:sz w:val="19"/>
+        </w:rPr>
+        <w:t>)</w:t>
       </w:r>
     </w:p>
     <w:p>
@@ -153,11 +835,503 @@
       <w:r>
         <w:rPr>
           <w:rFonts w:ascii="Arial" w:hAnsi="Arial"/>
-          <w:i/>
-          <w:color w:val="666666"/>
+          <w:b/>
+          <w:color w:val="000000"/>
           <w:sz w:val="19"/>
         </w:rPr>
-        <w:t>No client-in-news signal this fortnight across any jurisdiction.</w:t>
+        <w:t>Victoria</w:t>
+      </w:r>
+    </w:p>
+    <w:p>
+      <w:pPr>
+        <w:pStyle w:val="ListBullet"/>
+      </w:pPr>
+      <w:r>
+        <w:rPr>
+          <w:rFonts w:ascii="Arial" w:hAnsi="Arial"/>
+          <w:b/>
+          <w:color w:val="000000"/>
+          <w:sz w:val="19"/>
+        </w:rPr>
+        <w:t>Victorian Auditor-General's Office</w:t>
+      </w:r>
+      <w:r>
+        <w:rPr>
+          <w:rFonts w:ascii="Arial" w:hAnsi="Arial"/>
+          <w:color w:val="000000"/>
+          <w:sz w:val="19"/>
+        </w:rPr>
+        <w:t xml:space="preserve"> — </w:t>
+      </w:r>
+      <w:r>
+        <w:rPr>
+          <w:rFonts w:ascii="Arial" w:hAnsi="Arial"/>
+          <w:color w:val="000000"/>
+          <w:sz w:val="19"/>
+        </w:rPr>
+        <w:t>VAGO probes 40-year lottery licence deal</w:t>
+      </w:r>
+      <w:r>
+        <w:rPr>
+          <w:rFonts w:ascii="Arial" w:hAnsi="Arial"/>
+          <w:color w:val="000000"/>
+          <w:sz w:val="19"/>
+        </w:rPr>
+        <w:t xml:space="preserve"> (</w:t>
+      </w:r>
+      <w:hyperlink r:id="rId22">
+        <w:r>
+          <w:rPr>
+            <w:rFonts w:ascii="Arial" w:hAnsi="Arial" w:cs="Arial"/>
+            <w:color w:val="0000FF"/>
+            <w:sz w:val="19"/>
+            <w:szCs w:val="19"/>
+            <w:u w:val="single"/>
+          </w:rPr>
+          <w:t xml:space="preserve">Read more</w:t>
+        </w:r>
+      </w:hyperlink>
+      <w:r>
+        <w:rPr>
+          <w:rFonts w:ascii="Arial" w:hAnsi="Arial"/>
+          <w:color w:val="000000"/>
+          <w:sz w:val="19"/>
+        </w:rPr>
+        <w:t>)</w:t>
+      </w:r>
+    </w:p>
+    <w:p>
+      <w:pPr>
+        <w:pStyle w:val="ListBullet"/>
+      </w:pPr>
+      <w:r>
+        <w:rPr>
+          <w:rFonts w:ascii="Arial" w:hAnsi="Arial"/>
+          <w:b/>
+          <w:color w:val="000000"/>
+          <w:sz w:val="19"/>
+        </w:rPr>
+        <w:t>Environment Protection Authority Victoria</w:t>
+      </w:r>
+      <w:r>
+        <w:rPr>
+          <w:rFonts w:ascii="Arial" w:hAnsi="Arial"/>
+          <w:color w:val="000000"/>
+          <w:sz w:val="19"/>
+        </w:rPr>
+        <w:t xml:space="preserve"> — </w:t>
+      </w:r>
+      <w:r>
+        <w:rPr>
+          <w:rFonts w:ascii="Arial" w:hAnsi="Arial"/>
+          <w:color w:val="000000"/>
+          <w:sz w:val="19"/>
+        </w:rPr>
+        <w:t>Supreme Court upholds EPA landfill levy</w:t>
+      </w:r>
+      <w:r>
+        <w:rPr>
+          <w:rFonts w:ascii="Arial" w:hAnsi="Arial"/>
+          <w:color w:val="000000"/>
+          <w:sz w:val="19"/>
+        </w:rPr>
+        <w:t xml:space="preserve"> (</w:t>
+      </w:r>
+      <w:hyperlink r:id="rId23">
+        <w:r>
+          <w:rPr>
+            <w:rFonts w:ascii="Arial" w:hAnsi="Arial" w:cs="Arial"/>
+            <w:color w:val="0000FF"/>
+            <w:sz w:val="19"/>
+            <w:szCs w:val="19"/>
+            <w:u w:val="single"/>
+          </w:rPr>
+          <w:t xml:space="preserve">Read more</w:t>
+        </w:r>
+      </w:hyperlink>
+      <w:r>
+        <w:rPr>
+          <w:rFonts w:ascii="Arial" w:hAnsi="Arial"/>
+          <w:color w:val="000000"/>
+          <w:sz w:val="19"/>
+        </w:rPr>
+        <w:t>)</w:t>
+      </w:r>
+    </w:p>
+    <w:p>
+      <w:pPr>
+        <w:pStyle w:val="ListBullet"/>
+      </w:pPr>
+      <w:r>
+        <w:rPr>
+          <w:rFonts w:ascii="Arial" w:hAnsi="Arial"/>
+          <w:b/>
+          <w:color w:val="000000"/>
+          <w:sz w:val="19"/>
+        </w:rPr>
+        <w:t>Transport Accident Commission</w:t>
+      </w:r>
+      <w:r>
+        <w:rPr>
+          <w:rFonts w:ascii="Arial" w:hAnsi="Arial"/>
+          <w:color w:val="000000"/>
+          <w:sz w:val="19"/>
+        </w:rPr>
+        <w:t xml:space="preserve"> — </w:t>
+      </w:r>
+      <w:r>
+        <w:rPr>
+          <w:rFonts w:ascii="Arial" w:hAnsi="Arial"/>
+          <w:color w:val="000000"/>
+          <w:sz w:val="19"/>
+        </w:rPr>
+        <w:t>TAC boosts camera tech for road safety</w:t>
+      </w:r>
+      <w:r>
+        <w:rPr>
+          <w:rFonts w:ascii="Arial" w:hAnsi="Arial"/>
+          <w:color w:val="000000"/>
+          <w:sz w:val="19"/>
+        </w:rPr>
+        <w:t xml:space="preserve"> (</w:t>
+      </w:r>
+      <w:hyperlink r:id="rId24">
+        <w:r>
+          <w:rPr>
+            <w:rFonts w:ascii="Arial" w:hAnsi="Arial" w:cs="Arial"/>
+            <w:color w:val="0000FF"/>
+            <w:sz w:val="19"/>
+            <w:szCs w:val="19"/>
+            <w:u w:val="single"/>
+          </w:rPr>
+          <w:t xml:space="preserve">Read more</w:t>
+        </w:r>
+      </w:hyperlink>
+      <w:r>
+        <w:rPr>
+          <w:rFonts w:ascii="Arial" w:hAnsi="Arial"/>
+          <w:color w:val="000000"/>
+          <w:sz w:val="19"/>
+        </w:rPr>
+        <w:t>)</w:t>
+      </w:r>
+    </w:p>
+    <w:p>
+      <w:pPr>
+        <w:pStyle w:val="body_letter"/>
+      </w:pPr>
+      <w:r>
+        <w:rPr>
+          <w:rFonts w:ascii="Arial" w:hAnsi="Arial"/>
+          <w:b/>
+          <w:color w:val="000000"/>
+          <w:sz w:val="19"/>
+        </w:rPr>
+        <w:t>Commonwealth</w:t>
+      </w:r>
+    </w:p>
+    <w:p>
+      <w:pPr>
+        <w:pStyle w:val="ListBullet"/>
+      </w:pPr>
+      <w:r>
+        <w:rPr>
+          <w:rFonts w:ascii="Arial" w:hAnsi="Arial"/>
+          <w:b/>
+          <w:color w:val="000000"/>
+          <w:sz w:val="19"/>
+        </w:rPr>
+        <w:t>National Disability Insurance Agency</w:t>
+      </w:r>
+      <w:r>
+        <w:rPr>
+          <w:rFonts w:ascii="Arial" w:hAnsi="Arial"/>
+          <w:color w:val="000000"/>
+          <w:sz w:val="19"/>
+        </w:rPr>
+        <w:t xml:space="preserve"> — </w:t>
+      </w:r>
+      <w:r>
+        <w:rPr>
+          <w:rFonts w:ascii="Arial" w:hAnsi="Arial"/>
+          <w:color w:val="000000"/>
+          <w:sz w:val="19"/>
+        </w:rPr>
+        <w:t>NDIS access tightened under proposed rules</w:t>
+      </w:r>
+      <w:r>
+        <w:rPr>
+          <w:rFonts w:ascii="Arial" w:hAnsi="Arial"/>
+          <w:color w:val="000000"/>
+          <w:sz w:val="19"/>
+        </w:rPr>
+        <w:t xml:space="preserve"> (</w:t>
+      </w:r>
+      <w:hyperlink r:id="rId25">
+        <w:r>
+          <w:rPr>
+            <w:rFonts w:ascii="Arial" w:hAnsi="Arial" w:cs="Arial"/>
+            <w:color w:val="0000FF"/>
+            <w:sz w:val="19"/>
+            <w:szCs w:val="19"/>
+            <w:u w:val="single"/>
+          </w:rPr>
+          <w:t xml:space="preserve">Read more</w:t>
+        </w:r>
+      </w:hyperlink>
+      <w:r>
+        <w:rPr>
+          <w:rFonts w:ascii="Arial" w:hAnsi="Arial"/>
+          <w:color w:val="000000"/>
+          <w:sz w:val="19"/>
+        </w:rPr>
+        <w:t>)</w:t>
+      </w:r>
+    </w:p>
+    <w:p>
+      <w:pPr>
+        <w:pStyle w:val="ListBullet"/>
+      </w:pPr>
+      <w:r>
+        <w:rPr>
+          <w:rFonts w:ascii="Arial" w:hAnsi="Arial"/>
+          <w:b/>
+          <w:color w:val="000000"/>
+          <w:sz w:val="19"/>
+        </w:rPr>
+        <w:t>Australian Charities and Not-for-profits Commission</w:t>
+      </w:r>
+      <w:r>
+        <w:rPr>
+          <w:rFonts w:ascii="Arial" w:hAnsi="Arial"/>
+          <w:color w:val="000000"/>
+          <w:sz w:val="19"/>
+        </w:rPr>
+        <w:t xml:space="preserve"> — </w:t>
+      </w:r>
+      <w:r>
+        <w:rPr>
+          <w:rFonts w:ascii="Arial" w:hAnsi="Arial"/>
+          <w:color w:val="000000"/>
+          <w:sz w:val="19"/>
+        </w:rPr>
+        <w:t>ACNC suspends RACP president-elect</w:t>
+      </w:r>
+      <w:r>
+        <w:rPr>
+          <w:rFonts w:ascii="Arial" w:hAnsi="Arial"/>
+          <w:color w:val="000000"/>
+          <w:sz w:val="19"/>
+        </w:rPr>
+        <w:t xml:space="preserve"> (</w:t>
+      </w:r>
+      <w:hyperlink r:id="rId26">
+        <w:r>
+          <w:rPr>
+            <w:rFonts w:ascii="Arial" w:hAnsi="Arial" w:cs="Arial"/>
+            <w:color w:val="0000FF"/>
+            <w:sz w:val="19"/>
+            <w:szCs w:val="19"/>
+            <w:u w:val="single"/>
+          </w:rPr>
+          <w:t xml:space="preserve">Read more</w:t>
+        </w:r>
+      </w:hyperlink>
+      <w:r>
+        <w:rPr>
+          <w:rFonts w:ascii="Arial" w:hAnsi="Arial"/>
+          <w:color w:val="000000"/>
+          <w:sz w:val="19"/>
+        </w:rPr>
+        <w:t>)</w:t>
+      </w:r>
+    </w:p>
+    <w:p>
+      <w:pPr>
+        <w:pStyle w:val="ListBullet"/>
+      </w:pPr>
+      <w:r>
+        <w:rPr>
+          <w:rFonts w:ascii="Arial" w:hAnsi="Arial"/>
+          <w:b/>
+          <w:color w:val="000000"/>
+          <w:sz w:val="19"/>
+        </w:rPr>
+        <w:t>Department of Health, Disability and Ageing</w:t>
+      </w:r>
+      <w:r>
+        <w:rPr>
+          <w:rFonts w:ascii="Arial" w:hAnsi="Arial"/>
+          <w:color w:val="000000"/>
+          <w:sz w:val="19"/>
+        </w:rPr>
+        <w:t xml:space="preserve"> — </w:t>
+      </w:r>
+      <w:r>
+        <w:rPr>
+          <w:rFonts w:ascii="Arial" w:hAnsi="Arial"/>
+          <w:color w:val="000000"/>
+          <w:sz w:val="19"/>
+        </w:rPr>
+        <w:t>Federal Budget 2026-27 health snapshot</w:t>
+      </w:r>
+      <w:r>
+        <w:rPr>
+          <w:rFonts w:ascii="Arial" w:hAnsi="Arial"/>
+          <w:color w:val="000000"/>
+          <w:sz w:val="19"/>
+        </w:rPr>
+        <w:t xml:space="preserve"> (</w:t>
+      </w:r>
+      <w:hyperlink r:id="rId27">
+        <w:r>
+          <w:rPr>
+            <w:rFonts w:ascii="Arial" w:hAnsi="Arial" w:cs="Arial"/>
+            <w:color w:val="0000FF"/>
+            <w:sz w:val="19"/>
+            <w:szCs w:val="19"/>
+            <w:u w:val="single"/>
+          </w:rPr>
+          <w:t xml:space="preserve">Read more</w:t>
+        </w:r>
+      </w:hyperlink>
+      <w:r>
+        <w:rPr>
+          <w:rFonts w:ascii="Arial" w:hAnsi="Arial"/>
+          <w:color w:val="000000"/>
+          <w:sz w:val="19"/>
+        </w:rPr>
+        <w:t>)</w:t>
+      </w:r>
+    </w:p>
+    <w:p>
+      <w:pPr>
+        <w:pStyle w:val="body_letter"/>
+      </w:pPr>
+      <w:r>
+        <w:rPr>
+          <w:rFonts w:ascii="Arial" w:hAnsi="Arial"/>
+          <w:b/>
+          <w:color w:val="000000"/>
+          <w:sz w:val="19"/>
+        </w:rPr>
+        <w:t>New South Wales</w:t>
+      </w:r>
+    </w:p>
+    <w:p>
+      <w:pPr>
+        <w:pStyle w:val="ListBullet"/>
+      </w:pPr>
+      <w:r>
+        <w:rPr>
+          <w:rFonts w:ascii="Arial" w:hAnsi="Arial"/>
+          <w:b/>
+          <w:color w:val="000000"/>
+          <w:sz w:val="19"/>
+        </w:rPr>
+        <w:t>Environment Protection Authority</w:t>
+      </w:r>
+      <w:r>
+        <w:rPr>
+          <w:rFonts w:ascii="Arial" w:hAnsi="Arial"/>
+          <w:color w:val="000000"/>
+          <w:sz w:val="19"/>
+        </w:rPr>
+        <w:t xml:space="preserve"> — </w:t>
+      </w:r>
+      <w:r>
+        <w:rPr>
+          <w:rFonts w:ascii="Arial" w:hAnsi="Arial"/>
+          <w:color w:val="000000"/>
+          <w:sz w:val="19"/>
+        </w:rPr>
+        <w:t>NSW EPA $1.2M illegal dumping fund</w:t>
+      </w:r>
+      <w:r>
+        <w:rPr>
+          <w:rFonts w:ascii="Arial" w:hAnsi="Arial"/>
+          <w:color w:val="000000"/>
+          <w:sz w:val="19"/>
+        </w:rPr>
+        <w:t xml:space="preserve"> (</w:t>
+      </w:r>
+      <w:hyperlink r:id="rId28">
+        <w:r>
+          <w:rPr>
+            <w:rFonts w:ascii="Arial" w:hAnsi="Arial" w:cs="Arial"/>
+            <w:color w:val="0000FF"/>
+            <w:sz w:val="19"/>
+            <w:szCs w:val="19"/>
+            <w:u w:val="single"/>
+          </w:rPr>
+          <w:t xml:space="preserve">Read more</w:t>
+        </w:r>
+      </w:hyperlink>
+      <w:r>
+        <w:rPr>
+          <w:rFonts w:ascii="Arial" w:hAnsi="Arial"/>
+          <w:color w:val="000000"/>
+          <w:sz w:val="19"/>
+        </w:rPr>
+        <w:t>)</w:t>
+      </w:r>
+    </w:p>
+    <w:p>
+      <w:pPr>
+        <w:pStyle w:val="ListBullet"/>
+      </w:pPr>
+      <w:r>
+        <w:rPr>
+          <w:rFonts w:ascii="Arial" w:hAnsi="Arial"/>
+          <w:b/>
+          <w:color w:val="000000"/>
+          <w:sz w:val="19"/>
+        </w:rPr>
+        <w:t>Independent Commission Against Corruption</w:t>
+      </w:r>
+      <w:r>
+        <w:rPr>
+          <w:rFonts w:ascii="Arial" w:hAnsi="Arial"/>
+          <w:color w:val="000000"/>
+          <w:sz w:val="19"/>
+        </w:rPr>
+        <w:t xml:space="preserve"> — </w:t>
+      </w:r>
+      <w:r>
+        <w:rPr>
+          <w:rFonts w:ascii="Arial" w:hAnsi="Arial"/>
+          <w:color w:val="000000"/>
+          <w:sz w:val="19"/>
+        </w:rPr>
+        <w:t>ICAC opens 'Pink Ops' public hearings</w:t>
+      </w:r>
+      <w:r>
+        <w:rPr>
+          <w:rFonts w:ascii="Arial" w:hAnsi="Arial"/>
+          <w:color w:val="000000"/>
+          <w:sz w:val="19"/>
+        </w:rPr>
+        <w:t xml:space="preserve"> (</w:t>
+      </w:r>
+      <w:hyperlink r:id="rId22">
+        <w:r>
+          <w:rPr>
+            <w:rFonts w:ascii="Arial" w:hAnsi="Arial" w:cs="Arial"/>
+            <w:color w:val="0000FF"/>
+            <w:sz w:val="19"/>
+            <w:szCs w:val="19"/>
+            <w:u w:val="single"/>
+          </w:rPr>
+          <w:t xml:space="preserve">Read more</w:t>
+        </w:r>
+      </w:hyperlink>
+      <w:r>
+        <w:rPr>
+          <w:rFonts w:ascii="Arial" w:hAnsi="Arial"/>
+          <w:color w:val="000000"/>
+          <w:sz w:val="19"/>
+        </w:rPr>
+        <w:t>)</w:t>
       </w:r>
     </w:p>
     <w:p>
@@ -246,16 +1420,234 @@
     </w:p>
     <w:p>
       <w:pPr>
-        <w:pStyle w:val="body_letter"/>
+        <w:pStyle w:val="ListBullet"/>
       </w:pPr>
       <w:r>
         <w:rPr>
           <w:rFonts w:ascii="Arial" w:hAnsi="Arial"/>
-          <w:i/>
-          <w:color w:val="666666"/>
+          <w:b/>
+          <w:color w:val="000000"/>
           <w:sz w:val="19"/>
         </w:rPr>
-        <w:t>No emerging risks signal this fortnight.</w:t>
+        <w:t>AUSTRAC updates national financial crime risk snapshot</w:t>
+      </w:r>
+      <w:r>
+        <w:rPr>
+          <w:rFonts w:ascii="Arial" w:hAnsi="Arial"/>
+          <w:color w:val="000000"/>
+          <w:sz w:val="19"/>
+        </w:rPr>
+        <w:t xml:space="preserve"> — </w:t>
+      </w:r>
+      <w:r>
+        <w:rPr>
+          <w:rFonts w:ascii="Arial" w:hAnsi="Arial"/>
+          <w:color w:val="000000"/>
+          <w:sz w:val="19"/>
+        </w:rPr>
+        <w:t>AUSTRAC has released a refreshed risk snapshot of Australia's financial crime landscape, sharpening intelligence on money laundering, fraud and emerging typologies for reporting entities.</w:t>
+      </w:r>
+      <w:r>
+        <w:rPr>
+          <w:rFonts w:ascii="Arial" w:hAnsi="Arial"/>
+          <w:color w:val="000000"/>
+          <w:sz w:val="19"/>
+        </w:rPr>
+        <w:t xml:space="preserve"> (</w:t>
+      </w:r>
+      <w:hyperlink r:id="rId29">
+        <w:r>
+          <w:rPr>
+            <w:rFonts w:ascii="Arial" w:hAnsi="Arial" w:cs="Arial"/>
+            <w:color w:val="0000FF"/>
+            <w:sz w:val="19"/>
+            <w:szCs w:val="19"/>
+            <w:u w:val="single"/>
+          </w:rPr>
+          <w:t xml:space="preserve">Read more</w:t>
+        </w:r>
+      </w:hyperlink>
+      <w:r>
+        <w:rPr>
+          <w:rFonts w:ascii="Arial" w:hAnsi="Arial"/>
+          <w:color w:val="000000"/>
+          <w:sz w:val="19"/>
+        </w:rPr>
+        <w:t>)</w:t>
+      </w:r>
+    </w:p>
+    <w:p>
+      <w:pPr>
+        <w:pStyle w:val="ListBullet"/>
+      </w:pPr>
+      <w:r>
+        <w:rPr>
+          <w:rFonts w:ascii="Arial" w:hAnsi="Arial"/>
+          <w:b/>
+          <w:color w:val="000000"/>
+          <w:sz w:val="19"/>
+        </w:rPr>
+        <w:t>AUSTRAC opens enforcement investigation into Tabcorp AML/CTF compliance</w:t>
+      </w:r>
+      <w:r>
+        <w:rPr>
+          <w:rFonts w:ascii="Arial" w:hAnsi="Arial"/>
+          <w:color w:val="000000"/>
+          <w:sz w:val="19"/>
+        </w:rPr>
+        <w:t xml:space="preserve"> — </w:t>
+      </w:r>
+      <w:r>
+        <w:rPr>
+          <w:rFonts w:ascii="Arial" w:hAnsi="Arial"/>
+          <w:color w:val="000000"/>
+          <w:sz w:val="19"/>
+        </w:rPr>
+        <w:t>AUSTRAC has commenced a formal enforcement investigation into Tabcorp over suspected AML/CTF compliance failures, signalling continued pressure on gambling-sector reporting entities.</w:t>
+      </w:r>
+      <w:r>
+        <w:rPr>
+          <w:rFonts w:ascii="Arial" w:hAnsi="Arial"/>
+          <w:color w:val="000000"/>
+          <w:sz w:val="19"/>
+        </w:rPr>
+        <w:t xml:space="preserve"> (</w:t>
+      </w:r>
+      <w:hyperlink r:id="rId30">
+        <w:r>
+          <w:rPr>
+            <w:rFonts w:ascii="Arial" w:hAnsi="Arial" w:cs="Arial"/>
+            <w:color w:val="0000FF"/>
+            <w:sz w:val="19"/>
+            <w:szCs w:val="19"/>
+            <w:u w:val="single"/>
+          </w:rPr>
+          <w:t xml:space="preserve">Read more</w:t>
+        </w:r>
+      </w:hyperlink>
+      <w:r>
+        <w:rPr>
+          <w:rFonts w:ascii="Arial" w:hAnsi="Arial"/>
+          <w:color w:val="000000"/>
+          <w:sz w:val="19"/>
+        </w:rPr>
+        <w:t>)</w:t>
+      </w:r>
+    </w:p>
+    <w:p>
+      <w:pPr>
+        <w:pStyle w:val="ListBullet"/>
+      </w:pPr>
+      <w:r>
+        <w:rPr>
+          <w:rFonts w:ascii="Arial" w:hAnsi="Arial"/>
+          <w:b/>
+          <w:color w:val="000000"/>
+          <w:sz w:val="19"/>
+        </w:rPr>
+        <w:t>ASIC crackdown on finfluencers escalates</w:t>
+      </w:r>
+      <w:r>
+        <w:rPr>
+          <w:rFonts w:ascii="Arial" w:hAnsi="Arial"/>
+          <w:color w:val="000000"/>
+          <w:sz w:val="19"/>
+        </w:rPr>
+        <w:t xml:space="preserve"> — </w:t>
+      </w:r>
+      <w:r>
+        <w:rPr>
+          <w:rFonts w:ascii="Arial" w:hAnsi="Arial"/>
+          <w:color w:val="000000"/>
+          <w:sz w:val="19"/>
+        </w:rPr>
+        <w:t>ASIC has warned unlicensed financial influencers of intensified enforcement action, targeting misleading online advice as a growing consumer protection risk.</w:t>
+      </w:r>
+      <w:r>
+        <w:rPr>
+          <w:rFonts w:ascii="Arial" w:hAnsi="Arial"/>
+          <w:color w:val="000000"/>
+          <w:sz w:val="19"/>
+        </w:rPr>
+        <w:t xml:space="preserve"> (</w:t>
+      </w:r>
+      <w:hyperlink r:id="rId31">
+        <w:r>
+          <w:rPr>
+            <w:rFonts w:ascii="Arial" w:hAnsi="Arial" w:cs="Arial"/>
+            <w:color w:val="0000FF"/>
+            <w:sz w:val="19"/>
+            <w:szCs w:val="19"/>
+            <w:u w:val="single"/>
+          </w:rPr>
+          <w:t xml:space="preserve">Read more</w:t>
+        </w:r>
+      </w:hyperlink>
+      <w:r>
+        <w:rPr>
+          <w:rFonts w:ascii="Arial" w:hAnsi="Arial"/>
+          <w:color w:val="000000"/>
+          <w:sz w:val="19"/>
+        </w:rPr>
+        <w:t>)</w:t>
+      </w:r>
+    </w:p>
+    <w:p>
+      <w:pPr>
+        <w:pStyle w:val="ListBullet"/>
+      </w:pPr>
+      <w:r>
+        <w:rPr>
+          <w:rFonts w:ascii="Arial" w:hAnsi="Arial"/>
+          <w:b/>
+          <w:color w:val="000000"/>
+          <w:sz w:val="19"/>
+        </w:rPr>
+        <w:t>New federal counter-terrorism coordinator role created</w:t>
+      </w:r>
+      <w:r>
+        <w:rPr>
+          <w:rFonts w:ascii="Arial" w:hAnsi="Arial"/>
+          <w:color w:val="000000"/>
+          <w:sz w:val="19"/>
+        </w:rPr>
+        <w:t xml:space="preserve"> — </w:t>
+      </w:r>
+      <w:r>
+        <w:rPr>
+          <w:rFonts w:ascii="Arial" w:hAnsi="Arial"/>
+          <w:color w:val="000000"/>
+          <w:sz w:val="19"/>
+        </w:rPr>
+        <w:t>The Commonwealth has established a new national counter-terrorism coordinator position to strengthen cross-agency intelligence sharing amid a rising threat environment.</w:t>
+      </w:r>
+      <w:r>
+        <w:rPr>
+          <w:rFonts w:ascii="Arial" w:hAnsi="Arial"/>
+          <w:color w:val="000000"/>
+          <w:sz w:val="19"/>
+        </w:rPr>
+        <w:t xml:space="preserve"> (</w:t>
+      </w:r>
+      <w:hyperlink r:id="rId32">
+        <w:r>
+          <w:rPr>
+            <w:rFonts w:ascii="Arial" w:hAnsi="Arial" w:cs="Arial"/>
+            <w:color w:val="0000FF"/>
+            <w:sz w:val="19"/>
+            <w:szCs w:val="19"/>
+            <w:u w:val="single"/>
+          </w:rPr>
+          <w:t xml:space="preserve">Read more</w:t>
+        </w:r>
+      </w:hyperlink>
+      <w:r>
+        <w:rPr>
+          <w:rFonts w:ascii="Arial" w:hAnsi="Arial"/>
+          <w:color w:val="000000"/>
+          <w:sz w:val="19"/>
+        </w:rPr>
+        <w:t>)</w:t>
       </w:r>
     </w:p>
     <w:p>
@@ -274,16 +1666,234 @@
     </w:p>
     <w:p>
       <w:pPr>
-        <w:pStyle w:val="body_letter"/>
+        <w:pStyle w:val="ListBullet"/>
       </w:pPr>
       <w:r>
         <w:rPr>
           <w:rFonts w:ascii="Arial" w:hAnsi="Arial"/>
-          <w:i/>
-          <w:color w:val="666666"/>
+          <w:b/>
+          <w:color w:val="000000"/>
           <w:sz w:val="19"/>
         </w:rPr>
-        <w:t>No ai adoption signal this fortnight.</w:t>
+        <w:t>ASIC and APRA write to industry on emerging AI risks</w:t>
+      </w:r>
+      <w:r>
+        <w:rPr>
+          <w:rFonts w:ascii="Arial" w:hAnsi="Arial"/>
+          <w:color w:val="000000"/>
+          <w:sz w:val="19"/>
+        </w:rPr>
+        <w:t xml:space="preserve"> — </w:t>
+      </w:r>
+      <w:r>
+        <w:rPr>
+          <w:rFonts w:ascii="Arial" w:hAnsi="Arial"/>
+          <w:color w:val="000000"/>
+          <w:sz w:val="19"/>
+        </w:rPr>
+        <w:t>ASIC and APRA have jointly written to regulated entities setting clear expectations on AI governance, model risk management and board-level accountability for AI deployment.</w:t>
+      </w:r>
+      <w:r>
+        <w:rPr>
+          <w:rFonts w:ascii="Arial" w:hAnsi="Arial"/>
+          <w:color w:val="000000"/>
+          <w:sz w:val="19"/>
+        </w:rPr>
+        <w:t xml:space="preserve"> (</w:t>
+      </w:r>
+      <w:hyperlink r:id="rId33">
+        <w:r>
+          <w:rPr>
+            <w:rFonts w:ascii="Arial" w:hAnsi="Arial" w:cs="Arial"/>
+            <w:color w:val="0000FF"/>
+            <w:sz w:val="19"/>
+            <w:szCs w:val="19"/>
+            <w:u w:val="single"/>
+          </w:rPr>
+          <w:t xml:space="preserve">Read more</w:t>
+        </w:r>
+      </w:hyperlink>
+      <w:r>
+        <w:rPr>
+          <w:rFonts w:ascii="Arial" w:hAnsi="Arial"/>
+          <w:color w:val="000000"/>
+          <w:sz w:val="19"/>
+        </w:rPr>
+        <w:t>)</w:t>
+      </w:r>
+    </w:p>
+    <w:p>
+      <w:pPr>
+        <w:pStyle w:val="ListBullet"/>
+      </w:pPr>
+      <w:r>
+        <w:rPr>
+          <w:rFonts w:ascii="Arial" w:hAnsi="Arial"/>
+          <w:b/>
+          <w:color w:val="000000"/>
+          <w:sz w:val="19"/>
+        </w:rPr>
+        <w:t>OAIC consults on transparency guidance for automated decision-making</w:t>
+      </w:r>
+      <w:r>
+        <w:rPr>
+          <w:rFonts w:ascii="Arial" w:hAnsi="Arial"/>
+          <w:color w:val="000000"/>
+          <w:sz w:val="19"/>
+        </w:rPr>
+        <w:t xml:space="preserve"> — </w:t>
+      </w:r>
+      <w:r>
+        <w:rPr>
+          <w:rFonts w:ascii="Arial" w:hAnsi="Arial"/>
+          <w:color w:val="000000"/>
+          <w:sz w:val="19"/>
+        </w:rPr>
+        <w:t>The OAIC has opened consultation on new guidance requiring entities to be transparent with individuals about automated decision-making affecting them under Privacy Act reforms.</w:t>
+      </w:r>
+      <w:r>
+        <w:rPr>
+          <w:rFonts w:ascii="Arial" w:hAnsi="Arial"/>
+          <w:color w:val="000000"/>
+          <w:sz w:val="19"/>
+        </w:rPr>
+        <w:t xml:space="preserve"> (</w:t>
+      </w:r>
+      <w:hyperlink r:id="rId34">
+        <w:r>
+          <w:rPr>
+            <w:rFonts w:ascii="Arial" w:hAnsi="Arial" w:cs="Arial"/>
+            <w:color w:val="0000FF"/>
+            <w:sz w:val="19"/>
+            <w:szCs w:val="19"/>
+            <w:u w:val="single"/>
+          </w:rPr>
+          <w:t xml:space="preserve">Read more</w:t>
+        </w:r>
+      </w:hyperlink>
+      <w:r>
+        <w:rPr>
+          <w:rFonts w:ascii="Arial" w:hAnsi="Arial"/>
+          <w:color w:val="000000"/>
+          <w:sz w:val="19"/>
+        </w:rPr>
+        <w:t>)</w:t>
+      </w:r>
+    </w:p>
+    <w:p>
+      <w:pPr>
+        <w:pStyle w:val="ListBullet"/>
+      </w:pPr>
+      <w:r>
+        <w:rPr>
+          <w:rFonts w:ascii="Arial" w:hAnsi="Arial"/>
+          <w:b/>
+          <w:color w:val="000000"/>
+          <w:sz w:val="19"/>
+        </w:rPr>
+        <w:t>Government sustains key tech programs with new budget billions</w:t>
+      </w:r>
+      <w:r>
+        <w:rPr>
+          <w:rFonts w:ascii="Arial" w:hAnsi="Arial"/>
+          <w:color w:val="000000"/>
+          <w:sz w:val="19"/>
+        </w:rPr>
+        <w:t xml:space="preserve"> — </w:t>
+      </w:r>
+      <w:r>
+        <w:rPr>
+          <w:rFonts w:ascii="Arial" w:hAnsi="Arial"/>
+          <w:color w:val="000000"/>
+          <w:sz w:val="19"/>
+        </w:rPr>
+        <w:t>The Commonwealth has committed multi-billion-dollar funding in the 2026-27 Budget to sustain digital, cyber and AI-enabled programs across core agencies.</w:t>
+      </w:r>
+      <w:r>
+        <w:rPr>
+          <w:rFonts w:ascii="Arial" w:hAnsi="Arial"/>
+          <w:color w:val="000000"/>
+          <w:sz w:val="19"/>
+        </w:rPr>
+        <w:t xml:space="preserve"> (</w:t>
+      </w:r>
+      <w:hyperlink r:id="rId35">
+        <w:r>
+          <w:rPr>
+            <w:rFonts w:ascii="Arial" w:hAnsi="Arial" w:cs="Arial"/>
+            <w:color w:val="0000FF"/>
+            <w:sz w:val="19"/>
+            <w:szCs w:val="19"/>
+            <w:u w:val="single"/>
+          </w:rPr>
+          <w:t xml:space="preserve">Read more</w:t>
+        </w:r>
+      </w:hyperlink>
+      <w:r>
+        <w:rPr>
+          <w:rFonts w:ascii="Arial" w:hAnsi="Arial"/>
+          <w:color w:val="000000"/>
+          <w:sz w:val="19"/>
+        </w:rPr>
+        <w:t>)</w:t>
+      </w:r>
+    </w:p>
+    <w:p>
+      <w:pPr>
+        <w:pStyle w:val="ListBullet"/>
+      </w:pPr>
+      <w:r>
+        <w:rPr>
+          <w:rFonts w:ascii="Arial" w:hAnsi="Arial"/>
+          <w:b/>
+          <w:color w:val="000000"/>
+          <w:sz w:val="19"/>
+        </w:rPr>
+        <w:t>WGEA publishes AI transparency statement</w:t>
+      </w:r>
+      <w:r>
+        <w:rPr>
+          <w:rFonts w:ascii="Arial" w:hAnsi="Arial"/>
+          <w:color w:val="000000"/>
+          <w:sz w:val="19"/>
+        </w:rPr>
+        <w:t xml:space="preserve"> — </w:t>
+      </w:r>
+      <w:r>
+        <w:rPr>
+          <w:rFonts w:ascii="Arial" w:hAnsi="Arial"/>
+          <w:color w:val="000000"/>
+          <w:sz w:val="19"/>
+        </w:rPr>
+        <w:t>WGEA has issued an AI transparency statement disclosing its use of AI systems, modelling expected practice for federal agencies adopting AI tools.</w:t>
+      </w:r>
+      <w:r>
+        <w:rPr>
+          <w:rFonts w:ascii="Arial" w:hAnsi="Arial"/>
+          <w:color w:val="000000"/>
+          <w:sz w:val="19"/>
+        </w:rPr>
+        <w:t xml:space="preserve"> (</w:t>
+      </w:r>
+      <w:hyperlink r:id="rId36">
+        <w:r>
+          <w:rPr>
+            <w:rFonts w:ascii="Arial" w:hAnsi="Arial" w:cs="Arial"/>
+            <w:color w:val="0000FF"/>
+            <w:sz w:val="19"/>
+            <w:szCs w:val="19"/>
+            <w:u w:val="single"/>
+          </w:rPr>
+          <w:t xml:space="preserve">Read more</w:t>
+        </w:r>
+      </w:hyperlink>
+      <w:r>
+        <w:rPr>
+          <w:rFonts w:ascii="Arial" w:hAnsi="Arial"/>
+          <w:color w:val="000000"/>
+          <w:sz w:val="19"/>
+        </w:rPr>
+        <w:t>)</w:t>
       </w:r>
     </w:p>
     <w:p>
@@ -302,16 +1912,178 @@
     </w:p>
     <w:p>
       <w:pPr>
-        <w:pStyle w:val="body_letter"/>
+        <w:pStyle w:val="ListBullet"/>
       </w:pPr>
       <w:r>
         <w:rPr>
           <w:rFonts w:ascii="Arial" w:hAnsi="Arial"/>
-          <w:i/>
-          <w:color w:val="666666"/>
+          <w:b/>
+          <w:color w:val="000000"/>
           <w:sz w:val="19"/>
         </w:rPr>
-        <w:t>No regulatory burden signal this fortnight.</w:t>
+        <w:t>ASIC targets regulatory clutter with digital and guidance overhaul</w:t>
+      </w:r>
+      <w:r>
+        <w:rPr>
+          <w:rFonts w:ascii="Arial" w:hAnsi="Arial"/>
+          <w:color w:val="000000"/>
+          <w:sz w:val="19"/>
+        </w:rPr>
+        <w:t xml:space="preserve"> — </w:t>
+      </w:r>
+      <w:r>
+        <w:rPr>
+          <w:rFonts w:ascii="Arial" w:hAnsi="Arial"/>
+          <w:color w:val="000000"/>
+          <w:sz w:val="19"/>
+        </w:rPr>
+        <w:t>ASIC has launched a regulatory simplification program to consolidate guidance, retire outdated instruments and digitise interactions to reduce compliance burden on regulated entities.</w:t>
+      </w:r>
+    </w:p>
+    <w:p>
+      <w:pPr>
+        <w:pStyle w:val="ListBullet"/>
+      </w:pPr>
+      <w:r>
+        <w:rPr>
+          <w:rFonts w:ascii="Arial" w:hAnsi="Arial"/>
+          <w:b/>
+          <w:color w:val="000000"/>
+          <w:sz w:val="19"/>
+        </w:rPr>
+        <w:t>ASIC eases regulatory burden through simplification measures</w:t>
+      </w:r>
+      <w:r>
+        <w:rPr>
+          <w:rFonts w:ascii="Arial" w:hAnsi="Arial"/>
+          <w:color w:val="000000"/>
+          <w:sz w:val="19"/>
+        </w:rPr>
+        <w:t xml:space="preserve"> — </w:t>
+      </w:r>
+      <w:r>
+        <w:rPr>
+          <w:rFonts w:ascii="Arial" w:hAnsi="Arial"/>
+          <w:color w:val="000000"/>
+          <w:sz w:val="19"/>
+        </w:rPr>
+        <w:t>ASIC has confirmed further regulatory relief measures aimed at streamlining obligations for small business and licensees as part of its broader simplification agenda.</w:t>
+      </w:r>
+      <w:r>
+        <w:rPr>
+          <w:rFonts w:ascii="Arial" w:hAnsi="Arial"/>
+          <w:color w:val="000000"/>
+          <w:sz w:val="19"/>
+        </w:rPr>
+        <w:t xml:space="preserve"> (</w:t>
+      </w:r>
+      <w:hyperlink r:id="rId37">
+        <w:r>
+          <w:rPr>
+            <w:rFonts w:ascii="Arial" w:hAnsi="Arial" w:cs="Arial"/>
+            <w:color w:val="0000FF"/>
+            <w:sz w:val="19"/>
+            <w:szCs w:val="19"/>
+            <w:u w:val="single"/>
+          </w:rPr>
+          <w:t xml:space="preserve">Read more</w:t>
+        </w:r>
+      </w:hyperlink>
+      <w:r>
+        <w:rPr>
+          <w:rFonts w:ascii="Arial" w:hAnsi="Arial"/>
+          <w:color w:val="000000"/>
+          <w:sz w:val="19"/>
+        </w:rPr>
+        <w:t>)</w:t>
+      </w:r>
+    </w:p>
+    <w:p>
+      <w:pPr>
+        <w:pStyle w:val="ListBullet"/>
+      </w:pPr>
+      <w:r>
+        <w:rPr>
+          <w:rFonts w:ascii="Arial" w:hAnsi="Arial"/>
+          <w:b/>
+          <w:color w:val="000000"/>
+          <w:sz w:val="19"/>
+        </w:rPr>
+        <w:t>Federal Budget 2026-27 health, aged care and disability snapshot</w:t>
+      </w:r>
+      <w:r>
+        <w:rPr>
+          <w:rFonts w:ascii="Arial" w:hAnsi="Arial"/>
+          <w:color w:val="000000"/>
+          <w:sz w:val="19"/>
+        </w:rPr>
+        <w:t xml:space="preserve"> — </w:t>
+      </w:r>
+      <w:r>
+        <w:rPr>
+          <w:rFonts w:ascii="Arial" w:hAnsi="Arial"/>
+          <w:color w:val="000000"/>
+          <w:sz w:val="19"/>
+        </w:rPr>
+        <w:t>The 2026-27 Federal Budget reshapes regulatory settings across health, aged care, disability and life sciences, with significant NDIS savings and sector reform measures.</w:t>
+      </w:r>
+    </w:p>
+    <w:p>
+      <w:pPr>
+        <w:pStyle w:val="ListBullet"/>
+      </w:pPr>
+      <w:r>
+        <w:rPr>
+          <w:rFonts w:ascii="Arial" w:hAnsi="Arial"/>
+          <w:b/>
+          <w:color w:val="000000"/>
+          <w:sz w:val="19"/>
+        </w:rPr>
+        <w:t>WA overhauls regulation of renewable energy projects</w:t>
+      </w:r>
+      <w:r>
+        <w:rPr>
+          <w:rFonts w:ascii="Arial" w:hAnsi="Arial"/>
+          <w:color w:val="000000"/>
+          <w:sz w:val="19"/>
+        </w:rPr>
+        <w:t xml:space="preserve"> — </w:t>
+      </w:r>
+      <w:r>
+        <w:rPr>
+          <w:rFonts w:ascii="Arial" w:hAnsi="Arial"/>
+          <w:color w:val="000000"/>
+          <w:sz w:val="19"/>
+        </w:rPr>
+        <w:t>The WA Government has announced major reforms to streamline approvals and consolidate regulatory pathways for renewable energy projects to accelerate the energy transition.</w:t>
+      </w:r>
+      <w:r>
+        <w:rPr>
+          <w:rFonts w:ascii="Arial" w:hAnsi="Arial"/>
+          <w:color w:val="000000"/>
+          <w:sz w:val="19"/>
+        </w:rPr>
+        <w:t xml:space="preserve"> (</w:t>
+      </w:r>
+      <w:hyperlink r:id="rId38">
+        <w:r>
+          <w:rPr>
+            <w:rFonts w:ascii="Arial" w:hAnsi="Arial" w:cs="Arial"/>
+            <w:color w:val="0000FF"/>
+            <w:sz w:val="19"/>
+            <w:szCs w:val="19"/>
+            <w:u w:val="single"/>
+          </w:rPr>
+          <w:t xml:space="preserve">Read more</w:t>
+        </w:r>
+      </w:hyperlink>
+      <w:r>
+        <w:rPr>
+          <w:rFonts w:ascii="Arial" w:hAnsi="Arial"/>
+          <w:color w:val="000000"/>
+          <w:sz w:val="19"/>
+        </w:rPr>
+        <w:t>)</w:t>
       </w:r>
     </w:p>
     <w:p>
@@ -395,7 +2167,7 @@
         </w:rPr>
         <w:t xml:space="preserve"> (</w:t>
       </w:r>
-      <w:hyperlink r:id="rId10">
+      <w:hyperlink r:id="rId39">
         <w:r>
           <w:rPr>
             <w:rFonts w:ascii="Arial" w:hAnsi="Arial" w:cs="Arial"/>
@@ -476,6 +2248,122 @@
         <w:t>12 Jun 2026 — APRA · Online</w:t>
       </w:r>
     </w:p>
+    <w:p>
+      <w:pPr>
+        <w:pStyle w:val="ListBullet"/>
+      </w:pPr>
+      <w:r>
+        <w:rPr>
+          <w:rFonts w:ascii="Arial" w:hAnsi="Arial"/>
+          <w:b/>
+          <w:color w:val="000000"/>
+          <w:sz w:val="19"/>
+        </w:rPr>
+        <w:t>2026 AFR Insurance Summit</w:t>
+      </w:r>
+      <w:r>
+        <w:rPr>
+          <w:rFonts w:ascii="Arial" w:hAnsi="Arial"/>
+          <w:color w:val="000000"/>
+          <w:sz w:val="19"/>
+        </w:rPr>
+        <w:t xml:space="preserve"> — </w:t>
+      </w:r>
+      <w:r>
+        <w:rPr>
+          <w:rFonts w:ascii="Arial" w:hAnsi="Arial"/>
+          <w:color w:val="000000"/>
+          <w:sz w:val="19"/>
+        </w:rPr>
+        <w:t>16 Jun 2026 — APRA · Online</w:t>
+      </w:r>
+      <w:r>
+        <w:rPr>
+          <w:rFonts w:ascii="Arial" w:hAnsi="Arial"/>
+          <w:color w:val="000000"/>
+          <w:sz w:val="19"/>
+        </w:rPr>
+        <w:t xml:space="preserve"> (</w:t>
+      </w:r>
+      <w:hyperlink r:id="rId40">
+        <w:r>
+          <w:rPr>
+            <w:rFonts w:ascii="Arial" w:hAnsi="Arial" w:cs="Arial"/>
+            <w:color w:val="0000FF"/>
+            <w:sz w:val="19"/>
+            <w:szCs w:val="19"/>
+            <w:u w:val="single"/>
+          </w:rPr>
+          <w:t xml:space="preserve">Register</w:t>
+        </w:r>
+      </w:hyperlink>
+      <w:r>
+        <w:rPr>
+          <w:rFonts w:ascii="Arial" w:hAnsi="Arial"/>
+          <w:color w:val="000000"/>
+          <w:sz w:val="19"/>
+        </w:rPr>
+        <w:t>)</w:t>
+      </w:r>
+    </w:p>
+    <w:p>
+      <w:pPr>
+        <w:pStyle w:val="ListBullet"/>
+      </w:pPr>
+      <w:r>
+        <w:rPr>
+          <w:rFonts w:ascii="Arial" w:hAnsi="Arial"/>
+          <w:b/>
+          <w:color w:val="000000"/>
+          <w:sz w:val="19"/>
+        </w:rPr>
+        <w:t>ABA Banking Conference</w:t>
+      </w:r>
+      <w:r>
+        <w:rPr>
+          <w:rFonts w:ascii="Arial" w:hAnsi="Arial"/>
+          <w:color w:val="000000"/>
+          <w:sz w:val="19"/>
+        </w:rPr>
+        <w:t xml:space="preserve"> — </w:t>
+      </w:r>
+      <w:r>
+        <w:rPr>
+          <w:rFonts w:ascii="Arial" w:hAnsi="Arial"/>
+          <w:color w:val="000000"/>
+          <w:sz w:val="19"/>
+        </w:rPr>
+        <w:t>17 Jun 2026 — APRA · Online</w:t>
+      </w:r>
+      <w:r>
+        <w:rPr>
+          <w:rFonts w:ascii="Arial" w:hAnsi="Arial"/>
+          <w:color w:val="000000"/>
+          <w:sz w:val="19"/>
+        </w:rPr>
+        <w:t xml:space="preserve"> (</w:t>
+      </w:r>
+      <w:hyperlink r:id="rId41">
+        <w:r>
+          <w:rPr>
+            <w:rFonts w:ascii="Arial" w:hAnsi="Arial" w:cs="Arial"/>
+            <w:color w:val="0000FF"/>
+            <w:sz w:val="19"/>
+            <w:szCs w:val="19"/>
+            <w:u w:val="single"/>
+          </w:rPr>
+          <w:t xml:space="preserve">Register</w:t>
+        </w:r>
+      </w:hyperlink>
+      <w:r>
+        <w:rPr>
+          <w:rFonts w:ascii="Arial" w:hAnsi="Arial"/>
+          <w:color w:val="000000"/>
+          <w:sz w:val="19"/>
+        </w:rPr>
+        <w:t>)</w:t>
+      </w:r>
+    </w:p>
     <w:tbl>
       <w:tblPr>
         <w:tblW w:type="auto" w:w="0"/>
@@ -519,7 +2407,7 @@
                           <pic:cNvPicPr/>
                         </pic:nvPicPr>
                         <pic:blipFill>
-                          <a:blip r:embed="rId11"/>
+                          <a:blip r:embed="rId42"/>
                           <a:stretch>
                             <a:fillRect/>
                           </a:stretch>

</xml_diff>

<commit_message>
chore: update regulation hub 2026-06-01
</commit_message>
<xml_diff>
--- a/reg-hub/regulation_fortnightly_brief.docx
+++ b/reg-hub/regulation_fortnightly_brief.docx
@@ -46,7 +46,7 @@
         <w:pStyle w:val="Heading1"/>
       </w:pPr>
       <w:r>
-        <w:t>KPMG Regulatory Transformation Fortnightly Brief — 7–20 May 2026</w:t>
+        <w:t>KPMG Regulatory Transformation Fortnightly Brief — 20 May – 2 June 2026</w:t>
       </w:r>
     </w:p>
     <w:p>
@@ -73,7 +73,7 @@
           <w:color w:val="666666"/>
           <w:sz w:val="19"/>
         </w:rPr>
-        <w:t>20 May 2026</w:t>
+        <w:t>02 June 2026</w:t>
       </w:r>
     </w:p>
     <w:p>
@@ -97,11 +97,11 @@
       <w:r>
         <w:rPr>
           <w:rFonts w:ascii="Arial" w:hAnsi="Arial"/>
-          <w:b w:val="0"/>
-          <w:color w:val="000000"/>
+          <w:i/>
+          <w:color w:val="666666"/>
           <w:sz w:val="19"/>
         </w:rPr>
-        <w:t>This fortnight regulators are squarely focused on burden reduction and integrity, with the NDIS reform package moving through the Senate alongside fresh provider crackdowns, while governance failures at the RACP and TGA prescribing updates underline the pressure on professional and therapeutic regulators to lift transparency. The pivotal opportunity for our advisory practice sits in the NDIS reform pipeline, where tighter access tests, anti-fraud measures and the 2026-27 Budget settings will force providers, scheme administrators and oversight bodies to rebuild assurance, data and decision-making operating models at pace. Convene our Health, Ageing and Human Services leads with PEPI and Forensic this fortnight to land a single NDIS integrity and reform-readiness proposition, and brief priority portfolio agencies and provider boards before the legislation clears the Senate.</w:t>
+        <w:t>[edit before send] — Adam's 3-sentence key messages will prefill from the dashboard synthesis on the next fortnightly run. Type your replacement here.</w:t>
       </w:r>
     </w:p>
     <w:p>
@@ -120,698 +120,16 @@
     </w:p>
     <w:p>
       <w:pPr>
-        <w:pStyle w:val="ListBullet"/>
+        <w:pStyle w:val="body_letter"/>
       </w:pPr>
       <w:r>
         <w:rPr>
           <w:rFonts w:ascii="Arial" w:hAnsi="Arial"/>
-          <w:b/>
-          <w:color w:val="000000"/>
+          <w:i/>
+          <w:color w:val="666666"/>
           <w:sz w:val="19"/>
         </w:rPr>
-        <w:t>eSafety Commissioner</w:t>
-      </w:r>
-      <w:r>
-        <w:rPr>
-          <w:rFonts w:ascii="Arial" w:hAnsi="Arial"/>
-          <w:color w:val="000000"/>
-          <w:sz w:val="19"/>
-        </w:rPr>
-        <w:t xml:space="preserve"> — </w:t>
-      </w:r>
-      <w:r>
-        <w:rPr>
-          <w:rFonts w:ascii="Arial" w:hAnsi="Arial"/>
-          <w:color w:val="000000"/>
-          <w:sz w:val="19"/>
-        </w:rPr>
-        <w:t>eSafety issued enforcement action against another major 'nudify' service for failing to protect Australian children under the Online Safety Act.</w:t>
-      </w:r>
-      <w:r>
-        <w:rPr>
-          <w:rFonts w:ascii="Arial" w:hAnsi="Arial"/>
-          <w:color w:val="000000"/>
-          <w:sz w:val="19"/>
-        </w:rPr>
-        <w:t xml:space="preserve"> (</w:t>
-      </w:r>
-      <w:hyperlink r:id="rId10">
-        <w:r>
-          <w:rPr>
-            <w:rFonts w:ascii="Arial" w:hAnsi="Arial" w:cs="Arial"/>
-            <w:color w:val="0000FF"/>
-            <w:sz w:val="19"/>
-            <w:szCs w:val="19"/>
-            <w:u w:val="single"/>
-          </w:rPr>
-          <w:t xml:space="preserve">Read more</w:t>
-        </w:r>
-      </w:hyperlink>
-      <w:r>
-        <w:rPr>
-          <w:rFonts w:ascii="Arial" w:hAnsi="Arial"/>
-          <w:color w:val="000000"/>
-          <w:sz w:val="19"/>
-        </w:rPr>
-        <w:t>)</w:t>
-      </w:r>
-    </w:p>
-    <w:p>
-      <w:pPr>
-        <w:pStyle w:val="ListBullet"/>
-      </w:pPr>
-      <w:r>
-        <w:rPr>
-          <w:rFonts w:ascii="Arial" w:hAnsi="Arial"/>
-          <w:b/>
-          <w:color w:val="000000"/>
-          <w:sz w:val="19"/>
-        </w:rPr>
-        <w:t>Australian Prudential Regulation Authority</w:t>
-      </w:r>
-      <w:r>
-        <w:rPr>
-          <w:rFonts w:ascii="Arial" w:hAnsi="Arial"/>
-          <w:color w:val="000000"/>
-          <w:sz w:val="19"/>
-        </w:rPr>
-        <w:t xml:space="preserve"> — </w:t>
-      </w:r>
-      <w:r>
-        <w:rPr>
-          <w:rFonts w:ascii="Arial" w:hAnsi="Arial"/>
-          <w:color w:val="000000"/>
-          <w:sz w:val="19"/>
-        </w:rPr>
-        <w:t>APRA disqualified the former Xinja Bank chair for six years over undisclosed investor agreements that breached fit-and-proper obligations.</w:t>
-      </w:r>
-      <w:r>
-        <w:rPr>
-          <w:rFonts w:ascii="Arial" w:hAnsi="Arial"/>
-          <w:color w:val="000000"/>
-          <w:sz w:val="19"/>
-        </w:rPr>
-        <w:t xml:space="preserve"> (</w:t>
-      </w:r>
-      <w:hyperlink r:id="rId11">
-        <w:r>
-          <w:rPr>
-            <w:rFonts w:ascii="Arial" w:hAnsi="Arial" w:cs="Arial"/>
-            <w:color w:val="0000FF"/>
-            <w:sz w:val="19"/>
-            <w:szCs w:val="19"/>
-            <w:u w:val="single"/>
-          </w:rPr>
-          <w:t xml:space="preserve">Read more</w:t>
-        </w:r>
-      </w:hyperlink>
-      <w:r>
-        <w:rPr>
-          <w:rFonts w:ascii="Arial" w:hAnsi="Arial"/>
-          <w:color w:val="000000"/>
-          <w:sz w:val="19"/>
-        </w:rPr>
-        <w:t>)</w:t>
-      </w:r>
-    </w:p>
-    <w:p>
-      <w:pPr>
-        <w:pStyle w:val="ListBullet"/>
-      </w:pPr>
-      <w:r>
-        <w:rPr>
-          <w:rFonts w:ascii="Arial" w:hAnsi="Arial"/>
-          <w:b/>
-          <w:color w:val="000000"/>
-          <w:sz w:val="19"/>
-        </w:rPr>
-        <w:t>Australian Charities and Not-for-profits Commission</w:t>
-      </w:r>
-      <w:r>
-        <w:rPr>
-          <w:rFonts w:ascii="Arial" w:hAnsi="Arial"/>
-          <w:color w:val="000000"/>
-          <w:sz w:val="19"/>
-        </w:rPr>
-        <w:t xml:space="preserve"> — </w:t>
-      </w:r>
-      <w:r>
-        <w:rPr>
-          <w:rFonts w:ascii="Arial" w:hAnsi="Arial"/>
-          <w:color w:val="000000"/>
-          <w:sz w:val="19"/>
-        </w:rPr>
-        <w:t>ACNC suspended the RACP president-elect from her board role amid governance and safety concerns at the medical college.</w:t>
-      </w:r>
-      <w:r>
-        <w:rPr>
-          <w:rFonts w:ascii="Arial" w:hAnsi="Arial"/>
-          <w:color w:val="000000"/>
-          <w:sz w:val="19"/>
-        </w:rPr>
-        <w:t xml:space="preserve"> (</w:t>
-      </w:r>
-      <w:hyperlink r:id="rId12">
-        <w:r>
-          <w:rPr>
-            <w:rFonts w:ascii="Arial" w:hAnsi="Arial" w:cs="Arial"/>
-            <w:color w:val="0000FF"/>
-            <w:sz w:val="19"/>
-            <w:szCs w:val="19"/>
-            <w:u w:val="single"/>
-          </w:rPr>
-          <w:t xml:space="preserve">Read more</w:t>
-        </w:r>
-      </w:hyperlink>
-      <w:r>
-        <w:rPr>
-          <w:rFonts w:ascii="Arial" w:hAnsi="Arial"/>
-          <w:color w:val="000000"/>
-          <w:sz w:val="19"/>
-        </w:rPr>
-        <w:t>)</w:t>
-      </w:r>
-    </w:p>
-    <w:p>
-      <w:pPr>
-        <w:pStyle w:val="ListBullet"/>
-      </w:pPr>
-      <w:r>
-        <w:rPr>
-          <w:rFonts w:ascii="Arial" w:hAnsi="Arial"/>
-          <w:b/>
-          <w:color w:val="000000"/>
-          <w:sz w:val="19"/>
-        </w:rPr>
-        <w:t>National Disability Insurance Agency</w:t>
-      </w:r>
-      <w:r>
-        <w:rPr>
-          <w:rFonts w:ascii="Arial" w:hAnsi="Arial"/>
-          <w:color w:val="000000"/>
-          <w:sz w:val="19"/>
-        </w:rPr>
-        <w:t xml:space="preserve"> — </w:t>
-      </w:r>
-      <w:r>
-        <w:rPr>
-          <w:rFonts w:ascii="Arial" w:hAnsi="Arial"/>
-          <w:color w:val="000000"/>
-          <w:sz w:val="19"/>
-        </w:rPr>
-        <w:t>The NDIA's own analysis indicates proposed NDIS scheme reforms will disproportionately reduce supports for participants with Down syndrome and other lifelong conditions.</w:t>
-      </w:r>
-      <w:r>
-        <w:rPr>
-          <w:rFonts w:ascii="Arial" w:hAnsi="Arial"/>
-          <w:color w:val="000000"/>
-          <w:sz w:val="19"/>
-        </w:rPr>
-        <w:t xml:space="preserve"> (</w:t>
-      </w:r>
-      <w:hyperlink r:id="rId13">
-        <w:r>
-          <w:rPr>
-            <w:rFonts w:ascii="Arial" w:hAnsi="Arial" w:cs="Arial"/>
-            <w:color w:val="0000FF"/>
-            <w:sz w:val="19"/>
-            <w:szCs w:val="19"/>
-            <w:u w:val="single"/>
-          </w:rPr>
-          <w:t xml:space="preserve">Read more</w:t>
-        </w:r>
-      </w:hyperlink>
-      <w:r>
-        <w:rPr>
-          <w:rFonts w:ascii="Arial" w:hAnsi="Arial"/>
-          <w:color w:val="000000"/>
-          <w:sz w:val="19"/>
-        </w:rPr>
-        <w:t>)</w:t>
-      </w:r>
-    </w:p>
-    <w:p>
-      <w:pPr>
-        <w:pStyle w:val="ListBullet"/>
-      </w:pPr>
-      <w:r>
-        <w:rPr>
-          <w:rFonts w:ascii="Arial" w:hAnsi="Arial"/>
-          <w:b/>
-          <w:color w:val="000000"/>
-          <w:sz w:val="19"/>
-        </w:rPr>
-        <w:t>Australian Federal Police</w:t>
-      </w:r>
-      <w:r>
-        <w:rPr>
-          <w:rFonts w:ascii="Arial" w:hAnsi="Arial"/>
-          <w:color w:val="000000"/>
-          <w:sz w:val="19"/>
-        </w:rPr>
-        <w:t xml:space="preserve"> — </w:t>
-      </w:r>
-      <w:r>
-        <w:rPr>
-          <w:rFonts w:ascii="Arial" w:hAnsi="Arial"/>
-          <w:color w:val="000000"/>
-          <w:sz w:val="19"/>
-        </w:rPr>
-        <w:t>The AFP co-opened a Pacific-focused law enforcement summit with Fiji Police to coordinate disruption of transnational crime syndicates targeting the region.</w:t>
-      </w:r>
-      <w:r>
-        <w:rPr>
-          <w:rFonts w:ascii="Arial" w:hAnsi="Arial"/>
-          <w:color w:val="000000"/>
-          <w:sz w:val="19"/>
-        </w:rPr>
-        <w:t xml:space="preserve"> (</w:t>
-      </w:r>
-      <w:hyperlink r:id="rId14">
-        <w:r>
-          <w:rPr>
-            <w:rFonts w:ascii="Arial" w:hAnsi="Arial" w:cs="Arial"/>
-            <w:color w:val="0000FF"/>
-            <w:sz w:val="19"/>
-            <w:szCs w:val="19"/>
-            <w:u w:val="single"/>
-          </w:rPr>
-          <w:t xml:space="preserve">Read more</w:t>
-        </w:r>
-      </w:hyperlink>
-      <w:r>
-        <w:rPr>
-          <w:rFonts w:ascii="Arial" w:hAnsi="Arial"/>
-          <w:color w:val="000000"/>
-          <w:sz w:val="19"/>
-        </w:rPr>
-        <w:t>)</w:t>
-      </w:r>
-    </w:p>
-    <w:p>
-      <w:pPr>
-        <w:pStyle w:val="ListBullet"/>
-      </w:pPr>
-      <w:r>
-        <w:rPr>
-          <w:rFonts w:ascii="Arial" w:hAnsi="Arial"/>
-          <w:b/>
-          <w:color w:val="000000"/>
-          <w:sz w:val="19"/>
-        </w:rPr>
-        <w:t>Department of Education</w:t>
-      </w:r>
-      <w:r>
-        <w:rPr>
-          <w:rFonts w:ascii="Arial" w:hAnsi="Arial"/>
-          <w:color w:val="000000"/>
-          <w:sz w:val="19"/>
-        </w:rPr>
-        <w:t xml:space="preserve"> — </w:t>
-      </w:r>
-      <w:r>
-        <w:rPr>
-          <w:rFonts w:ascii="Arial" w:hAnsi="Arial"/>
-          <w:color w:val="000000"/>
-          <w:sz w:val="19"/>
-        </w:rPr>
-        <w:t>The Department of Education suspended new private college course and provider registrations for international students for 12 months pending integrity reforms.</w:t>
-      </w:r>
-      <w:r>
-        <w:rPr>
-          <w:rFonts w:ascii="Arial" w:hAnsi="Arial"/>
-          <w:color w:val="000000"/>
-          <w:sz w:val="19"/>
-        </w:rPr>
-        <w:t xml:space="preserve"> (</w:t>
-      </w:r>
-      <w:hyperlink r:id="rId15">
-        <w:r>
-          <w:rPr>
-            <w:rFonts w:ascii="Arial" w:hAnsi="Arial" w:cs="Arial"/>
-            <w:color w:val="0000FF"/>
-            <w:sz w:val="19"/>
-            <w:szCs w:val="19"/>
-            <w:u w:val="single"/>
-          </w:rPr>
-          <w:t xml:space="preserve">Read more</w:t>
-        </w:r>
-      </w:hyperlink>
-      <w:r>
-        <w:rPr>
-          <w:rFonts w:ascii="Arial" w:hAnsi="Arial"/>
-          <w:color w:val="000000"/>
-          <w:sz w:val="19"/>
-        </w:rPr>
-        <w:t>)</w:t>
-      </w:r>
-    </w:p>
-    <w:p>
-      <w:pPr>
-        <w:pStyle w:val="ListBullet"/>
-      </w:pPr>
-      <w:r>
-        <w:rPr>
-          <w:rFonts w:ascii="Arial" w:hAnsi="Arial"/>
-          <w:b/>
-          <w:color w:val="000000"/>
-          <w:sz w:val="19"/>
-        </w:rPr>
-        <w:t>Australian Securities and Investments Commission</w:t>
-      </w:r>
-      <w:r>
-        <w:rPr>
-          <w:rFonts w:ascii="Arial" w:hAnsi="Arial"/>
-          <w:color w:val="000000"/>
-          <w:sz w:val="19"/>
-        </w:rPr>
-        <w:t xml:space="preserve"> — </w:t>
-      </w:r>
-      <w:r>
-        <w:rPr>
-          <w:rFonts w:ascii="Arial" w:hAnsi="Arial"/>
-          <w:color w:val="000000"/>
-          <w:sz w:val="19"/>
-        </w:rPr>
-        <w:t>ASIC published REP 830 setting out its regulatory simplification program targeting digital guidance, instrument consolidation and reduced compliance clutter.</w:t>
-      </w:r>
-      <w:r>
-        <w:rPr>
-          <w:rFonts w:ascii="Arial" w:hAnsi="Arial"/>
-          <w:color w:val="000000"/>
-          <w:sz w:val="19"/>
-        </w:rPr>
-        <w:t xml:space="preserve"> (</w:t>
-      </w:r>
-      <w:hyperlink r:id="rId16">
-        <w:r>
-          <w:rPr>
-            <w:rFonts w:ascii="Arial" w:hAnsi="Arial" w:cs="Arial"/>
-            <w:color w:val="0000FF"/>
-            <w:sz w:val="19"/>
-            <w:szCs w:val="19"/>
-            <w:u w:val="single"/>
-          </w:rPr>
-          <w:t xml:space="preserve">Read more</w:t>
-        </w:r>
-      </w:hyperlink>
-      <w:r>
-        <w:rPr>
-          <w:rFonts w:ascii="Arial" w:hAnsi="Arial"/>
-          <w:color w:val="000000"/>
-          <w:sz w:val="19"/>
-        </w:rPr>
-        <w:t>)</w:t>
-      </w:r>
-    </w:p>
-    <w:p>
-      <w:pPr>
-        <w:pStyle w:val="ListBullet"/>
-      </w:pPr>
-      <w:r>
-        <w:rPr>
-          <w:rFonts w:ascii="Arial" w:hAnsi="Arial"/>
-          <w:b/>
-          <w:color w:val="000000"/>
-          <w:sz w:val="19"/>
-        </w:rPr>
-        <w:t>eSafety Commissioner</w:t>
-      </w:r>
-      <w:r>
-        <w:rPr>
-          <w:rFonts w:ascii="Arial" w:hAnsi="Arial"/>
-          <w:color w:val="000000"/>
-          <w:sz w:val="19"/>
-        </w:rPr>
-        <w:t xml:space="preserve"> — </w:t>
-      </w:r>
-      <w:r>
-        <w:rPr>
-          <w:rFonts w:ascii="Arial" w:hAnsi="Arial"/>
-          <w:color w:val="000000"/>
-          <w:sz w:val="19"/>
-        </w:rPr>
-        <w:t>eSafety convened national sporting code leaders to coordinate action on cyberbullying and online hate directed at athletes, officials and children in sport.</w:t>
-      </w:r>
-      <w:r>
-        <w:rPr>
-          <w:rFonts w:ascii="Arial" w:hAnsi="Arial"/>
-          <w:color w:val="000000"/>
-          <w:sz w:val="19"/>
-        </w:rPr>
-        <w:t xml:space="preserve"> (</w:t>
-      </w:r>
-      <w:hyperlink r:id="rId17">
-        <w:r>
-          <w:rPr>
-            <w:rFonts w:ascii="Arial" w:hAnsi="Arial" w:cs="Arial"/>
-            <w:color w:val="0000FF"/>
-            <w:sz w:val="19"/>
-            <w:szCs w:val="19"/>
-            <w:u w:val="single"/>
-          </w:rPr>
-          <w:t xml:space="preserve">Read more</w:t>
-        </w:r>
-      </w:hyperlink>
-      <w:r>
-        <w:rPr>
-          <w:rFonts w:ascii="Arial" w:hAnsi="Arial"/>
-          <w:color w:val="000000"/>
-          <w:sz w:val="19"/>
-        </w:rPr>
-        <w:t>)</w:t>
-      </w:r>
-    </w:p>
-    <w:p>
-      <w:pPr>
-        <w:pStyle w:val="ListBullet"/>
-      </w:pPr>
-      <w:r>
-        <w:rPr>
-          <w:rFonts w:ascii="Arial" w:hAnsi="Arial"/>
-          <w:b/>
-          <w:color w:val="000000"/>
-          <w:sz w:val="19"/>
-        </w:rPr>
-        <w:t>Office of the Australian Information Commissioner</w:t>
-      </w:r>
-      <w:r>
-        <w:rPr>
-          <w:rFonts w:ascii="Arial" w:hAnsi="Arial"/>
-          <w:color w:val="000000"/>
-          <w:sz w:val="19"/>
-        </w:rPr>
-        <w:t xml:space="preserve"> — </w:t>
-      </w:r>
-      <w:r>
-        <w:rPr>
-          <w:rFonts w:ascii="Arial" w:hAnsi="Arial"/>
-          <w:color w:val="000000"/>
-          <w:sz w:val="19"/>
-        </w:rPr>
-        <w:t>The OAIC issued updated Australian Privacy Principles guidance signalling tighter expectations on personal information collection practices.</w:t>
-      </w:r>
-      <w:r>
-        <w:rPr>
-          <w:rFonts w:ascii="Arial" w:hAnsi="Arial"/>
-          <w:color w:val="000000"/>
-          <w:sz w:val="19"/>
-        </w:rPr>
-        <w:t xml:space="preserve"> (</w:t>
-      </w:r>
-      <w:hyperlink r:id="rId18">
-        <w:r>
-          <w:rPr>
-            <w:rFonts w:ascii="Arial" w:hAnsi="Arial" w:cs="Arial"/>
-            <w:color w:val="0000FF"/>
-            <w:sz w:val="19"/>
-            <w:szCs w:val="19"/>
-            <w:u w:val="single"/>
-          </w:rPr>
-          <w:t xml:space="preserve">Read more</w:t>
-        </w:r>
-      </w:hyperlink>
-      <w:r>
-        <w:rPr>
-          <w:rFonts w:ascii="Arial" w:hAnsi="Arial"/>
-          <w:color w:val="000000"/>
-          <w:sz w:val="19"/>
-        </w:rPr>
-        <w:t>)</w:t>
-      </w:r>
-    </w:p>
-    <w:p>
-      <w:pPr>
-        <w:pStyle w:val="ListBullet"/>
-      </w:pPr>
-      <w:r>
-        <w:rPr>
-          <w:rFonts w:ascii="Arial" w:hAnsi="Arial"/>
-          <w:b/>
-          <w:color w:val="000000"/>
-          <w:sz w:val="19"/>
-        </w:rPr>
-        <w:t>Australian Securities and Investments Commission</w:t>
-      </w:r>
-      <w:r>
-        <w:rPr>
-          <w:rFonts w:ascii="Arial" w:hAnsi="Arial"/>
-          <w:color w:val="000000"/>
-          <w:sz w:val="19"/>
-        </w:rPr>
-        <w:t xml:space="preserve"> — </w:t>
-      </w:r>
-      <w:r>
-        <w:rPr>
-          <w:rFonts w:ascii="Arial" w:hAnsi="Arial"/>
-          <w:color w:val="000000"/>
-          <w:sz w:val="19"/>
-        </w:rPr>
-        <w:t>ASIC escalated its surveillance of registered company auditors' annual statements, flagging further enforcement where lodgement and quality obligations are not met.</w:t>
-      </w:r>
-      <w:r>
-        <w:rPr>
-          <w:rFonts w:ascii="Arial" w:hAnsi="Arial"/>
-          <w:color w:val="000000"/>
-          <w:sz w:val="19"/>
-        </w:rPr>
-        <w:t xml:space="preserve"> (</w:t>
-      </w:r>
-      <w:hyperlink r:id="rId19">
-        <w:r>
-          <w:rPr>
-            <w:rFonts w:ascii="Arial" w:hAnsi="Arial" w:cs="Arial"/>
-            <w:color w:val="0000FF"/>
-            <w:sz w:val="19"/>
-            <w:szCs w:val="19"/>
-            <w:u w:val="single"/>
-          </w:rPr>
-          <w:t xml:space="preserve">Read more</w:t>
-        </w:r>
-      </w:hyperlink>
-      <w:r>
-        <w:rPr>
-          <w:rFonts w:ascii="Arial" w:hAnsi="Arial"/>
-          <w:color w:val="000000"/>
-          <w:sz w:val="19"/>
-        </w:rPr>
-        <w:t>)</w:t>
-      </w:r>
-    </w:p>
-    <w:p>
-      <w:pPr>
-        <w:pStyle w:val="ListBullet"/>
-      </w:pPr>
-      <w:r>
-        <w:rPr>
-          <w:rFonts w:ascii="Arial" w:hAnsi="Arial"/>
-          <w:b/>
-          <w:color w:val="000000"/>
-          <w:sz w:val="19"/>
-        </w:rPr>
-        <w:t>Victorian Auditor-General's Office</w:t>
-      </w:r>
-      <w:r>
-        <w:rPr>
-          <w:rFonts w:ascii="Arial" w:hAnsi="Arial"/>
-          <w:color w:val="000000"/>
-          <w:sz w:val="19"/>
-        </w:rPr>
-        <w:t xml:space="preserve"> — </w:t>
-      </w:r>
-      <w:r>
-        <w:rPr>
-          <w:rFonts w:ascii="Arial" w:hAnsi="Arial"/>
-          <w:color w:val="000000"/>
-          <w:sz w:val="19"/>
-        </w:rPr>
-        <w:t>VAGO opened a performance audit into Victoria's 40-year lottery licensing deal, scrutinising probity and value-for-money in the long-dated arrangement.</w:t>
-      </w:r>
-      <w:r>
-        <w:rPr>
-          <w:rFonts w:ascii="Arial" w:hAnsi="Arial"/>
-          <w:color w:val="000000"/>
-          <w:sz w:val="19"/>
-        </w:rPr>
-        <w:t xml:space="preserve"> (</w:t>
-      </w:r>
-      <w:hyperlink r:id="rId20">
-        <w:r>
-          <w:rPr>
-            <w:rFonts w:ascii="Arial" w:hAnsi="Arial" w:cs="Arial"/>
-            <w:color w:val="0000FF"/>
-            <w:sz w:val="19"/>
-            <w:szCs w:val="19"/>
-            <w:u w:val="single"/>
-          </w:rPr>
-          <w:t xml:space="preserve">Read more</w:t>
-        </w:r>
-      </w:hyperlink>
-      <w:r>
-        <w:rPr>
-          <w:rFonts w:ascii="Arial" w:hAnsi="Arial"/>
-          <w:color w:val="000000"/>
-          <w:sz w:val="19"/>
-        </w:rPr>
-        <w:t>)</w:t>
-      </w:r>
-    </w:p>
-    <w:p>
-      <w:pPr>
-        <w:pStyle w:val="ListBullet"/>
-      </w:pPr>
-      <w:r>
-        <w:rPr>
-          <w:rFonts w:ascii="Arial" w:hAnsi="Arial"/>
-          <w:b/>
-          <w:color w:val="000000"/>
-          <w:sz w:val="19"/>
-        </w:rPr>
-        <w:t>Australian Communications and Media Authority</w:t>
-      </w:r>
-      <w:r>
-        <w:rPr>
-          <w:rFonts w:ascii="Arial" w:hAnsi="Arial"/>
-          <w:color w:val="000000"/>
-          <w:sz w:val="19"/>
-        </w:rPr>
-        <w:t xml:space="preserve"> — </w:t>
-      </w:r>
-      <w:r>
-        <w:rPr>
-          <w:rFonts w:ascii="Arial" w:hAnsi="Arial"/>
-          <w:color w:val="000000"/>
-          <w:sz w:val="19"/>
-        </w:rPr>
-        <w:t>ACMA released new consumer and advocate resources reinforcing telco obligations on complaints handling, financial hardship and customer protections.</w:t>
-      </w:r>
-      <w:r>
-        <w:rPr>
-          <w:rFonts w:ascii="Arial" w:hAnsi="Arial"/>
-          <w:color w:val="000000"/>
-          <w:sz w:val="19"/>
-        </w:rPr>
-        <w:t xml:space="preserve"> (</w:t>
-      </w:r>
-      <w:hyperlink r:id="rId21">
-        <w:r>
-          <w:rPr>
-            <w:rFonts w:ascii="Arial" w:hAnsi="Arial" w:cs="Arial"/>
-            <w:color w:val="0000FF"/>
-            <w:sz w:val="19"/>
-            <w:szCs w:val="19"/>
-            <w:u w:val="single"/>
-          </w:rPr>
-          <w:t xml:space="preserve">Read more</w:t>
-        </w:r>
-      </w:hyperlink>
-      <w:r>
-        <w:rPr>
-          <w:rFonts w:ascii="Arial" w:hAnsi="Arial"/>
-          <w:color w:val="000000"/>
-          <w:sz w:val="19"/>
-        </w:rPr>
-        <w:t>)</w:t>
+        <w:t>No regulator-in-news signal this fortnight — see Themes below.</w:t>
       </w:r>
     </w:p>
     <w:p>
@@ -835,307 +153,11 @@
       <w:r>
         <w:rPr>
           <w:rFonts w:ascii="Arial" w:hAnsi="Arial"/>
-          <w:b/>
-          <w:color w:val="000000"/>
+          <w:i/>
+          <w:color w:val="666666"/>
           <w:sz w:val="19"/>
         </w:rPr>
-        <w:t>Victoria</w:t>
-      </w:r>
-    </w:p>
-    <w:p>
-      <w:pPr>
-        <w:pStyle w:val="ListBullet"/>
-      </w:pPr>
-      <w:r>
-        <w:rPr>
-          <w:rFonts w:ascii="Arial" w:hAnsi="Arial"/>
-          <w:b/>
-          <w:color w:val="000000"/>
-          <w:sz w:val="19"/>
-        </w:rPr>
-        <w:t>Victorian Auditor-General's Office</w:t>
-      </w:r>
-      <w:r>
-        <w:rPr>
-          <w:rFonts w:ascii="Arial" w:hAnsi="Arial"/>
-          <w:color w:val="000000"/>
-          <w:sz w:val="19"/>
-        </w:rPr>
-        <w:t xml:space="preserve"> — </w:t>
-      </w:r>
-      <w:r>
-        <w:rPr>
-          <w:rFonts w:ascii="Arial" w:hAnsi="Arial"/>
-          <w:color w:val="000000"/>
-          <w:sz w:val="19"/>
-        </w:rPr>
-        <w:t>VAGO probes 40-year lottery licence deal</w:t>
-      </w:r>
-    </w:p>
-    <w:p>
-      <w:pPr>
-        <w:pStyle w:val="ListBullet"/>
-      </w:pPr>
-      <w:r>
-        <w:rPr>
-          <w:rFonts w:ascii="Arial" w:hAnsi="Arial"/>
-          <w:b/>
-          <w:color w:val="000000"/>
-          <w:sz w:val="19"/>
-        </w:rPr>
-        <w:t>Environment Protection Authority Victoria</w:t>
-      </w:r>
-      <w:r>
-        <w:rPr>
-          <w:rFonts w:ascii="Arial" w:hAnsi="Arial"/>
-          <w:color w:val="000000"/>
-          <w:sz w:val="19"/>
-        </w:rPr>
-        <w:t xml:space="preserve"> — </w:t>
-      </w:r>
-      <w:r>
-        <w:rPr>
-          <w:rFonts w:ascii="Arial" w:hAnsi="Arial"/>
-          <w:color w:val="000000"/>
-          <w:sz w:val="19"/>
-        </w:rPr>
-        <w:t>Supreme Court upholds EPA landfill levy</w:t>
-      </w:r>
-    </w:p>
-    <w:p>
-      <w:pPr>
-        <w:pStyle w:val="ListBullet"/>
-      </w:pPr>
-      <w:r>
-        <w:rPr>
-          <w:rFonts w:ascii="Arial" w:hAnsi="Arial"/>
-          <w:b/>
-          <w:color w:val="000000"/>
-          <w:sz w:val="19"/>
-        </w:rPr>
-        <w:t>Transport Accident Commission</w:t>
-      </w:r>
-      <w:r>
-        <w:rPr>
-          <w:rFonts w:ascii="Arial" w:hAnsi="Arial"/>
-          <w:color w:val="000000"/>
-          <w:sz w:val="19"/>
-        </w:rPr>
-        <w:t xml:space="preserve"> — </w:t>
-      </w:r>
-      <w:r>
-        <w:rPr>
-          <w:rFonts w:ascii="Arial" w:hAnsi="Arial"/>
-          <w:color w:val="000000"/>
-          <w:sz w:val="19"/>
-        </w:rPr>
-        <w:t>TAC boosts camera tech for road safety</w:t>
-      </w:r>
-    </w:p>
-    <w:p>
-      <w:pPr>
-        <w:pStyle w:val="body_letter"/>
-      </w:pPr>
-      <w:r>
-        <w:rPr>
-          <w:rFonts w:ascii="Arial" w:hAnsi="Arial"/>
-          <w:b/>
-          <w:color w:val="000000"/>
-          <w:sz w:val="19"/>
-        </w:rPr>
-        <w:t>Commonwealth</w:t>
-      </w:r>
-    </w:p>
-    <w:p>
-      <w:pPr>
-        <w:pStyle w:val="ListBullet"/>
-      </w:pPr>
-      <w:r>
-        <w:rPr>
-          <w:rFonts w:ascii="Arial" w:hAnsi="Arial"/>
-          <w:b/>
-          <w:color w:val="000000"/>
-          <w:sz w:val="19"/>
-        </w:rPr>
-        <w:t>National Disability Insurance Agency</w:t>
-      </w:r>
-      <w:r>
-        <w:rPr>
-          <w:rFonts w:ascii="Arial" w:hAnsi="Arial"/>
-          <w:color w:val="000000"/>
-          <w:sz w:val="19"/>
-        </w:rPr>
-        <w:t xml:space="preserve"> — </w:t>
-      </w:r>
-      <w:r>
-        <w:rPr>
-          <w:rFonts w:ascii="Arial" w:hAnsi="Arial"/>
-          <w:color w:val="000000"/>
-          <w:sz w:val="19"/>
-        </w:rPr>
-        <w:t>NDIS access tightened under proposed rules</w:t>
-      </w:r>
-    </w:p>
-    <w:p>
-      <w:pPr>
-        <w:pStyle w:val="ListBullet"/>
-      </w:pPr>
-      <w:r>
-        <w:rPr>
-          <w:rFonts w:ascii="Arial" w:hAnsi="Arial"/>
-          <w:b/>
-          <w:color w:val="000000"/>
-          <w:sz w:val="19"/>
-        </w:rPr>
-        <w:t>Australian Charities and Not-for-profits Commission</w:t>
-      </w:r>
-      <w:r>
-        <w:rPr>
-          <w:rFonts w:ascii="Arial" w:hAnsi="Arial"/>
-          <w:color w:val="000000"/>
-          <w:sz w:val="19"/>
-        </w:rPr>
-        <w:t xml:space="preserve"> — </w:t>
-      </w:r>
-      <w:r>
-        <w:rPr>
-          <w:rFonts w:ascii="Arial" w:hAnsi="Arial"/>
-          <w:color w:val="000000"/>
-          <w:sz w:val="19"/>
-        </w:rPr>
-        <w:t>ACNC suspends RACP president-elect</w:t>
-      </w:r>
-    </w:p>
-    <w:p>
-      <w:pPr>
-        <w:pStyle w:val="ListBullet"/>
-      </w:pPr>
-      <w:r>
-        <w:rPr>
-          <w:rFonts w:ascii="Arial" w:hAnsi="Arial"/>
-          <w:b/>
-          <w:color w:val="000000"/>
-          <w:sz w:val="19"/>
-        </w:rPr>
-        <w:t>Department of Health, Disability and Ageing</w:t>
-      </w:r>
-      <w:r>
-        <w:rPr>
-          <w:rFonts w:ascii="Arial" w:hAnsi="Arial"/>
-          <w:color w:val="000000"/>
-          <w:sz w:val="19"/>
-        </w:rPr>
-        <w:t xml:space="preserve"> — </w:t>
-      </w:r>
-      <w:r>
-        <w:rPr>
-          <w:rFonts w:ascii="Arial" w:hAnsi="Arial"/>
-          <w:color w:val="000000"/>
-          <w:sz w:val="19"/>
-        </w:rPr>
-        <w:t>Federal Budget 2026-27 health snapshot</w:t>
-      </w:r>
-    </w:p>
-    <w:p>
-      <w:pPr>
-        <w:pStyle w:val="body_letter"/>
-      </w:pPr>
-      <w:r>
-        <w:rPr>
-          <w:rFonts w:ascii="Arial" w:hAnsi="Arial"/>
-          <w:b/>
-          <w:color w:val="000000"/>
-          <w:sz w:val="19"/>
-        </w:rPr>
-        <w:t>New South Wales</w:t>
-      </w:r>
-    </w:p>
-    <w:p>
-      <w:pPr>
-        <w:pStyle w:val="ListBullet"/>
-      </w:pPr>
-      <w:r>
-        <w:rPr>
-          <w:rFonts w:ascii="Arial" w:hAnsi="Arial"/>
-          <w:b/>
-          <w:color w:val="000000"/>
-          <w:sz w:val="19"/>
-        </w:rPr>
-        <w:t>Environment Protection Authority</w:t>
-      </w:r>
-      <w:r>
-        <w:rPr>
-          <w:rFonts w:ascii="Arial" w:hAnsi="Arial"/>
-          <w:color w:val="000000"/>
-          <w:sz w:val="19"/>
-        </w:rPr>
-        <w:t xml:space="preserve"> — </w:t>
-      </w:r>
-      <w:r>
-        <w:rPr>
-          <w:rFonts w:ascii="Arial" w:hAnsi="Arial"/>
-          <w:color w:val="000000"/>
-          <w:sz w:val="19"/>
-        </w:rPr>
-        <w:t>NSW EPA $1.2M illegal dumping fund</w:t>
-      </w:r>
-    </w:p>
-    <w:p>
-      <w:pPr>
-        <w:pStyle w:val="ListBullet"/>
-      </w:pPr>
-      <w:r>
-        <w:rPr>
-          <w:rFonts w:ascii="Arial" w:hAnsi="Arial"/>
-          <w:b/>
-          <w:color w:val="000000"/>
-          <w:sz w:val="19"/>
-        </w:rPr>
-        <w:t>Independent Commission Against Corruption</w:t>
-      </w:r>
-      <w:r>
-        <w:rPr>
-          <w:rFonts w:ascii="Arial" w:hAnsi="Arial"/>
-          <w:color w:val="000000"/>
-          <w:sz w:val="19"/>
-        </w:rPr>
-        <w:t xml:space="preserve"> — </w:t>
-      </w:r>
-      <w:r>
-        <w:rPr>
-          <w:rFonts w:ascii="Arial" w:hAnsi="Arial"/>
-          <w:color w:val="000000"/>
-          <w:sz w:val="19"/>
-        </w:rPr>
-        <w:t>ICAC NSW opens ‘Pink Ops’ hearings</w:t>
-      </w:r>
-      <w:r>
-        <w:rPr>
-          <w:rFonts w:ascii="Arial" w:hAnsi="Arial"/>
-          <w:color w:val="000000"/>
-          <w:sz w:val="19"/>
-        </w:rPr>
-        <w:t xml:space="preserve"> (</w:t>
-      </w:r>
-      <w:hyperlink r:id="rId22">
-        <w:r>
-          <w:rPr>
-            <w:rFonts w:ascii="Arial" w:hAnsi="Arial" w:cs="Arial"/>
-            <w:color w:val="0000FF"/>
-            <w:sz w:val="19"/>
-            <w:szCs w:val="19"/>
-            <w:u w:val="single"/>
-          </w:rPr>
-          <w:t xml:space="preserve">Read more</w:t>
-        </w:r>
-      </w:hyperlink>
-      <w:r>
-        <w:rPr>
-          <w:rFonts w:ascii="Arial" w:hAnsi="Arial"/>
-          <w:color w:val="000000"/>
-          <w:sz w:val="19"/>
-        </w:rPr>
-        <w:t>)</w:t>
+        <w:t>No client-in-news signal this fortnight across any jurisdiction.</w:t>
       </w:r>
     </w:p>
     <w:p>
@@ -1224,234 +246,16 @@
     </w:p>
     <w:p>
       <w:pPr>
-        <w:pStyle w:val="ListBullet"/>
+        <w:pStyle w:val="body_letter"/>
       </w:pPr>
       <w:r>
         <w:rPr>
           <w:rFonts w:ascii="Arial" w:hAnsi="Arial"/>
-          <w:b/>
-          <w:color w:val="000000"/>
+          <w:i/>
+          <w:color w:val="666666"/>
           <w:sz w:val="19"/>
         </w:rPr>
-        <w:t>AUSTRAC updates national financial crime risk snapshot</w:t>
-      </w:r>
-      <w:r>
-        <w:rPr>
-          <w:rFonts w:ascii="Arial" w:hAnsi="Arial"/>
-          <w:color w:val="000000"/>
-          <w:sz w:val="19"/>
-        </w:rPr>
-        <w:t xml:space="preserve"> — </w:t>
-      </w:r>
-      <w:r>
-        <w:rPr>
-          <w:rFonts w:ascii="Arial" w:hAnsi="Arial"/>
-          <w:color w:val="000000"/>
-          <w:sz w:val="19"/>
-        </w:rPr>
-        <w:t>AUSTRAC has released a refreshed risk snapshot of Australia's financial crime landscape, sharpening intelligence on money laundering, fraud and emerging typologies for reporting entities.</w:t>
-      </w:r>
-      <w:r>
-        <w:rPr>
-          <w:rFonts w:ascii="Arial" w:hAnsi="Arial"/>
-          <w:color w:val="000000"/>
-          <w:sz w:val="19"/>
-        </w:rPr>
-        <w:t xml:space="preserve"> (</w:t>
-      </w:r>
-      <w:hyperlink r:id="rId23">
-        <w:r>
-          <w:rPr>
-            <w:rFonts w:ascii="Arial" w:hAnsi="Arial" w:cs="Arial"/>
-            <w:color w:val="0000FF"/>
-            <w:sz w:val="19"/>
-            <w:szCs w:val="19"/>
-            <w:u w:val="single"/>
-          </w:rPr>
-          <w:t xml:space="preserve">Read more</w:t>
-        </w:r>
-      </w:hyperlink>
-      <w:r>
-        <w:rPr>
-          <w:rFonts w:ascii="Arial" w:hAnsi="Arial"/>
-          <w:color w:val="000000"/>
-          <w:sz w:val="19"/>
-        </w:rPr>
-        <w:t>)</w:t>
-      </w:r>
-    </w:p>
-    <w:p>
-      <w:pPr>
-        <w:pStyle w:val="ListBullet"/>
-      </w:pPr>
-      <w:r>
-        <w:rPr>
-          <w:rFonts w:ascii="Arial" w:hAnsi="Arial"/>
-          <w:b/>
-          <w:color w:val="000000"/>
-          <w:sz w:val="19"/>
-        </w:rPr>
-        <w:t>AUSTRAC opens enforcement investigation into Tabcorp AML/CTF compliance</w:t>
-      </w:r>
-      <w:r>
-        <w:rPr>
-          <w:rFonts w:ascii="Arial" w:hAnsi="Arial"/>
-          <w:color w:val="000000"/>
-          <w:sz w:val="19"/>
-        </w:rPr>
-        <w:t xml:space="preserve"> — </w:t>
-      </w:r>
-      <w:r>
-        <w:rPr>
-          <w:rFonts w:ascii="Arial" w:hAnsi="Arial"/>
-          <w:color w:val="000000"/>
-          <w:sz w:val="19"/>
-        </w:rPr>
-        <w:t>AUSTRAC has commenced a formal enforcement investigation into Tabcorp over suspected AML/CTF compliance failures, signalling continued pressure on gambling-sector reporting entities.</w:t>
-      </w:r>
-      <w:r>
-        <w:rPr>
-          <w:rFonts w:ascii="Arial" w:hAnsi="Arial"/>
-          <w:color w:val="000000"/>
-          <w:sz w:val="19"/>
-        </w:rPr>
-        <w:t xml:space="preserve"> (</w:t>
-      </w:r>
-      <w:hyperlink r:id="rId24">
-        <w:r>
-          <w:rPr>
-            <w:rFonts w:ascii="Arial" w:hAnsi="Arial" w:cs="Arial"/>
-            <w:color w:val="0000FF"/>
-            <w:sz w:val="19"/>
-            <w:szCs w:val="19"/>
-            <w:u w:val="single"/>
-          </w:rPr>
-          <w:t xml:space="preserve">Read more</w:t>
-        </w:r>
-      </w:hyperlink>
-      <w:r>
-        <w:rPr>
-          <w:rFonts w:ascii="Arial" w:hAnsi="Arial"/>
-          <w:color w:val="000000"/>
-          <w:sz w:val="19"/>
-        </w:rPr>
-        <w:t>)</w:t>
-      </w:r>
-    </w:p>
-    <w:p>
-      <w:pPr>
-        <w:pStyle w:val="ListBullet"/>
-      </w:pPr>
-      <w:r>
-        <w:rPr>
-          <w:rFonts w:ascii="Arial" w:hAnsi="Arial"/>
-          <w:b/>
-          <w:color w:val="000000"/>
-          <w:sz w:val="19"/>
-        </w:rPr>
-        <w:t>ASIC crackdown on finfluencers escalates</w:t>
-      </w:r>
-      <w:r>
-        <w:rPr>
-          <w:rFonts w:ascii="Arial" w:hAnsi="Arial"/>
-          <w:color w:val="000000"/>
-          <w:sz w:val="19"/>
-        </w:rPr>
-        <w:t xml:space="preserve"> — </w:t>
-      </w:r>
-      <w:r>
-        <w:rPr>
-          <w:rFonts w:ascii="Arial" w:hAnsi="Arial"/>
-          <w:color w:val="000000"/>
-          <w:sz w:val="19"/>
-        </w:rPr>
-        <w:t>ASIC has warned unlicensed financial influencers of intensified enforcement action, targeting misleading online advice as a growing consumer protection risk.</w:t>
-      </w:r>
-      <w:r>
-        <w:rPr>
-          <w:rFonts w:ascii="Arial" w:hAnsi="Arial"/>
-          <w:color w:val="000000"/>
-          <w:sz w:val="19"/>
-        </w:rPr>
-        <w:t xml:space="preserve"> (</w:t>
-      </w:r>
-      <w:hyperlink r:id="rId25">
-        <w:r>
-          <w:rPr>
-            <w:rFonts w:ascii="Arial" w:hAnsi="Arial" w:cs="Arial"/>
-            <w:color w:val="0000FF"/>
-            <w:sz w:val="19"/>
-            <w:szCs w:val="19"/>
-            <w:u w:val="single"/>
-          </w:rPr>
-          <w:t xml:space="preserve">Read more</w:t>
-        </w:r>
-      </w:hyperlink>
-      <w:r>
-        <w:rPr>
-          <w:rFonts w:ascii="Arial" w:hAnsi="Arial"/>
-          <w:color w:val="000000"/>
-          <w:sz w:val="19"/>
-        </w:rPr>
-        <w:t>)</w:t>
-      </w:r>
-    </w:p>
-    <w:p>
-      <w:pPr>
-        <w:pStyle w:val="ListBullet"/>
-      </w:pPr>
-      <w:r>
-        <w:rPr>
-          <w:rFonts w:ascii="Arial" w:hAnsi="Arial"/>
-          <w:b/>
-          <w:color w:val="000000"/>
-          <w:sz w:val="19"/>
-        </w:rPr>
-        <w:t>New federal counter-terrorism coordinator role created</w:t>
-      </w:r>
-      <w:r>
-        <w:rPr>
-          <w:rFonts w:ascii="Arial" w:hAnsi="Arial"/>
-          <w:color w:val="000000"/>
-          <w:sz w:val="19"/>
-        </w:rPr>
-        <w:t xml:space="preserve"> — </w:t>
-      </w:r>
-      <w:r>
-        <w:rPr>
-          <w:rFonts w:ascii="Arial" w:hAnsi="Arial"/>
-          <w:color w:val="000000"/>
-          <w:sz w:val="19"/>
-        </w:rPr>
-        <w:t>The Commonwealth has established a new national counter-terrorism coordinator position to strengthen cross-agency intelligence sharing amid a rising threat environment.</w:t>
-      </w:r>
-      <w:r>
-        <w:rPr>
-          <w:rFonts w:ascii="Arial" w:hAnsi="Arial"/>
-          <w:color w:val="000000"/>
-          <w:sz w:val="19"/>
-        </w:rPr>
-        <w:t xml:space="preserve"> (</w:t>
-      </w:r>
-      <w:hyperlink r:id="rId26">
-        <w:r>
-          <w:rPr>
-            <w:rFonts w:ascii="Arial" w:hAnsi="Arial" w:cs="Arial"/>
-            <w:color w:val="0000FF"/>
-            <w:sz w:val="19"/>
-            <w:szCs w:val="19"/>
-            <w:u w:val="single"/>
-          </w:rPr>
-          <w:t xml:space="preserve">Read more</w:t>
-        </w:r>
-      </w:hyperlink>
-      <w:r>
-        <w:rPr>
-          <w:rFonts w:ascii="Arial" w:hAnsi="Arial"/>
-          <w:color w:val="000000"/>
-          <w:sz w:val="19"/>
-        </w:rPr>
-        <w:t>)</w:t>
+        <w:t>No emerging risks signal this fortnight.</w:t>
       </w:r>
     </w:p>
     <w:p>
@@ -1470,234 +274,16 @@
     </w:p>
     <w:p>
       <w:pPr>
-        <w:pStyle w:val="ListBullet"/>
+        <w:pStyle w:val="body_letter"/>
       </w:pPr>
       <w:r>
         <w:rPr>
           <w:rFonts w:ascii="Arial" w:hAnsi="Arial"/>
-          <w:b/>
-          <w:color w:val="000000"/>
+          <w:i/>
+          <w:color w:val="666666"/>
           <w:sz w:val="19"/>
         </w:rPr>
-        <w:t>ASIC and APRA write to industry on emerging AI risks</w:t>
-      </w:r>
-      <w:r>
-        <w:rPr>
-          <w:rFonts w:ascii="Arial" w:hAnsi="Arial"/>
-          <w:color w:val="000000"/>
-          <w:sz w:val="19"/>
-        </w:rPr>
-        <w:t xml:space="preserve"> — </w:t>
-      </w:r>
-      <w:r>
-        <w:rPr>
-          <w:rFonts w:ascii="Arial" w:hAnsi="Arial"/>
-          <w:color w:val="000000"/>
-          <w:sz w:val="19"/>
-        </w:rPr>
-        <w:t>ASIC and APRA have jointly written to regulated entities setting clear expectations on AI governance, model risk management and board-level accountability for AI deployment.</w:t>
-      </w:r>
-      <w:r>
-        <w:rPr>
-          <w:rFonts w:ascii="Arial" w:hAnsi="Arial"/>
-          <w:color w:val="000000"/>
-          <w:sz w:val="19"/>
-        </w:rPr>
-        <w:t xml:space="preserve"> (</w:t>
-      </w:r>
-      <w:hyperlink r:id="rId27">
-        <w:r>
-          <w:rPr>
-            <w:rFonts w:ascii="Arial" w:hAnsi="Arial" w:cs="Arial"/>
-            <w:color w:val="0000FF"/>
-            <w:sz w:val="19"/>
-            <w:szCs w:val="19"/>
-            <w:u w:val="single"/>
-          </w:rPr>
-          <w:t xml:space="preserve">Read more</w:t>
-        </w:r>
-      </w:hyperlink>
-      <w:r>
-        <w:rPr>
-          <w:rFonts w:ascii="Arial" w:hAnsi="Arial"/>
-          <w:color w:val="000000"/>
-          <w:sz w:val="19"/>
-        </w:rPr>
-        <w:t>)</w:t>
-      </w:r>
-    </w:p>
-    <w:p>
-      <w:pPr>
-        <w:pStyle w:val="ListBullet"/>
-      </w:pPr>
-      <w:r>
-        <w:rPr>
-          <w:rFonts w:ascii="Arial" w:hAnsi="Arial"/>
-          <w:b/>
-          <w:color w:val="000000"/>
-          <w:sz w:val="19"/>
-        </w:rPr>
-        <w:t>OAIC consults on transparency guidance for automated decision-making</w:t>
-      </w:r>
-      <w:r>
-        <w:rPr>
-          <w:rFonts w:ascii="Arial" w:hAnsi="Arial"/>
-          <w:color w:val="000000"/>
-          <w:sz w:val="19"/>
-        </w:rPr>
-        <w:t xml:space="preserve"> — </w:t>
-      </w:r>
-      <w:r>
-        <w:rPr>
-          <w:rFonts w:ascii="Arial" w:hAnsi="Arial"/>
-          <w:color w:val="000000"/>
-          <w:sz w:val="19"/>
-        </w:rPr>
-        <w:t>The OAIC has opened consultation on new guidance requiring entities to be transparent with individuals about automated decision-making affecting them under Privacy Act reforms.</w:t>
-      </w:r>
-      <w:r>
-        <w:rPr>
-          <w:rFonts w:ascii="Arial" w:hAnsi="Arial"/>
-          <w:color w:val="000000"/>
-          <w:sz w:val="19"/>
-        </w:rPr>
-        <w:t xml:space="preserve"> (</w:t>
-      </w:r>
-      <w:hyperlink r:id="rId28">
-        <w:r>
-          <w:rPr>
-            <w:rFonts w:ascii="Arial" w:hAnsi="Arial" w:cs="Arial"/>
-            <w:color w:val="0000FF"/>
-            <w:sz w:val="19"/>
-            <w:szCs w:val="19"/>
-            <w:u w:val="single"/>
-          </w:rPr>
-          <w:t xml:space="preserve">Read more</w:t>
-        </w:r>
-      </w:hyperlink>
-      <w:r>
-        <w:rPr>
-          <w:rFonts w:ascii="Arial" w:hAnsi="Arial"/>
-          <w:color w:val="000000"/>
-          <w:sz w:val="19"/>
-        </w:rPr>
-        <w:t>)</w:t>
-      </w:r>
-    </w:p>
-    <w:p>
-      <w:pPr>
-        <w:pStyle w:val="ListBullet"/>
-      </w:pPr>
-      <w:r>
-        <w:rPr>
-          <w:rFonts w:ascii="Arial" w:hAnsi="Arial"/>
-          <w:b/>
-          <w:color w:val="000000"/>
-          <w:sz w:val="19"/>
-        </w:rPr>
-        <w:t>Government sustains key tech programs with new budget billions</w:t>
-      </w:r>
-      <w:r>
-        <w:rPr>
-          <w:rFonts w:ascii="Arial" w:hAnsi="Arial"/>
-          <w:color w:val="000000"/>
-          <w:sz w:val="19"/>
-        </w:rPr>
-        <w:t xml:space="preserve"> — </w:t>
-      </w:r>
-      <w:r>
-        <w:rPr>
-          <w:rFonts w:ascii="Arial" w:hAnsi="Arial"/>
-          <w:color w:val="000000"/>
-          <w:sz w:val="19"/>
-        </w:rPr>
-        <w:t>The Commonwealth has committed multi-billion-dollar funding in the 2026-27 Budget to sustain digital, cyber and AI-enabled programs across core agencies.</w:t>
-      </w:r>
-      <w:r>
-        <w:rPr>
-          <w:rFonts w:ascii="Arial" w:hAnsi="Arial"/>
-          <w:color w:val="000000"/>
-          <w:sz w:val="19"/>
-        </w:rPr>
-        <w:t xml:space="preserve"> (</w:t>
-      </w:r>
-      <w:hyperlink r:id="rId29">
-        <w:r>
-          <w:rPr>
-            <w:rFonts w:ascii="Arial" w:hAnsi="Arial" w:cs="Arial"/>
-            <w:color w:val="0000FF"/>
-            <w:sz w:val="19"/>
-            <w:szCs w:val="19"/>
-            <w:u w:val="single"/>
-          </w:rPr>
-          <w:t xml:space="preserve">Read more</w:t>
-        </w:r>
-      </w:hyperlink>
-      <w:r>
-        <w:rPr>
-          <w:rFonts w:ascii="Arial" w:hAnsi="Arial"/>
-          <w:color w:val="000000"/>
-          <w:sz w:val="19"/>
-        </w:rPr>
-        <w:t>)</w:t>
-      </w:r>
-    </w:p>
-    <w:p>
-      <w:pPr>
-        <w:pStyle w:val="ListBullet"/>
-      </w:pPr>
-      <w:r>
-        <w:rPr>
-          <w:rFonts w:ascii="Arial" w:hAnsi="Arial"/>
-          <w:b/>
-          <w:color w:val="000000"/>
-          <w:sz w:val="19"/>
-        </w:rPr>
-        <w:t>WGEA publishes AI transparency statement</w:t>
-      </w:r>
-      <w:r>
-        <w:rPr>
-          <w:rFonts w:ascii="Arial" w:hAnsi="Arial"/>
-          <w:color w:val="000000"/>
-          <w:sz w:val="19"/>
-        </w:rPr>
-        <w:t xml:space="preserve"> — </w:t>
-      </w:r>
-      <w:r>
-        <w:rPr>
-          <w:rFonts w:ascii="Arial" w:hAnsi="Arial"/>
-          <w:color w:val="000000"/>
-          <w:sz w:val="19"/>
-        </w:rPr>
-        <w:t>WGEA has issued an AI transparency statement disclosing its use of AI systems, modelling expected practice for federal agencies adopting AI tools.</w:t>
-      </w:r>
-      <w:r>
-        <w:rPr>
-          <w:rFonts w:ascii="Arial" w:hAnsi="Arial"/>
-          <w:color w:val="000000"/>
-          <w:sz w:val="19"/>
-        </w:rPr>
-        <w:t xml:space="preserve"> (</w:t>
-      </w:r>
-      <w:hyperlink r:id="rId30">
-        <w:r>
-          <w:rPr>
-            <w:rFonts w:ascii="Arial" w:hAnsi="Arial" w:cs="Arial"/>
-            <w:color w:val="0000FF"/>
-            <w:sz w:val="19"/>
-            <w:szCs w:val="19"/>
-            <w:u w:val="single"/>
-          </w:rPr>
-          <w:t xml:space="preserve">Read more</w:t>
-        </w:r>
-      </w:hyperlink>
-      <w:r>
-        <w:rPr>
-          <w:rFonts w:ascii="Arial" w:hAnsi="Arial"/>
-          <w:color w:val="000000"/>
-          <w:sz w:val="19"/>
-        </w:rPr>
-        <w:t>)</w:t>
+        <w:t>No ai adoption signal this fortnight.</w:t>
       </w:r>
     </w:p>
     <w:p>
@@ -1716,178 +302,16 @@
     </w:p>
     <w:p>
       <w:pPr>
-        <w:pStyle w:val="ListBullet"/>
+        <w:pStyle w:val="body_letter"/>
       </w:pPr>
       <w:r>
         <w:rPr>
           <w:rFonts w:ascii="Arial" w:hAnsi="Arial"/>
-          <w:b/>
-          <w:color w:val="000000"/>
+          <w:i/>
+          <w:color w:val="666666"/>
           <w:sz w:val="19"/>
         </w:rPr>
-        <w:t>ASIC targets regulatory clutter with digital and guidance overhaul</w:t>
-      </w:r>
-      <w:r>
-        <w:rPr>
-          <w:rFonts w:ascii="Arial" w:hAnsi="Arial"/>
-          <w:color w:val="000000"/>
-          <w:sz w:val="19"/>
-        </w:rPr>
-        <w:t xml:space="preserve"> — </w:t>
-      </w:r>
-      <w:r>
-        <w:rPr>
-          <w:rFonts w:ascii="Arial" w:hAnsi="Arial"/>
-          <w:color w:val="000000"/>
-          <w:sz w:val="19"/>
-        </w:rPr>
-        <w:t>ASIC has launched a regulatory simplification program to consolidate guidance, retire outdated instruments and digitise interactions to reduce compliance burden on regulated entities.</w:t>
-      </w:r>
-    </w:p>
-    <w:p>
-      <w:pPr>
-        <w:pStyle w:val="ListBullet"/>
-      </w:pPr>
-      <w:r>
-        <w:rPr>
-          <w:rFonts w:ascii="Arial" w:hAnsi="Arial"/>
-          <w:b/>
-          <w:color w:val="000000"/>
-          <w:sz w:val="19"/>
-        </w:rPr>
-        <w:t>ASIC eases regulatory burden through simplification measures</w:t>
-      </w:r>
-      <w:r>
-        <w:rPr>
-          <w:rFonts w:ascii="Arial" w:hAnsi="Arial"/>
-          <w:color w:val="000000"/>
-          <w:sz w:val="19"/>
-        </w:rPr>
-        <w:t xml:space="preserve"> — </w:t>
-      </w:r>
-      <w:r>
-        <w:rPr>
-          <w:rFonts w:ascii="Arial" w:hAnsi="Arial"/>
-          <w:color w:val="000000"/>
-          <w:sz w:val="19"/>
-        </w:rPr>
-        <w:t>ASIC has confirmed further regulatory relief measures aimed at streamlining obligations for small business and licensees as part of its broader simplification agenda.</w:t>
-      </w:r>
-      <w:r>
-        <w:rPr>
-          <w:rFonts w:ascii="Arial" w:hAnsi="Arial"/>
-          <w:color w:val="000000"/>
-          <w:sz w:val="19"/>
-        </w:rPr>
-        <w:t xml:space="preserve"> (</w:t>
-      </w:r>
-      <w:hyperlink r:id="rId31">
-        <w:r>
-          <w:rPr>
-            <w:rFonts w:ascii="Arial" w:hAnsi="Arial" w:cs="Arial"/>
-            <w:color w:val="0000FF"/>
-            <w:sz w:val="19"/>
-            <w:szCs w:val="19"/>
-            <w:u w:val="single"/>
-          </w:rPr>
-          <w:t xml:space="preserve">Read more</w:t>
-        </w:r>
-      </w:hyperlink>
-      <w:r>
-        <w:rPr>
-          <w:rFonts w:ascii="Arial" w:hAnsi="Arial"/>
-          <w:color w:val="000000"/>
-          <w:sz w:val="19"/>
-        </w:rPr>
-        <w:t>)</w:t>
-      </w:r>
-    </w:p>
-    <w:p>
-      <w:pPr>
-        <w:pStyle w:val="ListBullet"/>
-      </w:pPr>
-      <w:r>
-        <w:rPr>
-          <w:rFonts w:ascii="Arial" w:hAnsi="Arial"/>
-          <w:b/>
-          <w:color w:val="000000"/>
-          <w:sz w:val="19"/>
-        </w:rPr>
-        <w:t>Federal Budget 2026-27 health, aged care and disability snapshot</w:t>
-      </w:r>
-      <w:r>
-        <w:rPr>
-          <w:rFonts w:ascii="Arial" w:hAnsi="Arial"/>
-          <w:color w:val="000000"/>
-          <w:sz w:val="19"/>
-        </w:rPr>
-        <w:t xml:space="preserve"> — </w:t>
-      </w:r>
-      <w:r>
-        <w:rPr>
-          <w:rFonts w:ascii="Arial" w:hAnsi="Arial"/>
-          <w:color w:val="000000"/>
-          <w:sz w:val="19"/>
-        </w:rPr>
-        <w:t>The 2026-27 Federal Budget reshapes regulatory settings across health, aged care, disability and life sciences, with significant NDIS savings and sector reform measures.</w:t>
-      </w:r>
-    </w:p>
-    <w:p>
-      <w:pPr>
-        <w:pStyle w:val="ListBullet"/>
-      </w:pPr>
-      <w:r>
-        <w:rPr>
-          <w:rFonts w:ascii="Arial" w:hAnsi="Arial"/>
-          <w:b/>
-          <w:color w:val="000000"/>
-          <w:sz w:val="19"/>
-        </w:rPr>
-        <w:t>WA overhauls regulation of renewable energy projects</w:t>
-      </w:r>
-      <w:r>
-        <w:rPr>
-          <w:rFonts w:ascii="Arial" w:hAnsi="Arial"/>
-          <w:color w:val="000000"/>
-          <w:sz w:val="19"/>
-        </w:rPr>
-        <w:t xml:space="preserve"> — </w:t>
-      </w:r>
-      <w:r>
-        <w:rPr>
-          <w:rFonts w:ascii="Arial" w:hAnsi="Arial"/>
-          <w:color w:val="000000"/>
-          <w:sz w:val="19"/>
-        </w:rPr>
-        <w:t>The WA Government has announced major reforms to streamline approvals and consolidate regulatory pathways for renewable energy projects to accelerate the energy transition.</w:t>
-      </w:r>
-      <w:r>
-        <w:rPr>
-          <w:rFonts w:ascii="Arial" w:hAnsi="Arial"/>
-          <w:color w:val="000000"/>
-          <w:sz w:val="19"/>
-        </w:rPr>
-        <w:t xml:space="preserve"> (</w:t>
-      </w:r>
-      <w:hyperlink r:id="rId32">
-        <w:r>
-          <w:rPr>
-            <w:rFonts w:ascii="Arial" w:hAnsi="Arial" w:cs="Arial"/>
-            <w:color w:val="0000FF"/>
-            <w:sz w:val="19"/>
-            <w:szCs w:val="19"/>
-            <w:u w:val="single"/>
-          </w:rPr>
-          <w:t xml:space="preserve">Read more</w:t>
-        </w:r>
-      </w:hyperlink>
-      <w:r>
-        <w:rPr>
-          <w:rFonts w:ascii="Arial" w:hAnsi="Arial"/>
-          <w:color w:val="000000"/>
-          <w:sz w:val="19"/>
-        </w:rPr>
-        <w:t>)</w:t>
+        <w:t>No regulatory burden signal this fortnight.</w:t>
       </w:r>
     </w:p>
     <w:p>
@@ -1902,94 +326,6 @@
           <w:sz w:val="21"/>
         </w:rPr>
         <w:t>Training, conferences, webinars &amp; in-person sessions</w:t>
-      </w:r>
-    </w:p>
-    <w:p>
-      <w:pPr>
-        <w:pStyle w:val="ListBullet"/>
-      </w:pPr>
-      <w:r>
-        <w:rPr>
-          <w:rFonts w:ascii="Arial" w:hAnsi="Arial"/>
-          <w:b/>
-          <w:color w:val="000000"/>
-          <w:sz w:val="19"/>
-        </w:rPr>
-        <w:t>AICD Boards &amp; Regulators Lunch — Sydney</w:t>
-      </w:r>
-      <w:r>
-        <w:rPr>
-          <w:rFonts w:ascii="Arial" w:hAnsi="Arial"/>
-          <w:color w:val="000000"/>
-          <w:sz w:val="19"/>
-        </w:rPr>
-        <w:t xml:space="preserve"> — </w:t>
-      </w:r>
-      <w:r>
-        <w:rPr>
-          <w:rFonts w:ascii="Arial" w:hAnsi="Arial"/>
-          <w:color w:val="000000"/>
-          <w:sz w:val="19"/>
-        </w:rPr>
-        <w:t>22 May 2026 — AICD · Sydney</w:t>
-      </w:r>
-    </w:p>
-    <w:p>
-      <w:pPr>
-        <w:pStyle w:val="ListBullet"/>
-      </w:pPr>
-      <w:r>
-        <w:rPr>
-          <w:rFonts w:ascii="Arial" w:hAnsi="Arial"/>
-          <w:b/>
-          <w:color w:val="000000"/>
-          <w:sz w:val="19"/>
-        </w:rPr>
-        <w:t>All Actuaries Summit 2026</w:t>
-      </w:r>
-      <w:r>
-        <w:rPr>
-          <w:rFonts w:ascii="Arial" w:hAnsi="Arial"/>
-          <w:color w:val="000000"/>
-          <w:sz w:val="19"/>
-        </w:rPr>
-        <w:t xml:space="preserve"> — </w:t>
-      </w:r>
-      <w:r>
-        <w:rPr>
-          <w:rFonts w:ascii="Arial" w:hAnsi="Arial"/>
-          <w:color w:val="000000"/>
-          <w:sz w:val="19"/>
-        </w:rPr>
-        <w:t>27 May 2026 — APRA · Online</w:t>
-      </w:r>
-      <w:r>
-        <w:rPr>
-          <w:rFonts w:ascii="Arial" w:hAnsi="Arial"/>
-          <w:color w:val="000000"/>
-          <w:sz w:val="19"/>
-        </w:rPr>
-        <w:t xml:space="preserve"> (</w:t>
-      </w:r>
-      <w:hyperlink r:id="rId33">
-        <w:r>
-          <w:rPr>
-            <w:rFonts w:ascii="Arial" w:hAnsi="Arial" w:cs="Arial"/>
-            <w:color w:val="0000FF"/>
-            <w:sz w:val="19"/>
-            <w:szCs w:val="19"/>
-            <w:u w:val="single"/>
-          </w:rPr>
-          <w:t xml:space="preserve">Register</w:t>
-        </w:r>
-      </w:hyperlink>
-      <w:r>
-        <w:rPr>
-          <w:rFonts w:ascii="Arial" w:hAnsi="Arial"/>
-          <w:color w:val="000000"/>
-          <w:sz w:val="19"/>
-        </w:rPr>
-        <w:t>)</w:t>
       </w:r>
     </w:p>
     <w:p>
@@ -2089,7 +425,7 @@
         </w:rPr>
         <w:t xml:space="preserve"> (</w:t>
       </w:r>
-      <w:hyperlink r:id="rId34">
+      <w:hyperlink r:id="rId10">
         <w:r>
           <w:rPr>
             <w:rFonts w:ascii="Arial" w:hAnsi="Arial" w:cs="Arial"/>
@@ -2147,7 +483,7 @@
         </w:rPr>
         <w:t xml:space="preserve"> (</w:t>
       </w:r>
-      <w:hyperlink r:id="rId35">
+      <w:hyperlink r:id="rId11">
         <w:r>
           <w:rPr>
             <w:rFonts w:ascii="Arial" w:hAnsi="Arial" w:cs="Arial"/>
@@ -2166,6 +502,94 @@
           <w:sz w:val="19"/>
         </w:rPr>
         <w:t>)</w:t>
+      </w:r>
+    </w:p>
+    <w:p>
+      <w:pPr>
+        <w:pStyle w:val="ListBullet"/>
+      </w:pPr>
+      <w:r>
+        <w:rPr>
+          <w:rFonts w:ascii="Arial" w:hAnsi="Arial"/>
+          <w:b/>
+          <w:color w:val="000000"/>
+          <w:sz w:val="19"/>
+        </w:rPr>
+        <w:t>AFIA Risk Summit</w:t>
+      </w:r>
+      <w:r>
+        <w:rPr>
+          <w:rFonts w:ascii="Arial" w:hAnsi="Arial"/>
+          <w:color w:val="000000"/>
+          <w:sz w:val="19"/>
+        </w:rPr>
+        <w:t xml:space="preserve"> — </w:t>
+      </w:r>
+      <w:r>
+        <w:rPr>
+          <w:rFonts w:ascii="Arial" w:hAnsi="Arial"/>
+          <w:color w:val="000000"/>
+          <w:sz w:val="19"/>
+        </w:rPr>
+        <w:t>24 Jun 2026 — APRA · Online</w:t>
+      </w:r>
+      <w:r>
+        <w:rPr>
+          <w:rFonts w:ascii="Arial" w:hAnsi="Arial"/>
+          <w:color w:val="000000"/>
+          <w:sz w:val="19"/>
+        </w:rPr>
+        <w:t xml:space="preserve"> (</w:t>
+      </w:r>
+      <w:hyperlink r:id="rId12">
+        <w:r>
+          <w:rPr>
+            <w:rFonts w:ascii="Arial" w:hAnsi="Arial" w:cs="Arial"/>
+            <w:color w:val="0000FF"/>
+            <w:sz w:val="19"/>
+            <w:szCs w:val="19"/>
+            <w:u w:val="single"/>
+          </w:rPr>
+          <w:t xml:space="preserve">Register</w:t>
+        </w:r>
+      </w:hyperlink>
+      <w:r>
+        <w:rPr>
+          <w:rFonts w:ascii="Arial" w:hAnsi="Arial"/>
+          <w:color w:val="000000"/>
+          <w:sz w:val="19"/>
+        </w:rPr>
+        <w:t>)</w:t>
+      </w:r>
+    </w:p>
+    <w:p>
+      <w:pPr>
+        <w:pStyle w:val="ListBullet"/>
+      </w:pPr>
+      <w:r>
+        <w:rPr>
+          <w:rFonts w:ascii="Arial" w:hAnsi="Arial"/>
+          <w:b/>
+          <w:color w:val="000000"/>
+          <w:sz w:val="19"/>
+        </w:rPr>
+        <w:t>ACCC Compliance &amp; Enforcement Forum</w:t>
+      </w:r>
+      <w:r>
+        <w:rPr>
+          <w:rFonts w:ascii="Arial" w:hAnsi="Arial"/>
+          <w:color w:val="000000"/>
+          <w:sz w:val="19"/>
+        </w:rPr>
+        <w:t xml:space="preserve"> — </w:t>
+      </w:r>
+      <w:r>
+        <w:rPr>
+          <w:rFonts w:ascii="Arial" w:hAnsi="Arial"/>
+          <w:color w:val="000000"/>
+          <w:sz w:val="19"/>
+        </w:rPr>
+        <w:t>26 Jun 2026 — ACCC · Melbourne</w:t>
       </w:r>
     </w:p>
     <w:tbl>
@@ -2211,7 +635,7 @@
                           <pic:cNvPicPr/>
                         </pic:nvPicPr>
                         <pic:blipFill>
-                          <a:blip r:embed="rId36"/>
+                          <a:blip r:embed="rId13"/>
                           <a:stretch>
                             <a:fillRect/>
                           </a:stretch>

</xml_diff>

<commit_message>
chore: update regulation hub 2026-06-10
</commit_message>
<xml_diff>
--- a/reg-hub/regulation_fortnightly_brief.docx
+++ b/reg-hub/regulation_fortnightly_brief.docx
@@ -46,7 +46,7 @@
         <w:pStyle w:val="Heading1"/>
       </w:pPr>
       <w:r>
-        <w:t>KPMG Regulatory Transformation Fortnightly Brief — 20 May – 2 June 2026</w:t>
+        <w:t>KPMG Regulatory Transformation Fortnightly Brief — 29 May – 11 June 2026</w:t>
       </w:r>
     </w:p>
     <w:p>
@@ -73,7 +73,7 @@
           <w:color w:val="666666"/>
           <w:sz w:val="19"/>
         </w:rPr>
-        <w:t>02 June 2026</w:t>
+        <w:t>11 June 2026</w:t>
       </w:r>
     </w:p>
     <w:p>
@@ -339,36 +339,6 @@
           <w:color w:val="000000"/>
           <w:sz w:val="19"/>
         </w:rPr>
-        <w:t>VIC Cyber Regulator Industry Briefing</w:t>
-      </w:r>
-      <w:r>
-        <w:rPr>
-          <w:rFonts w:ascii="Arial" w:hAnsi="Arial"/>
-          <w:color w:val="000000"/>
-          <w:sz w:val="19"/>
-        </w:rPr>
-        <w:t xml:space="preserve"> — </w:t>
-      </w:r>
-      <w:r>
-        <w:rPr>
-          <w:rFonts w:ascii="Arial" w:hAnsi="Arial"/>
-          <w:color w:val="000000"/>
-          <w:sz w:val="19"/>
-        </w:rPr>
-        <w:t>04 Jun 2026 — Office of the Victorian Information Commissioner · Melbourne</w:t>
-      </w:r>
-    </w:p>
-    <w:p>
-      <w:pPr>
-        <w:pStyle w:val="ListBullet"/>
-      </w:pPr>
-      <w:r>
-        <w:rPr>
-          <w:rFonts w:ascii="Arial" w:hAnsi="Arial"/>
-          <w:b/>
-          <w:color w:val="000000"/>
-          <w:sz w:val="19"/>
-        </w:rPr>
         <w:t>APRA Financial Risk &amp; Resilience Practitioners Roundtable — Q3</w:t>
       </w:r>
       <w:r>
@@ -590,6 +560,36 @@
           <w:sz w:val="19"/>
         </w:rPr>
         <w:t>26 Jun 2026 — ACCC · Melbourne</w:t>
+      </w:r>
+    </w:p>
+    <w:p>
+      <w:pPr>
+        <w:pStyle w:val="ListBullet"/>
+      </w:pPr>
+      <w:r>
+        <w:rPr>
+          <w:rFonts w:ascii="Arial" w:hAnsi="Arial"/>
+          <w:b/>
+          <w:color w:val="000000"/>
+          <w:sz w:val="19"/>
+        </w:rPr>
+        <w:t>ASIC Enforcement Update Webinar — Q3 2026</w:t>
+      </w:r>
+      <w:r>
+        <w:rPr>
+          <w:rFonts w:ascii="Arial" w:hAnsi="Arial"/>
+          <w:color w:val="000000"/>
+          <w:sz w:val="19"/>
+        </w:rPr>
+        <w:t xml:space="preserve"> — </w:t>
+      </w:r>
+      <w:r>
+        <w:rPr>
+          <w:rFonts w:ascii="Arial" w:hAnsi="Arial"/>
+          <w:color w:val="000000"/>
+          <w:sz w:val="19"/>
+        </w:rPr>
+        <w:t>09 Jul 2026 — ASIC · Online</w:t>
       </w:r>
     </w:p>
     <w:tbl>

</xml_diff>

<commit_message>
chore: update regulation hub 2026-06-11
</commit_message>
<xml_diff>
--- a/reg-hub/regulation_fortnightly_brief.docx
+++ b/reg-hub/regulation_fortnightly_brief.docx
@@ -97,11 +97,11 @@
       <w:r>
         <w:rPr>
           <w:rFonts w:ascii="Arial" w:hAnsi="Arial"/>
-          <w:i/>
-          <w:color w:val="666666"/>
+          <w:b w:val="0"/>
+          <w:color w:val="000000"/>
           <w:sz w:val="19"/>
         </w:rPr>
-        <w:t>[edit before send] — Adam's 3-sentence key messages will prefill from the dashboard synthesis on the next fortnightly run. Type your replacement here.</w:t>
+        <w:t>This fortnight, the Australian regulatory landscape is defined by fiscal consolidation reshaping regulator resourcing, ASIC sharpening public accountability and enforcement against private companies on financial reporting, and APRA issuing a direct warning on rapid AI uptake — signalling that boards and regulated entities face heightened scrutiny across burden reduction and AI governance simultaneously. The most consequential opportunity for our advisory practice sits at the intersection of APRA's AI warning and ASIC's accountability posture: regulators are moving from guidance to enforcement, and our clients need defensible AI governance frameworks and reporting uplift before supervisory engagement rather than in response to it. Convene a cross-practice session in the next fortnight to align our financial services and technology risk teams on a unified client proposition targeting AI governance readiness and ASIC reporting compliance, and bring that to market through targeted partner briefings before the end of June.</w:t>
       </w:r>
     </w:p>
     <w:p>

</xml_diff>

<commit_message>
chore: update regulation hub 2026-06-16
</commit_message>
<xml_diff>
--- a/reg-hub/regulation_fortnightly_brief.docx
+++ b/reg-hub/regulation_fortnightly_brief.docx
@@ -46,7 +46,7 @@
         <w:pStyle w:val="Heading1"/>
       </w:pPr>
       <w:r>
-        <w:t>KPMG Regulatory Transformation Fortnightly Brief — 29 May – 11 June 2026</w:t>
+        <w:t>KPMG Regulatory Transformation Fortnightly Brief — 3–16 June 2026</w:t>
       </w:r>
     </w:p>
     <w:p>
@@ -73,7 +73,7 @@
           <w:color w:val="666666"/>
           <w:sz w:val="19"/>
         </w:rPr>
-        <w:t>11 June 2026</w:t>
+        <w:t>16 June 2026</w:t>
       </w:r>
     </w:p>
     <w:p>
@@ -97,11 +97,11 @@
       <w:r>
         <w:rPr>
           <w:rFonts w:ascii="Arial" w:hAnsi="Arial"/>
-          <w:b w:val="0"/>
-          <w:color w:val="000000"/>
+          <w:i/>
+          <w:color w:val="666666"/>
           <w:sz w:val="19"/>
         </w:rPr>
-        <w:t>This fortnight, the Australian regulatory landscape is defined by fiscal consolidation reshaping regulator resourcing, ASIC sharpening public accountability and enforcement against private companies on financial reporting, and APRA issuing a direct warning on rapid AI uptake — signalling that boards and regulated entities face heightened scrutiny across burden reduction and AI governance simultaneously. The most consequential opportunity for our advisory practice sits at the intersection of APRA's AI warning and ASIC's accountability posture: regulators are moving from guidance to enforcement, and our clients need defensible AI governance frameworks and reporting uplift before supervisory engagement rather than in response to it. Convene a cross-practice session in the next fortnight to align our financial services and technology risk teams on a unified client proposition targeting AI governance readiness and ASIC reporting compliance, and bring that to market through targeted partner briefings before the end of June.</w:t>
+        <w:t>[edit before send] — Adam's 3-sentence key messages will prefill from the dashboard synthesis on the next fortnightly run. Type your replacement here.</w:t>
       </w:r>
     </w:p>
     <w:p>
@@ -339,94 +339,6 @@
           <w:color w:val="000000"/>
           <w:sz w:val="19"/>
         </w:rPr>
-        <w:t>APRA Financial Risk &amp; Resilience Practitioners Roundtable — Q3</w:t>
-      </w:r>
-      <w:r>
-        <w:rPr>
-          <w:rFonts w:ascii="Arial" w:hAnsi="Arial"/>
-          <w:color w:val="000000"/>
-          <w:sz w:val="19"/>
-        </w:rPr>
-        <w:t xml:space="preserve"> — </w:t>
-      </w:r>
-      <w:r>
-        <w:rPr>
-          <w:rFonts w:ascii="Arial" w:hAnsi="Arial"/>
-          <w:color w:val="000000"/>
-          <w:sz w:val="19"/>
-        </w:rPr>
-        <w:t>12 Jun 2026 — APRA · Online</w:t>
-      </w:r>
-    </w:p>
-    <w:p>
-      <w:pPr>
-        <w:pStyle w:val="ListBullet"/>
-      </w:pPr>
-      <w:r>
-        <w:rPr>
-          <w:rFonts w:ascii="Arial" w:hAnsi="Arial"/>
-          <w:b/>
-          <w:color w:val="000000"/>
-          <w:sz w:val="19"/>
-        </w:rPr>
-        <w:t>2026 AFR Insurance Summit</w:t>
-      </w:r>
-      <w:r>
-        <w:rPr>
-          <w:rFonts w:ascii="Arial" w:hAnsi="Arial"/>
-          <w:color w:val="000000"/>
-          <w:sz w:val="19"/>
-        </w:rPr>
-        <w:t xml:space="preserve"> — </w:t>
-      </w:r>
-      <w:r>
-        <w:rPr>
-          <w:rFonts w:ascii="Arial" w:hAnsi="Arial"/>
-          <w:color w:val="000000"/>
-          <w:sz w:val="19"/>
-        </w:rPr>
-        <w:t>16 Jun 2026 — APRA · Online</w:t>
-      </w:r>
-      <w:r>
-        <w:rPr>
-          <w:rFonts w:ascii="Arial" w:hAnsi="Arial"/>
-          <w:color w:val="000000"/>
-          <w:sz w:val="19"/>
-        </w:rPr>
-        <w:t xml:space="preserve"> (</w:t>
-      </w:r>
-      <w:hyperlink r:id="rId10">
-        <w:r>
-          <w:rPr>
-            <w:rFonts w:ascii="Arial" w:hAnsi="Arial" w:cs="Arial"/>
-            <w:color w:val="0000FF"/>
-            <w:sz w:val="19"/>
-            <w:szCs w:val="19"/>
-            <w:u w:val="single"/>
-          </w:rPr>
-          <w:t xml:space="preserve">Register</w:t>
-        </w:r>
-      </w:hyperlink>
-      <w:r>
-        <w:rPr>
-          <w:rFonts w:ascii="Arial" w:hAnsi="Arial"/>
-          <w:color w:val="000000"/>
-          <w:sz w:val="19"/>
-        </w:rPr>
-        <w:t>)</w:t>
-      </w:r>
-    </w:p>
-    <w:p>
-      <w:pPr>
-        <w:pStyle w:val="ListBullet"/>
-      </w:pPr>
-      <w:r>
-        <w:rPr>
-          <w:rFonts w:ascii="Arial" w:hAnsi="Arial"/>
-          <w:b/>
-          <w:color w:val="000000"/>
-          <w:sz w:val="19"/>
-        </w:rPr>
         <w:t>ABA Banking Conference</w:t>
       </w:r>
       <w:r>
@@ -453,7 +365,7 @@
         </w:rPr>
         <w:t xml:space="preserve"> (</w:t>
       </w:r>
-      <w:hyperlink r:id="rId11">
+      <w:hyperlink r:id="rId10">
         <w:r>
           <w:rPr>
             <w:rFonts w:ascii="Arial" w:hAnsi="Arial" w:cs="Arial"/>
@@ -511,7 +423,7 @@
         </w:rPr>
         <w:t xml:space="preserve"> (</w:t>
       </w:r>
-      <w:hyperlink r:id="rId12">
+      <w:hyperlink r:id="rId11">
         <w:r>
           <w:rPr>
             <w:rFonts w:ascii="Arial" w:hAnsi="Arial" w:cs="Arial"/>
@@ -635,7 +547,7 @@
                           <pic:cNvPicPr/>
                         </pic:nvPicPr>
                         <pic:blipFill>
-                          <a:blip r:embed="rId13"/>
+                          <a:blip r:embed="rId12"/>
                           <a:stretch>
                             <a:fillRect/>
                           </a:stretch>

</xml_diff>

<commit_message>
chore: update regulation hub 2026-06-17
</commit_message>
<xml_diff>
--- a/reg-hub/regulation_fortnightly_brief.docx
+++ b/reg-hub/regulation_fortnightly_brief.docx
@@ -46,7 +46,7 @@
         <w:pStyle w:val="Heading1"/>
       </w:pPr>
       <w:r>
-        <w:t>KPMG Regulatory Transformation Fortnightly Brief — 3–16 June 2026</w:t>
+        <w:t>KPMG Regulatory Transformation Fortnightly Brief — 4–17 June 2026</w:t>
       </w:r>
     </w:p>
     <w:p>
@@ -73,7 +73,7 @@
           <w:color w:val="666666"/>
           <w:sz w:val="19"/>
         </w:rPr>
-        <w:t>16 June 2026</w:t>
+        <w:t>17 June 2026</w:t>
       </w:r>
     </w:p>
     <w:p>
@@ -97,11 +97,11 @@
       <w:r>
         <w:rPr>
           <w:rFonts w:ascii="Arial" w:hAnsi="Arial"/>
-          <w:i/>
-          <w:color w:val="666666"/>
+          <w:b w:val="0"/>
+          <w:color w:val="000000"/>
           <w:sz w:val="19"/>
         </w:rPr>
-        <w:t>[edit before send] — Adam's 3-sentence key messages will prefill from the dashboard synthesis on the next fortnightly run. Type your replacement here.</w:t>
+        <w:t>This fortnight, the Tasmanian regulatory landscape is moving on multiple fronts simultaneously — liquor licensing is being streamlined, family violence protections are advancing, government contracting rules are being reformed, and native forest logging faces material financial exposure under looming EPBC changes, signalling that burden-reduction and compliance-risk pressures are running in parallel rather than sequence. The EPBC native logging liability of up to $300 million is the single most significant advisory opportunity we see this fortnight, as affected industry participants and government will need urgent clarity on transition obligations, financial provisioning, and stakeholder engagement strategies that sit squarely in our PEPI wheelhouse. Convene an internal cross-practice session with our environment, infrastructure, and government advisory teams this week to map the client landscape, identify where we hold existing relationships, and develop a targeted outreach position before the reform momentum crystallises.</w:t>
       </w:r>
     </w:p>
     <w:p>

</xml_diff>

<commit_message>
chore: update regulation hub 2026-06-30
</commit_message>
<xml_diff>
--- a/reg-hub/regulation_fortnightly_brief.docx
+++ b/reg-hub/regulation_fortnightly_brief.docx
@@ -46,7 +46,7 @@
         <w:pStyle w:val="Heading1"/>
       </w:pPr>
       <w:r>
-        <w:t>KPMG Regulatory Transformation Fortnightly Brief — 4–17 June 2026</w:t>
+        <w:t>KPMG Regulatory Transformation Fortnightly Brief — 18 June – 1 July 2026</w:t>
       </w:r>
     </w:p>
     <w:p>
@@ -73,7 +73,7 @@
           <w:color w:val="666666"/>
           <w:sz w:val="19"/>
         </w:rPr>
-        <w:t>17 June 2026</w:t>
+        <w:t>01 July 2026</w:t>
       </w:r>
     </w:p>
     <w:p>
@@ -101,7 +101,7 @@
           <w:color w:val="000000"/>
           <w:sz w:val="19"/>
         </w:rPr>
-        <w:t>This fortnight, the Tasmanian regulatory landscape is moving on multiple fronts simultaneously — liquor licensing is being streamlined, family violence protections are advancing, government contracting rules are being reformed, and native forest logging faces material financial exposure under looming EPBC changes, signalling that burden-reduction and compliance-risk pressures are running in parallel rather than sequence. The EPBC native logging liability of up to $300 million is the single most significant advisory opportunity we see this fortnight, as affected industry participants and government will need urgent clarity on transition obligations, financial provisioning, and stakeholder engagement strategies that sit squarely in our PEPI wheelhouse. Convene an internal cross-practice session with our environment, infrastructure, and government advisory teams this week to map the client landscape, identify where we hold existing relationships, and develop a targeted outreach position before the reform momentum crystallises.</w:t>
+        <w:t>This fortnight, Australian transport regulators are pressing on operational safety and compliance across maritime, aviation, road and rail modes, with notable ATSB findings on rail collision survivability, AMSA reporting over 4,000 maritime incidents in 2025, and advancing ETCS signalling reform signalling a structural shift in how regulators are targeting risk and modernising infrastructure frameworks. The most significant advisory opportunity lies in the accelerating push to embed data-driven risk prioritisation and digital safety frameworks into regulatory delivery — particularly as ETCS rollout, fare and rail funding reform in Queensland, and aviation consumer protection redesign converge to create demand for coherent regulatory transformation strategies that regulators are not yet resourced to develop alone. Convene a targeted session with our transport and infrastructure partners this fortnight to identify where fragmented regulator capability meets active government reform agenda, and bring a structured offer to market before mid-FY27 budget decisions lock in delivery models.</w:t>
       </w:r>
     </w:p>
     <w:p>
@@ -339,152 +339,6 @@
           <w:color w:val="000000"/>
           <w:sz w:val="19"/>
         </w:rPr>
-        <w:t>ABA Banking Conference</w:t>
-      </w:r>
-      <w:r>
-        <w:rPr>
-          <w:rFonts w:ascii="Arial" w:hAnsi="Arial"/>
-          <w:color w:val="000000"/>
-          <w:sz w:val="19"/>
-        </w:rPr>
-        <w:t xml:space="preserve"> — </w:t>
-      </w:r>
-      <w:r>
-        <w:rPr>
-          <w:rFonts w:ascii="Arial" w:hAnsi="Arial"/>
-          <w:color w:val="000000"/>
-          <w:sz w:val="19"/>
-        </w:rPr>
-        <w:t>17 Jun 2026 — APRA · Online</w:t>
-      </w:r>
-      <w:r>
-        <w:rPr>
-          <w:rFonts w:ascii="Arial" w:hAnsi="Arial"/>
-          <w:color w:val="000000"/>
-          <w:sz w:val="19"/>
-        </w:rPr>
-        <w:t xml:space="preserve"> (</w:t>
-      </w:r>
-      <w:hyperlink r:id="rId10">
-        <w:r>
-          <w:rPr>
-            <w:rFonts w:ascii="Arial" w:hAnsi="Arial" w:cs="Arial"/>
-            <w:color w:val="0000FF"/>
-            <w:sz w:val="19"/>
-            <w:szCs w:val="19"/>
-            <w:u w:val="single"/>
-          </w:rPr>
-          <w:t xml:space="preserve">Register</w:t>
-        </w:r>
-      </w:hyperlink>
-      <w:r>
-        <w:rPr>
-          <w:rFonts w:ascii="Arial" w:hAnsi="Arial"/>
-          <w:color w:val="000000"/>
-          <w:sz w:val="19"/>
-        </w:rPr>
-        <w:t>)</w:t>
-      </w:r>
-    </w:p>
-    <w:p>
-      <w:pPr>
-        <w:pStyle w:val="ListBullet"/>
-      </w:pPr>
-      <w:r>
-        <w:rPr>
-          <w:rFonts w:ascii="Arial" w:hAnsi="Arial"/>
-          <w:b/>
-          <w:color w:val="000000"/>
-          <w:sz w:val="19"/>
-        </w:rPr>
-        <w:t>AFIA Risk Summit</w:t>
-      </w:r>
-      <w:r>
-        <w:rPr>
-          <w:rFonts w:ascii="Arial" w:hAnsi="Arial"/>
-          <w:color w:val="000000"/>
-          <w:sz w:val="19"/>
-        </w:rPr>
-        <w:t xml:space="preserve"> — </w:t>
-      </w:r>
-      <w:r>
-        <w:rPr>
-          <w:rFonts w:ascii="Arial" w:hAnsi="Arial"/>
-          <w:color w:val="000000"/>
-          <w:sz w:val="19"/>
-        </w:rPr>
-        <w:t>24 Jun 2026 — APRA · Online</w:t>
-      </w:r>
-      <w:r>
-        <w:rPr>
-          <w:rFonts w:ascii="Arial" w:hAnsi="Arial"/>
-          <w:color w:val="000000"/>
-          <w:sz w:val="19"/>
-        </w:rPr>
-        <w:t xml:space="preserve"> (</w:t>
-      </w:r>
-      <w:hyperlink r:id="rId11">
-        <w:r>
-          <w:rPr>
-            <w:rFonts w:ascii="Arial" w:hAnsi="Arial" w:cs="Arial"/>
-            <w:color w:val="0000FF"/>
-            <w:sz w:val="19"/>
-            <w:szCs w:val="19"/>
-            <w:u w:val="single"/>
-          </w:rPr>
-          <w:t xml:space="preserve">Register</w:t>
-        </w:r>
-      </w:hyperlink>
-      <w:r>
-        <w:rPr>
-          <w:rFonts w:ascii="Arial" w:hAnsi="Arial"/>
-          <w:color w:val="000000"/>
-          <w:sz w:val="19"/>
-        </w:rPr>
-        <w:t>)</w:t>
-      </w:r>
-    </w:p>
-    <w:p>
-      <w:pPr>
-        <w:pStyle w:val="ListBullet"/>
-      </w:pPr>
-      <w:r>
-        <w:rPr>
-          <w:rFonts w:ascii="Arial" w:hAnsi="Arial"/>
-          <w:b/>
-          <w:color w:val="000000"/>
-          <w:sz w:val="19"/>
-        </w:rPr>
-        <w:t>ACCC Compliance &amp; Enforcement Forum</w:t>
-      </w:r>
-      <w:r>
-        <w:rPr>
-          <w:rFonts w:ascii="Arial" w:hAnsi="Arial"/>
-          <w:color w:val="000000"/>
-          <w:sz w:val="19"/>
-        </w:rPr>
-        <w:t xml:space="preserve"> — </w:t>
-      </w:r>
-      <w:r>
-        <w:rPr>
-          <w:rFonts w:ascii="Arial" w:hAnsi="Arial"/>
-          <w:color w:val="000000"/>
-          <w:sz w:val="19"/>
-        </w:rPr>
-        <w:t>26 Jun 2026 — ACCC · Melbourne</w:t>
-      </w:r>
-    </w:p>
-    <w:p>
-      <w:pPr>
-        <w:pStyle w:val="ListBullet"/>
-      </w:pPr>
-      <w:r>
-        <w:rPr>
-          <w:rFonts w:ascii="Arial" w:hAnsi="Arial"/>
-          <w:b/>
-          <w:color w:val="000000"/>
-          <w:sz w:val="19"/>
-        </w:rPr>
         <w:t>ASIC Enforcement Update Webinar — Q3 2026</w:t>
       </w:r>
       <w:r>
@@ -502,6 +356,36 @@
           <w:sz w:val="19"/>
         </w:rPr>
         <w:t>09 Jul 2026 — ASIC · Online</w:t>
+      </w:r>
+    </w:p>
+    <w:p>
+      <w:pPr>
+        <w:pStyle w:val="ListBullet"/>
+      </w:pPr>
+      <w:r>
+        <w:rPr>
+          <w:rFonts w:ascii="Arial" w:hAnsi="Arial"/>
+          <w:b/>
+          <w:color w:val="000000"/>
+          <w:sz w:val="19"/>
+        </w:rPr>
+        <w:t>KPMG Regulatory Practice Masterclass — RT CoP</w:t>
+      </w:r>
+      <w:r>
+        <w:rPr>
+          <w:rFonts w:ascii="Arial" w:hAnsi="Arial"/>
+          <w:color w:val="000000"/>
+          <w:sz w:val="19"/>
+        </w:rPr>
+        <w:t xml:space="preserve"> — </w:t>
+      </w:r>
+      <w:r>
+        <w:rPr>
+          <w:rFonts w:ascii="Arial" w:hAnsi="Arial"/>
+          <w:color w:val="000000"/>
+          <w:sz w:val="19"/>
+        </w:rPr>
+        <w:t>23 Jul 2026 — KPMG · Online</w:t>
       </w:r>
     </w:p>
     <w:tbl>
@@ -547,7 +431,7 @@
                           <pic:cNvPicPr/>
                         </pic:nvPicPr>
                         <pic:blipFill>
-                          <a:blip r:embed="rId12"/>
+                          <a:blip r:embed="rId10"/>
                           <a:stretch>
                             <a:fillRect/>
                           </a:stretch>

</xml_diff>

<commit_message>
chore: update regulation hub 2026-07-01
</commit_message>
<xml_diff>
--- a/reg-hub/regulation_fortnightly_brief.docx
+++ b/reg-hub/regulation_fortnightly_brief.docx
@@ -46,7 +46,7 @@
         <w:pStyle w:val="Heading1"/>
       </w:pPr>
       <w:r>
-        <w:t>KPMG Regulatory Transformation Fortnightly Brief — 18 June – 1 July 2026</w:t>
+        <w:t>KPMG Regulatory Transformation Fortnightly Brief — 19 June – 2 July 2026</w:t>
       </w:r>
     </w:p>
     <w:p>
@@ -73,7 +73,7 @@
           <w:color w:val="666666"/>
           <w:sz w:val="19"/>
         </w:rPr>
-        <w:t>01 July 2026</w:t>
+        <w:t>02 July 2026</w:t>
       </w:r>
     </w:p>
     <w:p>
@@ -97,11 +97,11 @@
       <w:r>
         <w:rPr>
           <w:rFonts w:ascii="Arial" w:hAnsi="Arial"/>
-          <w:b w:val="0"/>
-          <w:color w:val="000000"/>
+          <w:i/>
+          <w:color w:val="666666"/>
           <w:sz w:val="19"/>
         </w:rPr>
-        <w:t>This fortnight, Australian transport regulators are pressing on operational safety and compliance across maritime, aviation, road and rail modes, with notable ATSB findings on rail collision survivability, AMSA reporting over 4,000 maritime incidents in 2025, and advancing ETCS signalling reform signalling a structural shift in how regulators are targeting risk and modernising infrastructure frameworks. The most significant advisory opportunity lies in the accelerating push to embed data-driven risk prioritisation and digital safety frameworks into regulatory delivery — particularly as ETCS rollout, fare and rail funding reform in Queensland, and aviation consumer protection redesign converge to create demand for coherent regulatory transformation strategies that regulators are not yet resourced to develop alone. Convene a targeted session with our transport and infrastructure partners this fortnight to identify where fragmented regulator capability meets active government reform agenda, and bring a structured offer to market before mid-FY27 budget decisions lock in delivery models.</w:t>
+        <w:t>[edit before send] — Adam's 3-sentence key messages will prefill from the dashboard synthesis on the next fortnightly run. Type your replacement here.</w:t>
       </w:r>
     </w:p>
     <w:p>

</xml_diff>

<commit_message>
chore: update regulation hub 2026-07-13
</commit_message>
<xml_diff>
--- a/reg-hub/regulation_fortnightly_brief.docx
+++ b/reg-hub/regulation_fortnightly_brief.docx
@@ -46,7 +46,7 @@
         <w:pStyle w:val="Heading1"/>
       </w:pPr>
       <w:r>
-        <w:t>KPMG Regulatory Transformation Fortnightly Brief — 19 June – 2 July 2026</w:t>
+        <w:t>KPMG Regulatory Transformation Fortnightly Brief — 30 June – 13 July 2026</w:t>
       </w:r>
     </w:p>
     <w:p>
@@ -73,7 +73,7 @@
           <w:color w:val="666666"/>
           <w:sz w:val="19"/>
         </w:rPr>
-        <w:t>02 July 2026</w:t>
+        <w:t>13 July 2026</w:t>
       </w:r>
     </w:p>
     <w:p>
@@ -97,11 +97,11 @@
       <w:r>
         <w:rPr>
           <w:rFonts w:ascii="Arial" w:hAnsi="Arial"/>
-          <w:i/>
-          <w:color w:val="666666"/>
+          <w:b w:val="0"/>
+          <w:color w:val="000000"/>
           <w:sz w:val="19"/>
         </w:rPr>
-        <w:t>[edit before send] — Adam's 3-sentence key messages will prefill from the dashboard synthesis on the next fortnightly run. Type your replacement here.</w:t>
+        <w:t>This fortnight, the Australian regulatory landscape is being shaped by converging pressures across energy access arrangements, environmental agency reform, and the intersection of geopolitical risk with financial stability, with regulators and governments navigating fiscal constraints and escalating national security commitments — including the landmark AUKUS Pillar II signature project and a record $2.5 billion radar export deal — that are accelerating demand for integrated, cross-portfolio regulatory responses. The single greatest advisory opportunity for us lies in the geopolitical–financial stability nexus: as the RBA's June 2026 Bulletin confirms systemic exposure to geopolitical risk, our clients in financial services, energy, and defence-adjacent sectors face a convergence of regulatory obligations that existing frameworks are not equipped to manage cohesively, and we are positioned to lead that synthesis. Convene a targeted roundtable for partners across Financial Services, Energy and Infrastructure, and National Security advisory to align our go-to-market response to the AUKUS capability build-out and the new National Environmental Protection Agency, and develop a coordinated client engagement approach before the September budget cycle locks departmental priorities.</w:t>
       </w:r>
     </w:p>
     <w:p>
@@ -326,36 +326,6 @@
           <w:sz w:val="21"/>
         </w:rPr>
         <w:t>Training, conferences, webinars &amp; in-person sessions</w:t>
-      </w:r>
-    </w:p>
-    <w:p>
-      <w:pPr>
-        <w:pStyle w:val="ListBullet"/>
-      </w:pPr>
-      <w:r>
-        <w:rPr>
-          <w:rFonts w:ascii="Arial" w:hAnsi="Arial"/>
-          <w:b/>
-          <w:color w:val="000000"/>
-          <w:sz w:val="19"/>
-        </w:rPr>
-        <w:t>ASIC Enforcement Update Webinar — Q3 2026</w:t>
-      </w:r>
-      <w:r>
-        <w:rPr>
-          <w:rFonts w:ascii="Arial" w:hAnsi="Arial"/>
-          <w:color w:val="000000"/>
-          <w:sz w:val="19"/>
-        </w:rPr>
-        <w:t xml:space="preserve"> — </w:t>
-      </w:r>
-      <w:r>
-        <w:rPr>
-          <w:rFonts w:ascii="Arial" w:hAnsi="Arial"/>
-          <w:color w:val="000000"/>
-          <w:sz w:val="19"/>
-        </w:rPr>
-        <w:t>09 Jul 2026 — ASIC · Online</w:t>
       </w:r>
     </w:p>
     <w:p>

</xml_diff>

<commit_message>
chore: update regulation hub 2026-07-15
</commit_message>
<xml_diff>
--- a/reg-hub/regulation_fortnightly_brief.docx
+++ b/reg-hub/regulation_fortnightly_brief.docx
@@ -46,7 +46,7 @@
         <w:pStyle w:val="Heading1"/>
       </w:pPr>
       <w:r>
-        <w:t>KPMG Regulatory Transformation Fortnightly Brief — 30 June – 13 July 2026</w:t>
+        <w:t>KPMG Regulatory Transformation Fortnightly Brief - 2-15 July 2026</w:t>
       </w:r>
     </w:p>
     <w:p>
@@ -60,7 +60,7 @@
           <w:color w:val="666666"/>
           <w:sz w:val="19"/>
         </w:rPr>
-        <w:t>Regulatory Transformation Community of Practice — Fortnightly Brief</w:t>
+        <w:t>Regulatory Transformation Community of Practice - Fortnightly Brief</w:t>
       </w:r>
     </w:p>
     <w:p>
@@ -73,7 +73,7 @@
           <w:color w:val="666666"/>
           <w:sz w:val="19"/>
         </w:rPr>
-        <w:t>13 July 2026</w:t>
+        <w:t>15 July 2026</w:t>
       </w:r>
     </w:p>
     <w:p>
@@ -101,7 +101,7 @@
           <w:color w:val="000000"/>
           <w:sz w:val="19"/>
         </w:rPr>
-        <w:t>This fortnight, the Australian regulatory landscape is being shaped by converging pressures across energy access arrangements, environmental agency reform, and the intersection of geopolitical risk with financial stability, with regulators and governments navigating fiscal constraints and escalating national security commitments — including the landmark AUKUS Pillar II signature project and a record $2.5 billion radar export deal — that are accelerating demand for integrated, cross-portfolio regulatory responses. The single greatest advisory opportunity for us lies in the geopolitical–financial stability nexus: as the RBA's June 2026 Bulletin confirms systemic exposure to geopolitical risk, our clients in financial services, energy, and defence-adjacent sectors face a convergence of regulatory obligations that existing frameworks are not equipped to manage cohesively, and we are positioned to lead that synthesis. Convene a targeted roundtable for partners across Financial Services, Energy and Infrastructure, and National Security advisory to align our go-to-market response to the AUKUS capability build-out and the new National Environmental Protection Agency, and develop a coordinated client engagement approach before the September budget cycle locks departmental priorities.</w:t>
+        <w:t>This fortnight, the Australian regulatory landscape is being shaped by converging pressures across energy access arrangements, environmental agency reform, and the intersection of geopolitical risk with financial stability, with regulators and governments navigating fiscal constraints and escalating national security commitments, including the landmark AUKUS Pillar II signature project and a record $2.5 billion radar export deal, that are accelerating demand for integrated, cross-portfolio regulatory responses. The single greatest advisory opportunity for us lies in the geopolitical-financial stability nexus: as the RBA's June 2026 Bulletin confirms systemic exposure to geopolitical risk, our clients in financial services, energy, and defence-adjacent sectors face a convergence of regulatory obligations that existing frameworks are not equipped to manage cohesively, and we are positioned to lead that synthesis. Convene a targeted roundtable for partners across Financial Services, Energy and Infrastructure, and National Security advisory to align our go-to-market response to the AUKUS capability build-out and the new National Environmental Protection Agency, and develop a coordinated client engagement approach before the September budget cycle locks departmental priorities.</w:t>
       </w:r>
     </w:p>
     <w:p>
@@ -129,7 +129,7 @@
           <w:color w:val="666666"/>
           <w:sz w:val="19"/>
         </w:rPr>
-        <w:t>No regulator-in-news signal this fortnight — see Themes below.</w:t>
+        <w:t>No regulator-in-news signal this fortnight, see Themes below.</w:t>
       </w:r>
     </w:p>
     <w:p>
@@ -339,7 +339,7 @@
           <w:color w:val="000000"/>
           <w:sz w:val="19"/>
         </w:rPr>
-        <w:t>KPMG Regulatory Practice Masterclass — RT CoP</w:t>
+        <w:t>KPMG Regulatory Practice Masterclass, RT CoP</w:t>
       </w:r>
       <w:r>
         <w:rPr>
@@ -347,7 +347,7 @@
           <w:color w:val="000000"/>
           <w:sz w:val="19"/>
         </w:rPr>
-        <w:t xml:space="preserve"> — </w:t>
+        <w:t xml:space="preserve"> - </w:t>
       </w:r>
       <w:r>
         <w:rPr>
@@ -355,7 +355,697 @@
           <w:color w:val="000000"/>
           <w:sz w:val="19"/>
         </w:rPr>
-        <w:t>23 Jul 2026 — KPMG · Online</w:t>
+        <w:t>23 Jul 2026 - KPMG · Online</w:t>
+      </w:r>
+    </w:p>
+    <w:p>
+      <w:pPr>
+        <w:pStyle w:val="subheading_letter"/>
+      </w:pPr>
+      <w:r>
+        <w:rPr>
+          <w:rFonts w:ascii="Arial" w:hAnsi="Arial"/>
+          <w:b/>
+          <w:color w:val="76D2FF"/>
+          <w:sz w:val="21"/>
+        </w:rPr>
+        <w:t>Cross-sector synthesis (hub-wide)</w:t>
+      </w:r>
+    </w:p>
+    <w:p>
+      <w:pPr>
+        <w:pStyle w:val="body_letter"/>
+      </w:pPr>
+      <w:r>
+        <w:rPr>
+          <w:rFonts w:ascii="Arial" w:hAnsi="Arial"/>
+          <w:b w:val="0"/>
+          <w:color w:val="000000"/>
+          <w:sz w:val="19"/>
+        </w:rPr>
+        <w:t>This fortnight's dominant enforcement signal is AUSTRAC's concurrent enforceable undertakings against bet365 and Sportsbet, landing in the same week Tranche 2 AML/CTF obligations formally commence for real estate agents, accountants, and lawyers, a compressed, multi-sector compliance remediation market that KPMG's financial crime and regulatory bench must convert within days, not weeks. Commonwealth Finance's release of RMG 140 and its companion guidance, alongside the launch of Australia's first independent national EPA, simultaneously activate two new mandate-driven compliance obligations where KPMG's governance design, assurance, and capability-uplift offering has direct and immediate application across federal entities and the resources sector. The AER's 2028-33 regulatory determination cycle is generating live proceedings, Transgrid's expenditure forecasting methodology submission and contested gas access arrangements for AusNet and Multinet, where KPMG's regulatory economics bench has a concrete, time-limited submission-support opportunity. On the Defence and national security front, AUKUS Pillar II's first signature project, Australia's record $2.5B radar export to Canada, and the Omni-Samarkand nuclear partnership collectively signal accelerating Commonwealth capital allocation into sovereign capability domains, opening technology governance, program assurance, and export-controls advisory mandates that the firm must move on before incumbents consolidate position. ACIC's consolidation of national policing data into NCIS and AFSA's new Fraud and Corruption Control Plan 2026-28 represent structured Commonwealth capability-build cycles suited to external design and analytics support that the public sector bench should be pursuing now. Partners must flag that KPMG's disclosed suspension from several state government tender processes, reported to the US PCAOB, requires immediate partner-level triage of the affected state-client roster; no new state-government pursuit or proposal should be activated until that triage is complete.</w:t>
+      </w:r>
+    </w:p>
+    <w:p>
+      <w:pPr>
+        <w:pStyle w:val="body_letter"/>
+      </w:pPr>
+      <w:r>
+        <w:rPr>
+          <w:rFonts w:ascii="Arial" w:hAnsi="Arial"/>
+          <w:b/>
+          <w:color w:val="000000"/>
+          <w:sz w:val="19"/>
+        </w:rPr>
+        <w:t>Business development priorities</w:t>
+      </w:r>
+    </w:p>
+    <w:p>
+      <w:pPr>
+        <w:pStyle w:val="ListBullet"/>
+      </w:pPr>
+      <w:r>
+        <w:rPr>
+          <w:rFonts w:ascii="Arial" w:hAnsi="Arial"/>
+          <w:color w:val="000000"/>
+          <w:sz w:val="19"/>
+        </w:rPr>
+        <w:t>Activate the financial crime bench against bet365 and Sportsbet this week, both enforceable undertakings require independent compliance-program overhaul, creating immediate remediation, uplift, and assurance mandates before other firms embed.</w:t>
+      </w:r>
+    </w:p>
+    <w:p>
+      <w:pPr>
+        <w:pStyle w:val="ListBullet"/>
+      </w:pPr>
+      <w:r>
+        <w:rPr>
+          <w:rFonts w:ascii="Arial" w:hAnsi="Arial"/>
+          <w:color w:val="000000"/>
+          <w:sz w:val="19"/>
+        </w:rPr>
+        <w:t>Launch a targeted Tranche 2 AML/CTF campaign to real estate agents, accountancy firms, and law practices this fortnight, leading with a rapid compliance-readiness diagnostic positioned ahead of AUSTRAC's first enforcement actions in the sector.</w:t>
+      </w:r>
+    </w:p>
+    <w:p>
+      <w:pPr>
+        <w:pStyle w:val="ListBullet"/>
+      </w:pPr>
+      <w:r>
+        <w:rPr>
+          <w:rFonts w:ascii="Arial" w:hAnsi="Arial"/>
+          <w:color w:val="000000"/>
+          <w:sz w:val="19"/>
+        </w:rPr>
+        <w:t>Deploy regulatory economics partners to Transgrid, AusNet, and Multinet immediately to offer submission-support and benchmarking capability ahead of their 2028-33 AER determination deadlines.</w:t>
+      </w:r>
+    </w:p>
+    <w:p>
+      <w:pPr>
+        <w:pStyle w:val="ListBullet"/>
+      </w:pPr>
+      <w:r>
+        <w:rPr>
+          <w:rFonts w:ascii="Arial" w:hAnsi="Arial"/>
+          <w:color w:val="000000"/>
+          <w:sz w:val="19"/>
+        </w:rPr>
+        <w:t>Convene the Defence advisory and technology risk team to develop a sovereign capability and export-controls offering anchored to the AUKUS Pillar II signature project and the $2.5B radar export precedent, targeting a partner-level briefing to Defence clients within two weeks.</w:t>
+      </w:r>
+    </w:p>
+    <w:p>
+      <w:pPr>
+        <w:pStyle w:val="ListBullet"/>
+      </w:pPr>
+      <w:r>
+        <w:rPr>
+          <w:rFonts w:ascii="Arial" w:hAnsi="Arial"/>
+          <w:color w:val="000000"/>
+          <w:sz w:val="19"/>
+        </w:rPr>
+        <w:t>Build and take to market a Commonwealth climate disclosure rapid-assessment product against RMG 140, prioritising Finance panel clients with near-term compliance deadlines before competitors frame the offering.</w:t>
+      </w:r>
+    </w:p>
+    <w:p>
+      <w:pPr>
+        <w:pStyle w:val="body_letter"/>
+      </w:pPr>
+      <w:r>
+        <w:rPr>
+          <w:rFonts w:ascii="Arial" w:hAnsi="Arial"/>
+          <w:b/>
+          <w:color w:val="000000"/>
+          <w:sz w:val="19"/>
+        </w:rPr>
+        <w:t>Implications for clients</w:t>
+      </w:r>
+    </w:p>
+    <w:p>
+      <w:pPr>
+        <w:pStyle w:val="ListBullet"/>
+      </w:pPr>
+      <w:r>
+        <w:rPr>
+          <w:rFonts w:ascii="Arial" w:hAnsi="Arial"/>
+          <w:color w:val="000000"/>
+          <w:sz w:val="19"/>
+        </w:rPr>
+        <w:t>Activate the financial crime bench against bet365 and Sportsbet this week, both enforceable undertakings require independent compliance-program overhaul, creating immediate remediation, uplift, and assurance mandates before other firms embed.</w:t>
+      </w:r>
+    </w:p>
+    <w:p>
+      <w:pPr>
+        <w:pStyle w:val="ListBullet"/>
+      </w:pPr>
+      <w:r>
+        <w:rPr>
+          <w:rFonts w:ascii="Arial" w:hAnsi="Arial"/>
+          <w:color w:val="000000"/>
+          <w:sz w:val="19"/>
+        </w:rPr>
+        <w:t>Launch a targeted Tranche 2 AML/CTF campaign to real estate agents, accountancy firms, and law practices this fortnight, leading with a rapid compliance-readiness diagnostic positioned ahead of AUSTRAC's first enforcement actions in the sector.</w:t>
+      </w:r>
+    </w:p>
+    <w:p>
+      <w:pPr>
+        <w:pStyle w:val="ListBullet"/>
+      </w:pPr>
+      <w:r>
+        <w:rPr>
+          <w:rFonts w:ascii="Arial" w:hAnsi="Arial"/>
+          <w:color w:val="000000"/>
+          <w:sz w:val="19"/>
+        </w:rPr>
+        <w:t>Deploy regulatory economics partners to Transgrid, AusNet, and Multinet immediately to offer submission-support and benchmarking capability ahead of their 2028-33 AER determination deadlines.</w:t>
+      </w:r>
+    </w:p>
+    <w:p>
+      <w:pPr>
+        <w:pStyle w:val="ListBullet"/>
+      </w:pPr>
+      <w:r>
+        <w:rPr>
+          <w:rFonts w:ascii="Arial" w:hAnsi="Arial"/>
+          <w:color w:val="000000"/>
+          <w:sz w:val="19"/>
+        </w:rPr>
+        <w:t>Convene the Defence advisory and technology risk team to develop a sovereign capability and export-controls offering anchored to the AUKUS Pillar II signature project and the $2.5B radar export precedent, targeting a partner-level briefing to Defence clients within two weeks.</w:t>
+      </w:r>
+    </w:p>
+    <w:p>
+      <w:pPr>
+        <w:pStyle w:val="ListBullet"/>
+      </w:pPr>
+      <w:r>
+        <w:rPr>
+          <w:rFonts w:ascii="Arial" w:hAnsi="Arial"/>
+          <w:color w:val="000000"/>
+          <w:sz w:val="19"/>
+        </w:rPr>
+        <w:t>Build and take to market a Commonwealth climate disclosure rapid-assessment product against RMG 140, prioritising Finance panel clients with near-term compliance deadlines before competitors frame the offering.</w:t>
+      </w:r>
+    </w:p>
+    <w:p>
+      <w:pPr>
+        <w:pStyle w:val="subheading_letter"/>
+      </w:pPr>
+      <w:r>
+        <w:rPr>
+          <w:rFonts w:ascii="Arial" w:hAnsi="Arial"/>
+          <w:b/>
+          <w:color w:val="76D2FF"/>
+          <w:sz w:val="21"/>
+        </w:rPr>
+        <w:t>Sector signals</w:t>
+      </w:r>
+    </w:p>
+    <w:p>
+      <w:pPr>
+        <w:pStyle w:val="body_letter"/>
+      </w:pPr>
+      <w:r>
+        <w:rPr>
+          <w:rFonts w:ascii="Arial" w:hAnsi="Arial"/>
+          <w:b/>
+          <w:color w:val="000000"/>
+          <w:sz w:val="19"/>
+        </w:rPr>
+        <w:t>Public Sector</w:t>
+      </w:r>
+    </w:p>
+    <w:p>
+      <w:pPr>
+        <w:pStyle w:val="body_letter"/>
+      </w:pPr>
+      <w:r>
+        <w:rPr>
+          <w:rFonts w:ascii="Arial" w:hAnsi="Arial"/>
+          <w:b w:val="0"/>
+          <w:color w:val="000000"/>
+          <w:sz w:val="19"/>
+        </w:rPr>
+        <w:t>Commonwealth Finance's release of RMG 140 (Commonwealth Climate Disclosure) and its companion 'What needs to be disclosed?' guidance creates an immediate, mandate-driven advisory pull across Commonwealth entities that will need climate reporting frameworks, assurance-ready controls, and board-level capability uplift, the proximity of compliance deadlines makes early-mover positioning material this fortnight. PGPA Newsletter 118 reinforces ongoing governance and accountability obligations across the Commonwealth, opening performance advisory, internal audit refresh, and accountability-framework conversations with panel clients ahead of the next budget cycle. ACCC's concurrent market monitoring across CDR expansion to non-bank lenders, home battery consumer protections, and east-coast gas supply signals accelerating regulator investment in digital economy infrastructure and energy transition oversight, generating pursuit leads in regulatory design, data-sharing architecture, and consumer protection advisory. Partners must also note that KPMG's disclosed suspension from several state government tender processes, reported to the US PCAOB, requires urgent partner-level triage of the affected state-client roster before any new state-government pursuits are activated or proposals lodged.</w:t>
+      </w:r>
+    </w:p>
+    <w:p>
+      <w:pPr>
+        <w:pStyle w:val="body_letter"/>
+      </w:pPr>
+      <w:r>
+        <w:rPr>
+          <w:rFonts w:ascii="Arial" w:hAnsi="Arial"/>
+          <w:b/>
+          <w:color w:val="000000"/>
+          <w:sz w:val="19"/>
+        </w:rPr>
+        <w:t>Financial Services</w:t>
+      </w:r>
+    </w:p>
+    <w:p>
+      <w:pPr>
+        <w:pStyle w:val="body_letter"/>
+      </w:pPr>
+      <w:r>
+        <w:rPr>
+          <w:rFonts w:ascii="Arial" w:hAnsi="Arial"/>
+          <w:b w:val="0"/>
+          <w:color w:val="000000"/>
+          <w:sz w:val="19"/>
+        </w:rPr>
+        <w:t>ASIC's simultaneous publication of REP 833 and an enforcement action against platform trustees signals a sustained supervisory campaign on superannuation governance, creating immediate demand for independent risk-framework and adviser-oversight reviews across the trustee market, FSC's commencement of the platform trustee standard on the same cycle amplifies the urgency for clients still mapping compliance gaps. The Treasury/Assistant Treasurer proposal to expand ASIC's audit surveillance mandate, more file reviews, greater transparency, escalated penalties, positions KPMG's audit advisory and quality-assurance bench ahead of likely legislative change with material near-term pipeline implications. The $20.5M penalty against ASX for misleading conduct on the CHESS replacement project, read alongside ASIC's REP 835 FMI innovation landscape review, signals regulator intent to embed assurance and disclosure standards into technology transformation programs at market infrastructure entities, opening a project-governance and independent-review pitch to FMI operators. Deutsche Bank's $2M trade reporting penalty and two AFS licence cancellations in the same fortnight reinforce ASIC's systemic-risk and market-integrity priorities, creating regulatory remediation conversations with sell-side, CFD, and wholesale-product clients.</w:t>
+      </w:r>
+    </w:p>
+    <w:p>
+      <w:pPr>
+        <w:pStyle w:val="body_letter"/>
+      </w:pPr>
+      <w:r>
+        <w:rPr>
+          <w:rFonts w:ascii="Arial" w:hAnsi="Arial"/>
+          <w:b/>
+          <w:color w:val="000000"/>
+          <w:sz w:val="19"/>
+        </w:rPr>
+        <w:t>Health, Ageing &amp; Human Services</w:t>
+      </w:r>
+    </w:p>
+    <w:p>
+      <w:pPr>
+        <w:pStyle w:val="body_letter"/>
+      </w:pPr>
+      <w:r>
+        <w:rPr>
+          <w:rFonts w:ascii="Arial" w:hAnsi="Arial"/>
+          <w:b w:val="0"/>
+          <w:color w:val="000000"/>
+          <w:sz w:val="19"/>
+        </w:rPr>
+        <w:t>The NDIS Quality and Safeguards Commission's mandatory registration framework is generating acute compliance pressure across the provider ecosystem, with confirmed reporting of smaller operators, including family carers, unaware of criminal liability exposure under the new rules, creating an immediate readiness advisory gap that the market cannot yet self-serve. The Senate's passage of legislation reinstating a human override for Labor's algorithmic aged care home-support funding tool signals legislative appetite for AI governance controls in human services, opening a near-term technology risk and assurance engagement before enabling regulations are drafted. Ahpra's CEO has publicly committed to a proactive, future-ready regulatory posture backed by new 2026-31 Health Profession Agreements (OT Board confirmed), while TGA's 1 July 2026 Unique Device Identification requirements activate a parallel compliance uplift need across medical technology clients. Across these signals, KPMG's human services bench has credible entry points spanning NDIS provider registration readiness, aged care AI governance, and health-workforce regulatory strategy.</w:t>
+      </w:r>
+    </w:p>
+    <w:p>
+      <w:pPr>
+        <w:pStyle w:val="body_letter"/>
+      </w:pPr>
+      <w:r>
+        <w:rPr>
+          <w:rFonts w:ascii="Arial" w:hAnsi="Arial"/>
+          <w:b/>
+          <w:color w:val="000000"/>
+          <w:sz w:val="19"/>
+        </w:rPr>
+        <w:t>Energy, Mining &amp; Property</w:t>
+      </w:r>
+    </w:p>
+    <w:p>
+      <w:pPr>
+        <w:pStyle w:val="body_letter"/>
+      </w:pPr>
+      <w:r>
+        <w:rPr>
+          <w:rFonts w:ascii="Arial" w:hAnsi="Arial"/>
+          <w:b w:val="0"/>
+          <w:color w:val="000000"/>
+          <w:sz w:val="19"/>
+        </w:rPr>
+        <w:t>The AER's 2028-33 regulatory determination cycle is generating concentrated advisory demand: Transgrid's expenditure forecasting methodology submission and contested gas access arrangement reviews for AusNet and Multinet signal active proceedings where network businesses require regulatory economics, capex/opex benchmarking, and submission-support capability. Simultaneously, annual ring-fencing compliance reports from Jemena, Directlink/Murraylink, and the independent assessment requirement for Endeavour Energy indicate a maturing assurance market across regulated energy networks. The launch of Australia's first independent national Environmental Protection Agency creates a new Commonwealth client with urgent needs across governance design, data systems, environmental economics, and regulatory capability uplift. NSW's royalty deferral scheme for two critical minerals projects introduces a discrete project-finance and economic-modelling advisory angle in the mining sub-sector, while EPA Victoria's physical climate risk guidance signals expanding compliance obligations for property and resources clients.</w:t>
+      </w:r>
+    </w:p>
+    <w:p>
+      <w:pPr>
+        <w:pStyle w:val="body_letter"/>
+      </w:pPr>
+      <w:r>
+        <w:rPr>
+          <w:rFonts w:ascii="Arial" w:hAnsi="Arial"/>
+          <w:b/>
+          <w:color w:val="000000"/>
+          <w:sz w:val="19"/>
+        </w:rPr>
+        <w:t>National Security &amp; Justice</w:t>
+      </w:r>
+    </w:p>
+    <w:p>
+      <w:pPr>
+        <w:pStyle w:val="body_letter"/>
+      </w:pPr>
+      <w:r>
+        <w:rPr>
+          <w:rFonts w:ascii="Arial" w:hAnsi="Arial"/>
+          <w:b w:val="0"/>
+          <w:color w:val="000000"/>
+          <w:sz w:val="19"/>
+        </w:rPr>
+        <w:t>AUSTRAC's concurrent enforceable undertakings against bet365 and Sportsbet, combined with the formal commencement of Tranche 2 AML/CTF obligations covering real estate agents, accountants, and lawyers, signal a deliberate enforcement escalation that will drive systemic compliance-program remediation and uplift demand across multiple sectors. The ACIC's consolidation of national policing data and intelligence into NCIS represents a material federal technology and capability investment, opening advisory lanes in data architecture, program delivery, and analytics. AFSA's new Fraud and Corruption Control Plan 2026-28 and its targeted insolvency-manipulation program indicate a structured capability-building cycle suited to external design and implementation support. Collectively, these signals position KPMG for immediate pursuit conversations with AUSTRAC-supervised wagering entities, the incoming Tranche 2 regulated population, ACIC, and AFSA within the same fortnight window.</w:t>
+      </w:r>
+    </w:p>
+    <w:p>
+      <w:pPr>
+        <w:pStyle w:val="body_letter"/>
+      </w:pPr>
+      <w:r>
+        <w:rPr>
+          <w:rFonts w:ascii="Arial" w:hAnsi="Arial"/>
+          <w:b/>
+          <w:color w:val="000000"/>
+          <w:sz w:val="19"/>
+        </w:rPr>
+        <w:t>Defence</w:t>
+      </w:r>
+    </w:p>
+    <w:p>
+      <w:pPr>
+        <w:pStyle w:val="body_letter"/>
+      </w:pPr>
+      <w:r>
+        <w:rPr>
+          <w:rFonts w:ascii="Arial" w:hAnsi="Arial"/>
+          <w:b w:val="0"/>
+          <w:color w:val="000000"/>
+          <w:sz w:val="19"/>
+        </w:rPr>
+        <w:t>The announcement of AUKUS Pillar II's first signature project signals a material Commonwealth investment commitment in advanced capability domains, autonomous systems, AI integration, and quantum technologies, creating immediate demand for technology governance, program assurance, and capability-uplift advisory across the Defence and national security precinct. Concurrently, Australia's record $2.5 billion radar export to Canada, read alongside the Defence Connect export-controls reform signal, positions the revised DEFENCE EXPORT CONTROLS framework as the pivotal regulatory lever for sovereign industry scale-up, opening compliance-design and regulatory-advisory pursuit lanes. The Omni-Samarkand nuclear capability partnership reflects accelerating AUKUS Pillar I ecosystem development, where nuclear safety regulation, workforce L&amp;D gaps, and supply-chain due diligence are emerging as unserviced advisory needs. The RBA's June 2026 Bulletin framing geopolitical risk as a financial-stability variable provides a cross-sector hook for positioning KPMG's risk and resilience offering to Defence-adjacent financial institutions and Commonwealth entities.</w:t>
+      </w:r>
+    </w:p>
+    <w:p>
+      <w:pPr>
+        <w:pStyle w:val="body_letter"/>
+      </w:pPr>
+      <w:r>
+        <w:rPr>
+          <w:rFonts w:ascii="Arial" w:hAnsi="Arial"/>
+          <w:b/>
+          <w:color w:val="000000"/>
+          <w:sz w:val="19"/>
+        </w:rPr>
+        <w:t>Transport</w:t>
+      </w:r>
+    </w:p>
+    <w:p>
+      <w:pPr>
+        <w:pStyle w:val="body_letter"/>
+      </w:pPr>
+      <w:r>
+        <w:rPr>
+          <w:rFonts w:ascii="Arial" w:hAnsi="Arial"/>
+          <w:b w:val="0"/>
+          <w:color w:val="000000"/>
+          <w:sz w:val="19"/>
+        </w:rPr>
+        <w:t>AMSA's published National Compliance Plan 2026-27 is the period's clearest regulator-investment signal, setting out targeted enforcement priorities across maritime that translate directly into compliance-readiness and assurance demand for vessel operators, port managers, and cruise lines, with the live MUA complaint against Carnival Cruises illustrating that enforcement is already active. CASA's own-motion surveillance of the helicopter sector has uncovered recurring systemic safety issues, indicating a regulator primed for follow-on capability uplift and safety-management-system reform work, while the joint Home Affairs-CASA consultation on drone security (with a companion CASA proposal on above-400ft drone operations) signals cross-agency regulatory architecture being built in real time around uncrewed systems. The amended Heavy Vehicle National Law introduces new compliance obligations across road freight that will require legal-translation and gap-analysis support across state-based operators. Collectively these actions point to a dense pipeline of regulatory-change advisory, assurance, and capability-build work across aviation, maritime, and road freight in the second half of 2026.</w:t>
+      </w:r>
+    </w:p>
+    <w:p>
+      <w:pPr>
+        <w:pStyle w:val="body_letter"/>
+      </w:pPr>
+      <w:r>
+        <w:rPr>
+          <w:rFonts w:ascii="Arial" w:hAnsi="Arial"/>
+          <w:b/>
+          <w:color w:val="000000"/>
+          <w:sz w:val="19"/>
+        </w:rPr>
+        <w:t>Education</w:t>
+      </w:r>
+    </w:p>
+    <w:p>
+      <w:pPr>
+        <w:pStyle w:val="body_letter"/>
+      </w:pPr>
+      <w:r>
+        <w:rPr>
+          <w:rFonts w:ascii="Arial" w:hAnsi="Arial"/>
+          <w:b w:val="0"/>
+          <w:color w:val="000000"/>
+          <w:sz w:val="19"/>
+        </w:rPr>
+        <w:t>TEQSA and ASQA are jointly escalating compliance expectations across two fronts simultaneously: overseas student transfer practices are under a formal sector-wide alert, and new gen AI guidance is reframing learning-assurance obligations as a standing regulatory requirement for all registered providers. The public-service intervention to stabilise ANU signals a governance and financial-management failure severe enough to attract Commonwealth direction, creating an immediate institutional transformation mandate. DEWR's concurrent release of an AI-and-employment report and updated Strategic Framework positions workforce capability reform as a whole-of-government priority, reinforcing L&amp;D and change-management demand across the education and employment services interface. KPMG can credibly enter three near-term pursuits: a gen AI governance and learning-assurance rapid assessment pitched to Go8 and regional universities, an international student compliance risk review for providers with high offshore enrolments, and a transformation advisory offering anchored to the ANU crisis trajectory.</w:t>
+      </w:r>
+    </w:p>
+    <w:p>
+      <w:pPr>
+        <w:pStyle w:val="subheading_letter"/>
+      </w:pPr>
+      <w:r>
+        <w:rPr>
+          <w:rFonts w:ascii="Arial" w:hAnsi="Arial"/>
+          <w:b/>
+          <w:color w:val="76D2FF"/>
+          <w:sz w:val="21"/>
+        </w:rPr>
+        <w:t>Jurisdiction signals</w:t>
+      </w:r>
+    </w:p>
+    <w:p>
+      <w:pPr>
+        <w:pStyle w:val="body_letter"/>
+      </w:pPr>
+      <w:r>
+        <w:rPr>
+          <w:rFonts w:ascii="Arial" w:hAnsi="Arial"/>
+          <w:b/>
+          <w:color w:val="000000"/>
+          <w:sz w:val="19"/>
+        </w:rPr>
+        <w:t>Commonwealth</w:t>
+      </w:r>
+    </w:p>
+    <w:p>
+      <w:pPr>
+        <w:pStyle w:val="body_letter"/>
+      </w:pPr>
+      <w:r>
+        <w:rPr>
+          <w:rFonts w:ascii="Arial" w:hAnsi="Arial"/>
+          <w:b w:val="0"/>
+          <w:color w:val="000000"/>
+          <w:sz w:val="19"/>
+        </w:rPr>
+        <w:t>Australia's first national EPA has commenced operations with a chief executive appointed, establishing a significant new federal environmental regulator with compliance implications across energy, resources, and manufacturing sectors that clients must now engage with at the Commonwealth level. ASIC has recorded a historic enforcement period in the first half of 2026 with continued momentum signalled, indicating elevated investigation and litigation risk for financial services clients and strong advisory demand around enforcement readiness. The Department of Home Affairs is consulting on amendments to streamline and modernise the Security of Critical Infrastructure Act 2018, presenting near-term advisory opportunities for critical infrastructure entities, while the ACMA has published its 2026-27 compliance priorities centred on consumer protection. Concurrently, the ACCC has taken penalty action against an NDIS-linked provider and the Fair Work Ombudsman has engaged on payday super compliance, underscoring active multi-agency enforcement across the care economy and employment sectors.</w:t>
+      </w:r>
+    </w:p>
+    <w:p>
+      <w:pPr>
+        <w:pStyle w:val="body_letter"/>
+      </w:pPr>
+      <w:r>
+        <w:rPr>
+          <w:rFonts w:ascii="Arial" w:hAnsi="Arial"/>
+          <w:b/>
+          <w:color w:val="000000"/>
+          <w:sz w:val="19"/>
+        </w:rPr>
+        <w:t>New South Wales</w:t>
+      </w:r>
+    </w:p>
+    <w:p>
+      <w:pPr>
+        <w:pStyle w:val="body_letter"/>
+      </w:pPr>
+      <w:r>
+        <w:rPr>
+          <w:rFonts w:ascii="Arial" w:hAnsi="Arial"/>
+          <w:b w:val="0"/>
+          <w:color w:val="000000"/>
+          <w:sz w:val="19"/>
+        </w:rPr>
+        <w:t>SafeWork NSW has publicly flagged its current compliance priorities, and the appointment of an inaugural SafeWork NSW Advisory Council signals a strategic reset in the regulator's governance that businesses should monitor for emerging obligations. IPART has new leadership with the appointment of Anthony Wing as Chair, replacing Carmel Donnelly, which may foreshadow shifts in pricing and regulatory determinations across regulated sectors. The NSW Budget has foregrounded development delivery, with property acquisition functions being merged into the Department of Planning, Housing and Infrastructure to create a single touchpoint, concentrating planning regulatory risk and advisory demand. Integrity oversight remains active, with ICAC examining NSW Liberal factional conduct in the Hills district and the Attorney General responding publicly to an inquiry critical of the Office of the Director of Public Prosecutions.</w:t>
+      </w:r>
+    </w:p>
+    <w:p>
+      <w:pPr>
+        <w:pStyle w:val="body_letter"/>
+      </w:pPr>
+      <w:r>
+        <w:rPr>
+          <w:rFonts w:ascii="Arial" w:hAnsi="Arial"/>
+          <w:b/>
+          <w:color w:val="000000"/>
+          <w:sz w:val="19"/>
+        </w:rPr>
+        <w:t>Victoria</w:t>
+      </w:r>
+    </w:p>
+    <w:p>
+      <w:pPr>
+        <w:pStyle w:val="body_letter"/>
+      </w:pPr>
+      <w:r>
+        <w:rPr>
+          <w:rFonts w:ascii="Arial" w:hAnsi="Arial"/>
+          <w:b w:val="0"/>
+          <w:color w:val="000000"/>
+          <w:sz w:val="19"/>
+        </w:rPr>
+        <w:t>Victoria is experiencing significant legislative and regulatory activity across several sectors this period. The introduction of the Victorian Work from Home Bill establishes new employer compliance obligations and is expected to substantially increase VCAT's dispute resolution caseload, creating advisory demand across employment and industrial relations. The Essential Services Commission has launched a formal pricing inquiry into Port of Melbourne, signalling heightened scrutiny of infrastructure pricing arrangements and presenting immediate advisory opportunities in the utilities and transport sectors. EPA Victoria's launch of a new land-clearing surveillance program marks a material strategic shift toward proactive, technology-enabled environmental enforcement, raising compliance risk for landholders and developers, while concurrent building reform amendments and Owners Corporation Act changes, alongside an updated Ministerial Statement of Expectations, reinforce a sustained Victorian legislative reform agenda across property, construction, and strata sectors.</w:t>
+      </w:r>
+    </w:p>
+    <w:p>
+      <w:pPr>
+        <w:pStyle w:val="body_letter"/>
+      </w:pPr>
+      <w:r>
+        <w:rPr>
+          <w:rFonts w:ascii="Arial" w:hAnsi="Arial"/>
+          <w:b/>
+          <w:color w:val="000000"/>
+          <w:sz w:val="19"/>
+        </w:rPr>
+        <w:t>Queensland</w:t>
+      </w:r>
+    </w:p>
+    <w:p>
+      <w:pPr>
+        <w:pStyle w:val="body_letter"/>
+      </w:pPr>
+      <w:r>
+        <w:rPr>
+          <w:rFonts w:ascii="Arial" w:hAnsi="Arial"/>
+          <w:b w:val="0"/>
+          <w:color w:val="000000"/>
+          <w:sz w:val="19"/>
+        </w:rPr>
+        <w:t>Queensland's 2026-27 Budget commits a record $119 billion infrastructure and housing program alongside productivity reforms, creating broad advisory opportunities across procurement, planning, and compliance. New e-mobility legislation has commenced and Queensland law firms face immediate enrolment obligations under the expanded Commonwealth AML/CTF regime, presenting near-term compliance advisory work. The Palaszczuk government announced major safeguarding reforms in response to the In Plain Sight review, while a proposed new building code is generating industry-wide confusion and a concurrent misconduct inquiry targets the former building regulator boss, signalling heightened scrutiny in the construction sector. The Queensland Productivity Commission's review of EPBC Act reforms and the appointment of Supreme Court judges to lead a human rights framework review indicate a sustained pipeline of state-level regulatory change ahead.</w:t>
+      </w:r>
+    </w:p>
+    <w:p>
+      <w:pPr>
+        <w:pStyle w:val="body_letter"/>
+      </w:pPr>
+      <w:r>
+        <w:rPr>
+          <w:rFonts w:ascii="Arial" w:hAnsi="Arial"/>
+          <w:b/>
+          <w:color w:val="000000"/>
+          <w:sz w:val="19"/>
+        </w:rPr>
+        <w:t>Western Australia</w:t>
+      </w:r>
+    </w:p>
+    <w:p>
+      <w:pPr>
+        <w:pStyle w:val="body_letter"/>
+      </w:pPr>
+      <w:r>
+        <w:rPr>
+          <w:rFonts w:ascii="Arial" w:hAnsi="Arial"/>
+          <w:b w:val="0"/>
+          <w:color w:val="000000"/>
+          <w:sz w:val="19"/>
+        </w:rPr>
+        <w:t>Western Australia has become the first Australian jurisdiction to deploy real-time facial recognition surveillance cameras in a public policing context, generating significant civil liberties criticism and creating immediate privacy compliance and advisory opportunities for businesses operating in the state. The Cook Government has announced a major residential subdivision reform that will open thousands more Perth properties to subdivision, substantially reshaping planning compliance obligations and creating advisory demand across the development sector. WA enforcement activity has intensified across multiple sectors: over a tonne of illicit tobacco was seized and nearly 50 retail stores were closed, Inpex received a formal mercury-emissions warning from the resources regulator, and the state recorded its first conviction under recently enacted towing reform legislation. WA is also actively engaging with Commonwealth regulatory reform on online lotteries to protect its state-owned lottery system, signalling the government's strategic use of federal consultation processes to preserve state regulatory interests.</w:t>
+      </w:r>
+    </w:p>
+    <w:p>
+      <w:pPr>
+        <w:pStyle w:val="body_letter"/>
+      </w:pPr>
+      <w:r>
+        <w:rPr>
+          <w:rFonts w:ascii="Arial" w:hAnsi="Arial"/>
+          <w:b/>
+          <w:color w:val="000000"/>
+          <w:sz w:val="19"/>
+        </w:rPr>
+        <w:t>South Australia</w:t>
+      </w:r>
+    </w:p>
+    <w:p>
+      <w:pPr>
+        <w:pStyle w:val="body_letter"/>
+      </w:pPr>
+      <w:r>
+        <w:rPr>
+          <w:rFonts w:ascii="Arial" w:hAnsi="Arial"/>
+          <w:b w:val="0"/>
+          <w:color w:val="000000"/>
+          <w:sz w:val="19"/>
+        </w:rPr>
+        <w:t>South Australia has enacted new criminal legislation making the creation and distribution of deepfakes an offence, positioning SA ahead of a still-absent federal equivalent and creating advisory opportunities around digital compliance frameworks for SA-regulated entities. The SA gambling regulator concluded its independent review of SkyCity Adelaide, with a settlement requiring SkyCity to pay approximately AU$21 million in fines and appoint a dedicated Adelaide CEO, signalling continued regulatory scrutiny of casino AML/CTF and responsible gambling obligations. SA's First Nations Voice to Parliament reforms have been publicly revealed, introducing new legislative requirements that will affect government and industry engagement frameworks in the state. SafeWork SA has flagged major safety expenditure following asbestos risks identified at gym premises, indicating active WHS enforcement and potential compliance uplift obligations for facility operators across SA.</w:t>
+      </w:r>
+    </w:p>
+    <w:p>
+      <w:pPr>
+        <w:pStyle w:val="body_letter"/>
+      </w:pPr>
+      <w:r>
+        <w:rPr>
+          <w:rFonts w:ascii="Arial" w:hAnsi="Arial"/>
+          <w:b/>
+          <w:color w:val="000000"/>
+          <w:sz w:val="19"/>
+        </w:rPr>
+        <w:t>Tasmania</w:t>
+      </w:r>
+    </w:p>
+    <w:p>
+      <w:pPr>
+        <w:pStyle w:val="body_letter"/>
+      </w:pPr>
+      <w:r>
+        <w:rPr>
+          <w:rFonts w:ascii="Arial" w:hAnsi="Arial"/>
+          <w:b w:val="0"/>
+          <w:color w:val="000000"/>
+          <w:sz w:val="19"/>
+        </w:rPr>
+        <w:t>Tasmania has enacted a nation-first levy on family violence offenders and announced the first tranche of broader family violence protection reforms, creating new compliance obligations and advisory opportunities for organisations across the social services, legal, and insurance sectors. The state faces up to $300 million in potential native logging compensation liabilities as Commonwealth EPBC reforms loom, representing a material cross-jurisdictional risk requiring urgent attention for forestry and land-use clients. Significant local government structural reform, legislation to cut 50 councillors has cleared the upper house, will reshape regulatory and governance frameworks ahead of imminent council elections, with downstream implications for planning and procurement compliance. Concurrent regulator activity includes a WorkSafe Tasmania investigation following a public fireworks incident and an EPA decision to lift a processing ban on a recycling facility, signalling active enforcement postures in WHS and environmental compliance.</w:t>
+      </w:r>
+    </w:p>
+    <w:p>
+      <w:pPr>
+        <w:pStyle w:val="body_letter"/>
+      </w:pPr>
+      <w:r>
+        <w:rPr>
+          <w:rFonts w:ascii="Arial" w:hAnsi="Arial"/>
+          <w:b/>
+          <w:color w:val="000000"/>
+          <w:sz w:val="19"/>
+        </w:rPr>
+        <w:t>Australian Capital Territory</w:t>
+      </w:r>
+    </w:p>
+    <w:p>
+      <w:pPr>
+        <w:pStyle w:val="body_letter"/>
+      </w:pPr>
+      <w:r>
+        <w:rPr>
+          <w:rFonts w:ascii="Arial" w:hAnsi="Arial"/>
+          <w:b w:val="0"/>
+          <w:color w:val="000000"/>
+          <w:sz w:val="19"/>
+        </w:rPr>
+        <w:t>The ACT Government has passed 'missing middle' housing reforms permitting medium-density infill development, a landmark planning change creating compliance and advisory demand for developers, councils and affected landowners. The 2026-27 ACT Budget eliminates stamp duty for first-home buyers and projects net debt reaching $12.5 billion, signalling a significant shift in ACT revenue and property tax settings that will require updated compliance frameworks. A major statutory review of ACT pokies regulation has recommended a phased, managed transition rather than abrupt licence stripping, presenting advisory opportunities around club governance and licence compliance planning; separately, a firm avoided prosecution via a workplace safety undertaking, illustrating active WHS enforcement by Access Canberra. A cross-jurisdictional procurement integrity gap has been exposed, a subcontractor formally banned in NSW was found to have won ACT government work, underscoring weaknesses in ACT procurement screening and debarment reciprocity.</w:t>
+      </w:r>
+    </w:p>
+    <w:p>
+      <w:pPr>
+        <w:pStyle w:val="body_letter"/>
+      </w:pPr>
+      <w:r>
+        <w:rPr>
+          <w:rFonts w:ascii="Arial" w:hAnsi="Arial"/>
+          <w:b/>
+          <w:color w:val="000000"/>
+          <w:sz w:val="19"/>
+        </w:rPr>
+        <w:t>Northern Territory</w:t>
+      </w:r>
+    </w:p>
+    <w:p>
+      <w:pPr>
+        <w:pStyle w:val="body_letter"/>
+      </w:pPr>
+      <w:r>
+        <w:rPr>
+          <w:rFonts w:ascii="Arial" w:hAnsi="Arial"/>
+          <w:b w:val="0"/>
+          <w:color w:val="000000"/>
+          <w:sz w:val="19"/>
+        </w:rPr>
+        <w:t>NT WorkSafe has charged the NT Health Department over a patient death at Darwin Hospital involving an aerosol can, a notable enforcement action against a government entity, while a separate controversy over dropped charges in another workplace death raises questions about WorkSafe's prosecutorial consistency and accountability. The NT Government's Every Child Matters Bill is attracting sharp criticism from SNAICC, and a damning systemic-failings report reinforces pressure for substantive child protection legislative reform, presenting advisory opportunities around compliance frameworks and implementation. The NT EPA approved Santos' hot venting request, reflecting continued regulatory accommodation of resources sector operational needs, while consumer protection enforcement is active with $38,000 in fines issued to service stations for fuel price overcharging.</w:t>
       </w:r>
     </w:p>
     <w:tbl>

</xml_diff>

<commit_message>
chore: update regulation hub 2026-07-20
</commit_message>
<xml_diff>
--- a/reg-hub/regulation_fortnightly_brief.docx
+++ b/reg-hub/regulation_fortnightly_brief.docx
@@ -46,7 +46,7 @@
         <w:pStyle w:val="Heading1"/>
       </w:pPr>
       <w:r>
-        <w:t>KPMG Regulatory Transformation Fortnightly Brief - 3-16 July 2026</w:t>
+        <w:t>KPMG Regulatory Transformation Fortnightly Brief - 7-20 July 2026</w:t>
       </w:r>
     </w:p>
     <w:p>
@@ -73,7 +73,7 @@
           <w:color w:val="666666"/>
           <w:sz w:val="19"/>
         </w:rPr>
-        <w:t>16 July 2026</w:t>
+        <w:t>20 July 2026</w:t>
       </w:r>
     </w:p>
     <w:p>
@@ -97,11 +97,11 @@
       <w:r>
         <w:rPr>
           <w:rFonts w:ascii="Arial" w:hAnsi="Arial"/>
-          <w:i/>
-          <w:color w:val="666666"/>
+          <w:b w:val="0"/>
+          <w:color w:val="000000"/>
           <w:sz w:val="19"/>
         </w:rPr>
-        <w:t>[edit before send], Adam's 3-sentence key messages will prefill from the dashboard synthesis on the next fortnightly run. Type your replacement here.</w:t>
+        <w:t>This fortnight, Australia's regulatory landscape is dominated by higher education compliance pressures, with TEQSA and ASQA issuing joint alerts on overseas student transfers, the agent commission ban drawing scrutiny, and the federal government signalling a crackdown on antisemitism at universities, all while the Department of Employment and Workplace Relations releases a substantive report on AI and employment that positions workforce transition as a cross-sector regulatory priority. The most significant advisory opportunity lies in the convergence of higher education regulatory tightening and the AI and employment agenda, where institutions and government agencies alike face mounting compliance obligations without the analytical capability or governance frameworks to manage them coherently. Brief our higher education and workforce advisory teams to develop a targeted engagement proposition for institutions navigating TEQSA threshold standard amendments and agent commission compliance, and align this with our AI governance offering given the federal government's focus on AI and employment impacts.</w:t>
       </w:r>
     </w:p>
     <w:p>
@@ -153,11 +153,279 @@
       <w:r>
         <w:rPr>
           <w:rFonts w:ascii="Arial" w:hAnsi="Arial"/>
-          <w:i/>
-          <w:color w:val="666666"/>
+          <w:b/>
+          <w:color w:val="000000"/>
           <w:sz w:val="19"/>
         </w:rPr>
-        <w:t>No client-in-news signal this fortnight across any jurisdiction.</w:t>
+        <w:t>Victoria</w:t>
+      </w:r>
+    </w:p>
+    <w:p>
+      <w:pPr>
+        <w:pStyle w:val="ListBullet"/>
+      </w:pPr>
+      <w:r>
+        <w:rPr>
+          <w:rFonts w:ascii="Arial" w:hAnsi="Arial"/>
+          <w:b/>
+          <w:color w:val="000000"/>
+          <w:sz w:val="19"/>
+        </w:rPr>
+        <w:t>Commission for Children and Young People</w:t>
+      </w:r>
+      <w:r>
+        <w:rPr>
+          <w:rFonts w:ascii="Arial" w:hAnsi="Arial"/>
+          <w:color w:val="000000"/>
+          <w:sz w:val="19"/>
+        </w:rPr>
+        <w:t xml:space="preserve"> - </w:t>
+      </w:r>
+      <w:r>
+        <w:rPr>
+          <w:rFonts w:ascii="Arial" w:hAnsi="Arial"/>
+          <w:color w:val="000000"/>
+          <w:sz w:val="19"/>
+        </w:rPr>
+        <w:t>Child protection inquiry finds systemic reporting failures</w:t>
+      </w:r>
+    </w:p>
+    <w:p>
+      <w:pPr>
+        <w:pStyle w:val="ListBullet"/>
+      </w:pPr>
+      <w:r>
+        <w:rPr>
+          <w:rFonts w:ascii="Arial" w:hAnsi="Arial"/>
+          <w:b/>
+          <w:color w:val="000000"/>
+          <w:sz w:val="19"/>
+        </w:rPr>
+        <w:t>Consumer Affairs Victoria</w:t>
+      </w:r>
+      <w:r>
+        <w:rPr>
+          <w:rFonts w:ascii="Arial" w:hAnsi="Arial"/>
+          <w:color w:val="000000"/>
+          <w:sz w:val="19"/>
+        </w:rPr>
+        <w:t xml:space="preserve"> - </w:t>
+      </w:r>
+      <w:r>
+        <w:rPr>
+          <w:rFonts w:ascii="Arial" w:hAnsi="Arial"/>
+          <w:color w:val="000000"/>
+          <w:sz w:val="19"/>
+        </w:rPr>
+        <w:t>Estate agency prosecuted for systemic underquoting</w:t>
+      </w:r>
+    </w:p>
+    <w:p>
+      <w:pPr>
+        <w:pStyle w:val="ListBullet"/>
+      </w:pPr>
+      <w:r>
+        <w:rPr>
+          <w:rFonts w:ascii="Arial" w:hAnsi="Arial"/>
+          <w:b/>
+          <w:color w:val="000000"/>
+          <w:sz w:val="19"/>
+        </w:rPr>
+        <w:t>Victorian Gambling and Casino Control Commission</w:t>
+      </w:r>
+      <w:r>
+        <w:rPr>
+          <w:rFonts w:ascii="Arial" w:hAnsi="Arial"/>
+          <w:color w:val="000000"/>
+          <w:sz w:val="19"/>
+        </w:rPr>
+        <w:t xml:space="preserve"> - </w:t>
+      </w:r>
+      <w:r>
+        <w:rPr>
+          <w:rFonts w:ascii="Arial" w:hAnsi="Arial"/>
+          <w:color w:val="000000"/>
+          <w:sz w:val="19"/>
+        </w:rPr>
+        <w:t>VGCCC hosts Cambodia regulator on casino oversight</w:t>
+      </w:r>
+    </w:p>
+    <w:p>
+      <w:pPr>
+        <w:pStyle w:val="body_letter"/>
+      </w:pPr>
+      <w:r>
+        <w:rPr>
+          <w:rFonts w:ascii="Arial" w:hAnsi="Arial"/>
+          <w:b/>
+          <w:color w:val="000000"/>
+          <w:sz w:val="19"/>
+        </w:rPr>
+        <w:t>Commonwealth</w:t>
+      </w:r>
+    </w:p>
+    <w:p>
+      <w:pPr>
+        <w:pStyle w:val="ListBullet"/>
+      </w:pPr>
+      <w:r>
+        <w:rPr>
+          <w:rFonts w:ascii="Arial" w:hAnsi="Arial"/>
+          <w:b/>
+          <w:color w:val="000000"/>
+          <w:sz w:val="19"/>
+        </w:rPr>
+        <w:t>Tertiary Education Quality and Standards Agency</w:t>
+      </w:r>
+      <w:r>
+        <w:rPr>
+          <w:rFonts w:ascii="Arial" w:hAnsi="Arial"/>
+          <w:color w:val="000000"/>
+          <w:sz w:val="19"/>
+        </w:rPr>
+        <w:t xml:space="preserve"> - </w:t>
+      </w:r>
+      <w:r>
+        <w:rPr>
+          <w:rFonts w:ascii="Arial" w:hAnsi="Arial"/>
+          <w:color w:val="000000"/>
+          <w:sz w:val="19"/>
+        </w:rPr>
+        <w:t>TEQSA and ASQA issue joint overseas student compliance alert</w:t>
+      </w:r>
+    </w:p>
+    <w:p>
+      <w:pPr>
+        <w:pStyle w:val="ListBullet"/>
+      </w:pPr>
+      <w:r>
+        <w:rPr>
+          <w:rFonts w:ascii="Arial" w:hAnsi="Arial"/>
+          <w:b/>
+          <w:color w:val="000000"/>
+          <w:sz w:val="19"/>
+        </w:rPr>
+        <w:t>Department of Employment and Workplace Relations</w:t>
+      </w:r>
+      <w:r>
+        <w:rPr>
+          <w:rFonts w:ascii="Arial" w:hAnsi="Arial"/>
+          <w:color w:val="000000"/>
+          <w:sz w:val="19"/>
+        </w:rPr>
+        <w:t xml:space="preserve"> - </w:t>
+      </w:r>
+      <w:r>
+        <w:rPr>
+          <w:rFonts w:ascii="Arial" w:hAnsi="Arial"/>
+          <w:color w:val="000000"/>
+          <w:sz w:val="19"/>
+        </w:rPr>
+        <w:t>DEWR releases AI and employment report</w:t>
+      </w:r>
+    </w:p>
+    <w:p>
+      <w:pPr>
+        <w:pStyle w:val="ListBullet"/>
+      </w:pPr>
+      <w:r>
+        <w:rPr>
+          <w:rFonts w:ascii="Arial" w:hAnsi="Arial"/>
+          <w:b/>
+          <w:color w:val="000000"/>
+          <w:sz w:val="19"/>
+        </w:rPr>
+        <w:t>Therapeutic Goods Administration</w:t>
+      </w:r>
+      <w:r>
+        <w:rPr>
+          <w:rFonts w:ascii="Arial" w:hAnsi="Arial"/>
+          <w:color w:val="000000"/>
+          <w:sz w:val="19"/>
+        </w:rPr>
+        <w:t xml:space="preserve"> - </w:t>
+      </w:r>
+      <w:r>
+        <w:rPr>
+          <w:rFonts w:ascii="Arial" w:hAnsi="Arial"/>
+          <w:color w:val="000000"/>
+          <w:sz w:val="19"/>
+        </w:rPr>
+        <w:t>TGA responds publicly to 60 Minutes medical device scrutiny</w:t>
+      </w:r>
+    </w:p>
+    <w:p>
+      <w:pPr>
+        <w:pStyle w:val="body_letter"/>
+      </w:pPr>
+      <w:r>
+        <w:rPr>
+          <w:rFonts w:ascii="Arial" w:hAnsi="Arial"/>
+          <w:b/>
+          <w:color w:val="000000"/>
+          <w:sz w:val="19"/>
+        </w:rPr>
+        <w:t>New South Wales</w:t>
+      </w:r>
+    </w:p>
+    <w:p>
+      <w:pPr>
+        <w:pStyle w:val="ListBullet"/>
+      </w:pPr>
+      <w:r>
+        <w:rPr>
+          <w:rFonts w:ascii="Arial" w:hAnsi="Arial"/>
+          <w:b/>
+          <w:color w:val="000000"/>
+          <w:sz w:val="19"/>
+        </w:rPr>
+        <w:t>Independent Commission Against Corruption</w:t>
+      </w:r>
+      <w:r>
+        <w:rPr>
+          <w:rFonts w:ascii="Arial" w:hAnsi="Arial"/>
+          <w:color w:val="000000"/>
+          <w:sz w:val="19"/>
+        </w:rPr>
+        <w:t xml:space="preserve"> - </w:t>
+      </w:r>
+      <w:r>
+        <w:rPr>
+          <w:rFonts w:ascii="Arial" w:hAnsi="Arial"/>
+          <w:color w:val="000000"/>
+          <w:sz w:val="19"/>
+        </w:rPr>
+        <w:t>ICAC examines NSW Liberal factional conduct</w:t>
+      </w:r>
+    </w:p>
+    <w:p>
+      <w:pPr>
+        <w:pStyle w:val="ListBullet"/>
+      </w:pPr>
+      <w:r>
+        <w:rPr>
+          <w:rFonts w:ascii="Arial" w:hAnsi="Arial"/>
+          <w:b/>
+          <w:color w:val="000000"/>
+          <w:sz w:val="19"/>
+        </w:rPr>
+        <w:t>Environment Protection Authority</w:t>
+      </w:r>
+      <w:r>
+        <w:rPr>
+          <w:rFonts w:ascii="Arial" w:hAnsi="Arial"/>
+          <w:color w:val="000000"/>
+          <w:sz w:val="19"/>
+        </w:rPr>
+        <w:t xml:space="preserve"> - </w:t>
+      </w:r>
+      <w:r>
+        <w:rPr>
+          <w:rFonts w:ascii="Arial" w:hAnsi="Arial"/>
+          <w:color w:val="000000"/>
+          <w:sz w:val="19"/>
+        </w:rPr>
+        <w:t>NSW EPA releases FOGO business mandate council guidance</w:t>
       </w:r>
     </w:p>
     <w:p>
@@ -246,16 +514,234 @@
     </w:p>
     <w:p>
       <w:pPr>
-        <w:pStyle w:val="body_letter"/>
+        <w:pStyle w:val="ListBullet"/>
       </w:pPr>
       <w:r>
         <w:rPr>
           <w:rFonts w:ascii="Arial" w:hAnsi="Arial"/>
-          <w:i/>
-          <w:color w:val="666666"/>
+          <w:b/>
+          <w:color w:val="000000"/>
           <w:sz w:val="19"/>
         </w:rPr>
-        <w:t>No emerging risks signal this fortnight.</w:t>
+        <w:t>TEQSA and ASQA joint alert on overseas student transfer compliance</w:t>
+      </w:r>
+      <w:r>
+        <w:rPr>
+          <w:rFonts w:ascii="Arial" w:hAnsi="Arial"/>
+          <w:color w:val="000000"/>
+          <w:sz w:val="19"/>
+        </w:rPr>
+        <w:t xml:space="preserve"> - </w:t>
+      </w:r>
+      <w:r>
+        <w:rPr>
+          <w:rFonts w:ascii="Arial" w:hAnsi="Arial"/>
+          <w:color w:val="000000"/>
+          <w:sz w:val="19"/>
+        </w:rPr>
+        <w:t>TEQSA and ASQA issued a joint sector alert warning registered providers of serious compliance risks associated with non-genuine overseas student transfers between institutions.</w:t>
+      </w:r>
+      <w:r>
+        <w:rPr>
+          <w:rFonts w:ascii="Arial" w:hAnsi="Arial"/>
+          <w:color w:val="000000"/>
+          <w:sz w:val="19"/>
+        </w:rPr>
+        <w:t xml:space="preserve"> (</w:t>
+      </w:r>
+      <w:hyperlink r:id="rId10">
+        <w:r>
+          <w:rPr>
+            <w:rFonts w:ascii="Arial" w:hAnsi="Arial" w:cs="Arial"/>
+            <w:color w:val="0000FF"/>
+            <w:sz w:val="19"/>
+            <w:szCs w:val="19"/>
+            <w:u w:val="single"/>
+          </w:rPr>
+          <w:t xml:space="preserve">Read more</w:t>
+        </w:r>
+      </w:hyperlink>
+      <w:r>
+        <w:rPr>
+          <w:rFonts w:ascii="Arial" w:hAnsi="Arial"/>
+          <w:color w:val="000000"/>
+          <w:sz w:val="19"/>
+        </w:rPr>
+        <w:t>)</w:t>
+      </w:r>
+    </w:p>
+    <w:p>
+      <w:pPr>
+        <w:pStyle w:val="ListBullet"/>
+      </w:pPr>
+      <w:r>
+        <w:rPr>
+          <w:rFonts w:ascii="Arial" w:hAnsi="Arial"/>
+          <w:b/>
+          <w:color w:val="000000"/>
+          <w:sz w:val="19"/>
+        </w:rPr>
+        <w:t>Regulators raise compliance concerns over agent commission ban</w:t>
+      </w:r>
+      <w:r>
+        <w:rPr>
+          <w:rFonts w:ascii="Arial" w:hAnsi="Arial"/>
+          <w:color w:val="000000"/>
+          <w:sz w:val="19"/>
+        </w:rPr>
+        <w:t xml:space="preserve"> - </w:t>
+      </w:r>
+      <w:r>
+        <w:rPr>
+          <w:rFonts w:ascii="Arial" w:hAnsi="Arial"/>
+          <w:color w:val="000000"/>
+          <w:sz w:val="19"/>
+        </w:rPr>
+        <w:t>Australian regulators flagged compliance concerns about the overseas student agent commission ban, warning providers of risks to international student recruitment integrity and regulatory standing.</w:t>
+      </w:r>
+      <w:r>
+        <w:rPr>
+          <w:rFonts w:ascii="Arial" w:hAnsi="Arial"/>
+          <w:color w:val="000000"/>
+          <w:sz w:val="19"/>
+        </w:rPr>
+        <w:t xml:space="preserve"> (</w:t>
+      </w:r>
+      <w:hyperlink r:id="rId11">
+        <w:r>
+          <w:rPr>
+            <w:rFonts w:ascii="Arial" w:hAnsi="Arial" w:cs="Arial"/>
+            <w:color w:val="0000FF"/>
+            <w:sz w:val="19"/>
+            <w:szCs w:val="19"/>
+            <w:u w:val="single"/>
+          </w:rPr>
+          <w:t xml:space="preserve">Read more</w:t>
+        </w:r>
+      </w:hyperlink>
+      <w:r>
+        <w:rPr>
+          <w:rFonts w:ascii="Arial" w:hAnsi="Arial"/>
+          <w:color w:val="000000"/>
+          <w:sz w:val="19"/>
+        </w:rPr>
+        <w:t>)</w:t>
+      </w:r>
+    </w:p>
+    <w:p>
+      <w:pPr>
+        <w:pStyle w:val="ListBullet"/>
+      </w:pPr>
+      <w:r>
+        <w:rPr>
+          <w:rFonts w:ascii="Arial" w:hAnsi="Arial"/>
+          <w:b/>
+          <w:color w:val="000000"/>
+          <w:sz w:val="19"/>
+        </w:rPr>
+        <w:t>eSafety Commissioner finds Big Tech blind spots on child sexual extortion</w:t>
+      </w:r>
+      <w:r>
+        <w:rPr>
+          <w:rFonts w:ascii="Arial" w:hAnsi="Arial"/>
+          <w:color w:val="000000"/>
+          <w:sz w:val="19"/>
+        </w:rPr>
+        <w:t xml:space="preserve"> - </w:t>
+      </w:r>
+      <w:r>
+        <w:rPr>
+          <w:rFonts w:ascii="Arial" w:hAnsi="Arial"/>
+          <w:color w:val="000000"/>
+          <w:sz w:val="19"/>
+        </w:rPr>
+        <w:t>The eSafety Commissioner released a report finding that major technology platforms have significant blind spots in detecting and preventing sexual extortion targeting children and young adults.</w:t>
+      </w:r>
+      <w:r>
+        <w:rPr>
+          <w:rFonts w:ascii="Arial" w:hAnsi="Arial"/>
+          <w:color w:val="000000"/>
+          <w:sz w:val="19"/>
+        </w:rPr>
+        <w:t xml:space="preserve"> (</w:t>
+      </w:r>
+      <w:hyperlink r:id="rId12">
+        <w:r>
+          <w:rPr>
+            <w:rFonts w:ascii="Arial" w:hAnsi="Arial" w:cs="Arial"/>
+            <w:color w:val="0000FF"/>
+            <w:sz w:val="19"/>
+            <w:szCs w:val="19"/>
+            <w:u w:val="single"/>
+          </w:rPr>
+          <w:t xml:space="preserve">Read more</w:t>
+        </w:r>
+      </w:hyperlink>
+      <w:r>
+        <w:rPr>
+          <w:rFonts w:ascii="Arial" w:hAnsi="Arial"/>
+          <w:color w:val="000000"/>
+          <w:sz w:val="19"/>
+        </w:rPr>
+        <w:t>)</w:t>
+      </w:r>
+    </w:p>
+    <w:p>
+      <w:pPr>
+        <w:pStyle w:val="ListBullet"/>
+      </w:pPr>
+      <w:r>
+        <w:rPr>
+          <w:rFonts w:ascii="Arial" w:hAnsi="Arial"/>
+          <w:b/>
+          <w:color w:val="000000"/>
+          <w:sz w:val="19"/>
+        </w:rPr>
+        <w:t>TGA and manufacturers respond to medical device safety investigation</w:t>
+      </w:r>
+      <w:r>
+        <w:rPr>
+          <w:rFonts w:ascii="Arial" w:hAnsi="Arial"/>
+          <w:color w:val="000000"/>
+          <w:sz w:val="19"/>
+        </w:rPr>
+        <w:t xml:space="preserve"> - </w:t>
+      </w:r>
+      <w:r>
+        <w:rPr>
+          <w:rFonts w:ascii="Arial" w:hAnsi="Arial"/>
+          <w:color w:val="000000"/>
+          <w:sz w:val="19"/>
+        </w:rPr>
+        <w:t>The Therapeutic Goods Administration and device manufacturers issued responses to a broadcast investigation raising public safety concerns about the approval and monitoring of medical devices in…</w:t>
+      </w:r>
+      <w:r>
+        <w:rPr>
+          <w:rFonts w:ascii="Arial" w:hAnsi="Arial"/>
+          <w:color w:val="000000"/>
+          <w:sz w:val="19"/>
+        </w:rPr>
+        <w:t xml:space="preserve"> (</w:t>
+      </w:r>
+      <w:hyperlink r:id="rId13">
+        <w:r>
+          <w:rPr>
+            <w:rFonts w:ascii="Arial" w:hAnsi="Arial" w:cs="Arial"/>
+            <w:color w:val="0000FF"/>
+            <w:sz w:val="19"/>
+            <w:szCs w:val="19"/>
+            <w:u w:val="single"/>
+          </w:rPr>
+          <w:t xml:space="preserve">Read more</w:t>
+        </w:r>
+      </w:hyperlink>
+      <w:r>
+        <w:rPr>
+          <w:rFonts w:ascii="Arial" w:hAnsi="Arial"/>
+          <w:color w:val="000000"/>
+          <w:sz w:val="19"/>
+        </w:rPr>
+        <w:t>)</w:t>
       </w:r>
     </w:p>
     <w:p>
@@ -274,16 +760,118 @@
     </w:p>
     <w:p>
       <w:pPr>
-        <w:pStyle w:val="body_letter"/>
+        <w:pStyle w:val="ListBullet"/>
       </w:pPr>
       <w:r>
         <w:rPr>
           <w:rFonts w:ascii="Arial" w:hAnsi="Arial"/>
-          <w:i/>
-          <w:color w:val="666666"/>
+          <w:b/>
+          <w:color w:val="000000"/>
           <w:sz w:val="19"/>
         </w:rPr>
-        <w:t>No ai adoption signal this fortnight.</w:t>
+        <w:t>DEWR releases AI and Employment in Australia report</w:t>
+      </w:r>
+      <w:r>
+        <w:rPr>
+          <w:rFonts w:ascii="Arial" w:hAnsi="Arial"/>
+          <w:color w:val="000000"/>
+          <w:sz w:val="19"/>
+        </w:rPr>
+        <w:t xml:space="preserve"> - </w:t>
+      </w:r>
+      <w:r>
+        <w:rPr>
+          <w:rFonts w:ascii="Arial" w:hAnsi="Arial"/>
+          <w:color w:val="000000"/>
+          <w:sz w:val="19"/>
+        </w:rPr>
+        <w:t>The Department of Employment and Workplace Relations published its AI and Employment in Australia report, assessing AI-driven workforce disruption and outlining the policy response required to…</w:t>
+      </w:r>
+      <w:r>
+        <w:rPr>
+          <w:rFonts w:ascii="Arial" w:hAnsi="Arial"/>
+          <w:color w:val="000000"/>
+          <w:sz w:val="19"/>
+        </w:rPr>
+        <w:t xml:space="preserve"> (</w:t>
+      </w:r>
+      <w:hyperlink r:id="rId14">
+        <w:r>
+          <w:rPr>
+            <w:rFonts w:ascii="Arial" w:hAnsi="Arial" w:cs="Arial"/>
+            <w:color w:val="0000FF"/>
+            <w:sz w:val="19"/>
+            <w:szCs w:val="19"/>
+            <w:u w:val="single"/>
+          </w:rPr>
+          <w:t xml:space="preserve">Read more</w:t>
+        </w:r>
+      </w:hyperlink>
+      <w:r>
+        <w:rPr>
+          <w:rFonts w:ascii="Arial" w:hAnsi="Arial"/>
+          <w:color w:val="000000"/>
+          <w:sz w:val="19"/>
+        </w:rPr>
+        <w:t>)</w:t>
+      </w:r>
+    </w:p>
+    <w:p>
+      <w:pPr>
+        <w:pStyle w:val="ListBullet"/>
+      </w:pPr>
+      <w:r>
+        <w:rPr>
+          <w:rFonts w:ascii="Arial" w:hAnsi="Arial"/>
+          <w:b/>
+          <w:color w:val="000000"/>
+          <w:sz w:val="19"/>
+        </w:rPr>
+        <w:t>ACNC charity data made available through BLADE for researchers</w:t>
+      </w:r>
+      <w:r>
+        <w:rPr>
+          <w:rFonts w:ascii="Arial" w:hAnsi="Arial"/>
+          <w:color w:val="000000"/>
+          <w:sz w:val="19"/>
+        </w:rPr>
+        <w:t xml:space="preserve"> - </w:t>
+      </w:r>
+      <w:r>
+        <w:rPr>
+          <w:rFonts w:ascii="Arial" w:hAnsi="Arial"/>
+          <w:color w:val="000000"/>
+          <w:sz w:val="19"/>
+        </w:rPr>
+        <w:t>The Australian Charities and Not-for-profits Commission opened its charity dataset through the BLADE platform, enabling approved researchers to apply advanced analytics to drive evidence-based…</w:t>
+      </w:r>
+      <w:r>
+        <w:rPr>
+          <w:rFonts w:ascii="Arial" w:hAnsi="Arial"/>
+          <w:color w:val="000000"/>
+          <w:sz w:val="19"/>
+        </w:rPr>
+        <w:t xml:space="preserve"> (</w:t>
+      </w:r>
+      <w:hyperlink r:id="rId15">
+        <w:r>
+          <w:rPr>
+            <w:rFonts w:ascii="Arial" w:hAnsi="Arial" w:cs="Arial"/>
+            <w:color w:val="0000FF"/>
+            <w:sz w:val="19"/>
+            <w:szCs w:val="19"/>
+            <w:u w:val="single"/>
+          </w:rPr>
+          <w:t xml:space="preserve">Read more</w:t>
+        </w:r>
+      </w:hyperlink>
+      <w:r>
+        <w:rPr>
+          <w:rFonts w:ascii="Arial" w:hAnsi="Arial"/>
+          <w:color w:val="000000"/>
+          <w:sz w:val="19"/>
+        </w:rPr>
+        <w:t>)</w:t>
       </w:r>
     </w:p>
     <w:p>
@@ -302,16 +890,118 @@
     </w:p>
     <w:p>
       <w:pPr>
-        <w:pStyle w:val="body_letter"/>
+        <w:pStyle w:val="ListBullet"/>
       </w:pPr>
       <w:r>
         <w:rPr>
           <w:rFonts w:ascii="Arial" w:hAnsi="Arial"/>
-          <w:i/>
-          <w:color w:val="666666"/>
+          <w:b/>
+          <w:color w:val="000000"/>
           <w:sz w:val="19"/>
         </w:rPr>
-        <w:t>No regulatory burden signal this fortnight.</w:t>
+        <w:t>TEQSA announces amendments to Higher Education Threshold Standards</w:t>
+      </w:r>
+      <w:r>
+        <w:rPr>
+          <w:rFonts w:ascii="Arial" w:hAnsi="Arial"/>
+          <w:color w:val="000000"/>
+          <w:sz w:val="19"/>
+        </w:rPr>
+        <w:t xml:space="preserve"> - </w:t>
+      </w:r>
+      <w:r>
+        <w:rPr>
+          <w:rFonts w:ascii="Arial" w:hAnsi="Arial"/>
+          <w:color w:val="000000"/>
+          <w:sz w:val="19"/>
+        </w:rPr>
+        <w:t>TEQSA announced amendments to the Higher Education Threshold Standards, placing updated compliance obligations on registered providers and signalling a recalibration of quality benchmarks across the…</w:t>
+      </w:r>
+      <w:r>
+        <w:rPr>
+          <w:rFonts w:ascii="Arial" w:hAnsi="Arial"/>
+          <w:color w:val="000000"/>
+          <w:sz w:val="19"/>
+        </w:rPr>
+        <w:t xml:space="preserve"> (</w:t>
+      </w:r>
+      <w:hyperlink r:id="rId16">
+        <w:r>
+          <w:rPr>
+            <w:rFonts w:ascii="Arial" w:hAnsi="Arial" w:cs="Arial"/>
+            <w:color w:val="0000FF"/>
+            <w:sz w:val="19"/>
+            <w:szCs w:val="19"/>
+            <w:u w:val="single"/>
+          </w:rPr>
+          <w:t xml:space="preserve">Read more</w:t>
+        </w:r>
+      </w:hyperlink>
+      <w:r>
+        <w:rPr>
+          <w:rFonts w:ascii="Arial" w:hAnsi="Arial"/>
+          <w:color w:val="000000"/>
+          <w:sz w:val="19"/>
+        </w:rPr>
+        <w:t>)</w:t>
+      </w:r>
+    </w:p>
+    <w:p>
+      <w:pPr>
+        <w:pStyle w:val="ListBullet"/>
+      </w:pPr>
+      <w:r>
+        <w:rPr>
+          <w:rFonts w:ascii="Arial" w:hAnsi="Arial"/>
+          <w:b/>
+          <w:color w:val="000000"/>
+          <w:sz w:val="19"/>
+        </w:rPr>
+        <w:t>New NDIS rules expose small disability carers to criminal penalties</w:t>
+      </w:r>
+      <w:r>
+        <w:rPr>
+          <w:rFonts w:ascii="Arial" w:hAnsi="Arial"/>
+          <w:color w:val="000000"/>
+          <w:sz w:val="19"/>
+        </w:rPr>
+        <w:t xml:space="preserve"> - </w:t>
+      </w:r>
+      <w:r>
+        <w:rPr>
+          <w:rFonts w:ascii="Arial" w:hAnsi="Arial"/>
+          <w:color w:val="000000"/>
+          <w:sz w:val="19"/>
+        </w:rPr>
+        <w:t>New NDIS regulatory requirements create criminal liability risks for small disability carers, with sector advocates warning that the compliance burden is falling on providers who remain largely…</w:t>
+      </w:r>
+      <w:r>
+        <w:rPr>
+          <w:rFonts w:ascii="Arial" w:hAnsi="Arial"/>
+          <w:color w:val="000000"/>
+          <w:sz w:val="19"/>
+        </w:rPr>
+        <w:t xml:space="preserve"> (</w:t>
+      </w:r>
+      <w:hyperlink r:id="rId17">
+        <w:r>
+          <w:rPr>
+            <w:rFonts w:ascii="Arial" w:hAnsi="Arial" w:cs="Arial"/>
+            <w:color w:val="0000FF"/>
+            <w:sz w:val="19"/>
+            <w:szCs w:val="19"/>
+            <w:u w:val="single"/>
+          </w:rPr>
+          <w:t xml:space="preserve">Read more</w:t>
+        </w:r>
+      </w:hyperlink>
+      <w:r>
+        <w:rPr>
+          <w:rFonts w:ascii="Arial" w:hAnsi="Arial"/>
+          <w:color w:val="000000"/>
+          <w:sz w:val="19"/>
+        </w:rPr>
+        <w:t>)</w:t>
       </w:r>
     </w:p>
     <w:p>
@@ -409,6 +1099,20 @@
       <w:r>
         <w:rPr>
           <w:rFonts w:ascii="Arial" w:hAnsi="Arial"/>
+          <w:b w:val="0"/>
+          <w:color w:val="000000"/>
+          <w:sz w:val="19"/>
+        </w:rPr>
+        <w:t>The fortnight's education regulatory landscape is defined by three compounding signals: TEQSA's aggressive supervisory posture, epitomised by Julie Bishop's public resignation from ANU citing 'coercive threats' and 'overreach', signals a regulator willing to escalate governance interventions, with public servants now mobilised inside ANU and immediate reputational and advisory demand live at the institution. Concurrently, TEQSA's amendments to the Higher Education Threshold Standards and the joint ASQA-TEQSA overseas-student-transfer compliance alert mark a structural uplift cycle that will force governance, student-protection, and international-cohort management investments across the university and VET sectors before the next assessment window. The ATEC Working Group's advancing costing-and-pricing framework creates a near-term financial modelling and strategic advisory window as universities face funding compression, while the Free TAFE expansion and DEWR's AI and employment report signal a sustained workforce-transformation overlay reshaping qualification relevance and delivery models. ASQA's escalation to cancelling childcare qualifications issued by a deregistered RTO, combined with the NCVET-ASQA quality-assurance MOU, accelerates enforcement risk for VET providers and validates an assurance and re-registration advisory offer. KPMG's priority BD investments this fortnight are ANU governance stabilisation, Threshold Standards readiness across the Go8, and VET provider compliance remediation ahead of ASQA enforcement calendar activation.</w:t>
+      </w:r>
+    </w:p>
+    <w:p>
+      <w:pPr>
+        <w:pStyle w:val="body_letter"/>
+      </w:pPr>
+      <w:r>
+        <w:rPr>
+          <w:rFonts w:ascii="Arial" w:hAnsi="Arial"/>
           <w:b/>
           <w:color w:val="000000"/>
           <w:sz w:val="19"/>
@@ -426,7 +1130,7 @@
           <w:color w:val="000000"/>
           <w:sz w:val="19"/>
         </w:rPr>
-        <w:t>Brief the relevant sector partner this fortnight on the highest-signal regulator development above.</w:t>
+        <w:t>Engage ANU's incoming leadership and Council this week to position KPMG for a governance stabilisation and TEQSA regulatory-relations advisory mandate before external appointments lock in a competitor.</w:t>
       </w:r>
     </w:p>
     <w:p>
@@ -439,7 +1143,7 @@
           <w:color w:val="000000"/>
           <w:sz w:val="19"/>
         </w:rPr>
-        <w:t>Convene the capability bench for the next reg-tech / capability-review pursuit in pipeline.</w:t>
+        <w:t>Launch a Threshold Standards readiness diagnostic to the Go8 and ATN university roster, framing it as a pre-assessment risk triage ahead of TEQSA's next compliance cycle.</w:t>
       </w:r>
     </w:p>
     <w:p>
@@ -452,7 +1156,112 @@
           <w:color w:val="000000"/>
           <w:sz w:val="19"/>
         </w:rPr>
-        <w:t>Pursue at least one tracked client on a near-term advisory hook before the next CoP cadence.</w:t>
+        <w:t>Convene a targeted CFO roundtable with ATEC Working Group member institutions to establish KPMG's financial modelling and strategic pricing capability ahead of formal sector costing-framework adoption.</w:t>
+      </w:r>
+    </w:p>
+    <w:p>
+      <w:pPr>
+        <w:pStyle w:val="ListBullet"/>
+      </w:pPr>
+      <w:r>
+        <w:rPr>
+          <w:rFonts w:ascii="Arial" w:hAnsi="Arial"/>
+          <w:color w:val="000000"/>
+          <w:sz w:val="19"/>
+        </w:rPr>
+        <w:t>Activate a VET compliance remediation offer to childcare and early-education RTO clients citing the ASQA cancellation action as a concrete enforcement precedent requiring immediate gap assessment and re-registration readiness work.</w:t>
+      </w:r>
+    </w:p>
+    <w:p>
+      <w:pPr>
+        <w:pStyle w:val="ListBullet"/>
+      </w:pPr>
+      <w:r>
+        <w:rPr>
+          <w:rFonts w:ascii="Arial" w:hAnsi="Arial"/>
+          <w:color w:val="000000"/>
+          <w:sz w:val="19"/>
+        </w:rPr>
+        <w:t>Brief the workforce transformation practice on the DEWR AI and employment report to develop a bundled AI-capability uplift and change advisory proposition for universities and TAFEs facing dual pressure on qualification relevance and teaching model redesign.</w:t>
+      </w:r>
+    </w:p>
+    <w:p>
+      <w:pPr>
+        <w:pStyle w:val="body_letter"/>
+      </w:pPr>
+      <w:r>
+        <w:rPr>
+          <w:rFonts w:ascii="Arial" w:hAnsi="Arial"/>
+          <w:b/>
+          <w:color w:val="000000"/>
+          <w:sz w:val="19"/>
+        </w:rPr>
+        <w:t>Implications for clients</w:t>
+      </w:r>
+    </w:p>
+    <w:p>
+      <w:pPr>
+        <w:pStyle w:val="ListBullet"/>
+      </w:pPr>
+      <w:r>
+        <w:rPr>
+          <w:rFonts w:ascii="Arial" w:hAnsi="Arial"/>
+          <w:color w:val="000000"/>
+          <w:sz w:val="19"/>
+        </w:rPr>
+        <w:t>Engage ANU's incoming leadership and Council this week to position KPMG for a governance stabilisation and TEQSA regulatory-relations advisory mandate before external appointments lock in a competitor.</w:t>
+      </w:r>
+    </w:p>
+    <w:p>
+      <w:pPr>
+        <w:pStyle w:val="ListBullet"/>
+      </w:pPr>
+      <w:r>
+        <w:rPr>
+          <w:rFonts w:ascii="Arial" w:hAnsi="Arial"/>
+          <w:color w:val="000000"/>
+          <w:sz w:val="19"/>
+        </w:rPr>
+        <w:t>Launch a Threshold Standards readiness diagnostic to the Go8 and ATN university roster, framing it as a pre-assessment risk triage ahead of TEQSA's next compliance cycle.</w:t>
+      </w:r>
+    </w:p>
+    <w:p>
+      <w:pPr>
+        <w:pStyle w:val="ListBullet"/>
+      </w:pPr>
+      <w:r>
+        <w:rPr>
+          <w:rFonts w:ascii="Arial" w:hAnsi="Arial"/>
+          <w:color w:val="000000"/>
+          <w:sz w:val="19"/>
+        </w:rPr>
+        <w:t>Convene a targeted CFO roundtable with ATEC Working Group member institutions to establish KPMG's financial modelling and strategic pricing capability ahead of formal sector costing-framework adoption.</w:t>
+      </w:r>
+    </w:p>
+    <w:p>
+      <w:pPr>
+        <w:pStyle w:val="ListBullet"/>
+      </w:pPr>
+      <w:r>
+        <w:rPr>
+          <w:rFonts w:ascii="Arial" w:hAnsi="Arial"/>
+          <w:color w:val="000000"/>
+          <w:sz w:val="19"/>
+        </w:rPr>
+        <w:t>Activate a VET compliance remediation offer to childcare and early-education RTO clients citing the ASQA cancellation action as a concrete enforcement precedent requiring immediate gap assessment and re-registration readiness work.</w:t>
+      </w:r>
+    </w:p>
+    <w:p>
+      <w:pPr>
+        <w:pStyle w:val="ListBullet"/>
+      </w:pPr>
+      <w:r>
+        <w:rPr>
+          <w:rFonts w:ascii="Arial" w:hAnsi="Arial"/>
+          <w:color w:val="000000"/>
+          <w:sz w:val="19"/>
+        </w:rPr>
+        <w:t>Brief the workforce transformation practice on the DEWR AI and employment report to develop a bundled AI-capability uplift and change advisory proposition for universities and TAFEs facing dual pressure on qualification relevance and teaching model redesign.</w:t>
       </w:r>
     </w:p>
     <w:p>
@@ -476,11 +1285,221 @@
       <w:r>
         <w:rPr>
           <w:rFonts w:ascii="Arial" w:hAnsi="Arial"/>
-          <w:i/>
-          <w:color w:val="666666"/>
+          <w:b/>
+          <w:color w:val="000000"/>
           <w:sz w:val="19"/>
         </w:rPr>
-        <w:t>No sector-level synthesis available this fortnight.</w:t>
+        <w:t>Public Sector</w:t>
+      </w:r>
+    </w:p>
+    <w:p>
+      <w:pPr>
+        <w:pStyle w:val="body_letter"/>
+      </w:pPr>
+      <w:r>
+        <w:rPr>
+          <w:rFonts w:ascii="Arial" w:hAnsi="Arial"/>
+          <w:b w:val="0"/>
+          <w:color w:val="000000"/>
+          <w:sz w:val="19"/>
+        </w:rPr>
+        <w:t>The Commonwealth's announcement of Australian Standards for AI shifts the policy intent to implementation obligation, creating immediate advisory demand for AI governance frameworks, risk uplift, and assurance readiness across federal agencies before procurement cycles open. Concurrently, expanding Security of Critical Infrastructure Act requirements are imposing tighter compliance timelines on government-owned and government-adjacent operators, opening assurance and program advisory pursuits particularly in energy and transport portfolios. The APSC's live APS bargaining posture, alongside Tasmania's active state-government workforce retraining initiative for the Liberty Bell Bay cohort, signals a sustained public sector L&amp;D and workforce-transformation pipeline at both Commonwealth and state levels. The Robodebt whistleblower litigation now before the courts continues to focus executive attention on public sector integrity, accountability culture, and protected disclosure frameworks, sustaining demand for culture and governance advisory.</w:t>
+      </w:r>
+    </w:p>
+    <w:p>
+      <w:pPr>
+        <w:pStyle w:val="body_letter"/>
+      </w:pPr>
+      <w:r>
+        <w:rPr>
+          <w:rFonts w:ascii="Arial" w:hAnsi="Arial"/>
+          <w:b/>
+          <w:color w:val="000000"/>
+          <w:sz w:val="19"/>
+        </w:rPr>
+        <w:t>Financial Services</w:t>
+      </w:r>
+    </w:p>
+    <w:p>
+      <w:pPr>
+        <w:pStyle w:val="body_letter"/>
+      </w:pPr>
+      <w:r>
+        <w:rPr>
+          <w:rFonts w:ascii="Arial" w:hAnsi="Arial"/>
+          <w:b w:val="0"/>
+          <w:color w:val="000000"/>
+          <w:sz w:val="19"/>
+        </w:rPr>
+        <w:t>The Treasurer's formal riding instructions to APRA and ASIC, reinforced by ASIC's published Statement of Intent, mark a deliberate regulatory pivot toward growth-enabling supervision without softening enforcement, ASIC recorded a record $830 million in civil penalties in 2025-26, signalling simultaneous deregulatory ambition and heightened accountability. The Financial Accountability Regime remains materially underutilised in superannuation, creating an active advisory window for FAR gap assessments and accountability-mapping engagements across super trustees before enforcement posture hardens. Systemic reporting failures at Deutsche Bank (trade reporting, $2M penalty) and NAB's WealthHub ($1M+ breach reporting fine), alongside multiple AFS licence suspensions and wind-up actions, reflect a pattern of governance and controls deficiency that supports assurance, remediation, and managed-services pitches across banking and wealth. Labor's AI-powered regulatory red-tape reduction agenda adds a technology-transformation hook, particularly for institutions facing dual pressure to cut compliance cost while meeting elevated FAR and reporting obligations.</w:t>
+      </w:r>
+    </w:p>
+    <w:p>
+      <w:pPr>
+        <w:pStyle w:val="body_letter"/>
+      </w:pPr>
+      <w:r>
+        <w:rPr>
+          <w:rFonts w:ascii="Arial" w:hAnsi="Arial"/>
+          <w:b/>
+          <w:color w:val="000000"/>
+          <w:sz w:val="19"/>
+        </w:rPr>
+        <w:t>Health, Ageing &amp; Human Services</w:t>
+      </w:r>
+    </w:p>
+    <w:p>
+      <w:pPr>
+        <w:pStyle w:val="body_letter"/>
+      </w:pPr>
+      <w:r>
+        <w:rPr>
+          <w:rFonts w:ascii="Arial" w:hAnsi="Arial"/>
+          <w:b w:val="0"/>
+          <w:color w:val="000000"/>
+          <w:sz w:val="19"/>
+        </w:rPr>
+        <w:t>The NDIS Quality and Safeguards Commission's mandatory registration regime represents a structural compliance inflection point for the sector, forcing thousands of currently unregistered providers to meet registration standards under criminal-liability exposure, a direct readiness and governance advisory pull-through. Ahpra's CEO has publicly anchored a multi-year transformation agenda around cultural safety, proactive oversight, and future-ready digital regulation, signalling sustained investment in operating model and capability uplift where KPMG can compete on both strategy and delivery. The TGA's responsive posture to the 60 Minutes medical device investigation, combined with its launch of interactive regulatory e-learning modules, indicates a regulator under reputational and parliamentary pressure investing in stakeholder engagement infrastructure, an environment that rewards a trusted advisory presence. A concurrent CCYP inquiry finding that multiple child protection reports failed to stem harm adds a cross-sector systemic reform signal, reinforcing demand for risk assurance and case-management redesign across human services agencies.</w:t>
+      </w:r>
+    </w:p>
+    <w:p>
+      <w:pPr>
+        <w:pStyle w:val="body_letter"/>
+      </w:pPr>
+      <w:r>
+        <w:rPr>
+          <w:rFonts w:ascii="Arial" w:hAnsi="Arial"/>
+          <w:b/>
+          <w:color w:val="000000"/>
+          <w:sz w:val="19"/>
+        </w:rPr>
+        <w:t>Energy, Mining &amp; Property</w:t>
+      </w:r>
+    </w:p>
+    <w:p>
+      <w:pPr>
+        <w:pStyle w:val="body_letter"/>
+      </w:pPr>
+      <w:r>
+        <w:rPr>
+          <w:rFonts w:ascii="Arial" w:hAnsi="Arial"/>
+          <w:b w:val="0"/>
+          <w:color w:val="000000"/>
+          <w:sz w:val="19"/>
+        </w:rPr>
+        <w:t>The AER's Independent Panel report on the 2026 Rate of Return Instrument is the highest-priority regulatory economics signal this fortnight, with the instrument's final settings directly shaping allowable returns across all gas and electricity access arrangements currently in reset, including RBP (2027-32), AusNet Gas, and Multinet (2028-33). APA Group's concurrent advanced capex and South West Pipeline determinations, combined with LMS Energy and AGIG submissions into the Multinet and AusNet resets, mark a concentrated window of network regulatory activity where KPMG's regulatory economics and submission advisory capability can be deployed at scale. The Federal Government's Critical Minerals Production Tax Incentive consultation and the WA project approval anchoring the Australia-US critical minerals pact signal strong upstream investment momentum, generating demand for incentive guidance, project-level due diligence, and compliance program design. Origin Energy's ACCC-mandated customer refund program and the Fair Work regulator's action over unpaid wages on a WA offshore platform are live enforcement signals that reinforce the case for proactive compliance and regulatory risk engagements across energy and resources clients.</w:t>
+      </w:r>
+    </w:p>
+    <w:p>
+      <w:pPr>
+        <w:pStyle w:val="body_letter"/>
+      </w:pPr>
+      <w:r>
+        <w:rPr>
+          <w:rFonts w:ascii="Arial" w:hAnsi="Arial"/>
+          <w:b/>
+          <w:color w:val="000000"/>
+          <w:sz w:val="19"/>
+        </w:rPr>
+        <w:t>National Security &amp; Justice</w:t>
+      </w:r>
+    </w:p>
+    <w:p>
+      <w:pPr>
+        <w:pStyle w:val="body_letter"/>
+      </w:pPr>
+      <w:r>
+        <w:rPr>
+          <w:rFonts w:ascii="Arial" w:hAnsi="Arial"/>
+          <w:b w:val="0"/>
+          <w:color w:val="000000"/>
+          <w:sz w:val="19"/>
+        </w:rPr>
+        <w:t>AUSTRAC's publication of AML/CTF program-build resources and professional designated services guidance, timed to the imminent tranche-2 extension of obligations to real estate agents, lawyers, and accountants, signals a step-change in the regulated population that creates an immediate compliance program build-out wave KPMG's financial crime practice should be positioned to capture ahead of implementation deadlines. The ACIC's ten-year wastewater analytics milestone and its consolidation of national policing data under NCIS demonstrate sustained Commonwealth investment in intelligence data capability, opening near-term data architecture, governance, and analytics advisory opportunities. The AFP's Operation Moonbi and ABF's enforcement actions on weapons importation and Russia export-control breaches reinforce an active enforcement cycle across the national security portfolio, which partners should use as a market-activation trigger. KPMG should accelerate real estate and professional-services sector outreach on AML/CTF gap assessments while initiating a scoping conversation with the ACIC account team on the NCIS data-platform expansion.</w:t>
+      </w:r>
+    </w:p>
+    <w:p>
+      <w:pPr>
+        <w:pStyle w:val="body_letter"/>
+      </w:pPr>
+      <w:r>
+        <w:rPr>
+          <w:rFonts w:ascii="Arial" w:hAnsi="Arial"/>
+          <w:b/>
+          <w:color w:val="000000"/>
+          <w:sz w:val="19"/>
+        </w:rPr>
+        <w:t>Defence</w:t>
+      </w:r>
+    </w:p>
+    <w:p>
+      <w:pPr>
+        <w:pStyle w:val="body_letter"/>
+      </w:pPr>
+      <w:r>
+        <w:rPr>
+          <w:rFonts w:ascii="Arial" w:hAnsi="Arial"/>
+          <w:b w:val="0"/>
+          <w:color w:val="000000"/>
+          <w:sz w:val="19"/>
+        </w:rPr>
+        <w:t>The Defence portfolio is generating strong forward signals across capability investment, export commercialisation, and data governance reform. The Department of Defence's stated shift to an 'enable, not gatekeep' posture on sensitive data and expertise guidelines creates an immediate advisory opening around industry engagement frameworks, information architecture, and data-sharing governance for prime and sub-prime contractors. Confirmation of AUKUS Pillar II's first signature project formalises a trilateral advanced-capabilities pipeline, driving sustained demand across technology transfer governance, program assurance, and sovereign industrial base development. Australia's record $2.5b radar export deal with Canada signals a maturing defence export machinery, raising near-term demand for export compliance frameworks, offset obligation structuring, and commercial due diligence support.</w:t>
+      </w:r>
+    </w:p>
+    <w:p>
+      <w:pPr>
+        <w:pStyle w:val="body_letter"/>
+      </w:pPr>
+      <w:r>
+        <w:rPr>
+          <w:rFonts w:ascii="Arial" w:hAnsi="Arial"/>
+          <w:b/>
+          <w:color w:val="000000"/>
+          <w:sz w:val="19"/>
+        </w:rPr>
+        <w:t>Transport</w:t>
+      </w:r>
+    </w:p>
+    <w:p>
+      <w:pPr>
+        <w:pStyle w:val="body_letter"/>
+      </w:pPr>
+      <w:r>
+        <w:rPr>
+          <w:rFonts w:ascii="Arial" w:hAnsi="Arial"/>
+          <w:b w:val="0"/>
+          <w:color w:val="000000"/>
+          <w:sz w:val="19"/>
+        </w:rPr>
+        <w:t>AMSA's National Compliance Plan 2026-27 formalises an enforcement uplift cycle targeting operator risk practices and seafarer safety standards, providing a concrete entry point for compliance-readiness and assurance engagements across maritime clients before the enforcement calendar activates. CASA is advancing dual active consultations, annual registration for VH-registered aircraft (PP 2616CS) and expanded drone operations above 400 ft in defined environments (PP 2612US), while Home Affairs runs a parallel drone security consultation, signalling a multi-agency UAS regulatory architecture build that will require operators to redesign compliance frameworks from the ground up. New CASA pathways for UK and US aircraft maintenance engineers and the Bonza commercial approval reinforce underlying aviation workforce and capability gaps, while the Victorian Government's road safety camera technology trial flags state-level transport tech procurement pipeline. KPMG is well-positioned to lead compliance architecture design, risk framework uplift, and implementation advisory across both the maritime enforcement cycle and the converging aviation and UAS regulatory reform agenda.</w:t>
+      </w:r>
+    </w:p>
+    <w:p>
+      <w:pPr>
+        <w:pStyle w:val="body_letter"/>
+      </w:pPr>
+      <w:r>
+        <w:rPr>
+          <w:rFonts w:ascii="Arial" w:hAnsi="Arial"/>
+          <w:b/>
+          <w:color w:val="000000"/>
+          <w:sz w:val="19"/>
+        </w:rPr>
+        <w:t>Education</w:t>
+      </w:r>
+    </w:p>
+    <w:p>
+      <w:pPr>
+        <w:pStyle w:val="body_letter"/>
+      </w:pPr>
+      <w:r>
+        <w:rPr>
+          <w:rFonts w:ascii="Arial" w:hAnsi="Arial"/>
+          <w:b w:val="0"/>
+          <w:color w:val="000000"/>
+          <w:sz w:val="19"/>
+        </w:rPr>
+        <w:t>TEQSA's amendments to the Higher Education Threshold Standards and the joint ASQA-TEQSA compliance alert on overseas student transfers signal a sustained regulatory uplift cycle across both university and VET sectors, with provider governance, student protections, and international cohort management all under heightened scrutiny. The ATEC Working Group on Higher Education Costing and Pricing is advancing sector-wide costing frameworks, creating near-term demand for financial modelling and strategic pricing advisory among universities facing funding pressure. ASQA's move to cancel childcare qualifications issued by a deregistered RTO, alongside the NCVET-ASQA quality-assurance MOU, points to accelerating cross-jurisdictional compliance burden for VET providers and a pull-through for risk and assurance engagements. DEWR's AI and employment report adds a workforce-transformation overlay, with education and training providers likely to require capability uplift and change advisory as AI reshapes qualification relevance and delivery models.</w:t>
       </w:r>
     </w:p>
     <w:p>
@@ -504,11 +1523,249 @@
       <w:r>
         <w:rPr>
           <w:rFonts w:ascii="Arial" w:hAnsi="Arial"/>
-          <w:i/>
-          <w:color w:val="666666"/>
+          <w:b/>
+          <w:color w:val="000000"/>
           <w:sz w:val="19"/>
         </w:rPr>
-        <w:t>No jurisdiction-level synthesis available this fortnight.</w:t>
+        <w:t>Commonwealth</w:t>
+      </w:r>
+    </w:p>
+    <w:p>
+      <w:pPr>
+        <w:pStyle w:val="body_letter"/>
+      </w:pPr>
+      <w:r>
+        <w:rPr>
+          <w:rFonts w:ascii="Arial" w:hAnsi="Arial"/>
+          <w:b w:val="0"/>
+          <w:color w:val="000000"/>
+          <w:sz w:val="19"/>
+        </w:rPr>
+        <w:t>ASIC delivered a record $830 million in penalties across its strongest enforcement year to date, underscoring a materially elevated federal enforcement posture in financial services and corporate conduct that raises compliance risk for regulated entities. The Albanese Government announced mandatory Australian AI Standards, a comprehensive framework governing automated decision-making by Commonwealth agencies and industry, creating immediate and prospective compliance obligations for entities operating under federal regulation, with legal analysis from Maddocks and White &amp; Case flagging a significant course change from prior voluntary guidance. The Department of Home Affairs has opened consultation on proposed amendments to streamline and modernise the Security of Critical Infrastructure Act 2018, presenting a near-term advisory window for regulated critical infrastructure operators. Financial regulators have also received a formal growth mandate welcomed by the banking sector, signalling a strategic reorientation of supervisory priorities that KPMG clients should monitor for downstream compliance implications.</w:t>
+      </w:r>
+    </w:p>
+    <w:p>
+      <w:pPr>
+        <w:pStyle w:val="body_letter"/>
+      </w:pPr>
+      <w:r>
+        <w:rPr>
+          <w:rFonts w:ascii="Arial" w:hAnsi="Arial"/>
+          <w:b/>
+          <w:color w:val="000000"/>
+          <w:sz w:val="19"/>
+        </w:rPr>
+        <w:t>New South Wales</w:t>
+      </w:r>
+    </w:p>
+    <w:p>
+      <w:pPr>
+        <w:pStyle w:val="body_letter"/>
+      </w:pPr>
+      <w:r>
+        <w:rPr>
+          <w:rFonts w:ascii="Arial" w:hAnsi="Arial"/>
+          <w:b w:val="0"/>
+          <w:color w:val="000000"/>
+          <w:sz w:val="19"/>
+        </w:rPr>
+        <w:t>SafeWork NSW is intensifying enforcement focus across high-risk industries, with quarrying and other sectors flagged for heightened compliance scrutiny, creating advisory demand around WHS frameworks. NSW is progressing amendments to building regulations, imposing updated compliance obligations on developers, builders and certifiers that will require close monitoring. The NSW EPA's FOGO business mandate guidance to councils signals imminent waste-sector compliance requirements, while the IPART chair appointment of Anthony Wing introduces potential strategic recalibration of utility pricing and regulatory oversight priorities. The ODPP inquiry findings and ICAC activity in the Hills Liberal matter underscore ongoing integrity and governance risks for public-sector clients.</w:t>
+      </w:r>
+    </w:p>
+    <w:p>
+      <w:pPr>
+        <w:pStyle w:val="body_letter"/>
+      </w:pPr>
+      <w:r>
+        <w:rPr>
+          <w:rFonts w:ascii="Arial" w:hAnsi="Arial"/>
+          <w:b/>
+          <w:color w:val="000000"/>
+          <w:sz w:val="19"/>
+        </w:rPr>
+        <w:t>Victoria</w:t>
+      </w:r>
+    </w:p>
+    <w:p>
+      <w:pPr>
+        <w:pStyle w:val="body_letter"/>
+      </w:pPr>
+      <w:r>
+        <w:rPr>
+          <w:rFonts w:ascii="Arial" w:hAnsi="Arial"/>
+          <w:b w:val="0"/>
+          <w:color w:val="000000"/>
+          <w:sz w:val="19"/>
+        </w:rPr>
+        <w:t>Victoria is experiencing a dense legislative and enforcement cycle across multiple sectors simultaneously. The Work from Home Bill has been introduced into Parliament, creating significant new employer compliance obligations and, per Lawyers Weekly, material operational impacts on VCAT, while building reform amendments that commenced on 1 July continue to reshape construction sector licensing and standards requirements. The Essential Services Commission has launched a Port of Melbourne pricing inquiry, representing a material advisory opportunity in infrastructure regulation, and EPA Victoria has initiated satellite-based land-clearing surveillance capabilities signalling a step-change in environmental enforcement posture. An updated Ministerial Statement of Expectations, reinstated electoral donation caps, new social media vilification demasking powers, and a family day care provider suspension for compliance failures collectively signal active regulatory expansion across digital, electoral, environmental and social services sectors.</w:t>
+      </w:r>
+    </w:p>
+    <w:p>
+      <w:pPr>
+        <w:pStyle w:val="body_letter"/>
+      </w:pPr>
+      <w:r>
+        <w:rPr>
+          <w:rFonts w:ascii="Arial" w:hAnsi="Arial"/>
+          <w:b/>
+          <w:color w:val="000000"/>
+          <w:sz w:val="19"/>
+        </w:rPr>
+        <w:t>Queensland</w:t>
+      </w:r>
+    </w:p>
+    <w:p>
+      <w:pPr>
+        <w:pStyle w:val="body_letter"/>
+      </w:pPr>
+      <w:r>
+        <w:rPr>
+          <w:rFonts w:ascii="Arial" w:hAnsi="Arial"/>
+          <w:b w:val="0"/>
+          <w:color w:val="000000"/>
+          <w:sz w:val="19"/>
+        </w:rPr>
+        <w:t>Queensland's 2026-27 Budget ($119B capital program) introduces significant procurement, productivity, and housing compliance obligations, while the Financial Provisioning Scheme Review delivers material 2025 reforms to resource-sector financial assurance arrangements, both representing immediate advisory mandates. New AML/CTF obligations have commenced for Queensland law firms, with the QLS urging enrolment, creating a time-sensitive compliance uplift opportunity across the legal sector. The Queensland Productivity Commission's examination of EPBC Act reform signals potential streamlining of state-federal environmental approval pathways, and Supreme Court judges have been appointed to lead a Queensland human rights framework review, flagging downstream legislative change. Concurrent safeguarding reforms responding to the In Plain Sight review, ongoing CFMEU enforcement failures in construction, and a building regulator misconduct inquiry compound an already crowded regulatory reform agenda requiring client risk-triage across multiple sectors.</w:t>
+      </w:r>
+    </w:p>
+    <w:p>
+      <w:pPr>
+        <w:pStyle w:val="body_letter"/>
+      </w:pPr>
+      <w:r>
+        <w:rPr>
+          <w:rFonts w:ascii="Arial" w:hAnsi="Arial"/>
+          <w:b/>
+          <w:color w:val="000000"/>
+          <w:sz w:val="19"/>
+        </w:rPr>
+        <w:t>Western Australia</w:t>
+      </w:r>
+    </w:p>
+    <w:p>
+      <w:pPr>
+        <w:pStyle w:val="body_letter"/>
+      </w:pPr>
+      <w:r>
+        <w:rPr>
+          <w:rFonts w:ascii="Arial" w:hAnsi="Arial"/>
+          <w:b w:val="0"/>
+          <w:color w:val="000000"/>
+          <w:sz w:val="19"/>
+        </w:rPr>
+        <w:t>Western Australia has become the first Australian jurisdiction to deploy real-time facial recognition surveillance cameras, a landmark development with significant privacy law, civil liberties, and compliance framework implications for organisations operating in the state. Concurrently, a major planning reform will open thousands more Perth properties to subdivision, expanding development approval and land-use compliance obligations across the residential sector. On the enforcement front, WA regulators have conducted large-scale tobacco compliance operations, seizing over a tonne of product and closing nearly 50 stores, signalling a sustained crackdown on illicit retail trade. Separately, WA has reduced registered builder licensing requirements for ancillary structures (sheds, garages, carports) and backed federal online lottery reform to protect its state-owned lottery monopoly, both representing targeted deregulatory and intergovernmental positioning moves.</w:t>
+      </w:r>
+    </w:p>
+    <w:p>
+      <w:pPr>
+        <w:pStyle w:val="body_letter"/>
+      </w:pPr>
+      <w:r>
+        <w:rPr>
+          <w:rFonts w:ascii="Arial" w:hAnsi="Arial"/>
+          <w:b/>
+          <w:color w:val="000000"/>
+          <w:sz w:val="19"/>
+        </w:rPr>
+        <w:t>South Australia</w:t>
+      </w:r>
+    </w:p>
+    <w:p>
+      <w:pPr>
+        <w:pStyle w:val="body_letter"/>
+      </w:pPr>
+      <w:r>
+        <w:rPr>
+          <w:rFonts w:ascii="Arial" w:hAnsi="Arial"/>
+          <w:b w:val="0"/>
+          <w:color w:val="000000"/>
+          <w:sz w:val="19"/>
+        </w:rPr>
+        <w:t>The South Australian Commissioner for Gambling has finalised a AU$21 million enforcement settlement with SkyCity Adelaide, also mandating appointment of a dedicated Adelaide CEO, a significant precedent for gaming compliance obligations and board-governance expectations for SA-licensed operators. SA has legislated criminal offences for non-consensual deepfake content ahead of any federal equivalent, creating immediate compliance and legal-risk obligations for technology, media, and platform businesses operating in the state. Proposed reforms to SA's First Nations Voice to Parliament introduce potential new consultation and engagement obligations relevant to planning, development, and government procurement advisory work. SafeWork SA's active enforcement response to asbestos risks in commercial fitness facilities signals continued priority on WHS compliance in non-traditional settings, opening workplace-safety compliance review opportunities across the SA commercial property sector.</w:t>
+      </w:r>
+    </w:p>
+    <w:p>
+      <w:pPr>
+        <w:pStyle w:val="body_letter"/>
+      </w:pPr>
+      <w:r>
+        <w:rPr>
+          <w:rFonts w:ascii="Arial" w:hAnsi="Arial"/>
+          <w:b/>
+          <w:color w:val="000000"/>
+          <w:sz w:val="19"/>
+        </w:rPr>
+        <w:t>Tasmania</w:t>
+      </w:r>
+    </w:p>
+    <w:p>
+      <w:pPr>
+        <w:pStyle w:val="body_letter"/>
+      </w:pPr>
+      <w:r>
+        <w:rPr>
+          <w:rFonts w:ascii="Arial" w:hAnsi="Arial"/>
+          <w:b w:val="0"/>
+          <w:color w:val="000000"/>
+          <w:sz w:val="19"/>
+        </w:rPr>
+        <w:t>Tasmania's legislative agenda is particularly active on family violence, with the first tranche of protection reforms announced alongside a nation-first levy on offenders, both creating new compliance and reporting obligations for relevant sectors. Liquor licensing has been streamlined via legislative reform, reducing approval timelines and presenting advisory opportunities for hospitality clients navigating the updated framework. Enforcement activity is elevated across multiple regulators: Consumer/health agencies seized 5.5 million illegal cigarettes and ~30,000 vapes; WorkSafe Tasmania has opened an investigation into the Hobart Cracker Night fireworks incident; and the EPA lifted a processing ban on a recycling facility, signalling active regulatory oversight of waste management. Local government structural reform, cutting 50 councillors after passing the upper house, and the repeal of the one-metre powerline clearance rule for tradies round out a busy period of state-level regulatory change.</w:t>
+      </w:r>
+    </w:p>
+    <w:p>
+      <w:pPr>
+        <w:pStyle w:val="body_letter"/>
+      </w:pPr>
+      <w:r>
+        <w:rPr>
+          <w:rFonts w:ascii="Arial" w:hAnsi="Arial"/>
+          <w:b/>
+          <w:color w:val="000000"/>
+          <w:sz w:val="19"/>
+        </w:rPr>
+        <w:t>Australian Capital Territory</w:t>
+      </w:r>
+    </w:p>
+    <w:p>
+      <w:pPr>
+        <w:pStyle w:val="body_letter"/>
+      </w:pPr>
+      <w:r>
+        <w:rPr>
+          <w:rFonts w:ascii="Arial" w:hAnsi="Arial"/>
+          <w:b w:val="0"/>
+          <w:color w:val="000000"/>
+          <w:sz w:val="19"/>
+        </w:rPr>
+        <w:t>The ACT Legislative Assembly has passed landmark 'missing middle' housing reforms permitting medium-density development in established suburbs, creating immediate compliance and planning advisory demand for developers, councils, and legal practitioners navigating the new framework. The 2026-27 ACT Budget eliminates stamp duty for first-home buyers while projecting net debt of $12.5 billion, signalling continued property tax reform and heightened fiscal risk, both areas requiring advisory support on transaction structuring and government financial sustainability. A significant cross-jurisdictional procurement compliance gap has been exposed with a subcontractor banned in NSW reportedly winning ACT government contracts, pointing to material weaknesses in the ACT's contractor screening and debarment-recognition processes. Concurrently, the ACT Government's formal acceptance of the health system inquiry report and a major pokies review recommending a managed phase-down of gaming machines both present near-term advisory opportunities in regulated industry transition planning and compliance strategy.</w:t>
+      </w:r>
+    </w:p>
+    <w:p>
+      <w:pPr>
+        <w:pStyle w:val="body_letter"/>
+      </w:pPr>
+      <w:r>
+        <w:rPr>
+          <w:rFonts w:ascii="Arial" w:hAnsi="Arial"/>
+          <w:b/>
+          <w:color w:val="000000"/>
+          <w:sz w:val="19"/>
+        </w:rPr>
+        <w:t>Northern Territory</w:t>
+      </w:r>
+    </w:p>
+    <w:p>
+      <w:pPr>
+        <w:pStyle w:val="body_letter"/>
+      </w:pPr>
+      <w:r>
+        <w:rPr>
+          <w:rFonts w:ascii="Arial" w:hAnsi="Arial"/>
+          <w:b w:val="0"/>
+          <w:color w:val="000000"/>
+          <w:sz w:val="19"/>
+        </w:rPr>
+        <w:t>The NT Government is pressing ahead with the contested 'Every Child Matters Bill', drawing sharp criticism from SNAICC, the National Justice Project, and the outgoing Children's Commissioner, who publicly condemned the government's lack of accountability on departure; a concurrent systemic-failings report is being cited by government to justify the accelerated reform. WorkSafe NT is under scrutiny over dropped charges in a workplace fatality, while a separate WorkSafe prosecution of an NT Aboriginal corporation over a fatal ute rollover signals continued WHS enforcement exposure for community-controlled organisations. The NT EPA approved Santos' hot venting request, a material environmental regulatory decision with implications for energy sector compliance obligations in the Territory. Consumer protection regulators fined NT service stations $38,000 for fuel overcharging, and the NT Government extended alcohol bans in town camps, each signalling active use of existing regulatory tools alongside the legislative reform agenda.</w:t>
       </w:r>
     </w:p>
     <w:tbl>
@@ -554,7 +1811,7 @@
                           <pic:cNvPicPr/>
                         </pic:nvPicPr>
                         <pic:blipFill>
-                          <a:blip r:embed="rId10"/>
+                          <a:blip r:embed="rId18"/>
                           <a:stretch>
                             <a:fillRect/>
                           </a:stretch>

</xml_diff>

<commit_message>
chore: update regulation hub 2026-07-26
</commit_message>
<xml_diff>
--- a/reg-hub/regulation_fortnightly_brief.docx
+++ b/reg-hub/regulation_fortnightly_brief.docx
@@ -46,7 +46,7 @@
         <w:pStyle w:val="Heading1"/>
       </w:pPr>
       <w:r>
-        <w:t>KPMG Regulatory Transformation Fortnightly Brief - 7-20 July 2026</w:t>
+        <w:t>KPMG Regulatory Transformation Fortnightly Brief - 13-26 July 2026</w:t>
       </w:r>
     </w:p>
     <w:p>
@@ -73,7 +73,7 @@
           <w:color w:val="666666"/>
           <w:sz w:val="19"/>
         </w:rPr>
-        <w:t>20 July 2026</w:t>
+        <w:t>26 July 2026</w:t>
       </w:r>
     </w:p>
     <w:p>
@@ -1029,36 +1029,6 @@
           <w:color w:val="000000"/>
           <w:sz w:val="19"/>
         </w:rPr>
-        <w:t>KPMG Regulatory Practice Masterclass, RT CoP</w:t>
-      </w:r>
-      <w:r>
-        <w:rPr>
-          <w:rFonts w:ascii="Arial" w:hAnsi="Arial"/>
-          <w:color w:val="000000"/>
-          <w:sz w:val="19"/>
-        </w:rPr>
-        <w:t xml:space="preserve"> - </w:t>
-      </w:r>
-      <w:r>
-        <w:rPr>
-          <w:rFonts w:ascii="Arial" w:hAnsi="Arial"/>
-          <w:color w:val="000000"/>
-          <w:sz w:val="19"/>
-        </w:rPr>
-        <w:t>23 Jul 2026 - KPMG · Online</w:t>
-      </w:r>
-    </w:p>
-    <w:p>
-      <w:pPr>
-        <w:pStyle w:val="ListBullet"/>
-      </w:pPr>
-      <w:r>
-        <w:rPr>
-          <w:rFonts w:ascii="Arial" w:hAnsi="Arial"/>
-          <w:b/>
-          <w:color w:val="000000"/>
-          <w:sz w:val="19"/>
-        </w:rPr>
         <w:t>IPAA National Regulatory Governance Forum 2026</w:t>
       </w:r>
       <w:r>
@@ -1076,6 +1046,36 @@
           <w:sz w:val="19"/>
         </w:rPr>
         <w:t>13 Aug 2026 - IPAA · Canberra</w:t>
+      </w:r>
+    </w:p>
+    <w:p>
+      <w:pPr>
+        <w:pStyle w:val="ListBullet"/>
+      </w:pPr>
+      <w:r>
+        <w:rPr>
+          <w:rFonts w:ascii="Arial" w:hAnsi="Arial"/>
+          <w:b/>
+          <w:color w:val="000000"/>
+          <w:sz w:val="19"/>
+        </w:rPr>
+        <w:t>AHRI Public Sector L&amp;D Symposium</w:t>
+      </w:r>
+      <w:r>
+        <w:rPr>
+          <w:rFonts w:ascii="Arial" w:hAnsi="Arial"/>
+          <w:color w:val="000000"/>
+          <w:sz w:val="19"/>
+        </w:rPr>
+        <w:t xml:space="preserve"> - </w:t>
+      </w:r>
+      <w:r>
+        <w:rPr>
+          <w:rFonts w:ascii="Arial" w:hAnsi="Arial"/>
+          <w:color w:val="000000"/>
+          <w:sz w:val="19"/>
+        </w:rPr>
+        <w:t>20 Aug 2026 - AHRI · Sydney</w:t>
       </w:r>
     </w:p>
     <w:p>

</xml_diff>

<commit_message>
chore: update regulation hub 2026-07-28
</commit_message>
<xml_diff>
--- a/reg-hub/regulation_fortnightly_brief.docx
+++ b/reg-hub/regulation_fortnightly_brief.docx
@@ -46,7 +46,7 @@
         <w:pStyle w:val="Heading1"/>
       </w:pPr>
       <w:r>
-        <w:t>KPMG Regulatory Transformation Fortnightly Brief - 13-26 July 2026</w:t>
+        <w:t>KPMG Regulatory Transformation Fortnightly Brief - 15-28 July 2026</w:t>
       </w:r>
     </w:p>
     <w:p>
@@ -73,7 +73,7 @@
           <w:color w:val="666666"/>
           <w:sz w:val="19"/>
         </w:rPr>
-        <w:t>26 July 2026</w:t>
+        <w:t>28 July 2026</w:t>
       </w:r>
     </w:p>
     <w:p>
@@ -97,11 +97,11 @@
       <w:r>
         <w:rPr>
           <w:rFonts w:ascii="Arial" w:hAnsi="Arial"/>
-          <w:b w:val="0"/>
-          <w:color w:val="000000"/>
+          <w:i/>
+          <w:color w:val="666666"/>
           <w:sz w:val="19"/>
         </w:rPr>
-        <w:t>This fortnight, Australia's regulatory landscape is dominated by higher education compliance pressures, with TEQSA and ASQA issuing joint alerts on overseas student transfers, the agent commission ban drawing scrutiny, and the federal government signalling a crackdown on antisemitism at universities, all while the Department of Employment and Workplace Relations releases a substantive report on AI and employment that positions workforce transition as a cross-sector regulatory priority. The most significant advisory opportunity lies in the convergence of higher education regulatory tightening and the AI and employment agenda, where institutions and government agencies alike face mounting compliance obligations without the analytical capability or governance frameworks to manage them coherently. Brief our higher education and workforce advisory teams to develop a targeted engagement proposition for institutions navigating TEQSA threshold standard amendments and agent commission compliance, and align this with our AI governance offering given the federal government's focus on AI and employment impacts.</w:t>
+        <w:t>[edit before send], Adam's 3-sentence key messages will prefill from the dashboard synthesis on the next fortnightly run. Type your replacement here.</w:t>
       </w:r>
     </w:p>
     <w:p>
@@ -153,279 +153,11 @@
       <w:r>
         <w:rPr>
           <w:rFonts w:ascii="Arial" w:hAnsi="Arial"/>
-          <w:b/>
-          <w:color w:val="000000"/>
+          <w:i/>
+          <w:color w:val="666666"/>
           <w:sz w:val="19"/>
         </w:rPr>
-        <w:t>Victoria</w:t>
-      </w:r>
-    </w:p>
-    <w:p>
-      <w:pPr>
-        <w:pStyle w:val="ListBullet"/>
-      </w:pPr>
-      <w:r>
-        <w:rPr>
-          <w:rFonts w:ascii="Arial" w:hAnsi="Arial"/>
-          <w:b/>
-          <w:color w:val="000000"/>
-          <w:sz w:val="19"/>
-        </w:rPr>
-        <w:t>Commission for Children and Young People</w:t>
-      </w:r>
-      <w:r>
-        <w:rPr>
-          <w:rFonts w:ascii="Arial" w:hAnsi="Arial"/>
-          <w:color w:val="000000"/>
-          <w:sz w:val="19"/>
-        </w:rPr>
-        <w:t xml:space="preserve"> - </w:t>
-      </w:r>
-      <w:r>
-        <w:rPr>
-          <w:rFonts w:ascii="Arial" w:hAnsi="Arial"/>
-          <w:color w:val="000000"/>
-          <w:sz w:val="19"/>
-        </w:rPr>
-        <w:t>Child protection inquiry finds systemic reporting failures</w:t>
-      </w:r>
-    </w:p>
-    <w:p>
-      <w:pPr>
-        <w:pStyle w:val="ListBullet"/>
-      </w:pPr>
-      <w:r>
-        <w:rPr>
-          <w:rFonts w:ascii="Arial" w:hAnsi="Arial"/>
-          <w:b/>
-          <w:color w:val="000000"/>
-          <w:sz w:val="19"/>
-        </w:rPr>
-        <w:t>Consumer Affairs Victoria</w:t>
-      </w:r>
-      <w:r>
-        <w:rPr>
-          <w:rFonts w:ascii="Arial" w:hAnsi="Arial"/>
-          <w:color w:val="000000"/>
-          <w:sz w:val="19"/>
-        </w:rPr>
-        <w:t xml:space="preserve"> - </w:t>
-      </w:r>
-      <w:r>
-        <w:rPr>
-          <w:rFonts w:ascii="Arial" w:hAnsi="Arial"/>
-          <w:color w:val="000000"/>
-          <w:sz w:val="19"/>
-        </w:rPr>
-        <w:t>Estate agency prosecuted for systemic underquoting</w:t>
-      </w:r>
-    </w:p>
-    <w:p>
-      <w:pPr>
-        <w:pStyle w:val="ListBullet"/>
-      </w:pPr>
-      <w:r>
-        <w:rPr>
-          <w:rFonts w:ascii="Arial" w:hAnsi="Arial"/>
-          <w:b/>
-          <w:color w:val="000000"/>
-          <w:sz w:val="19"/>
-        </w:rPr>
-        <w:t>Victorian Gambling and Casino Control Commission</w:t>
-      </w:r>
-      <w:r>
-        <w:rPr>
-          <w:rFonts w:ascii="Arial" w:hAnsi="Arial"/>
-          <w:color w:val="000000"/>
-          <w:sz w:val="19"/>
-        </w:rPr>
-        <w:t xml:space="preserve"> - </w:t>
-      </w:r>
-      <w:r>
-        <w:rPr>
-          <w:rFonts w:ascii="Arial" w:hAnsi="Arial"/>
-          <w:color w:val="000000"/>
-          <w:sz w:val="19"/>
-        </w:rPr>
-        <w:t>VGCCC hosts Cambodia regulator on casino oversight</w:t>
-      </w:r>
-    </w:p>
-    <w:p>
-      <w:pPr>
-        <w:pStyle w:val="body_letter"/>
-      </w:pPr>
-      <w:r>
-        <w:rPr>
-          <w:rFonts w:ascii="Arial" w:hAnsi="Arial"/>
-          <w:b/>
-          <w:color w:val="000000"/>
-          <w:sz w:val="19"/>
-        </w:rPr>
-        <w:t>Commonwealth</w:t>
-      </w:r>
-    </w:p>
-    <w:p>
-      <w:pPr>
-        <w:pStyle w:val="ListBullet"/>
-      </w:pPr>
-      <w:r>
-        <w:rPr>
-          <w:rFonts w:ascii="Arial" w:hAnsi="Arial"/>
-          <w:b/>
-          <w:color w:val="000000"/>
-          <w:sz w:val="19"/>
-        </w:rPr>
-        <w:t>Tertiary Education Quality and Standards Agency</w:t>
-      </w:r>
-      <w:r>
-        <w:rPr>
-          <w:rFonts w:ascii="Arial" w:hAnsi="Arial"/>
-          <w:color w:val="000000"/>
-          <w:sz w:val="19"/>
-        </w:rPr>
-        <w:t xml:space="preserve"> - </w:t>
-      </w:r>
-      <w:r>
-        <w:rPr>
-          <w:rFonts w:ascii="Arial" w:hAnsi="Arial"/>
-          <w:color w:val="000000"/>
-          <w:sz w:val="19"/>
-        </w:rPr>
-        <w:t>TEQSA and ASQA issue joint overseas student compliance alert</w:t>
-      </w:r>
-    </w:p>
-    <w:p>
-      <w:pPr>
-        <w:pStyle w:val="ListBullet"/>
-      </w:pPr>
-      <w:r>
-        <w:rPr>
-          <w:rFonts w:ascii="Arial" w:hAnsi="Arial"/>
-          <w:b/>
-          <w:color w:val="000000"/>
-          <w:sz w:val="19"/>
-        </w:rPr>
-        <w:t>Department of Employment and Workplace Relations</w:t>
-      </w:r>
-      <w:r>
-        <w:rPr>
-          <w:rFonts w:ascii="Arial" w:hAnsi="Arial"/>
-          <w:color w:val="000000"/>
-          <w:sz w:val="19"/>
-        </w:rPr>
-        <w:t xml:space="preserve"> - </w:t>
-      </w:r>
-      <w:r>
-        <w:rPr>
-          <w:rFonts w:ascii="Arial" w:hAnsi="Arial"/>
-          <w:color w:val="000000"/>
-          <w:sz w:val="19"/>
-        </w:rPr>
-        <w:t>DEWR releases AI and employment report</w:t>
-      </w:r>
-    </w:p>
-    <w:p>
-      <w:pPr>
-        <w:pStyle w:val="ListBullet"/>
-      </w:pPr>
-      <w:r>
-        <w:rPr>
-          <w:rFonts w:ascii="Arial" w:hAnsi="Arial"/>
-          <w:b/>
-          <w:color w:val="000000"/>
-          <w:sz w:val="19"/>
-        </w:rPr>
-        <w:t>Therapeutic Goods Administration</w:t>
-      </w:r>
-      <w:r>
-        <w:rPr>
-          <w:rFonts w:ascii="Arial" w:hAnsi="Arial"/>
-          <w:color w:val="000000"/>
-          <w:sz w:val="19"/>
-        </w:rPr>
-        <w:t xml:space="preserve"> - </w:t>
-      </w:r>
-      <w:r>
-        <w:rPr>
-          <w:rFonts w:ascii="Arial" w:hAnsi="Arial"/>
-          <w:color w:val="000000"/>
-          <w:sz w:val="19"/>
-        </w:rPr>
-        <w:t>TGA responds publicly to 60 Minutes medical device scrutiny</w:t>
-      </w:r>
-    </w:p>
-    <w:p>
-      <w:pPr>
-        <w:pStyle w:val="body_letter"/>
-      </w:pPr>
-      <w:r>
-        <w:rPr>
-          <w:rFonts w:ascii="Arial" w:hAnsi="Arial"/>
-          <w:b/>
-          <w:color w:val="000000"/>
-          <w:sz w:val="19"/>
-        </w:rPr>
-        <w:t>New South Wales</w:t>
-      </w:r>
-    </w:p>
-    <w:p>
-      <w:pPr>
-        <w:pStyle w:val="ListBullet"/>
-      </w:pPr>
-      <w:r>
-        <w:rPr>
-          <w:rFonts w:ascii="Arial" w:hAnsi="Arial"/>
-          <w:b/>
-          <w:color w:val="000000"/>
-          <w:sz w:val="19"/>
-        </w:rPr>
-        <w:t>Independent Commission Against Corruption</w:t>
-      </w:r>
-      <w:r>
-        <w:rPr>
-          <w:rFonts w:ascii="Arial" w:hAnsi="Arial"/>
-          <w:color w:val="000000"/>
-          <w:sz w:val="19"/>
-        </w:rPr>
-        <w:t xml:space="preserve"> - </w:t>
-      </w:r>
-      <w:r>
-        <w:rPr>
-          <w:rFonts w:ascii="Arial" w:hAnsi="Arial"/>
-          <w:color w:val="000000"/>
-          <w:sz w:val="19"/>
-        </w:rPr>
-        <w:t>ICAC examines NSW Liberal factional conduct</w:t>
-      </w:r>
-    </w:p>
-    <w:p>
-      <w:pPr>
-        <w:pStyle w:val="ListBullet"/>
-      </w:pPr>
-      <w:r>
-        <w:rPr>
-          <w:rFonts w:ascii="Arial" w:hAnsi="Arial"/>
-          <w:b/>
-          <w:color w:val="000000"/>
-          <w:sz w:val="19"/>
-        </w:rPr>
-        <w:t>Environment Protection Authority</w:t>
-      </w:r>
-      <w:r>
-        <w:rPr>
-          <w:rFonts w:ascii="Arial" w:hAnsi="Arial"/>
-          <w:color w:val="000000"/>
-          <w:sz w:val="19"/>
-        </w:rPr>
-        <w:t xml:space="preserve"> - </w:t>
-      </w:r>
-      <w:r>
-        <w:rPr>
-          <w:rFonts w:ascii="Arial" w:hAnsi="Arial"/>
-          <w:color w:val="000000"/>
-          <w:sz w:val="19"/>
-        </w:rPr>
-        <w:t>NSW EPA releases FOGO business mandate council guidance</w:t>
+        <w:t>No client-in-news signal this fortnight across any jurisdiction.</w:t>
       </w:r>
     </w:p>
     <w:p>
@@ -514,234 +246,16 @@
     </w:p>
     <w:p>
       <w:pPr>
-        <w:pStyle w:val="ListBullet"/>
+        <w:pStyle w:val="body_letter"/>
       </w:pPr>
       <w:r>
         <w:rPr>
           <w:rFonts w:ascii="Arial" w:hAnsi="Arial"/>
-          <w:b/>
-          <w:color w:val="000000"/>
+          <w:i/>
+          <w:color w:val="666666"/>
           <w:sz w:val="19"/>
         </w:rPr>
-        <w:t>TEQSA and ASQA joint alert on overseas student transfer compliance</w:t>
-      </w:r>
-      <w:r>
-        <w:rPr>
-          <w:rFonts w:ascii="Arial" w:hAnsi="Arial"/>
-          <w:color w:val="000000"/>
-          <w:sz w:val="19"/>
-        </w:rPr>
-        <w:t xml:space="preserve"> - </w:t>
-      </w:r>
-      <w:r>
-        <w:rPr>
-          <w:rFonts w:ascii="Arial" w:hAnsi="Arial"/>
-          <w:color w:val="000000"/>
-          <w:sz w:val="19"/>
-        </w:rPr>
-        <w:t>TEQSA and ASQA issued a joint sector alert warning registered providers of serious compliance risks associated with non-genuine overseas student transfers between institutions.</w:t>
-      </w:r>
-      <w:r>
-        <w:rPr>
-          <w:rFonts w:ascii="Arial" w:hAnsi="Arial"/>
-          <w:color w:val="000000"/>
-          <w:sz w:val="19"/>
-        </w:rPr>
-        <w:t xml:space="preserve"> (</w:t>
-      </w:r>
-      <w:hyperlink r:id="rId10">
-        <w:r>
-          <w:rPr>
-            <w:rFonts w:ascii="Arial" w:hAnsi="Arial" w:cs="Arial"/>
-            <w:color w:val="0000FF"/>
-            <w:sz w:val="19"/>
-            <w:szCs w:val="19"/>
-            <w:u w:val="single"/>
-          </w:rPr>
-          <w:t xml:space="preserve">Read more</w:t>
-        </w:r>
-      </w:hyperlink>
-      <w:r>
-        <w:rPr>
-          <w:rFonts w:ascii="Arial" w:hAnsi="Arial"/>
-          <w:color w:val="000000"/>
-          <w:sz w:val="19"/>
-        </w:rPr>
-        <w:t>)</w:t>
-      </w:r>
-    </w:p>
-    <w:p>
-      <w:pPr>
-        <w:pStyle w:val="ListBullet"/>
-      </w:pPr>
-      <w:r>
-        <w:rPr>
-          <w:rFonts w:ascii="Arial" w:hAnsi="Arial"/>
-          <w:b/>
-          <w:color w:val="000000"/>
-          <w:sz w:val="19"/>
-        </w:rPr>
-        <w:t>Regulators raise compliance concerns over agent commission ban</w:t>
-      </w:r>
-      <w:r>
-        <w:rPr>
-          <w:rFonts w:ascii="Arial" w:hAnsi="Arial"/>
-          <w:color w:val="000000"/>
-          <w:sz w:val="19"/>
-        </w:rPr>
-        <w:t xml:space="preserve"> - </w:t>
-      </w:r>
-      <w:r>
-        <w:rPr>
-          <w:rFonts w:ascii="Arial" w:hAnsi="Arial"/>
-          <w:color w:val="000000"/>
-          <w:sz w:val="19"/>
-        </w:rPr>
-        <w:t>Australian regulators flagged compliance concerns about the overseas student agent commission ban, warning providers of risks to international student recruitment integrity and regulatory standing.</w:t>
-      </w:r>
-      <w:r>
-        <w:rPr>
-          <w:rFonts w:ascii="Arial" w:hAnsi="Arial"/>
-          <w:color w:val="000000"/>
-          <w:sz w:val="19"/>
-        </w:rPr>
-        <w:t xml:space="preserve"> (</w:t>
-      </w:r>
-      <w:hyperlink r:id="rId11">
-        <w:r>
-          <w:rPr>
-            <w:rFonts w:ascii="Arial" w:hAnsi="Arial" w:cs="Arial"/>
-            <w:color w:val="0000FF"/>
-            <w:sz w:val="19"/>
-            <w:szCs w:val="19"/>
-            <w:u w:val="single"/>
-          </w:rPr>
-          <w:t xml:space="preserve">Read more</w:t>
-        </w:r>
-      </w:hyperlink>
-      <w:r>
-        <w:rPr>
-          <w:rFonts w:ascii="Arial" w:hAnsi="Arial"/>
-          <w:color w:val="000000"/>
-          <w:sz w:val="19"/>
-        </w:rPr>
-        <w:t>)</w:t>
-      </w:r>
-    </w:p>
-    <w:p>
-      <w:pPr>
-        <w:pStyle w:val="ListBullet"/>
-      </w:pPr>
-      <w:r>
-        <w:rPr>
-          <w:rFonts w:ascii="Arial" w:hAnsi="Arial"/>
-          <w:b/>
-          <w:color w:val="000000"/>
-          <w:sz w:val="19"/>
-        </w:rPr>
-        <w:t>eSafety Commissioner finds Big Tech blind spots on child sexual extortion</w:t>
-      </w:r>
-      <w:r>
-        <w:rPr>
-          <w:rFonts w:ascii="Arial" w:hAnsi="Arial"/>
-          <w:color w:val="000000"/>
-          <w:sz w:val="19"/>
-        </w:rPr>
-        <w:t xml:space="preserve"> - </w:t>
-      </w:r>
-      <w:r>
-        <w:rPr>
-          <w:rFonts w:ascii="Arial" w:hAnsi="Arial"/>
-          <w:color w:val="000000"/>
-          <w:sz w:val="19"/>
-        </w:rPr>
-        <w:t>The eSafety Commissioner released a report finding that major technology platforms have significant blind spots in detecting and preventing sexual extortion targeting children and young adults.</w:t>
-      </w:r>
-      <w:r>
-        <w:rPr>
-          <w:rFonts w:ascii="Arial" w:hAnsi="Arial"/>
-          <w:color w:val="000000"/>
-          <w:sz w:val="19"/>
-        </w:rPr>
-        <w:t xml:space="preserve"> (</w:t>
-      </w:r>
-      <w:hyperlink r:id="rId12">
-        <w:r>
-          <w:rPr>
-            <w:rFonts w:ascii="Arial" w:hAnsi="Arial" w:cs="Arial"/>
-            <w:color w:val="0000FF"/>
-            <w:sz w:val="19"/>
-            <w:szCs w:val="19"/>
-            <w:u w:val="single"/>
-          </w:rPr>
-          <w:t xml:space="preserve">Read more</w:t>
-        </w:r>
-      </w:hyperlink>
-      <w:r>
-        <w:rPr>
-          <w:rFonts w:ascii="Arial" w:hAnsi="Arial"/>
-          <w:color w:val="000000"/>
-          <w:sz w:val="19"/>
-        </w:rPr>
-        <w:t>)</w:t>
-      </w:r>
-    </w:p>
-    <w:p>
-      <w:pPr>
-        <w:pStyle w:val="ListBullet"/>
-      </w:pPr>
-      <w:r>
-        <w:rPr>
-          <w:rFonts w:ascii="Arial" w:hAnsi="Arial"/>
-          <w:b/>
-          <w:color w:val="000000"/>
-          <w:sz w:val="19"/>
-        </w:rPr>
-        <w:t>TGA and manufacturers respond to medical device safety investigation</w:t>
-      </w:r>
-      <w:r>
-        <w:rPr>
-          <w:rFonts w:ascii="Arial" w:hAnsi="Arial"/>
-          <w:color w:val="000000"/>
-          <w:sz w:val="19"/>
-        </w:rPr>
-        <w:t xml:space="preserve"> - </w:t>
-      </w:r>
-      <w:r>
-        <w:rPr>
-          <w:rFonts w:ascii="Arial" w:hAnsi="Arial"/>
-          <w:color w:val="000000"/>
-          <w:sz w:val="19"/>
-        </w:rPr>
-        <w:t>The Therapeutic Goods Administration and device manufacturers issued responses to a broadcast investigation raising public safety concerns about the approval and monitoring of medical devices in…</w:t>
-      </w:r>
-      <w:r>
-        <w:rPr>
-          <w:rFonts w:ascii="Arial" w:hAnsi="Arial"/>
-          <w:color w:val="000000"/>
-          <w:sz w:val="19"/>
-        </w:rPr>
-        <w:t xml:space="preserve"> (</w:t>
-      </w:r>
-      <w:hyperlink r:id="rId13">
-        <w:r>
-          <w:rPr>
-            <w:rFonts w:ascii="Arial" w:hAnsi="Arial" w:cs="Arial"/>
-            <w:color w:val="0000FF"/>
-            <w:sz w:val="19"/>
-            <w:szCs w:val="19"/>
-            <w:u w:val="single"/>
-          </w:rPr>
-          <w:t xml:space="preserve">Read more</w:t>
-        </w:r>
-      </w:hyperlink>
-      <w:r>
-        <w:rPr>
-          <w:rFonts w:ascii="Arial" w:hAnsi="Arial"/>
-          <w:color w:val="000000"/>
-          <w:sz w:val="19"/>
-        </w:rPr>
-        <w:t>)</w:t>
+        <w:t>No emerging risks signal this fortnight.</w:t>
       </w:r>
     </w:p>
     <w:p>
@@ -760,118 +274,16 @@
     </w:p>
     <w:p>
       <w:pPr>
-        <w:pStyle w:val="ListBullet"/>
+        <w:pStyle w:val="body_letter"/>
       </w:pPr>
       <w:r>
         <w:rPr>
           <w:rFonts w:ascii="Arial" w:hAnsi="Arial"/>
-          <w:b/>
-          <w:color w:val="000000"/>
+          <w:i/>
+          <w:color w:val="666666"/>
           <w:sz w:val="19"/>
         </w:rPr>
-        <w:t>DEWR releases AI and Employment in Australia report</w:t>
-      </w:r>
-      <w:r>
-        <w:rPr>
-          <w:rFonts w:ascii="Arial" w:hAnsi="Arial"/>
-          <w:color w:val="000000"/>
-          <w:sz w:val="19"/>
-        </w:rPr>
-        <w:t xml:space="preserve"> - </w:t>
-      </w:r>
-      <w:r>
-        <w:rPr>
-          <w:rFonts w:ascii="Arial" w:hAnsi="Arial"/>
-          <w:color w:val="000000"/>
-          <w:sz w:val="19"/>
-        </w:rPr>
-        <w:t>The Department of Employment and Workplace Relations published its AI and Employment in Australia report, assessing AI-driven workforce disruption and outlining the policy response required to…</w:t>
-      </w:r>
-      <w:r>
-        <w:rPr>
-          <w:rFonts w:ascii="Arial" w:hAnsi="Arial"/>
-          <w:color w:val="000000"/>
-          <w:sz w:val="19"/>
-        </w:rPr>
-        <w:t xml:space="preserve"> (</w:t>
-      </w:r>
-      <w:hyperlink r:id="rId14">
-        <w:r>
-          <w:rPr>
-            <w:rFonts w:ascii="Arial" w:hAnsi="Arial" w:cs="Arial"/>
-            <w:color w:val="0000FF"/>
-            <w:sz w:val="19"/>
-            <w:szCs w:val="19"/>
-            <w:u w:val="single"/>
-          </w:rPr>
-          <w:t xml:space="preserve">Read more</w:t>
-        </w:r>
-      </w:hyperlink>
-      <w:r>
-        <w:rPr>
-          <w:rFonts w:ascii="Arial" w:hAnsi="Arial"/>
-          <w:color w:val="000000"/>
-          <w:sz w:val="19"/>
-        </w:rPr>
-        <w:t>)</w:t>
-      </w:r>
-    </w:p>
-    <w:p>
-      <w:pPr>
-        <w:pStyle w:val="ListBullet"/>
-      </w:pPr>
-      <w:r>
-        <w:rPr>
-          <w:rFonts w:ascii="Arial" w:hAnsi="Arial"/>
-          <w:b/>
-          <w:color w:val="000000"/>
-          <w:sz w:val="19"/>
-        </w:rPr>
-        <w:t>ACNC charity data made available through BLADE for researchers</w:t>
-      </w:r>
-      <w:r>
-        <w:rPr>
-          <w:rFonts w:ascii="Arial" w:hAnsi="Arial"/>
-          <w:color w:val="000000"/>
-          <w:sz w:val="19"/>
-        </w:rPr>
-        <w:t xml:space="preserve"> - </w:t>
-      </w:r>
-      <w:r>
-        <w:rPr>
-          <w:rFonts w:ascii="Arial" w:hAnsi="Arial"/>
-          <w:color w:val="000000"/>
-          <w:sz w:val="19"/>
-        </w:rPr>
-        <w:t>The Australian Charities and Not-for-profits Commission opened its charity dataset through the BLADE platform, enabling approved researchers to apply advanced analytics to drive evidence-based…</w:t>
-      </w:r>
-      <w:r>
-        <w:rPr>
-          <w:rFonts w:ascii="Arial" w:hAnsi="Arial"/>
-          <w:color w:val="000000"/>
-          <w:sz w:val="19"/>
-        </w:rPr>
-        <w:t xml:space="preserve"> (</w:t>
-      </w:r>
-      <w:hyperlink r:id="rId15">
-        <w:r>
-          <w:rPr>
-            <w:rFonts w:ascii="Arial" w:hAnsi="Arial" w:cs="Arial"/>
-            <w:color w:val="0000FF"/>
-            <w:sz w:val="19"/>
-            <w:szCs w:val="19"/>
-            <w:u w:val="single"/>
-          </w:rPr>
-          <w:t xml:space="preserve">Read more</w:t>
-        </w:r>
-      </w:hyperlink>
-      <w:r>
-        <w:rPr>
-          <w:rFonts w:ascii="Arial" w:hAnsi="Arial"/>
-          <w:color w:val="000000"/>
-          <w:sz w:val="19"/>
-        </w:rPr>
-        <w:t>)</w:t>
+        <w:t>No ai adoption signal this fortnight.</w:t>
       </w:r>
     </w:p>
     <w:p>
@@ -890,118 +302,16 @@
     </w:p>
     <w:p>
       <w:pPr>
-        <w:pStyle w:val="ListBullet"/>
+        <w:pStyle w:val="body_letter"/>
       </w:pPr>
       <w:r>
         <w:rPr>
           <w:rFonts w:ascii="Arial" w:hAnsi="Arial"/>
-          <w:b/>
-          <w:color w:val="000000"/>
+          <w:i/>
+          <w:color w:val="666666"/>
           <w:sz w:val="19"/>
         </w:rPr>
-        <w:t>TEQSA announces amendments to Higher Education Threshold Standards</w:t>
-      </w:r>
-      <w:r>
-        <w:rPr>
-          <w:rFonts w:ascii="Arial" w:hAnsi="Arial"/>
-          <w:color w:val="000000"/>
-          <w:sz w:val="19"/>
-        </w:rPr>
-        <w:t xml:space="preserve"> - </w:t>
-      </w:r>
-      <w:r>
-        <w:rPr>
-          <w:rFonts w:ascii="Arial" w:hAnsi="Arial"/>
-          <w:color w:val="000000"/>
-          <w:sz w:val="19"/>
-        </w:rPr>
-        <w:t>TEQSA announced amendments to the Higher Education Threshold Standards, placing updated compliance obligations on registered providers and signalling a recalibration of quality benchmarks across the…</w:t>
-      </w:r>
-      <w:r>
-        <w:rPr>
-          <w:rFonts w:ascii="Arial" w:hAnsi="Arial"/>
-          <w:color w:val="000000"/>
-          <w:sz w:val="19"/>
-        </w:rPr>
-        <w:t xml:space="preserve"> (</w:t>
-      </w:r>
-      <w:hyperlink r:id="rId16">
-        <w:r>
-          <w:rPr>
-            <w:rFonts w:ascii="Arial" w:hAnsi="Arial" w:cs="Arial"/>
-            <w:color w:val="0000FF"/>
-            <w:sz w:val="19"/>
-            <w:szCs w:val="19"/>
-            <w:u w:val="single"/>
-          </w:rPr>
-          <w:t xml:space="preserve">Read more</w:t>
-        </w:r>
-      </w:hyperlink>
-      <w:r>
-        <w:rPr>
-          <w:rFonts w:ascii="Arial" w:hAnsi="Arial"/>
-          <w:color w:val="000000"/>
-          <w:sz w:val="19"/>
-        </w:rPr>
-        <w:t>)</w:t>
-      </w:r>
-    </w:p>
-    <w:p>
-      <w:pPr>
-        <w:pStyle w:val="ListBullet"/>
-      </w:pPr>
-      <w:r>
-        <w:rPr>
-          <w:rFonts w:ascii="Arial" w:hAnsi="Arial"/>
-          <w:b/>
-          <w:color w:val="000000"/>
-          <w:sz w:val="19"/>
-        </w:rPr>
-        <w:t>New NDIS rules expose small disability carers to criminal penalties</w:t>
-      </w:r>
-      <w:r>
-        <w:rPr>
-          <w:rFonts w:ascii="Arial" w:hAnsi="Arial"/>
-          <w:color w:val="000000"/>
-          <w:sz w:val="19"/>
-        </w:rPr>
-        <w:t xml:space="preserve"> - </w:t>
-      </w:r>
-      <w:r>
-        <w:rPr>
-          <w:rFonts w:ascii="Arial" w:hAnsi="Arial"/>
-          <w:color w:val="000000"/>
-          <w:sz w:val="19"/>
-        </w:rPr>
-        <w:t>New NDIS regulatory requirements create criminal liability risks for small disability carers, with sector advocates warning that the compliance burden is falling on providers who remain largely…</w:t>
-      </w:r>
-      <w:r>
-        <w:rPr>
-          <w:rFonts w:ascii="Arial" w:hAnsi="Arial"/>
-          <w:color w:val="000000"/>
-          <w:sz w:val="19"/>
-        </w:rPr>
-        <w:t xml:space="preserve"> (</w:t>
-      </w:r>
-      <w:hyperlink r:id="rId17">
-        <w:r>
-          <w:rPr>
-            <w:rFonts w:ascii="Arial" w:hAnsi="Arial" w:cs="Arial"/>
-            <w:color w:val="0000FF"/>
-            <w:sz w:val="19"/>
-            <w:szCs w:val="19"/>
-            <w:u w:val="single"/>
-          </w:rPr>
-          <w:t xml:space="preserve">Read more</w:t>
-        </w:r>
-      </w:hyperlink>
-      <w:r>
-        <w:rPr>
-          <w:rFonts w:ascii="Arial" w:hAnsi="Arial"/>
-          <w:color w:val="000000"/>
-          <w:sz w:val="19"/>
-        </w:rPr>
-        <w:t>)</w:t>
+        <w:t>No regulatory burden signal this fortnight.</w:t>
       </w:r>
     </w:p>
     <w:p>
@@ -1099,20 +409,6 @@
       <w:r>
         <w:rPr>
           <w:rFonts w:ascii="Arial" w:hAnsi="Arial"/>
-          <w:b w:val="0"/>
-          <w:color w:val="000000"/>
-          <w:sz w:val="19"/>
-        </w:rPr>
-        <w:t>The fortnight's education regulatory landscape is defined by three compounding signals: TEQSA's aggressive supervisory posture, epitomised by Julie Bishop's public resignation from ANU citing 'coercive threats' and 'overreach', signals a regulator willing to escalate governance interventions, with public servants now mobilised inside ANU and immediate reputational and advisory demand live at the institution. Concurrently, TEQSA's amendments to the Higher Education Threshold Standards and the joint ASQA-TEQSA overseas-student-transfer compliance alert mark a structural uplift cycle that will force governance, student-protection, and international-cohort management investments across the university and VET sectors before the next assessment window. The ATEC Working Group's advancing costing-and-pricing framework creates a near-term financial modelling and strategic advisory window as universities face funding compression, while the Free TAFE expansion and DEWR's AI and employment report signal a sustained workforce-transformation overlay reshaping qualification relevance and delivery models. ASQA's escalation to cancelling childcare qualifications issued by a deregistered RTO, combined with the NCVET-ASQA quality-assurance MOU, accelerates enforcement risk for VET providers and validates an assurance and re-registration advisory offer. KPMG's priority BD investments this fortnight are ANU governance stabilisation, Threshold Standards readiness across the Go8, and VET provider compliance remediation ahead of ASQA enforcement calendar activation.</w:t>
-      </w:r>
-    </w:p>
-    <w:p>
-      <w:pPr>
-        <w:pStyle w:val="body_letter"/>
-      </w:pPr>
-      <w:r>
-        <w:rPr>
-          <w:rFonts w:ascii="Arial" w:hAnsi="Arial"/>
           <w:b/>
           <w:color w:val="000000"/>
           <w:sz w:val="19"/>
@@ -1130,7 +426,7 @@
           <w:color w:val="000000"/>
           <w:sz w:val="19"/>
         </w:rPr>
-        <w:t>Engage ANU's incoming leadership and Council this week to position KPMG for a governance stabilisation and TEQSA regulatory-relations advisory mandate before external appointments lock in a competitor.</w:t>
+        <w:t>Brief the relevant sector partner this fortnight on the highest-signal regulator development above.</w:t>
       </w:r>
     </w:p>
     <w:p>
@@ -1143,7 +439,7 @@
           <w:color w:val="000000"/>
           <w:sz w:val="19"/>
         </w:rPr>
-        <w:t>Launch a Threshold Standards readiness diagnostic to the Go8 and ATN university roster, framing it as a pre-assessment risk triage ahead of TEQSA's next compliance cycle.</w:t>
+        <w:t>Convene the capability bench for the next reg-tech / capability-review pursuit in pipeline.</w:t>
       </w:r>
     </w:p>
     <w:p>
@@ -1156,112 +452,7 @@
           <w:color w:val="000000"/>
           <w:sz w:val="19"/>
         </w:rPr>
-        <w:t>Convene a targeted CFO roundtable with ATEC Working Group member institutions to establish KPMG's financial modelling and strategic pricing capability ahead of formal sector costing-framework adoption.</w:t>
-      </w:r>
-    </w:p>
-    <w:p>
-      <w:pPr>
-        <w:pStyle w:val="ListBullet"/>
-      </w:pPr>
-      <w:r>
-        <w:rPr>
-          <w:rFonts w:ascii="Arial" w:hAnsi="Arial"/>
-          <w:color w:val="000000"/>
-          <w:sz w:val="19"/>
-        </w:rPr>
-        <w:t>Activate a VET compliance remediation offer to childcare and early-education RTO clients citing the ASQA cancellation action as a concrete enforcement precedent requiring immediate gap assessment and re-registration readiness work.</w:t>
-      </w:r>
-    </w:p>
-    <w:p>
-      <w:pPr>
-        <w:pStyle w:val="ListBullet"/>
-      </w:pPr>
-      <w:r>
-        <w:rPr>
-          <w:rFonts w:ascii="Arial" w:hAnsi="Arial"/>
-          <w:color w:val="000000"/>
-          <w:sz w:val="19"/>
-        </w:rPr>
-        <w:t>Brief the workforce transformation practice on the DEWR AI and employment report to develop a bundled AI-capability uplift and change advisory proposition for universities and TAFEs facing dual pressure on qualification relevance and teaching model redesign.</w:t>
-      </w:r>
-    </w:p>
-    <w:p>
-      <w:pPr>
-        <w:pStyle w:val="body_letter"/>
-      </w:pPr>
-      <w:r>
-        <w:rPr>
-          <w:rFonts w:ascii="Arial" w:hAnsi="Arial"/>
-          <w:b/>
-          <w:color w:val="000000"/>
-          <w:sz w:val="19"/>
-        </w:rPr>
-        <w:t>Implications for clients</w:t>
-      </w:r>
-    </w:p>
-    <w:p>
-      <w:pPr>
-        <w:pStyle w:val="ListBullet"/>
-      </w:pPr>
-      <w:r>
-        <w:rPr>
-          <w:rFonts w:ascii="Arial" w:hAnsi="Arial"/>
-          <w:color w:val="000000"/>
-          <w:sz w:val="19"/>
-        </w:rPr>
-        <w:t>Engage ANU's incoming leadership and Council this week to position KPMG for a governance stabilisation and TEQSA regulatory-relations advisory mandate before external appointments lock in a competitor.</w:t>
-      </w:r>
-    </w:p>
-    <w:p>
-      <w:pPr>
-        <w:pStyle w:val="ListBullet"/>
-      </w:pPr>
-      <w:r>
-        <w:rPr>
-          <w:rFonts w:ascii="Arial" w:hAnsi="Arial"/>
-          <w:color w:val="000000"/>
-          <w:sz w:val="19"/>
-        </w:rPr>
-        <w:t>Launch a Threshold Standards readiness diagnostic to the Go8 and ATN university roster, framing it as a pre-assessment risk triage ahead of TEQSA's next compliance cycle.</w:t>
-      </w:r>
-    </w:p>
-    <w:p>
-      <w:pPr>
-        <w:pStyle w:val="ListBullet"/>
-      </w:pPr>
-      <w:r>
-        <w:rPr>
-          <w:rFonts w:ascii="Arial" w:hAnsi="Arial"/>
-          <w:color w:val="000000"/>
-          <w:sz w:val="19"/>
-        </w:rPr>
-        <w:t>Convene a targeted CFO roundtable with ATEC Working Group member institutions to establish KPMG's financial modelling and strategic pricing capability ahead of formal sector costing-framework adoption.</w:t>
-      </w:r>
-    </w:p>
-    <w:p>
-      <w:pPr>
-        <w:pStyle w:val="ListBullet"/>
-      </w:pPr>
-      <w:r>
-        <w:rPr>
-          <w:rFonts w:ascii="Arial" w:hAnsi="Arial"/>
-          <w:color w:val="000000"/>
-          <w:sz w:val="19"/>
-        </w:rPr>
-        <w:t>Activate a VET compliance remediation offer to childcare and early-education RTO clients citing the ASQA cancellation action as a concrete enforcement precedent requiring immediate gap assessment and re-registration readiness work.</w:t>
-      </w:r>
-    </w:p>
-    <w:p>
-      <w:pPr>
-        <w:pStyle w:val="ListBullet"/>
-      </w:pPr>
-      <w:r>
-        <w:rPr>
-          <w:rFonts w:ascii="Arial" w:hAnsi="Arial"/>
-          <w:color w:val="000000"/>
-          <w:sz w:val="19"/>
-        </w:rPr>
-        <w:t>Brief the workforce transformation practice on the DEWR AI and employment report to develop a bundled AI-capability uplift and change advisory proposition for universities and TAFEs facing dual pressure on qualification relevance and teaching model redesign.</w:t>
+        <w:t>Pursue at least one tracked client on a near-term advisory hook before the next CoP cadence.</w:t>
       </w:r>
     </w:p>
     <w:p>
@@ -1285,221 +476,11 @@
       <w:r>
         <w:rPr>
           <w:rFonts w:ascii="Arial" w:hAnsi="Arial"/>
-          <w:b/>
-          <w:color w:val="000000"/>
+          <w:i/>
+          <w:color w:val="666666"/>
           <w:sz w:val="19"/>
         </w:rPr>
-        <w:t>Public Sector</w:t>
-      </w:r>
-    </w:p>
-    <w:p>
-      <w:pPr>
-        <w:pStyle w:val="body_letter"/>
-      </w:pPr>
-      <w:r>
-        <w:rPr>
-          <w:rFonts w:ascii="Arial" w:hAnsi="Arial"/>
-          <w:b w:val="0"/>
-          <w:color w:val="000000"/>
-          <w:sz w:val="19"/>
-        </w:rPr>
-        <w:t>The Commonwealth's announcement of Australian Standards for AI shifts the policy intent to implementation obligation, creating immediate advisory demand for AI governance frameworks, risk uplift, and assurance readiness across federal agencies before procurement cycles open. Concurrently, expanding Security of Critical Infrastructure Act requirements are imposing tighter compliance timelines on government-owned and government-adjacent operators, opening assurance and program advisory pursuits particularly in energy and transport portfolios. The APSC's live APS bargaining posture, alongside Tasmania's active state-government workforce retraining initiative for the Liberty Bell Bay cohort, signals a sustained public sector L&amp;D and workforce-transformation pipeline at both Commonwealth and state levels. The Robodebt whistleblower litigation now before the courts continues to focus executive attention on public sector integrity, accountability culture, and protected disclosure frameworks, sustaining demand for culture and governance advisory.</w:t>
-      </w:r>
-    </w:p>
-    <w:p>
-      <w:pPr>
-        <w:pStyle w:val="body_letter"/>
-      </w:pPr>
-      <w:r>
-        <w:rPr>
-          <w:rFonts w:ascii="Arial" w:hAnsi="Arial"/>
-          <w:b/>
-          <w:color w:val="000000"/>
-          <w:sz w:val="19"/>
-        </w:rPr>
-        <w:t>Financial Services</w:t>
-      </w:r>
-    </w:p>
-    <w:p>
-      <w:pPr>
-        <w:pStyle w:val="body_letter"/>
-      </w:pPr>
-      <w:r>
-        <w:rPr>
-          <w:rFonts w:ascii="Arial" w:hAnsi="Arial"/>
-          <w:b w:val="0"/>
-          <w:color w:val="000000"/>
-          <w:sz w:val="19"/>
-        </w:rPr>
-        <w:t>The Treasurer's formal riding instructions to APRA and ASIC, reinforced by ASIC's published Statement of Intent, mark a deliberate regulatory pivot toward growth-enabling supervision without softening enforcement, ASIC recorded a record $830 million in civil penalties in 2025-26, signalling simultaneous deregulatory ambition and heightened accountability. The Financial Accountability Regime remains materially underutilised in superannuation, creating an active advisory window for FAR gap assessments and accountability-mapping engagements across super trustees before enforcement posture hardens. Systemic reporting failures at Deutsche Bank (trade reporting, $2M penalty) and NAB's WealthHub ($1M+ breach reporting fine), alongside multiple AFS licence suspensions and wind-up actions, reflect a pattern of governance and controls deficiency that supports assurance, remediation, and managed-services pitches across banking and wealth. Labor's AI-powered regulatory red-tape reduction agenda adds a technology-transformation hook, particularly for institutions facing dual pressure to cut compliance cost while meeting elevated FAR and reporting obligations.</w:t>
-      </w:r>
-    </w:p>
-    <w:p>
-      <w:pPr>
-        <w:pStyle w:val="body_letter"/>
-      </w:pPr>
-      <w:r>
-        <w:rPr>
-          <w:rFonts w:ascii="Arial" w:hAnsi="Arial"/>
-          <w:b/>
-          <w:color w:val="000000"/>
-          <w:sz w:val="19"/>
-        </w:rPr>
-        <w:t>Health, Ageing &amp; Human Services</w:t>
-      </w:r>
-    </w:p>
-    <w:p>
-      <w:pPr>
-        <w:pStyle w:val="body_letter"/>
-      </w:pPr>
-      <w:r>
-        <w:rPr>
-          <w:rFonts w:ascii="Arial" w:hAnsi="Arial"/>
-          <w:b w:val="0"/>
-          <w:color w:val="000000"/>
-          <w:sz w:val="19"/>
-        </w:rPr>
-        <w:t>The NDIS Quality and Safeguards Commission's mandatory registration regime represents a structural compliance inflection point for the sector, forcing thousands of currently unregistered providers to meet registration standards under criminal-liability exposure, a direct readiness and governance advisory pull-through. Ahpra's CEO has publicly anchored a multi-year transformation agenda around cultural safety, proactive oversight, and future-ready digital regulation, signalling sustained investment in operating model and capability uplift where KPMG can compete on both strategy and delivery. The TGA's responsive posture to the 60 Minutes medical device investigation, combined with its launch of interactive regulatory e-learning modules, indicates a regulator under reputational and parliamentary pressure investing in stakeholder engagement infrastructure, an environment that rewards a trusted advisory presence. A concurrent CCYP inquiry finding that multiple child protection reports failed to stem harm adds a cross-sector systemic reform signal, reinforcing demand for risk assurance and case-management redesign across human services agencies.</w:t>
-      </w:r>
-    </w:p>
-    <w:p>
-      <w:pPr>
-        <w:pStyle w:val="body_letter"/>
-      </w:pPr>
-      <w:r>
-        <w:rPr>
-          <w:rFonts w:ascii="Arial" w:hAnsi="Arial"/>
-          <w:b/>
-          <w:color w:val="000000"/>
-          <w:sz w:val="19"/>
-        </w:rPr>
-        <w:t>Energy, Mining &amp; Property</w:t>
-      </w:r>
-    </w:p>
-    <w:p>
-      <w:pPr>
-        <w:pStyle w:val="body_letter"/>
-      </w:pPr>
-      <w:r>
-        <w:rPr>
-          <w:rFonts w:ascii="Arial" w:hAnsi="Arial"/>
-          <w:b w:val="0"/>
-          <w:color w:val="000000"/>
-          <w:sz w:val="19"/>
-        </w:rPr>
-        <w:t>The AER's Independent Panel report on the 2026 Rate of Return Instrument is the highest-priority regulatory economics signal this fortnight, with the instrument's final settings directly shaping allowable returns across all gas and electricity access arrangements currently in reset, including RBP (2027-32), AusNet Gas, and Multinet (2028-33). APA Group's concurrent advanced capex and South West Pipeline determinations, combined with LMS Energy and AGIG submissions into the Multinet and AusNet resets, mark a concentrated window of network regulatory activity where KPMG's regulatory economics and submission advisory capability can be deployed at scale. The Federal Government's Critical Minerals Production Tax Incentive consultation and the WA project approval anchoring the Australia-US critical minerals pact signal strong upstream investment momentum, generating demand for incentive guidance, project-level due diligence, and compliance program design. Origin Energy's ACCC-mandated customer refund program and the Fair Work regulator's action over unpaid wages on a WA offshore platform are live enforcement signals that reinforce the case for proactive compliance and regulatory risk engagements across energy and resources clients.</w:t>
-      </w:r>
-    </w:p>
-    <w:p>
-      <w:pPr>
-        <w:pStyle w:val="body_letter"/>
-      </w:pPr>
-      <w:r>
-        <w:rPr>
-          <w:rFonts w:ascii="Arial" w:hAnsi="Arial"/>
-          <w:b/>
-          <w:color w:val="000000"/>
-          <w:sz w:val="19"/>
-        </w:rPr>
-        <w:t>National Security &amp; Justice</w:t>
-      </w:r>
-    </w:p>
-    <w:p>
-      <w:pPr>
-        <w:pStyle w:val="body_letter"/>
-      </w:pPr>
-      <w:r>
-        <w:rPr>
-          <w:rFonts w:ascii="Arial" w:hAnsi="Arial"/>
-          <w:b w:val="0"/>
-          <w:color w:val="000000"/>
-          <w:sz w:val="19"/>
-        </w:rPr>
-        <w:t>AUSTRAC's publication of AML/CTF program-build resources and professional designated services guidance, timed to the imminent tranche-2 extension of obligations to real estate agents, lawyers, and accountants, signals a step-change in the regulated population that creates an immediate compliance program build-out wave KPMG's financial crime practice should be positioned to capture ahead of implementation deadlines. The ACIC's ten-year wastewater analytics milestone and its consolidation of national policing data under NCIS demonstrate sustained Commonwealth investment in intelligence data capability, opening near-term data architecture, governance, and analytics advisory opportunities. The AFP's Operation Moonbi and ABF's enforcement actions on weapons importation and Russia export-control breaches reinforce an active enforcement cycle across the national security portfolio, which partners should use as a market-activation trigger. KPMG should accelerate real estate and professional-services sector outreach on AML/CTF gap assessments while initiating a scoping conversation with the ACIC account team on the NCIS data-platform expansion.</w:t>
-      </w:r>
-    </w:p>
-    <w:p>
-      <w:pPr>
-        <w:pStyle w:val="body_letter"/>
-      </w:pPr>
-      <w:r>
-        <w:rPr>
-          <w:rFonts w:ascii="Arial" w:hAnsi="Arial"/>
-          <w:b/>
-          <w:color w:val="000000"/>
-          <w:sz w:val="19"/>
-        </w:rPr>
-        <w:t>Defence</w:t>
-      </w:r>
-    </w:p>
-    <w:p>
-      <w:pPr>
-        <w:pStyle w:val="body_letter"/>
-      </w:pPr>
-      <w:r>
-        <w:rPr>
-          <w:rFonts w:ascii="Arial" w:hAnsi="Arial"/>
-          <w:b w:val="0"/>
-          <w:color w:val="000000"/>
-          <w:sz w:val="19"/>
-        </w:rPr>
-        <w:t>The Defence portfolio is generating strong forward signals across capability investment, export commercialisation, and data governance reform. The Department of Defence's stated shift to an 'enable, not gatekeep' posture on sensitive data and expertise guidelines creates an immediate advisory opening around industry engagement frameworks, information architecture, and data-sharing governance for prime and sub-prime contractors. Confirmation of AUKUS Pillar II's first signature project formalises a trilateral advanced-capabilities pipeline, driving sustained demand across technology transfer governance, program assurance, and sovereign industrial base development. Australia's record $2.5b radar export deal with Canada signals a maturing defence export machinery, raising near-term demand for export compliance frameworks, offset obligation structuring, and commercial due diligence support.</w:t>
-      </w:r>
-    </w:p>
-    <w:p>
-      <w:pPr>
-        <w:pStyle w:val="body_letter"/>
-      </w:pPr>
-      <w:r>
-        <w:rPr>
-          <w:rFonts w:ascii="Arial" w:hAnsi="Arial"/>
-          <w:b/>
-          <w:color w:val="000000"/>
-          <w:sz w:val="19"/>
-        </w:rPr>
-        <w:t>Transport</w:t>
-      </w:r>
-    </w:p>
-    <w:p>
-      <w:pPr>
-        <w:pStyle w:val="body_letter"/>
-      </w:pPr>
-      <w:r>
-        <w:rPr>
-          <w:rFonts w:ascii="Arial" w:hAnsi="Arial"/>
-          <w:b w:val="0"/>
-          <w:color w:val="000000"/>
-          <w:sz w:val="19"/>
-        </w:rPr>
-        <w:t>AMSA's National Compliance Plan 2026-27 formalises an enforcement uplift cycle targeting operator risk practices and seafarer safety standards, providing a concrete entry point for compliance-readiness and assurance engagements across maritime clients before the enforcement calendar activates. CASA is advancing dual active consultations, annual registration for VH-registered aircraft (PP 2616CS) and expanded drone operations above 400 ft in defined environments (PP 2612US), while Home Affairs runs a parallel drone security consultation, signalling a multi-agency UAS regulatory architecture build that will require operators to redesign compliance frameworks from the ground up. New CASA pathways for UK and US aircraft maintenance engineers and the Bonza commercial approval reinforce underlying aviation workforce and capability gaps, while the Victorian Government's road safety camera technology trial flags state-level transport tech procurement pipeline. KPMG is well-positioned to lead compliance architecture design, risk framework uplift, and implementation advisory across both the maritime enforcement cycle and the converging aviation and UAS regulatory reform agenda.</w:t>
-      </w:r>
-    </w:p>
-    <w:p>
-      <w:pPr>
-        <w:pStyle w:val="body_letter"/>
-      </w:pPr>
-      <w:r>
-        <w:rPr>
-          <w:rFonts w:ascii="Arial" w:hAnsi="Arial"/>
-          <w:b/>
-          <w:color w:val="000000"/>
-          <w:sz w:val="19"/>
-        </w:rPr>
-        <w:t>Education</w:t>
-      </w:r>
-    </w:p>
-    <w:p>
-      <w:pPr>
-        <w:pStyle w:val="body_letter"/>
-      </w:pPr>
-      <w:r>
-        <w:rPr>
-          <w:rFonts w:ascii="Arial" w:hAnsi="Arial"/>
-          <w:b w:val="0"/>
-          <w:color w:val="000000"/>
-          <w:sz w:val="19"/>
-        </w:rPr>
-        <w:t>TEQSA's amendments to the Higher Education Threshold Standards and the joint ASQA-TEQSA compliance alert on overseas student transfers signal a sustained regulatory uplift cycle across both university and VET sectors, with provider governance, student protections, and international cohort management all under heightened scrutiny. The ATEC Working Group on Higher Education Costing and Pricing is advancing sector-wide costing frameworks, creating near-term demand for financial modelling and strategic pricing advisory among universities facing funding pressure. ASQA's move to cancel childcare qualifications issued by a deregistered RTO, alongside the NCVET-ASQA quality-assurance MOU, points to accelerating cross-jurisdictional compliance burden for VET providers and a pull-through for risk and assurance engagements. DEWR's AI and employment report adds a workforce-transformation overlay, with education and training providers likely to require capability uplift and change advisory as AI reshapes qualification relevance and delivery models.</w:t>
+        <w:t>No sector-level synthesis available this fortnight.</w:t>
       </w:r>
     </w:p>
     <w:p>
@@ -1523,249 +504,11 @@
       <w:r>
         <w:rPr>
           <w:rFonts w:ascii="Arial" w:hAnsi="Arial"/>
-          <w:b/>
-          <w:color w:val="000000"/>
+          <w:i/>
+          <w:color w:val="666666"/>
           <w:sz w:val="19"/>
         </w:rPr>
-        <w:t>Commonwealth</w:t>
-      </w:r>
-    </w:p>
-    <w:p>
-      <w:pPr>
-        <w:pStyle w:val="body_letter"/>
-      </w:pPr>
-      <w:r>
-        <w:rPr>
-          <w:rFonts w:ascii="Arial" w:hAnsi="Arial"/>
-          <w:b w:val="0"/>
-          <w:color w:val="000000"/>
-          <w:sz w:val="19"/>
-        </w:rPr>
-        <w:t>ASIC delivered a record $830 million in penalties across its strongest enforcement year to date, underscoring a materially elevated federal enforcement posture in financial services and corporate conduct that raises compliance risk for regulated entities. The Albanese Government announced mandatory Australian AI Standards, a comprehensive framework governing automated decision-making by Commonwealth agencies and industry, creating immediate and prospective compliance obligations for entities operating under federal regulation, with legal analysis from Maddocks and White &amp; Case flagging a significant course change from prior voluntary guidance. The Department of Home Affairs has opened consultation on proposed amendments to streamline and modernise the Security of Critical Infrastructure Act 2018, presenting a near-term advisory window for regulated critical infrastructure operators. Financial regulators have also received a formal growth mandate welcomed by the banking sector, signalling a strategic reorientation of supervisory priorities that KPMG clients should monitor for downstream compliance implications.</w:t>
-      </w:r>
-    </w:p>
-    <w:p>
-      <w:pPr>
-        <w:pStyle w:val="body_letter"/>
-      </w:pPr>
-      <w:r>
-        <w:rPr>
-          <w:rFonts w:ascii="Arial" w:hAnsi="Arial"/>
-          <w:b/>
-          <w:color w:val="000000"/>
-          <w:sz w:val="19"/>
-        </w:rPr>
-        <w:t>New South Wales</w:t>
-      </w:r>
-    </w:p>
-    <w:p>
-      <w:pPr>
-        <w:pStyle w:val="body_letter"/>
-      </w:pPr>
-      <w:r>
-        <w:rPr>
-          <w:rFonts w:ascii="Arial" w:hAnsi="Arial"/>
-          <w:b w:val="0"/>
-          <w:color w:val="000000"/>
-          <w:sz w:val="19"/>
-        </w:rPr>
-        <w:t>SafeWork NSW is intensifying enforcement focus across high-risk industries, with quarrying and other sectors flagged for heightened compliance scrutiny, creating advisory demand around WHS frameworks. NSW is progressing amendments to building regulations, imposing updated compliance obligations on developers, builders and certifiers that will require close monitoring. The NSW EPA's FOGO business mandate guidance to councils signals imminent waste-sector compliance requirements, while the IPART chair appointment of Anthony Wing introduces potential strategic recalibration of utility pricing and regulatory oversight priorities. The ODPP inquiry findings and ICAC activity in the Hills Liberal matter underscore ongoing integrity and governance risks for public-sector clients.</w:t>
-      </w:r>
-    </w:p>
-    <w:p>
-      <w:pPr>
-        <w:pStyle w:val="body_letter"/>
-      </w:pPr>
-      <w:r>
-        <w:rPr>
-          <w:rFonts w:ascii="Arial" w:hAnsi="Arial"/>
-          <w:b/>
-          <w:color w:val="000000"/>
-          <w:sz w:val="19"/>
-        </w:rPr>
-        <w:t>Victoria</w:t>
-      </w:r>
-    </w:p>
-    <w:p>
-      <w:pPr>
-        <w:pStyle w:val="body_letter"/>
-      </w:pPr>
-      <w:r>
-        <w:rPr>
-          <w:rFonts w:ascii="Arial" w:hAnsi="Arial"/>
-          <w:b w:val="0"/>
-          <w:color w:val="000000"/>
-          <w:sz w:val="19"/>
-        </w:rPr>
-        <w:t>Victoria is experiencing a dense legislative and enforcement cycle across multiple sectors simultaneously. The Work from Home Bill has been introduced into Parliament, creating significant new employer compliance obligations and, per Lawyers Weekly, material operational impacts on VCAT, while building reform amendments that commenced on 1 July continue to reshape construction sector licensing and standards requirements. The Essential Services Commission has launched a Port of Melbourne pricing inquiry, representing a material advisory opportunity in infrastructure regulation, and EPA Victoria has initiated satellite-based land-clearing surveillance capabilities signalling a step-change in environmental enforcement posture. An updated Ministerial Statement of Expectations, reinstated electoral donation caps, new social media vilification demasking powers, and a family day care provider suspension for compliance failures collectively signal active regulatory expansion across digital, electoral, environmental and social services sectors.</w:t>
-      </w:r>
-    </w:p>
-    <w:p>
-      <w:pPr>
-        <w:pStyle w:val="body_letter"/>
-      </w:pPr>
-      <w:r>
-        <w:rPr>
-          <w:rFonts w:ascii="Arial" w:hAnsi="Arial"/>
-          <w:b/>
-          <w:color w:val="000000"/>
-          <w:sz w:val="19"/>
-        </w:rPr>
-        <w:t>Queensland</w:t>
-      </w:r>
-    </w:p>
-    <w:p>
-      <w:pPr>
-        <w:pStyle w:val="body_letter"/>
-      </w:pPr>
-      <w:r>
-        <w:rPr>
-          <w:rFonts w:ascii="Arial" w:hAnsi="Arial"/>
-          <w:b w:val="0"/>
-          <w:color w:val="000000"/>
-          <w:sz w:val="19"/>
-        </w:rPr>
-        <w:t>Queensland's 2026-27 Budget ($119B capital program) introduces significant procurement, productivity, and housing compliance obligations, while the Financial Provisioning Scheme Review delivers material 2025 reforms to resource-sector financial assurance arrangements, both representing immediate advisory mandates. New AML/CTF obligations have commenced for Queensland law firms, with the QLS urging enrolment, creating a time-sensitive compliance uplift opportunity across the legal sector. The Queensland Productivity Commission's examination of EPBC Act reform signals potential streamlining of state-federal environmental approval pathways, and Supreme Court judges have been appointed to lead a Queensland human rights framework review, flagging downstream legislative change. Concurrent safeguarding reforms responding to the In Plain Sight review, ongoing CFMEU enforcement failures in construction, and a building regulator misconduct inquiry compound an already crowded regulatory reform agenda requiring client risk-triage across multiple sectors.</w:t>
-      </w:r>
-    </w:p>
-    <w:p>
-      <w:pPr>
-        <w:pStyle w:val="body_letter"/>
-      </w:pPr>
-      <w:r>
-        <w:rPr>
-          <w:rFonts w:ascii="Arial" w:hAnsi="Arial"/>
-          <w:b/>
-          <w:color w:val="000000"/>
-          <w:sz w:val="19"/>
-        </w:rPr>
-        <w:t>Western Australia</w:t>
-      </w:r>
-    </w:p>
-    <w:p>
-      <w:pPr>
-        <w:pStyle w:val="body_letter"/>
-      </w:pPr>
-      <w:r>
-        <w:rPr>
-          <w:rFonts w:ascii="Arial" w:hAnsi="Arial"/>
-          <w:b w:val="0"/>
-          <w:color w:val="000000"/>
-          <w:sz w:val="19"/>
-        </w:rPr>
-        <w:t>Western Australia has become the first Australian jurisdiction to deploy real-time facial recognition surveillance cameras, a landmark development with significant privacy law, civil liberties, and compliance framework implications for organisations operating in the state. Concurrently, a major planning reform will open thousands more Perth properties to subdivision, expanding development approval and land-use compliance obligations across the residential sector. On the enforcement front, WA regulators have conducted large-scale tobacco compliance operations, seizing over a tonne of product and closing nearly 50 stores, signalling a sustained crackdown on illicit retail trade. Separately, WA has reduced registered builder licensing requirements for ancillary structures (sheds, garages, carports) and backed federal online lottery reform to protect its state-owned lottery monopoly, both representing targeted deregulatory and intergovernmental positioning moves.</w:t>
-      </w:r>
-    </w:p>
-    <w:p>
-      <w:pPr>
-        <w:pStyle w:val="body_letter"/>
-      </w:pPr>
-      <w:r>
-        <w:rPr>
-          <w:rFonts w:ascii="Arial" w:hAnsi="Arial"/>
-          <w:b/>
-          <w:color w:val="000000"/>
-          <w:sz w:val="19"/>
-        </w:rPr>
-        <w:t>South Australia</w:t>
-      </w:r>
-    </w:p>
-    <w:p>
-      <w:pPr>
-        <w:pStyle w:val="body_letter"/>
-      </w:pPr>
-      <w:r>
-        <w:rPr>
-          <w:rFonts w:ascii="Arial" w:hAnsi="Arial"/>
-          <w:b w:val="0"/>
-          <w:color w:val="000000"/>
-          <w:sz w:val="19"/>
-        </w:rPr>
-        <w:t>The South Australian Commissioner for Gambling has finalised a AU$21 million enforcement settlement with SkyCity Adelaide, also mandating appointment of a dedicated Adelaide CEO, a significant precedent for gaming compliance obligations and board-governance expectations for SA-licensed operators. SA has legislated criminal offences for non-consensual deepfake content ahead of any federal equivalent, creating immediate compliance and legal-risk obligations for technology, media, and platform businesses operating in the state. Proposed reforms to SA's First Nations Voice to Parliament introduce potential new consultation and engagement obligations relevant to planning, development, and government procurement advisory work. SafeWork SA's active enforcement response to asbestos risks in commercial fitness facilities signals continued priority on WHS compliance in non-traditional settings, opening workplace-safety compliance review opportunities across the SA commercial property sector.</w:t>
-      </w:r>
-    </w:p>
-    <w:p>
-      <w:pPr>
-        <w:pStyle w:val="body_letter"/>
-      </w:pPr>
-      <w:r>
-        <w:rPr>
-          <w:rFonts w:ascii="Arial" w:hAnsi="Arial"/>
-          <w:b/>
-          <w:color w:val="000000"/>
-          <w:sz w:val="19"/>
-        </w:rPr>
-        <w:t>Tasmania</w:t>
-      </w:r>
-    </w:p>
-    <w:p>
-      <w:pPr>
-        <w:pStyle w:val="body_letter"/>
-      </w:pPr>
-      <w:r>
-        <w:rPr>
-          <w:rFonts w:ascii="Arial" w:hAnsi="Arial"/>
-          <w:b w:val="0"/>
-          <w:color w:val="000000"/>
-          <w:sz w:val="19"/>
-        </w:rPr>
-        <w:t>Tasmania's legislative agenda is particularly active on family violence, with the first tranche of protection reforms announced alongside a nation-first levy on offenders, both creating new compliance and reporting obligations for relevant sectors. Liquor licensing has been streamlined via legislative reform, reducing approval timelines and presenting advisory opportunities for hospitality clients navigating the updated framework. Enforcement activity is elevated across multiple regulators: Consumer/health agencies seized 5.5 million illegal cigarettes and ~30,000 vapes; WorkSafe Tasmania has opened an investigation into the Hobart Cracker Night fireworks incident; and the EPA lifted a processing ban on a recycling facility, signalling active regulatory oversight of waste management. Local government structural reform, cutting 50 councillors after passing the upper house, and the repeal of the one-metre powerline clearance rule for tradies round out a busy period of state-level regulatory change.</w:t>
-      </w:r>
-    </w:p>
-    <w:p>
-      <w:pPr>
-        <w:pStyle w:val="body_letter"/>
-      </w:pPr>
-      <w:r>
-        <w:rPr>
-          <w:rFonts w:ascii="Arial" w:hAnsi="Arial"/>
-          <w:b/>
-          <w:color w:val="000000"/>
-          <w:sz w:val="19"/>
-        </w:rPr>
-        <w:t>Australian Capital Territory</w:t>
-      </w:r>
-    </w:p>
-    <w:p>
-      <w:pPr>
-        <w:pStyle w:val="body_letter"/>
-      </w:pPr>
-      <w:r>
-        <w:rPr>
-          <w:rFonts w:ascii="Arial" w:hAnsi="Arial"/>
-          <w:b w:val="0"/>
-          <w:color w:val="000000"/>
-          <w:sz w:val="19"/>
-        </w:rPr>
-        <w:t>The ACT Legislative Assembly has passed landmark 'missing middle' housing reforms permitting medium-density development in established suburbs, creating immediate compliance and planning advisory demand for developers, councils, and legal practitioners navigating the new framework. The 2026-27 ACT Budget eliminates stamp duty for first-home buyers while projecting net debt of $12.5 billion, signalling continued property tax reform and heightened fiscal risk, both areas requiring advisory support on transaction structuring and government financial sustainability. A significant cross-jurisdictional procurement compliance gap has been exposed with a subcontractor banned in NSW reportedly winning ACT government contracts, pointing to material weaknesses in the ACT's contractor screening and debarment-recognition processes. Concurrently, the ACT Government's formal acceptance of the health system inquiry report and a major pokies review recommending a managed phase-down of gaming machines both present near-term advisory opportunities in regulated industry transition planning and compliance strategy.</w:t>
-      </w:r>
-    </w:p>
-    <w:p>
-      <w:pPr>
-        <w:pStyle w:val="body_letter"/>
-      </w:pPr>
-      <w:r>
-        <w:rPr>
-          <w:rFonts w:ascii="Arial" w:hAnsi="Arial"/>
-          <w:b/>
-          <w:color w:val="000000"/>
-          <w:sz w:val="19"/>
-        </w:rPr>
-        <w:t>Northern Territory</w:t>
-      </w:r>
-    </w:p>
-    <w:p>
-      <w:pPr>
-        <w:pStyle w:val="body_letter"/>
-      </w:pPr>
-      <w:r>
-        <w:rPr>
-          <w:rFonts w:ascii="Arial" w:hAnsi="Arial"/>
-          <w:b w:val="0"/>
-          <w:color w:val="000000"/>
-          <w:sz w:val="19"/>
-        </w:rPr>
-        <w:t>The NT Government is pressing ahead with the contested 'Every Child Matters Bill', drawing sharp criticism from SNAICC, the National Justice Project, and the outgoing Children's Commissioner, who publicly condemned the government's lack of accountability on departure; a concurrent systemic-failings report is being cited by government to justify the accelerated reform. WorkSafe NT is under scrutiny over dropped charges in a workplace fatality, while a separate WorkSafe prosecution of an NT Aboriginal corporation over a fatal ute rollover signals continued WHS enforcement exposure for community-controlled organisations. The NT EPA approved Santos' hot venting request, a material environmental regulatory decision with implications for energy sector compliance obligations in the Territory. Consumer protection regulators fined NT service stations $38,000 for fuel overcharging, and the NT Government extended alcohol bans in town camps, each signalling active use of existing regulatory tools alongside the legislative reform agenda.</w:t>
+        <w:t>No jurisdiction-level synthesis available this fortnight.</w:t>
       </w:r>
     </w:p>
     <w:tbl>
@@ -1811,7 +554,7 @@
                           <pic:cNvPicPr/>
                         </pic:nvPicPr>
                         <pic:blipFill>
-                          <a:blip r:embed="rId18"/>
+                          <a:blip r:embed="rId10"/>
                           <a:stretch>
                             <a:fillRect/>
                           </a:stretch>

</xml_diff>

<commit_message>
chore: update regulation hub 2026-08-01
</commit_message>
<xml_diff>
--- a/reg-hub/regulation_fortnightly_brief.docx
+++ b/reg-hub/regulation_fortnightly_brief.docx
@@ -46,7 +46,7 @@
         <w:pStyle w:val="Heading1"/>
       </w:pPr>
       <w:r>
-        <w:t>KPMG Regulatory Transformation Fortnightly Brief - 16-29 July 2026</w:t>
+        <w:t>KPMG Regulatory Transformation Fortnightly Brief - 20 July - 2 August 2026</w:t>
       </w:r>
     </w:p>
     <w:p>
@@ -73,7 +73,7 @@
           <w:color w:val="666666"/>
           <w:sz w:val="19"/>
         </w:rPr>
-        <w:t>29 July 2026</w:t>
+        <w:t>02 August 2026</w:t>
       </w:r>
     </w:p>
     <w:p>
@@ -390,6 +390,64 @@
     </w:p>
     <w:p>
       <w:pPr>
+        <w:pStyle w:val="ListBullet"/>
+      </w:pPr>
+      <w:r>
+        <w:rPr>
+          <w:rFonts w:ascii="Arial" w:hAnsi="Arial"/>
+          <w:b/>
+          <w:color w:val="000000"/>
+          <w:sz w:val="19"/>
+        </w:rPr>
+        <w:t>Banking &amp;amp; Financial Services Law Association Conference 2026</w:t>
+      </w:r>
+      <w:r>
+        <w:rPr>
+          <w:rFonts w:ascii="Arial" w:hAnsi="Arial"/>
+          <w:color w:val="000000"/>
+          <w:sz w:val="19"/>
+        </w:rPr>
+        <w:t xml:space="preserve"> - </w:t>
+      </w:r>
+      <w:r>
+        <w:rPr>
+          <w:rFonts w:ascii="Arial" w:hAnsi="Arial"/>
+          <w:color w:val="000000"/>
+          <w:sz w:val="19"/>
+        </w:rPr>
+        <w:t>22 Aug 2026 - APRA · Online</w:t>
+      </w:r>
+      <w:r>
+        <w:rPr>
+          <w:rFonts w:ascii="Arial" w:hAnsi="Arial"/>
+          <w:color w:val="000000"/>
+          <w:sz w:val="19"/>
+        </w:rPr>
+        <w:t xml:space="preserve"> (</w:t>
+      </w:r>
+      <w:hyperlink r:id="rId10">
+        <w:r>
+          <w:rPr>
+            <w:rFonts w:ascii="Arial" w:hAnsi="Arial" w:cs="Arial"/>
+            <w:color w:val="0000FF"/>
+            <w:sz w:val="19"/>
+            <w:szCs w:val="19"/>
+            <w:u w:val="single"/>
+          </w:rPr>
+          <w:t xml:space="preserve">Register</w:t>
+        </w:r>
+      </w:hyperlink>
+      <w:r>
+        <w:rPr>
+          <w:rFonts w:ascii="Arial" w:hAnsi="Arial"/>
+          <w:color w:val="000000"/>
+          <w:sz w:val="19"/>
+        </w:rPr>
+        <w:t>)</w:t>
+      </w:r>
+    </w:p>
+    <w:p>
+      <w:pPr>
         <w:pStyle w:val="subheading_letter"/>
       </w:pPr>
       <w:r>
@@ -554,7 +612,7 @@
                           <pic:cNvPicPr/>
                         </pic:nvPicPr>
                         <pic:blipFill>
-                          <a:blip r:embed="rId10"/>
+                          <a:blip r:embed="rId11"/>
                           <a:stretch>
                             <a:fillRect/>
                           </a:stretch>

</xml_diff>

<commit_message>
chore: update regulation hub 2026-08-15
</commit_message>
<xml_diff>
--- a/reg-hub/regulation_fortnightly_brief.docx
+++ b/reg-hub/regulation_fortnightly_brief.docx
@@ -46,7 +46,7 @@
         <w:pStyle w:val="Heading1"/>
       </w:pPr>
       <w:r>
-        <w:t>KPMG Regulatory Transformation Fortnightly Brief - 20 July - 2 August 2026</w:t>
+        <w:t>KPMG Regulatory Transformation Fortnightly Brief - 3-16 August 2026</w:t>
       </w:r>
     </w:p>
     <w:p>
@@ -73,7 +73,7 @@
           <w:color w:val="666666"/>
           <w:sz w:val="19"/>
         </w:rPr>
-        <w:t>02 August 2026</w:t>
+        <w:t>16 August 2026</w:t>
       </w:r>
     </w:p>
     <w:p>
@@ -339,7 +339,7 @@
           <w:color w:val="000000"/>
           <w:sz w:val="19"/>
         </w:rPr>
-        <w:t>IPAA National Regulatory Governance Forum 2026</w:t>
+        <w:t>2026 Retirement Leadership Summit</w:t>
       </w:r>
       <w:r>
         <w:rPr>
@@ -355,7 +355,35 @@
           <w:color w:val="000000"/>
           <w:sz w:val="19"/>
         </w:rPr>
-        <w:t>13 Aug 2026 - IPAA · Canberra</w:t>
+        <w:t>19 Aug 2026 - APRA · Online</w:t>
+      </w:r>
+      <w:r>
+        <w:rPr>
+          <w:rFonts w:ascii="Arial" w:hAnsi="Arial"/>
+          <w:color w:val="000000"/>
+          <w:sz w:val="19"/>
+        </w:rPr>
+        <w:t xml:space="preserve"> (</w:t>
+      </w:r>
+      <w:hyperlink r:id="rId10">
+        <w:r>
+          <w:rPr>
+            <w:rFonts w:ascii="Arial" w:hAnsi="Arial" w:cs="Arial"/>
+            <w:color w:val="0000FF"/>
+            <w:sz w:val="19"/>
+            <w:szCs w:val="19"/>
+            <w:u w:val="single"/>
+          </w:rPr>
+          <w:t xml:space="preserve">Register</w:t>
+        </w:r>
+      </w:hyperlink>
+      <w:r>
+        <w:rPr>
+          <w:rFonts w:ascii="Arial" w:hAnsi="Arial"/>
+          <w:color w:val="000000"/>
+          <w:sz w:val="19"/>
+        </w:rPr>
+        <w:t>)</w:t>
       </w:r>
     </w:p>
     <w:p>
@@ -425,7 +453,65 @@
         </w:rPr>
         <w:t xml:space="preserve"> (</w:t>
       </w:r>
-      <w:hyperlink r:id="rId10">
+      <w:hyperlink r:id="rId11">
+        <w:r>
+          <w:rPr>
+            <w:rFonts w:ascii="Arial" w:hAnsi="Arial" w:cs="Arial"/>
+            <w:color w:val="0000FF"/>
+            <w:sz w:val="19"/>
+            <w:szCs w:val="19"/>
+            <w:u w:val="single"/>
+          </w:rPr>
+          <w:t xml:space="preserve">Register</w:t>
+        </w:r>
+      </w:hyperlink>
+      <w:r>
+        <w:rPr>
+          <w:rFonts w:ascii="Arial" w:hAnsi="Arial"/>
+          <w:color w:val="000000"/>
+          <w:sz w:val="19"/>
+        </w:rPr>
+        <w:t>)</w:t>
+      </w:r>
+    </w:p>
+    <w:p>
+      <w:pPr>
+        <w:pStyle w:val="ListBullet"/>
+      </w:pPr>
+      <w:r>
+        <w:rPr>
+          <w:rFonts w:ascii="Arial" w:hAnsi="Arial"/>
+          <w:b/>
+          <w:color w:val="000000"/>
+          <w:sz w:val="19"/>
+        </w:rPr>
+        <w:t>Law Society of NSW In-House Lawyers Conference 2026</w:t>
+      </w:r>
+      <w:r>
+        <w:rPr>
+          <w:rFonts w:ascii="Arial" w:hAnsi="Arial"/>
+          <w:color w:val="000000"/>
+          <w:sz w:val="19"/>
+        </w:rPr>
+        <w:t xml:space="preserve"> - </w:t>
+      </w:r>
+      <w:r>
+        <w:rPr>
+          <w:rFonts w:ascii="Arial" w:hAnsi="Arial"/>
+          <w:color w:val="000000"/>
+          <w:sz w:val="19"/>
+        </w:rPr>
+        <w:t>09 Sep 2026 - APRA · Online</w:t>
+      </w:r>
+      <w:r>
+        <w:rPr>
+          <w:rFonts w:ascii="Arial" w:hAnsi="Arial"/>
+          <w:color w:val="000000"/>
+          <w:sz w:val="19"/>
+        </w:rPr>
+        <w:t xml:space="preserve"> (</w:t>
+      </w:r>
+      <w:hyperlink r:id="rId12">
         <w:r>
           <w:rPr>
             <w:rFonts w:ascii="Arial" w:hAnsi="Arial" w:cs="Arial"/>
@@ -612,7 +698,7 @@
                           <pic:cNvPicPr/>
                         </pic:nvPicPr>
                         <pic:blipFill>
-                          <a:blip r:embed="rId11"/>
+                          <a:blip r:embed="rId13"/>
                           <a:stretch>
                             <a:fillRect/>
                           </a:stretch>

</xml_diff>

<commit_message>
chore: update regulation hub 2026-08-19
</commit_message>
<xml_diff>
--- a/reg-hub/regulation_fortnightly_brief.docx
+++ b/reg-hub/regulation_fortnightly_brief.docx
@@ -46,7 +46,7 @@
         <w:pStyle w:val="Heading1"/>
       </w:pPr>
       <w:r>
-        <w:t>KPMG Regulatory Transformation Fortnightly Brief - 3-16 August 2026</w:t>
+        <w:t>KPMG Regulatory Transformation Fortnightly Brief - 7-20 August 2026</w:t>
       </w:r>
     </w:p>
     <w:p>
@@ -73,7 +73,7 @@
           <w:color w:val="666666"/>
           <w:sz w:val="19"/>
         </w:rPr>
-        <w:t>16 August 2026</w:t>
+        <w:t>20 August 2026</w:t>
       </w:r>
     </w:p>
     <w:p>
@@ -339,64 +339,6 @@
           <w:color w:val="000000"/>
           <w:sz w:val="19"/>
         </w:rPr>
-        <w:t>2026 Retirement Leadership Summit</w:t>
-      </w:r>
-      <w:r>
-        <w:rPr>
-          <w:rFonts w:ascii="Arial" w:hAnsi="Arial"/>
-          <w:color w:val="000000"/>
-          <w:sz w:val="19"/>
-        </w:rPr>
-        <w:t xml:space="preserve"> - </w:t>
-      </w:r>
-      <w:r>
-        <w:rPr>
-          <w:rFonts w:ascii="Arial" w:hAnsi="Arial"/>
-          <w:color w:val="000000"/>
-          <w:sz w:val="19"/>
-        </w:rPr>
-        <w:t>19 Aug 2026 - APRA · Online</w:t>
-      </w:r>
-      <w:r>
-        <w:rPr>
-          <w:rFonts w:ascii="Arial" w:hAnsi="Arial"/>
-          <w:color w:val="000000"/>
-          <w:sz w:val="19"/>
-        </w:rPr>
-        <w:t xml:space="preserve"> (</w:t>
-      </w:r>
-      <w:hyperlink r:id="rId10">
-        <w:r>
-          <w:rPr>
-            <w:rFonts w:ascii="Arial" w:hAnsi="Arial" w:cs="Arial"/>
-            <w:color w:val="0000FF"/>
-            <w:sz w:val="19"/>
-            <w:szCs w:val="19"/>
-            <w:u w:val="single"/>
-          </w:rPr>
-          <w:t xml:space="preserve">Register</w:t>
-        </w:r>
-      </w:hyperlink>
-      <w:r>
-        <w:rPr>
-          <w:rFonts w:ascii="Arial" w:hAnsi="Arial"/>
-          <w:color w:val="000000"/>
-          <w:sz w:val="19"/>
-        </w:rPr>
-        <w:t>)</w:t>
-      </w:r>
-    </w:p>
-    <w:p>
-      <w:pPr>
-        <w:pStyle w:val="ListBullet"/>
-      </w:pPr>
-      <w:r>
-        <w:rPr>
-          <w:rFonts w:ascii="Arial" w:hAnsi="Arial"/>
-          <w:b/>
-          <w:color w:val="000000"/>
-          <w:sz w:val="19"/>
-        </w:rPr>
         <w:t>AHRI Public Sector L&amp;D Symposium</w:t>
       </w:r>
       <w:r>
@@ -414,122 +356,6 @@
           <w:sz w:val="19"/>
         </w:rPr>
         <w:t>20 Aug 2026 - AHRI · Sydney</w:t>
-      </w:r>
-    </w:p>
-    <w:p>
-      <w:pPr>
-        <w:pStyle w:val="ListBullet"/>
-      </w:pPr>
-      <w:r>
-        <w:rPr>
-          <w:rFonts w:ascii="Arial" w:hAnsi="Arial"/>
-          <w:b/>
-          <w:color w:val="000000"/>
-          <w:sz w:val="19"/>
-        </w:rPr>
-        <w:t>Banking &amp;amp; Financial Services Law Association Conference 2026</w:t>
-      </w:r>
-      <w:r>
-        <w:rPr>
-          <w:rFonts w:ascii="Arial" w:hAnsi="Arial"/>
-          <w:color w:val="000000"/>
-          <w:sz w:val="19"/>
-        </w:rPr>
-        <w:t xml:space="preserve"> - </w:t>
-      </w:r>
-      <w:r>
-        <w:rPr>
-          <w:rFonts w:ascii="Arial" w:hAnsi="Arial"/>
-          <w:color w:val="000000"/>
-          <w:sz w:val="19"/>
-        </w:rPr>
-        <w:t>22 Aug 2026 - APRA · Online</w:t>
-      </w:r>
-      <w:r>
-        <w:rPr>
-          <w:rFonts w:ascii="Arial" w:hAnsi="Arial"/>
-          <w:color w:val="000000"/>
-          <w:sz w:val="19"/>
-        </w:rPr>
-        <w:t xml:space="preserve"> (</w:t>
-      </w:r>
-      <w:hyperlink r:id="rId11">
-        <w:r>
-          <w:rPr>
-            <w:rFonts w:ascii="Arial" w:hAnsi="Arial" w:cs="Arial"/>
-            <w:color w:val="0000FF"/>
-            <w:sz w:val="19"/>
-            <w:szCs w:val="19"/>
-            <w:u w:val="single"/>
-          </w:rPr>
-          <w:t xml:space="preserve">Register</w:t>
-        </w:r>
-      </w:hyperlink>
-      <w:r>
-        <w:rPr>
-          <w:rFonts w:ascii="Arial" w:hAnsi="Arial"/>
-          <w:color w:val="000000"/>
-          <w:sz w:val="19"/>
-        </w:rPr>
-        <w:t>)</w:t>
-      </w:r>
-    </w:p>
-    <w:p>
-      <w:pPr>
-        <w:pStyle w:val="ListBullet"/>
-      </w:pPr>
-      <w:r>
-        <w:rPr>
-          <w:rFonts w:ascii="Arial" w:hAnsi="Arial"/>
-          <w:b/>
-          <w:color w:val="000000"/>
-          <w:sz w:val="19"/>
-        </w:rPr>
-        <w:t>Law Society of NSW In-House Lawyers Conference 2026</w:t>
-      </w:r>
-      <w:r>
-        <w:rPr>
-          <w:rFonts w:ascii="Arial" w:hAnsi="Arial"/>
-          <w:color w:val="000000"/>
-          <w:sz w:val="19"/>
-        </w:rPr>
-        <w:t xml:space="preserve"> - </w:t>
-      </w:r>
-      <w:r>
-        <w:rPr>
-          <w:rFonts w:ascii="Arial" w:hAnsi="Arial"/>
-          <w:color w:val="000000"/>
-          <w:sz w:val="19"/>
-        </w:rPr>
-        <w:t>09 Sep 2026 - APRA · Online</w:t>
-      </w:r>
-      <w:r>
-        <w:rPr>
-          <w:rFonts w:ascii="Arial" w:hAnsi="Arial"/>
-          <w:color w:val="000000"/>
-          <w:sz w:val="19"/>
-        </w:rPr>
-        <w:t xml:space="preserve"> (</w:t>
-      </w:r>
-      <w:hyperlink r:id="rId12">
-        <w:r>
-          <w:rPr>
-            <w:rFonts w:ascii="Arial" w:hAnsi="Arial" w:cs="Arial"/>
-            <w:color w:val="0000FF"/>
-            <w:sz w:val="19"/>
-            <w:szCs w:val="19"/>
-            <w:u w:val="single"/>
-          </w:rPr>
-          <w:t xml:space="preserve">Register</w:t>
-        </w:r>
-      </w:hyperlink>
-      <w:r>
-        <w:rPr>
-          <w:rFonts w:ascii="Arial" w:hAnsi="Arial"/>
-          <w:color w:val="000000"/>
-          <w:sz w:val="19"/>
-        </w:rPr>
-        <w:t>)</w:t>
       </w:r>
     </w:p>
     <w:p>
@@ -698,7 +524,7 @@
                           <pic:cNvPicPr/>
                         </pic:nvPicPr>
                         <pic:blipFill>
-                          <a:blip r:embed="rId13"/>
+                          <a:blip r:embed="rId10"/>
                           <a:stretch>
                             <a:fillRect/>
                           </a:stretch>

</xml_diff>

<commit_message>
chore: update regulation hub 2026-08-31
</commit_message>
<xml_diff>
--- a/reg-hub/regulation_fortnightly_brief.docx
+++ b/reg-hub/regulation_fortnightly_brief.docx
@@ -46,7 +46,7 @@
         <w:pStyle w:val="Heading1"/>
       </w:pPr>
       <w:r>
-        <w:t>KPMG Regulatory Transformation Fortnightly Brief - 7-20 August 2026</w:t>
+        <w:t>KPMG Regulatory Transformation Fortnightly Brief - 18-31 August 2026</w:t>
       </w:r>
     </w:p>
     <w:p>
@@ -73,7 +73,7 @@
           <w:color w:val="666666"/>
           <w:sz w:val="19"/>
         </w:rPr>
-        <w:t>20 August 2026</w:t>
+        <w:t>31 August 2026</w:t>
       </w:r>
     </w:p>
     <w:p>
@@ -97,11 +97,11 @@
       <w:r>
         <w:rPr>
           <w:rFonts w:ascii="Arial" w:hAnsi="Arial"/>
-          <w:i/>
-          <w:color w:val="666666"/>
+          <w:b w:val="0"/>
+          <w:color w:val="000000"/>
           <w:sz w:val="19"/>
         </w:rPr>
-        <w:t>[edit before send], Adam's 3-sentence key messages will prefill from the dashboard synthesis on the next fortnightly run. Type your replacement here.</w:t>
+        <w:t>This fortnight, transport safety regulators dominate Australia's regulatory landscape, with AMSA advancing cargo securing inspection campaigns, an updated GMDSS Handbook and an expanded medical provider network, CASA consulting on new operational classifications, a WA Rail Safety Bill attracting broad industry and community backing, and NSW Government analysis confirming that targeted enforcement outperforms mandatory insurance schemes on a cost-benefit basis. The standout opportunity for us is the emerging regulatory preference for enforcement prioritisation and risk-based compliance targeting over new legislative mandates, a shift that positions our regulatory intelligence, analytics and transformation capabilities directly where regulators are choosing to invest under fiscal pressure. Convene a cross-sector transport and safety briefing for partners and directors within the next fortnight to map live regulatory reform pipelines across maritime, aviation and rail, and identify which clients face the earliest compliance exposure from AMSA's inspection campaign and CASA's classification review.</w:t>
       </w:r>
     </w:p>
     <w:p>
@@ -120,16 +120,670 @@
     </w:p>
     <w:p>
       <w:pPr>
-        <w:pStyle w:val="body_letter"/>
+        <w:pStyle w:val="ListBullet"/>
       </w:pPr>
       <w:r>
         <w:rPr>
           <w:rFonts w:ascii="Arial" w:hAnsi="Arial"/>
-          <w:i/>
-          <w:color w:val="666666"/>
+          <w:b/>
+          <w:color w:val="000000"/>
           <w:sz w:val="19"/>
         </w:rPr>
-        <w:t>No regulator-in-news signal this fortnight, see Themes below.</w:t>
+        <w:t>Australian Securities and Investments Commission</w:t>
+      </w:r>
+      <w:r>
+        <w:rPr>
+          <w:rFonts w:ascii="Arial" w:hAnsi="Arial"/>
+          <w:color w:val="000000"/>
+          <w:sz w:val="19"/>
+        </w:rPr>
+        <w:t xml:space="preserve"> - </w:t>
+      </w:r>
+      <w:r>
+        <w:rPr>
+          <w:rFonts w:ascii="Arial" w:hAnsi="Arial"/>
+          <w:color w:val="000000"/>
+          <w:sz w:val="19"/>
+        </w:rPr>
+        <w:t>ASIC warned home insurers that cash settlement practices must not short-change homeowners, flagging enforcement focus on reducing consumer harm in property insurance claims.</w:t>
+      </w:r>
+      <w:r>
+        <w:rPr>
+          <w:rFonts w:ascii="Arial" w:hAnsi="Arial"/>
+          <w:color w:val="000000"/>
+          <w:sz w:val="19"/>
+        </w:rPr>
+        <w:t xml:space="preserve"> (</w:t>
+      </w:r>
+      <w:hyperlink r:id="rId10">
+        <w:r>
+          <w:rPr>
+            <w:rFonts w:ascii="Arial" w:hAnsi="Arial" w:cs="Arial"/>
+            <w:color w:val="0000FF"/>
+            <w:sz w:val="19"/>
+            <w:szCs w:val="19"/>
+            <w:u w:val="single"/>
+          </w:rPr>
+          <w:t xml:space="preserve">Read more</w:t>
+        </w:r>
+      </w:hyperlink>
+      <w:r>
+        <w:rPr>
+          <w:rFonts w:ascii="Arial" w:hAnsi="Arial"/>
+          <w:color w:val="000000"/>
+          <w:sz w:val="19"/>
+        </w:rPr>
+        <w:t>)</w:t>
+      </w:r>
+    </w:p>
+    <w:p>
+      <w:pPr>
+        <w:pStyle w:val="ListBullet"/>
+      </w:pPr>
+      <w:r>
+        <w:rPr>
+          <w:rFonts w:ascii="Arial" w:hAnsi="Arial"/>
+          <w:b/>
+          <w:color w:val="000000"/>
+          <w:sz w:val="19"/>
+        </w:rPr>
+        <w:t>Australian Transaction Reports and Analysis Centre</w:t>
+      </w:r>
+      <w:r>
+        <w:rPr>
+          <w:rFonts w:ascii="Arial" w:hAnsi="Arial"/>
+          <w:color w:val="000000"/>
+          <w:sz w:val="19"/>
+        </w:rPr>
+        <w:t xml:space="preserve"> - </w:t>
+      </w:r>
+      <w:r>
+        <w:rPr>
+          <w:rFonts w:ascii="Arial" w:hAnsi="Arial"/>
+          <w:color w:val="000000"/>
+          <w:sz w:val="19"/>
+        </w:rPr>
+        <w:t>AUSTRAC commenced issuing compulsory section 167 notices to businesses not enrolled under AML/CTF obligations, escalating enforcement pressure on Tranche 2 entities ahead of the compliance deadline.</w:t>
+      </w:r>
+      <w:r>
+        <w:rPr>
+          <w:rFonts w:ascii="Arial" w:hAnsi="Arial"/>
+          <w:color w:val="000000"/>
+          <w:sz w:val="19"/>
+        </w:rPr>
+        <w:t xml:space="preserve"> (</w:t>
+      </w:r>
+      <w:hyperlink r:id="rId11">
+        <w:r>
+          <w:rPr>
+            <w:rFonts w:ascii="Arial" w:hAnsi="Arial" w:cs="Arial"/>
+            <w:color w:val="0000FF"/>
+            <w:sz w:val="19"/>
+            <w:szCs w:val="19"/>
+            <w:u w:val="single"/>
+          </w:rPr>
+          <w:t xml:space="preserve">Read more</w:t>
+        </w:r>
+      </w:hyperlink>
+      <w:r>
+        <w:rPr>
+          <w:rFonts w:ascii="Arial" w:hAnsi="Arial"/>
+          <w:color w:val="000000"/>
+          <w:sz w:val="19"/>
+        </w:rPr>
+        <w:t>)</w:t>
+      </w:r>
+    </w:p>
+    <w:p>
+      <w:pPr>
+        <w:pStyle w:val="ListBullet"/>
+      </w:pPr>
+      <w:r>
+        <w:rPr>
+          <w:rFonts w:ascii="Arial" w:hAnsi="Arial"/>
+          <w:b/>
+          <w:color w:val="000000"/>
+          <w:sz w:val="19"/>
+        </w:rPr>
+        <w:t>Tertiary Education Quality and Standards Agency</w:t>
+      </w:r>
+      <w:r>
+        <w:rPr>
+          <w:rFonts w:ascii="Arial" w:hAnsi="Arial"/>
+          <w:color w:val="000000"/>
+          <w:sz w:val="19"/>
+        </w:rPr>
+        <w:t xml:space="preserve"> - </w:t>
+      </w:r>
+      <w:r>
+        <w:rPr>
+          <w:rFonts w:ascii="Arial" w:hAnsi="Arial"/>
+          <w:color w:val="000000"/>
+          <w:sz w:val="19"/>
+        </w:rPr>
+        <w:t>TEQSA published its 2026-30 Corporate Plan, signalling its strategic priorities and regulatory focus areas for the higher education sector over the next four years.</w:t>
+      </w:r>
+      <w:r>
+        <w:rPr>
+          <w:rFonts w:ascii="Arial" w:hAnsi="Arial"/>
+          <w:color w:val="000000"/>
+          <w:sz w:val="19"/>
+        </w:rPr>
+        <w:t xml:space="preserve"> (</w:t>
+      </w:r>
+      <w:hyperlink r:id="rId12">
+        <w:r>
+          <w:rPr>
+            <w:rFonts w:ascii="Arial" w:hAnsi="Arial" w:cs="Arial"/>
+            <w:color w:val="0000FF"/>
+            <w:sz w:val="19"/>
+            <w:szCs w:val="19"/>
+            <w:u w:val="single"/>
+          </w:rPr>
+          <w:t xml:space="preserve">Read more</w:t>
+        </w:r>
+      </w:hyperlink>
+      <w:r>
+        <w:rPr>
+          <w:rFonts w:ascii="Arial" w:hAnsi="Arial"/>
+          <w:color w:val="000000"/>
+          <w:sz w:val="19"/>
+        </w:rPr>
+        <w:t>)</w:t>
+      </w:r>
+    </w:p>
+    <w:p>
+      <w:pPr>
+        <w:pStyle w:val="ListBullet"/>
+      </w:pPr>
+      <w:r>
+        <w:rPr>
+          <w:rFonts w:ascii="Arial" w:hAnsi="Arial"/>
+          <w:b/>
+          <w:color w:val="000000"/>
+          <w:sz w:val="19"/>
+        </w:rPr>
+        <w:t>Australian Public Service Commission</w:t>
+      </w:r>
+      <w:r>
+        <w:rPr>
+          <w:rFonts w:ascii="Arial" w:hAnsi="Arial"/>
+          <w:color w:val="000000"/>
+          <w:sz w:val="19"/>
+        </w:rPr>
+        <w:t xml:space="preserve"> - </w:t>
+      </w:r>
+      <w:r>
+        <w:rPr>
+          <w:rFonts w:ascii="Arial" w:hAnsi="Arial"/>
+          <w:color w:val="000000"/>
+          <w:sz w:val="19"/>
+        </w:rPr>
+        <w:t>APSC published its Corporate Plan 2026-27, setting out workforce capability and integrity priorities for the Australian Public Service in the coming year.</w:t>
+      </w:r>
+      <w:r>
+        <w:rPr>
+          <w:rFonts w:ascii="Arial" w:hAnsi="Arial"/>
+          <w:color w:val="000000"/>
+          <w:sz w:val="19"/>
+        </w:rPr>
+        <w:t xml:space="preserve"> (</w:t>
+      </w:r>
+      <w:hyperlink r:id="rId13">
+        <w:r>
+          <w:rPr>
+            <w:rFonts w:ascii="Arial" w:hAnsi="Arial" w:cs="Arial"/>
+            <w:color w:val="0000FF"/>
+            <w:sz w:val="19"/>
+            <w:szCs w:val="19"/>
+            <w:u w:val="single"/>
+          </w:rPr>
+          <w:t xml:space="preserve">Read more</w:t>
+        </w:r>
+      </w:hyperlink>
+      <w:r>
+        <w:rPr>
+          <w:rFonts w:ascii="Arial" w:hAnsi="Arial"/>
+          <w:color w:val="000000"/>
+          <w:sz w:val="19"/>
+        </w:rPr>
+        <w:t>)</w:t>
+      </w:r>
+    </w:p>
+    <w:p>
+      <w:pPr>
+        <w:pStyle w:val="ListBullet"/>
+      </w:pPr>
+      <w:r>
+        <w:rPr>
+          <w:rFonts w:ascii="Arial" w:hAnsi="Arial"/>
+          <w:b/>
+          <w:color w:val="000000"/>
+          <w:sz w:val="19"/>
+        </w:rPr>
+        <w:t>Department of Finance</w:t>
+      </w:r>
+      <w:r>
+        <w:rPr>
+          <w:rFonts w:ascii="Arial" w:hAnsi="Arial"/>
+          <w:color w:val="000000"/>
+          <w:sz w:val="19"/>
+        </w:rPr>
+        <w:t xml:space="preserve"> - </w:t>
+      </w:r>
+      <w:r>
+        <w:rPr>
+          <w:rFonts w:ascii="Arial" w:hAnsi="Arial"/>
+          <w:color w:val="000000"/>
+          <w:sz w:val="19"/>
+        </w:rPr>
+        <w:t>The Department of Finance convened the Australian Government Data Forum to address barriers to data sharing and integration across the public sector, signalling a renewed policy push on cross-agency…</w:t>
+      </w:r>
+      <w:r>
+        <w:rPr>
+          <w:rFonts w:ascii="Arial" w:hAnsi="Arial"/>
+          <w:color w:val="000000"/>
+          <w:sz w:val="19"/>
+        </w:rPr>
+        <w:t xml:space="preserve"> (</w:t>
+      </w:r>
+      <w:hyperlink r:id="rId14">
+        <w:r>
+          <w:rPr>
+            <w:rFonts w:ascii="Arial" w:hAnsi="Arial" w:cs="Arial"/>
+            <w:color w:val="0000FF"/>
+            <w:sz w:val="19"/>
+            <w:szCs w:val="19"/>
+            <w:u w:val="single"/>
+          </w:rPr>
+          <w:t xml:space="preserve">Read more</w:t>
+        </w:r>
+      </w:hyperlink>
+      <w:r>
+        <w:rPr>
+          <w:rFonts w:ascii="Arial" w:hAnsi="Arial"/>
+          <w:color w:val="000000"/>
+          <w:sz w:val="19"/>
+        </w:rPr>
+        <w:t>)</w:t>
+      </w:r>
+    </w:p>
+    <w:p>
+      <w:pPr>
+        <w:pStyle w:val="ListBullet"/>
+      </w:pPr>
+      <w:r>
+        <w:rPr>
+          <w:rFonts w:ascii="Arial" w:hAnsi="Arial"/>
+          <w:b/>
+          <w:color w:val="000000"/>
+          <w:sz w:val="19"/>
+        </w:rPr>
+        <w:t>Australian Financial Security Authority</w:t>
+      </w:r>
+      <w:r>
+        <w:rPr>
+          <w:rFonts w:ascii="Arial" w:hAnsi="Arial"/>
+          <w:color w:val="000000"/>
+          <w:sz w:val="19"/>
+        </w:rPr>
+        <w:t xml:space="preserve"> - </w:t>
+      </w:r>
+      <w:r>
+        <w:rPr>
+          <w:rFonts w:ascii="Arial" w:hAnsi="Arial"/>
+          <w:color w:val="000000"/>
+          <w:sz w:val="19"/>
+        </w:rPr>
+        <w:t>AFSA released its August 2026 Personal Insolvency Register newsletter, providing updated guidance and enforcement insights for practitioners operating in the personal insolvency space.</w:t>
+      </w:r>
+      <w:r>
+        <w:rPr>
+          <w:rFonts w:ascii="Arial" w:hAnsi="Arial"/>
+          <w:color w:val="000000"/>
+          <w:sz w:val="19"/>
+        </w:rPr>
+        <w:t xml:space="preserve"> (</w:t>
+      </w:r>
+      <w:hyperlink r:id="rId15">
+        <w:r>
+          <w:rPr>
+            <w:rFonts w:ascii="Arial" w:hAnsi="Arial" w:cs="Arial"/>
+            <w:color w:val="0000FF"/>
+            <w:sz w:val="19"/>
+            <w:szCs w:val="19"/>
+            <w:u w:val="single"/>
+          </w:rPr>
+          <w:t xml:space="preserve">Read more</w:t>
+        </w:r>
+      </w:hyperlink>
+      <w:r>
+        <w:rPr>
+          <w:rFonts w:ascii="Arial" w:hAnsi="Arial"/>
+          <w:color w:val="000000"/>
+          <w:sz w:val="19"/>
+        </w:rPr>
+        <w:t>)</w:t>
+      </w:r>
+    </w:p>
+    <w:p>
+      <w:pPr>
+        <w:pStyle w:val="ListBullet"/>
+      </w:pPr>
+      <w:r>
+        <w:rPr>
+          <w:rFonts w:ascii="Arial" w:hAnsi="Arial"/>
+          <w:b/>
+          <w:color w:val="000000"/>
+          <w:sz w:val="19"/>
+        </w:rPr>
+        <w:t>Australian Competition and Consumer Commission</w:t>
+      </w:r>
+      <w:r>
+        <w:rPr>
+          <w:rFonts w:ascii="Arial" w:hAnsi="Arial"/>
+          <w:color w:val="000000"/>
+          <w:sz w:val="19"/>
+        </w:rPr>
+        <w:t xml:space="preserve"> - </w:t>
+      </w:r>
+      <w:r>
+        <w:rPr>
+          <w:rFonts w:ascii="Arial" w:hAnsi="Arial"/>
+          <w:color w:val="000000"/>
+          <w:sz w:val="19"/>
+        </w:rPr>
+        <w:t>ACCC pursued right to repair enforcement action in the automotive sector, drawing support from the Motor Trades Association of Australia and intensifying scrutiny on manufacturers restricting repair…</w:t>
+      </w:r>
+    </w:p>
+    <w:p>
+      <w:pPr>
+        <w:pStyle w:val="ListBullet"/>
+      </w:pPr>
+      <w:r>
+        <w:rPr>
+          <w:rFonts w:ascii="Arial" w:hAnsi="Arial"/>
+          <w:b/>
+          <w:color w:val="000000"/>
+          <w:sz w:val="19"/>
+        </w:rPr>
+        <w:t>eSafety Commissioner</w:t>
+      </w:r>
+      <w:r>
+        <w:rPr>
+          <w:rFonts w:ascii="Arial" w:hAnsi="Arial"/>
+          <w:color w:val="000000"/>
+          <w:sz w:val="19"/>
+        </w:rPr>
+        <w:t xml:space="preserve"> - </w:t>
+      </w:r>
+      <w:r>
+        <w:rPr>
+          <w:rFonts w:ascii="Arial" w:hAnsi="Arial"/>
+          <w:color w:val="000000"/>
+          <w:sz w:val="19"/>
+        </w:rPr>
+        <w:t>eSafety Commissioner warned that AI-enabled smart glasses pose compounding online safety harms, flagging the need for proactive regulatory and industry responses to emerging surveillance risks.</w:t>
+      </w:r>
+      <w:r>
+        <w:rPr>
+          <w:rFonts w:ascii="Arial" w:hAnsi="Arial"/>
+          <w:color w:val="000000"/>
+          <w:sz w:val="19"/>
+        </w:rPr>
+        <w:t xml:space="preserve"> (</w:t>
+      </w:r>
+      <w:hyperlink r:id="rId16">
+        <w:r>
+          <w:rPr>
+            <w:rFonts w:ascii="Arial" w:hAnsi="Arial" w:cs="Arial"/>
+            <w:color w:val="0000FF"/>
+            <w:sz w:val="19"/>
+            <w:szCs w:val="19"/>
+            <w:u w:val="single"/>
+          </w:rPr>
+          <w:t xml:space="preserve">Read more</w:t>
+        </w:r>
+      </w:hyperlink>
+      <w:r>
+        <w:rPr>
+          <w:rFonts w:ascii="Arial" w:hAnsi="Arial"/>
+          <w:color w:val="000000"/>
+          <w:sz w:val="19"/>
+        </w:rPr>
+        <w:t>)</w:t>
+      </w:r>
+    </w:p>
+    <w:p>
+      <w:pPr>
+        <w:pStyle w:val="ListBullet"/>
+      </w:pPr>
+      <w:r>
+        <w:rPr>
+          <w:rFonts w:ascii="Arial" w:hAnsi="Arial"/>
+          <w:b/>
+          <w:color w:val="000000"/>
+          <w:sz w:val="19"/>
+        </w:rPr>
+        <w:t>Independent Commission Against Corruption</w:t>
+      </w:r>
+      <w:r>
+        <w:rPr>
+          <w:rFonts w:ascii="Arial" w:hAnsi="Arial"/>
+          <w:color w:val="000000"/>
+          <w:sz w:val="19"/>
+        </w:rPr>
+        <w:t xml:space="preserve"> - </w:t>
+      </w:r>
+      <w:r>
+        <w:rPr>
+          <w:rFonts w:ascii="Arial" w:hAnsi="Arial"/>
+          <w:color w:val="000000"/>
+          <w:sz w:val="19"/>
+        </w:rPr>
+        <w:t>ICAC found a NSW Health worker corrupt and heard evidence from the former NSW Building Commissioner detailing a year of alleged shakedowns, underscoring active integrity enforcement across…</w:t>
+      </w:r>
+      <w:r>
+        <w:rPr>
+          <w:rFonts w:ascii="Arial" w:hAnsi="Arial"/>
+          <w:color w:val="000000"/>
+          <w:sz w:val="19"/>
+        </w:rPr>
+        <w:t xml:space="preserve"> (</w:t>
+      </w:r>
+      <w:hyperlink r:id="rId17">
+        <w:r>
+          <w:rPr>
+            <w:rFonts w:ascii="Arial" w:hAnsi="Arial" w:cs="Arial"/>
+            <w:color w:val="0000FF"/>
+            <w:sz w:val="19"/>
+            <w:szCs w:val="19"/>
+            <w:u w:val="single"/>
+          </w:rPr>
+          <w:t xml:space="preserve">Read more</w:t>
+        </w:r>
+      </w:hyperlink>
+      <w:r>
+        <w:rPr>
+          <w:rFonts w:ascii="Arial" w:hAnsi="Arial"/>
+          <w:color w:val="000000"/>
+          <w:sz w:val="19"/>
+        </w:rPr>
+        <w:t>)</w:t>
+      </w:r>
+    </w:p>
+    <w:p>
+      <w:pPr>
+        <w:pStyle w:val="ListBullet"/>
+      </w:pPr>
+      <w:r>
+        <w:rPr>
+          <w:rFonts w:ascii="Arial" w:hAnsi="Arial"/>
+          <w:b/>
+          <w:color w:val="000000"/>
+          <w:sz w:val="19"/>
+        </w:rPr>
+        <w:t>Department of Health, Disability and Ageing</w:t>
+      </w:r>
+      <w:r>
+        <w:rPr>
+          <w:rFonts w:ascii="Arial" w:hAnsi="Arial"/>
+          <w:color w:val="000000"/>
+          <w:sz w:val="19"/>
+        </w:rPr>
+        <w:t xml:space="preserve"> - </w:t>
+      </w:r>
+      <w:r>
+        <w:rPr>
+          <w:rFonts w:ascii="Arial" w:hAnsi="Arial"/>
+          <w:color w:val="000000"/>
+          <w:sz w:val="19"/>
+        </w:rPr>
+        <w:t>The Department of Health, Disability and Ageing opened public consultation on proposed changes to NDIS access criteria, inviting stakeholder input on reforms that could affect eligibility for…</w:t>
+      </w:r>
+      <w:r>
+        <w:rPr>
+          <w:rFonts w:ascii="Arial" w:hAnsi="Arial"/>
+          <w:color w:val="000000"/>
+          <w:sz w:val="19"/>
+        </w:rPr>
+        <w:t xml:space="preserve"> (</w:t>
+      </w:r>
+      <w:hyperlink r:id="rId18">
+        <w:r>
+          <w:rPr>
+            <w:rFonts w:ascii="Arial" w:hAnsi="Arial" w:cs="Arial"/>
+            <w:color w:val="0000FF"/>
+            <w:sz w:val="19"/>
+            <w:szCs w:val="19"/>
+            <w:u w:val="single"/>
+          </w:rPr>
+          <w:t xml:space="preserve">Read more</w:t>
+        </w:r>
+      </w:hyperlink>
+      <w:r>
+        <w:rPr>
+          <w:rFonts w:ascii="Arial" w:hAnsi="Arial"/>
+          <w:color w:val="000000"/>
+          <w:sz w:val="19"/>
+        </w:rPr>
+        <w:t>)</w:t>
+      </w:r>
+    </w:p>
+    <w:p>
+      <w:pPr>
+        <w:pStyle w:val="ListBullet"/>
+      </w:pPr>
+      <w:r>
+        <w:rPr>
+          <w:rFonts w:ascii="Arial" w:hAnsi="Arial"/>
+          <w:b/>
+          <w:color w:val="000000"/>
+          <w:sz w:val="19"/>
+        </w:rPr>
+        <w:t>Australian Border Force</w:t>
+      </w:r>
+      <w:r>
+        <w:rPr>
+          <w:rFonts w:ascii="Arial" w:hAnsi="Arial"/>
+          <w:color w:val="000000"/>
+          <w:sz w:val="19"/>
+        </w:rPr>
+        <w:t xml:space="preserve"> - </w:t>
+      </w:r>
+      <w:r>
+        <w:rPr>
+          <w:rFonts w:ascii="Arial" w:hAnsi="Arial"/>
+          <w:color w:val="000000"/>
+          <w:sz w:val="19"/>
+        </w:rPr>
+        <w:t>Australian Border Force seized millions of dollars in illicit cigarettes and restrained criminal assets as part of a coordinated enforcement action targeting a transnational illicit tobacco network.</w:t>
+      </w:r>
+      <w:r>
+        <w:rPr>
+          <w:rFonts w:ascii="Arial" w:hAnsi="Arial"/>
+          <w:color w:val="000000"/>
+          <w:sz w:val="19"/>
+        </w:rPr>
+        <w:t xml:space="preserve"> (</w:t>
+      </w:r>
+      <w:hyperlink r:id="rId19">
+        <w:r>
+          <w:rPr>
+            <w:rFonts w:ascii="Arial" w:hAnsi="Arial" w:cs="Arial"/>
+            <w:color w:val="0000FF"/>
+            <w:sz w:val="19"/>
+            <w:szCs w:val="19"/>
+            <w:u w:val="single"/>
+          </w:rPr>
+          <w:t xml:space="preserve">Read more</w:t>
+        </w:r>
+      </w:hyperlink>
+      <w:r>
+        <w:rPr>
+          <w:rFonts w:ascii="Arial" w:hAnsi="Arial"/>
+          <w:color w:val="000000"/>
+          <w:sz w:val="19"/>
+        </w:rPr>
+        <w:t>)</w:t>
+      </w:r>
+    </w:p>
+    <w:p>
+      <w:pPr>
+        <w:pStyle w:val="ListBullet"/>
+      </w:pPr>
+      <w:r>
+        <w:rPr>
+          <w:rFonts w:ascii="Arial" w:hAnsi="Arial"/>
+          <w:b/>
+          <w:color w:val="000000"/>
+          <w:sz w:val="19"/>
+        </w:rPr>
+        <w:t>Australian Communications and Media Authority</w:t>
+      </w:r>
+      <w:r>
+        <w:rPr>
+          <w:rFonts w:ascii="Arial" w:hAnsi="Arial"/>
+          <w:color w:val="000000"/>
+          <w:sz w:val="19"/>
+        </w:rPr>
+        <w:t xml:space="preserve"> - </w:t>
+      </w:r>
+      <w:r>
+        <w:rPr>
+          <w:rFonts w:ascii="Arial" w:hAnsi="Arial"/>
+          <w:color w:val="000000"/>
+          <w:sz w:val="19"/>
+        </w:rPr>
+        <w:t>ACMA published new research segmenting Australian news consumers by habits and trust levels, informing the regulator's ongoing work on media diversity and misinformation policy.</w:t>
+      </w:r>
+      <w:r>
+        <w:rPr>
+          <w:rFonts w:ascii="Arial" w:hAnsi="Arial"/>
+          <w:color w:val="000000"/>
+          <w:sz w:val="19"/>
+        </w:rPr>
+        <w:t xml:space="preserve"> (</w:t>
+      </w:r>
+      <w:hyperlink r:id="rId20">
+        <w:r>
+          <w:rPr>
+            <w:rFonts w:ascii="Arial" w:hAnsi="Arial" w:cs="Arial"/>
+            <w:color w:val="0000FF"/>
+            <w:sz w:val="19"/>
+            <w:szCs w:val="19"/>
+            <w:u w:val="single"/>
+          </w:rPr>
+          <w:t xml:space="preserve">Read more</w:t>
+        </w:r>
+      </w:hyperlink>
+      <w:r>
+        <w:rPr>
+          <w:rFonts w:ascii="Arial" w:hAnsi="Arial"/>
+          <w:color w:val="000000"/>
+          <w:sz w:val="19"/>
+        </w:rPr>
+        <w:t>)</w:t>
       </w:r>
     </w:p>
     <w:p>
@@ -153,11 +807,337 @@
       <w:r>
         <w:rPr>
           <w:rFonts w:ascii="Arial" w:hAnsi="Arial"/>
-          <w:i/>
-          <w:color w:val="666666"/>
+          <w:b/>
+          <w:color w:val="000000"/>
           <w:sz w:val="19"/>
         </w:rPr>
-        <w:t>No client-in-news signal this fortnight across any jurisdiction.</w:t>
+        <w:t>Victoria</w:t>
+      </w:r>
+    </w:p>
+    <w:p>
+      <w:pPr>
+        <w:pStyle w:val="ListBullet"/>
+      </w:pPr>
+      <w:r>
+        <w:rPr>
+          <w:rFonts w:ascii="Arial" w:hAnsi="Arial"/>
+          <w:b/>
+          <w:color w:val="000000"/>
+          <w:sz w:val="19"/>
+        </w:rPr>
+        <w:t>Environment Protection Authority Victoria</w:t>
+      </w:r>
+      <w:r>
+        <w:rPr>
+          <w:rFonts w:ascii="Arial" w:hAnsi="Arial"/>
+          <w:color w:val="000000"/>
+          <w:sz w:val="19"/>
+        </w:rPr>
+        <w:t xml:space="preserve"> - </w:t>
+      </w:r>
+      <w:r>
+        <w:rPr>
+          <w:rFonts w:ascii="Arial" w:hAnsi="Arial"/>
+          <w:color w:val="000000"/>
+          <w:sz w:val="19"/>
+        </w:rPr>
+        <w:t>EPA Annual Delivery Plan 2026-27 Published</w:t>
+      </w:r>
+    </w:p>
+    <w:p>
+      <w:pPr>
+        <w:pStyle w:val="ListBullet"/>
+      </w:pPr>
+      <w:r>
+        <w:rPr>
+          <w:rFonts w:ascii="Arial" w:hAnsi="Arial"/>
+          <w:b/>
+          <w:color w:val="000000"/>
+          <w:sz w:val="19"/>
+        </w:rPr>
+        <w:t>Environment Protection Authority Victoria</w:t>
+      </w:r>
+      <w:r>
+        <w:rPr>
+          <w:rFonts w:ascii="Arial" w:hAnsi="Arial"/>
+          <w:color w:val="000000"/>
+          <w:sz w:val="19"/>
+        </w:rPr>
+        <w:t xml:space="preserve"> - </w:t>
+      </w:r>
+      <w:r>
+        <w:rPr>
+          <w:rFonts w:ascii="Arial" w:hAnsi="Arial"/>
+          <w:color w:val="000000"/>
+          <w:sz w:val="19"/>
+        </w:rPr>
+        <w:t>SenSen Wins EPA Acoustic Camera Contract</w:t>
+      </w:r>
+    </w:p>
+    <w:p>
+      <w:pPr>
+        <w:pStyle w:val="ListBullet"/>
+      </w:pPr>
+      <w:r>
+        <w:rPr>
+          <w:rFonts w:ascii="Arial" w:hAnsi="Arial"/>
+          <w:b/>
+          <w:color w:val="000000"/>
+          <w:sz w:val="19"/>
+        </w:rPr>
+        <w:t>Victorian WorkCover Authority (WorkSafe Victoria)</w:t>
+      </w:r>
+      <w:r>
+        <w:rPr>
+          <w:rFonts w:ascii="Arial" w:hAnsi="Arial"/>
+          <w:color w:val="000000"/>
+          <w:sz w:val="19"/>
+        </w:rPr>
+        <w:t xml:space="preserve"> - </w:t>
+      </w:r>
+      <w:r>
+        <w:rPr>
+          <w:rFonts w:ascii="Arial" w:hAnsi="Arial"/>
+          <w:color w:val="000000"/>
+          <w:sz w:val="19"/>
+        </w:rPr>
+        <w:t>WorkSafe Reviews CFA Fleet Safety</w:t>
+      </w:r>
+    </w:p>
+    <w:p>
+      <w:pPr>
+        <w:pStyle w:val="body_letter"/>
+      </w:pPr>
+      <w:r>
+        <w:rPr>
+          <w:rFonts w:ascii="Arial" w:hAnsi="Arial"/>
+          <w:b/>
+          <w:color w:val="000000"/>
+          <w:sz w:val="19"/>
+        </w:rPr>
+        <w:t>Commonwealth</w:t>
+      </w:r>
+    </w:p>
+    <w:p>
+      <w:pPr>
+        <w:pStyle w:val="ListBullet"/>
+      </w:pPr>
+      <w:r>
+        <w:rPr>
+          <w:rFonts w:ascii="Arial" w:hAnsi="Arial"/>
+          <w:b/>
+          <w:color w:val="000000"/>
+          <w:sz w:val="19"/>
+        </w:rPr>
+        <w:t>Australian Securities and Investments Commission</w:t>
+      </w:r>
+      <w:r>
+        <w:rPr>
+          <w:rFonts w:ascii="Arial" w:hAnsi="Arial"/>
+          <w:color w:val="000000"/>
+          <w:sz w:val="19"/>
+        </w:rPr>
+        <w:t xml:space="preserve"> - </w:t>
+      </w:r>
+      <w:r>
+        <w:rPr>
+          <w:rFonts w:ascii="Arial" w:hAnsi="Arial"/>
+          <w:color w:val="000000"/>
+          <w:sz w:val="19"/>
+        </w:rPr>
+        <w:t>ASIC Signals Recalibrated Enforcement Posture</w:t>
+      </w:r>
+    </w:p>
+    <w:p>
+      <w:pPr>
+        <w:pStyle w:val="ListBullet"/>
+      </w:pPr>
+      <w:r>
+        <w:rPr>
+          <w:rFonts w:ascii="Arial" w:hAnsi="Arial"/>
+          <w:b/>
+          <w:color w:val="000000"/>
+          <w:sz w:val="19"/>
+        </w:rPr>
+        <w:t>Australian Energy Regulator</w:t>
+      </w:r>
+      <w:r>
+        <w:rPr>
+          <w:rFonts w:ascii="Arial" w:hAnsi="Arial"/>
+          <w:color w:val="000000"/>
+          <w:sz w:val="19"/>
+        </w:rPr>
+        <w:t xml:space="preserve"> - </w:t>
+      </w:r>
+      <w:r>
+        <w:rPr>
+          <w:rFonts w:ascii="Arial" w:hAnsi="Arial"/>
+          <w:color w:val="000000"/>
+          <w:sz w:val="19"/>
+        </w:rPr>
+        <w:t>AER Publishes New Strategic Plan</w:t>
+      </w:r>
+    </w:p>
+    <w:p>
+      <w:pPr>
+        <w:pStyle w:val="ListBullet"/>
+      </w:pPr>
+      <w:r>
+        <w:rPr>
+          <w:rFonts w:ascii="Arial" w:hAnsi="Arial"/>
+          <w:b/>
+          <w:color w:val="000000"/>
+          <w:sz w:val="19"/>
+        </w:rPr>
+        <w:t>Department of Defence</w:t>
+      </w:r>
+      <w:r>
+        <w:rPr>
+          <w:rFonts w:ascii="Arial" w:hAnsi="Arial"/>
+          <w:color w:val="000000"/>
+          <w:sz w:val="19"/>
+        </w:rPr>
+        <w:t xml:space="preserve"> - </w:t>
+      </w:r>
+      <w:r>
+        <w:rPr>
+          <w:rFonts w:ascii="Arial" w:hAnsi="Arial"/>
+          <w:color w:val="000000"/>
+          <w:sz w:val="19"/>
+        </w:rPr>
+        <w:t>Defence Axes 26-Year Contract</w:t>
+      </w:r>
+    </w:p>
+    <w:p>
+      <w:pPr>
+        <w:pStyle w:val="body_letter"/>
+      </w:pPr>
+      <w:r>
+        <w:rPr>
+          <w:rFonts w:ascii="Arial" w:hAnsi="Arial"/>
+          <w:b/>
+          <w:color w:val="000000"/>
+          <w:sz w:val="19"/>
+        </w:rPr>
+        <w:t>New South Wales</w:t>
+      </w:r>
+    </w:p>
+    <w:p>
+      <w:pPr>
+        <w:pStyle w:val="ListBullet"/>
+      </w:pPr>
+      <w:r>
+        <w:rPr>
+          <w:rFonts w:ascii="Arial" w:hAnsi="Arial"/>
+          <w:b/>
+          <w:color w:val="000000"/>
+          <w:sz w:val="19"/>
+        </w:rPr>
+        <w:t>Independent Commission Against Corruption</w:t>
+      </w:r>
+      <w:r>
+        <w:rPr>
+          <w:rFonts w:ascii="Arial" w:hAnsi="Arial"/>
+          <w:color w:val="000000"/>
+          <w:sz w:val="19"/>
+        </w:rPr>
+        <w:t xml:space="preserve"> - </w:t>
+      </w:r>
+      <w:r>
+        <w:rPr>
+          <w:rFonts w:ascii="Arial" w:hAnsi="Arial"/>
+          <w:color w:val="000000"/>
+          <w:sz w:val="19"/>
+        </w:rPr>
+        <w:t>ICAC finds NSW Health worker corrupt</w:t>
+      </w:r>
+      <w:r>
+        <w:rPr>
+          <w:rFonts w:ascii="Arial" w:hAnsi="Arial"/>
+          <w:color w:val="000000"/>
+          <w:sz w:val="19"/>
+        </w:rPr>
+        <w:t xml:space="preserve"> (</w:t>
+      </w:r>
+      <w:hyperlink r:id="rId17">
+        <w:r>
+          <w:rPr>
+            <w:rFonts w:ascii="Arial" w:hAnsi="Arial" w:cs="Arial"/>
+            <w:color w:val="0000FF"/>
+            <w:sz w:val="19"/>
+            <w:szCs w:val="19"/>
+            <w:u w:val="single"/>
+          </w:rPr>
+          <w:t xml:space="preserve">Read more</w:t>
+        </w:r>
+      </w:hyperlink>
+      <w:r>
+        <w:rPr>
+          <w:rFonts w:ascii="Arial" w:hAnsi="Arial"/>
+          <w:color w:val="000000"/>
+          <w:sz w:val="19"/>
+        </w:rPr>
+        <w:t>)</w:t>
+      </w:r>
+    </w:p>
+    <w:p>
+      <w:pPr>
+        <w:pStyle w:val="ListBullet"/>
+      </w:pPr>
+      <w:r>
+        <w:rPr>
+          <w:rFonts w:ascii="Arial" w:hAnsi="Arial"/>
+          <w:b/>
+          <w:color w:val="000000"/>
+          <w:sz w:val="19"/>
+        </w:rPr>
+        <w:t>Independent Commission Against Corruption</w:t>
+      </w:r>
+      <w:r>
+        <w:rPr>
+          <w:rFonts w:ascii="Arial" w:hAnsi="Arial"/>
+          <w:color w:val="000000"/>
+          <w:sz w:val="19"/>
+        </w:rPr>
+        <w:t xml:space="preserve"> - </w:t>
+      </w:r>
+      <w:r>
+        <w:rPr>
+          <w:rFonts w:ascii="Arial" w:hAnsi="Arial"/>
+          <w:color w:val="000000"/>
+          <w:sz w:val="19"/>
+        </w:rPr>
+        <w:t>Building Commissioner Details Shakedown Claims</w:t>
+      </w:r>
+    </w:p>
+    <w:p>
+      <w:pPr>
+        <w:pStyle w:val="ListBullet"/>
+      </w:pPr>
+      <w:r>
+        <w:rPr>
+          <w:rFonts w:ascii="Arial" w:hAnsi="Arial"/>
+          <w:b/>
+          <w:color w:val="000000"/>
+          <w:sz w:val="19"/>
+        </w:rPr>
+        <w:t>Independent Commission Against Corruption</w:t>
+      </w:r>
+      <w:r>
+        <w:rPr>
+          <w:rFonts w:ascii="Arial" w:hAnsi="Arial"/>
+          <w:color w:val="000000"/>
+          <w:sz w:val="19"/>
+        </w:rPr>
+        <w:t xml:space="preserve"> - </w:t>
+      </w:r>
+      <w:r>
+        <w:rPr>
+          <w:rFonts w:ascii="Arial" w:hAnsi="Arial"/>
+          <w:color w:val="000000"/>
+          <w:sz w:val="19"/>
+        </w:rPr>
+        <w:t>Perrottet Texts Aired at ICAC Hearings</w:t>
       </w:r>
     </w:p>
     <w:p>
@@ -246,16 +1226,234 @@
     </w:p>
     <w:p>
       <w:pPr>
-        <w:pStyle w:val="body_letter"/>
+        <w:pStyle w:val="ListBullet"/>
       </w:pPr>
       <w:r>
         <w:rPr>
           <w:rFonts w:ascii="Arial" w:hAnsi="Arial"/>
-          <w:i/>
-          <w:color w:val="666666"/>
+          <w:b/>
+          <w:color w:val="000000"/>
           <w:sz w:val="19"/>
         </w:rPr>
-        <w:t>No emerging risks signal this fortnight.</w:t>
+        <w:t>AMSA Annual Regulatory Program 2026-27</w:t>
+      </w:r>
+      <w:r>
+        <w:rPr>
+          <w:rFonts w:ascii="Arial" w:hAnsi="Arial"/>
+          <w:color w:val="000000"/>
+          <w:sz w:val="19"/>
+        </w:rPr>
+        <w:t xml:space="preserve"> - </w:t>
+      </w:r>
+      <w:r>
+        <w:rPr>
+          <w:rFonts w:ascii="Arial" w:hAnsi="Arial"/>
+          <w:color w:val="000000"/>
+          <w:sz w:val="19"/>
+        </w:rPr>
+        <w:t>AMSA has published its Annual Regulatory Program for 2026-27, identifying maritime risk priorities and setting out the compliance and enforcement activities the authority will pursue across the…</w:t>
+      </w:r>
+      <w:r>
+        <w:rPr>
+          <w:rFonts w:ascii="Arial" w:hAnsi="Arial"/>
+          <w:color w:val="000000"/>
+          <w:sz w:val="19"/>
+        </w:rPr>
+        <w:t xml:space="preserve"> (</w:t>
+      </w:r>
+      <w:hyperlink r:id="rId21">
+        <w:r>
+          <w:rPr>
+            <w:rFonts w:ascii="Arial" w:hAnsi="Arial" w:cs="Arial"/>
+            <w:color w:val="0000FF"/>
+            <w:sz w:val="19"/>
+            <w:szCs w:val="19"/>
+            <w:u w:val="single"/>
+          </w:rPr>
+          <w:t xml:space="preserve">Read more</w:t>
+        </w:r>
+      </w:hyperlink>
+      <w:r>
+        <w:rPr>
+          <w:rFonts w:ascii="Arial" w:hAnsi="Arial"/>
+          <w:color w:val="000000"/>
+          <w:sz w:val="19"/>
+        </w:rPr>
+        <w:t>)</w:t>
+      </w:r>
+    </w:p>
+    <w:p>
+      <w:pPr>
+        <w:pStyle w:val="ListBullet"/>
+      </w:pPr>
+      <w:r>
+        <w:rPr>
+          <w:rFonts w:ascii="Arial" w:hAnsi="Arial"/>
+          <w:b/>
+          <w:color w:val="000000"/>
+          <w:sz w:val="19"/>
+        </w:rPr>
+        <w:t>Almost 60 vessels a year grounded or sunk on Great Barrier Reef</w:t>
+      </w:r>
+      <w:r>
+        <w:rPr>
+          <w:rFonts w:ascii="Arial" w:hAnsi="Arial"/>
+          <w:color w:val="000000"/>
+          <w:sz w:val="19"/>
+        </w:rPr>
+        <w:t xml:space="preserve"> - </w:t>
+      </w:r>
+      <w:r>
+        <w:rPr>
+          <w:rFonts w:ascii="Arial" w:hAnsi="Arial"/>
+          <w:color w:val="000000"/>
+          <w:sz w:val="19"/>
+        </w:rPr>
+        <w:t>The Reef Authority has revealed that almost 60 vessels a year are grounded or sunk on the Great Barrier Reef, underscoring persistent navigation and environmental risk in one of Australia's most…</w:t>
+      </w:r>
+      <w:r>
+        <w:rPr>
+          <w:rFonts w:ascii="Arial" w:hAnsi="Arial"/>
+          <w:color w:val="000000"/>
+          <w:sz w:val="19"/>
+        </w:rPr>
+        <w:t xml:space="preserve"> (</w:t>
+      </w:r>
+      <w:hyperlink r:id="rId22">
+        <w:r>
+          <w:rPr>
+            <w:rFonts w:ascii="Arial" w:hAnsi="Arial" w:cs="Arial"/>
+            <w:color w:val="0000FF"/>
+            <w:sz w:val="19"/>
+            <w:szCs w:val="19"/>
+            <w:u w:val="single"/>
+          </w:rPr>
+          <w:t xml:space="preserve">Read more</w:t>
+        </w:r>
+      </w:hyperlink>
+      <w:r>
+        <w:rPr>
+          <w:rFonts w:ascii="Arial" w:hAnsi="Arial"/>
+          <w:color w:val="000000"/>
+          <w:sz w:val="19"/>
+        </w:rPr>
+        <w:t>)</w:t>
+      </w:r>
+    </w:p>
+    <w:p>
+      <w:pPr>
+        <w:pStyle w:val="ListBullet"/>
+      </w:pPr>
+      <w:r>
+        <w:rPr>
+          <w:rFonts w:ascii="Arial" w:hAnsi="Arial"/>
+          <w:b/>
+          <w:color w:val="000000"/>
+          <w:sz w:val="19"/>
+        </w:rPr>
+        <w:t>Fatal Mine Incident Triggers Safety Probe in New South Wales</w:t>
+      </w:r>
+      <w:r>
+        <w:rPr>
+          <w:rFonts w:ascii="Arial" w:hAnsi="Arial"/>
+          <w:color w:val="000000"/>
+          <w:sz w:val="19"/>
+        </w:rPr>
+        <w:t xml:space="preserve"> - </w:t>
+      </w:r>
+      <w:r>
+        <w:rPr>
+          <w:rFonts w:ascii="Arial" w:hAnsi="Arial"/>
+          <w:color w:val="000000"/>
+          <w:sz w:val="19"/>
+        </w:rPr>
+        <w:t>The NSW resources regulator has initiated a formal safety investigation following a fatal mine incident, raising the risk profile of extractive industry operations and signalling heightened…</w:t>
+      </w:r>
+      <w:r>
+        <w:rPr>
+          <w:rFonts w:ascii="Arial" w:hAnsi="Arial"/>
+          <w:color w:val="000000"/>
+          <w:sz w:val="19"/>
+        </w:rPr>
+        <w:t xml:space="preserve"> (</w:t>
+      </w:r>
+      <w:hyperlink r:id="rId23">
+        <w:r>
+          <w:rPr>
+            <w:rFonts w:ascii="Arial" w:hAnsi="Arial" w:cs="Arial"/>
+            <w:color w:val="0000FF"/>
+            <w:sz w:val="19"/>
+            <w:szCs w:val="19"/>
+            <w:u w:val="single"/>
+          </w:rPr>
+          <w:t xml:space="preserve">Read more</w:t>
+        </w:r>
+      </w:hyperlink>
+      <w:r>
+        <w:rPr>
+          <w:rFonts w:ascii="Arial" w:hAnsi="Arial"/>
+          <w:color w:val="000000"/>
+          <w:sz w:val="19"/>
+        </w:rPr>
+        <w:t>)</w:t>
+      </w:r>
+    </w:p>
+    <w:p>
+      <w:pPr>
+        <w:pStyle w:val="ListBullet"/>
+      </w:pPr>
+      <w:r>
+        <w:rPr>
+          <w:rFonts w:ascii="Arial" w:hAnsi="Arial"/>
+          <w:b/>
+          <w:color w:val="000000"/>
+          <w:sz w:val="19"/>
+        </w:rPr>
+        <w:t>NHVR focuses on avoidance behaviour within industry</w:t>
+      </w:r>
+      <w:r>
+        <w:rPr>
+          <w:rFonts w:ascii="Arial" w:hAnsi="Arial"/>
+          <w:color w:val="000000"/>
+          <w:sz w:val="19"/>
+        </w:rPr>
+        <w:t xml:space="preserve"> - </w:t>
+      </w:r>
+      <w:r>
+        <w:rPr>
+          <w:rFonts w:ascii="Arial" w:hAnsi="Arial"/>
+          <w:color w:val="000000"/>
+          <w:sz w:val="19"/>
+        </w:rPr>
+        <w:t>The National Heavy Vehicle Regulator has flagged a targeted focus on avoidance behaviour, indicating stepped-up enforcement against operators who deliberately circumvent compliance obligations under…</w:t>
+      </w:r>
+      <w:r>
+        <w:rPr>
+          <w:rFonts w:ascii="Arial" w:hAnsi="Arial"/>
+          <w:color w:val="000000"/>
+          <w:sz w:val="19"/>
+        </w:rPr>
+        <w:t xml:space="preserve"> (</w:t>
+      </w:r>
+      <w:hyperlink r:id="rId24">
+        <w:r>
+          <w:rPr>
+            <w:rFonts w:ascii="Arial" w:hAnsi="Arial" w:cs="Arial"/>
+            <w:color w:val="0000FF"/>
+            <w:sz w:val="19"/>
+            <w:szCs w:val="19"/>
+            <w:u w:val="single"/>
+          </w:rPr>
+          <w:t xml:space="preserve">Read more</w:t>
+        </w:r>
+      </w:hyperlink>
+      <w:r>
+        <w:rPr>
+          <w:rFonts w:ascii="Arial" w:hAnsi="Arial"/>
+          <w:color w:val="000000"/>
+          <w:sz w:val="19"/>
+        </w:rPr>
+        <w:t>)</w:t>
       </w:r>
     </w:p>
     <w:p>
@@ -274,16 +1472,118 @@
     </w:p>
     <w:p>
       <w:pPr>
-        <w:pStyle w:val="body_letter"/>
+        <w:pStyle w:val="ListBullet"/>
       </w:pPr>
       <w:r>
         <w:rPr>
           <w:rFonts w:ascii="Arial" w:hAnsi="Arial"/>
-          <w:i/>
-          <w:color w:val="666666"/>
+          <w:b/>
+          <w:color w:val="000000"/>
           <w:sz w:val="19"/>
         </w:rPr>
-        <w:t>No ai adoption signal this fortnight.</w:t>
+        <w:t>Reform to data centre policy in NSW</w:t>
+      </w:r>
+      <w:r>
+        <w:rPr>
+          <w:rFonts w:ascii="Arial" w:hAnsi="Arial"/>
+          <w:color w:val="000000"/>
+          <w:sz w:val="19"/>
+        </w:rPr>
+        <w:t xml:space="preserve"> - </w:t>
+      </w:r>
+      <w:r>
+        <w:rPr>
+          <w:rFonts w:ascii="Arial" w:hAnsi="Arial"/>
+          <w:color w:val="000000"/>
+          <w:sz w:val="19"/>
+        </w:rPr>
+        <w:t>The NSW Government has introduced reformed data centre planning policy, streamlining approvals for digital infrastructure to support the rapid expansion of AI and cloud computing workloads across…</w:t>
+      </w:r>
+      <w:r>
+        <w:rPr>
+          <w:rFonts w:ascii="Arial" w:hAnsi="Arial"/>
+          <w:color w:val="000000"/>
+          <w:sz w:val="19"/>
+        </w:rPr>
+        <w:t xml:space="preserve"> (</w:t>
+      </w:r>
+      <w:hyperlink r:id="rId25">
+        <w:r>
+          <w:rPr>
+            <w:rFonts w:ascii="Arial" w:hAnsi="Arial" w:cs="Arial"/>
+            <w:color w:val="0000FF"/>
+            <w:sz w:val="19"/>
+            <w:szCs w:val="19"/>
+            <w:u w:val="single"/>
+          </w:rPr>
+          <w:t xml:space="preserve">Read more</w:t>
+        </w:r>
+      </w:hyperlink>
+      <w:r>
+        <w:rPr>
+          <w:rFonts w:ascii="Arial" w:hAnsi="Arial"/>
+          <w:color w:val="000000"/>
+          <w:sz w:val="19"/>
+        </w:rPr>
+        <w:t>)</w:t>
+      </w:r>
+    </w:p>
+    <w:p>
+      <w:pPr>
+        <w:pStyle w:val="ListBullet"/>
+      </w:pPr>
+      <w:r>
+        <w:rPr>
+          <w:rFonts w:ascii="Arial" w:hAnsi="Arial"/>
+          <w:b/>
+          <w:color w:val="000000"/>
+          <w:sz w:val="19"/>
+        </w:rPr>
+        <w:t>Australian Energy Regulator: Our Strategic Plan</w:t>
+      </w:r>
+      <w:r>
+        <w:rPr>
+          <w:rFonts w:ascii="Arial" w:hAnsi="Arial"/>
+          <w:color w:val="000000"/>
+          <w:sz w:val="19"/>
+        </w:rPr>
+        <w:t xml:space="preserve"> - </w:t>
+      </w:r>
+      <w:r>
+        <w:rPr>
+          <w:rFonts w:ascii="Arial" w:hAnsi="Arial"/>
+          <w:color w:val="000000"/>
+          <w:sz w:val="19"/>
+        </w:rPr>
+        <w:t>The Australian Energy Regulator has released its Strategic Plan, signalling investment in data and analytical capability to support evidence-based regulatory decision-making as Australia's energy…</w:t>
+      </w:r>
+      <w:r>
+        <w:rPr>
+          <w:rFonts w:ascii="Arial" w:hAnsi="Arial"/>
+          <w:color w:val="000000"/>
+          <w:sz w:val="19"/>
+        </w:rPr>
+        <w:t xml:space="preserve"> (</w:t>
+      </w:r>
+      <w:hyperlink r:id="rId26">
+        <w:r>
+          <w:rPr>
+            <w:rFonts w:ascii="Arial" w:hAnsi="Arial" w:cs="Arial"/>
+            <w:color w:val="0000FF"/>
+            <w:sz w:val="19"/>
+            <w:szCs w:val="19"/>
+            <w:u w:val="single"/>
+          </w:rPr>
+          <w:t xml:space="preserve">Read more</w:t>
+        </w:r>
+      </w:hyperlink>
+      <w:r>
+        <w:rPr>
+          <w:rFonts w:ascii="Arial" w:hAnsi="Arial"/>
+          <w:color w:val="000000"/>
+          <w:sz w:val="19"/>
+        </w:rPr>
+        <w:t>)</w:t>
       </w:r>
     </w:p>
     <w:p>
@@ -302,16 +1602,206 @@
     </w:p>
     <w:p>
       <w:pPr>
-        <w:pStyle w:val="body_letter"/>
+        <w:pStyle w:val="ListBullet"/>
       </w:pPr>
       <w:r>
         <w:rPr>
           <w:rFonts w:ascii="Arial" w:hAnsi="Arial"/>
-          <w:i/>
-          <w:color w:val="666666"/>
+          <w:b/>
+          <w:color w:val="000000"/>
           <w:sz w:val="19"/>
         </w:rPr>
-        <w:t>No regulatory burden signal this fortnight.</w:t>
+        <w:t>$55 million better off: education and enforcement over mandatory e-bike insurance</w:t>
+      </w:r>
+      <w:r>
+        <w:rPr>
+          <w:rFonts w:ascii="Arial" w:hAnsi="Arial"/>
+          <w:color w:val="000000"/>
+          <w:sz w:val="19"/>
+        </w:rPr>
+        <w:t xml:space="preserve"> - </w:t>
+      </w:r>
+      <w:r>
+        <w:rPr>
+          <w:rFonts w:ascii="Arial" w:hAnsi="Arial"/>
+          <w:color w:val="000000"/>
+          <w:sz w:val="19"/>
+        </w:rPr>
+        <w:t>The NSW Productivity and Equality Commission has quantified a $55 million net community benefit from choosing education and enforcement over mandatory e-bike insurance, providing a strong model for…</w:t>
+      </w:r>
+      <w:r>
+        <w:rPr>
+          <w:rFonts w:ascii="Arial" w:hAnsi="Arial"/>
+          <w:color w:val="000000"/>
+          <w:sz w:val="19"/>
+        </w:rPr>
+        <w:t xml:space="preserve"> (</w:t>
+      </w:r>
+      <w:hyperlink r:id="rId27">
+        <w:r>
+          <w:rPr>
+            <w:rFonts w:ascii="Arial" w:hAnsi="Arial" w:cs="Arial"/>
+            <w:color w:val="0000FF"/>
+            <w:sz w:val="19"/>
+            <w:szCs w:val="19"/>
+            <w:u w:val="single"/>
+          </w:rPr>
+          <w:t xml:space="preserve">Read more</w:t>
+        </w:r>
+      </w:hyperlink>
+      <w:r>
+        <w:rPr>
+          <w:rFonts w:ascii="Arial" w:hAnsi="Arial"/>
+          <w:color w:val="000000"/>
+          <w:sz w:val="19"/>
+        </w:rPr>
+        <w:t>)</w:t>
+      </w:r>
+    </w:p>
+    <w:p>
+      <w:pPr>
+        <w:pStyle w:val="ListBullet"/>
+      </w:pPr>
+      <w:r>
+        <w:rPr>
+          <w:rFonts w:ascii="Arial" w:hAnsi="Arial"/>
+          <w:b/>
+          <w:color w:val="000000"/>
+          <w:sz w:val="19"/>
+        </w:rPr>
+        <w:t>CASA proposes new business and owner transport classifications</w:t>
+      </w:r>
+      <w:r>
+        <w:rPr>
+          <w:rFonts w:ascii="Arial" w:hAnsi="Arial"/>
+          <w:color w:val="000000"/>
+          <w:sz w:val="19"/>
+        </w:rPr>
+        <w:t xml:space="preserve"> - </w:t>
+      </w:r>
+      <w:r>
+        <w:rPr>
+          <w:rFonts w:ascii="Arial" w:hAnsi="Arial"/>
+          <w:color w:val="000000"/>
+          <w:sz w:val="19"/>
+        </w:rPr>
+        <w:t>CASA is consulting on proposed new operational classifications for business and owner transport, a reform designed to simplify the regulatory framework and reduce compliance complexity for…</w:t>
+      </w:r>
+      <w:r>
+        <w:rPr>
+          <w:rFonts w:ascii="Arial" w:hAnsi="Arial"/>
+          <w:color w:val="000000"/>
+          <w:sz w:val="19"/>
+        </w:rPr>
+        <w:t xml:space="preserve"> (</w:t>
+      </w:r>
+      <w:hyperlink r:id="rId28">
+        <w:r>
+          <w:rPr>
+            <w:rFonts w:ascii="Arial" w:hAnsi="Arial" w:cs="Arial"/>
+            <w:color w:val="0000FF"/>
+            <w:sz w:val="19"/>
+            <w:szCs w:val="19"/>
+            <w:u w:val="single"/>
+          </w:rPr>
+          <w:t xml:space="preserve">Read more</w:t>
+        </w:r>
+      </w:hyperlink>
+      <w:r>
+        <w:rPr>
+          <w:rFonts w:ascii="Arial" w:hAnsi="Arial"/>
+          <w:color w:val="000000"/>
+          <w:sz w:val="19"/>
+        </w:rPr>
+        <w:t>)</w:t>
+      </w:r>
+    </w:p>
+    <w:p>
+      <w:pPr>
+        <w:pStyle w:val="ListBullet"/>
+      </w:pPr>
+      <w:r>
+        <w:rPr>
+          <w:rFonts w:ascii="Arial" w:hAnsi="Arial"/>
+          <w:b/>
+          <w:color w:val="000000"/>
+          <w:sz w:val="19"/>
+        </w:rPr>
+        <w:t>EPBC Act: New National Environmental Standards commence</w:t>
+      </w:r>
+      <w:r>
+        <w:rPr>
+          <w:rFonts w:ascii="Arial" w:hAnsi="Arial"/>
+          <w:color w:val="000000"/>
+          <w:sz w:val="19"/>
+        </w:rPr>
+        <w:t xml:space="preserve"> - </w:t>
+      </w:r>
+      <w:r>
+        <w:rPr>
+          <w:rFonts w:ascii="Arial" w:hAnsi="Arial"/>
+          <w:color w:val="000000"/>
+          <w:sz w:val="19"/>
+        </w:rPr>
+        <w:t>New National Environmental Standards have commenced under the EPBC Act, marking a significant milestone in Australia's environmental regulatory reform agenda and introducing updated compliance…</w:t>
+      </w:r>
+    </w:p>
+    <w:p>
+      <w:pPr>
+        <w:pStyle w:val="ListBullet"/>
+      </w:pPr>
+      <w:r>
+        <w:rPr>
+          <w:rFonts w:ascii="Arial" w:hAnsi="Arial"/>
+          <w:b/>
+          <w:color w:val="000000"/>
+          <w:sz w:val="19"/>
+        </w:rPr>
+        <w:t>ASIC: Easier to deal with, harder to avoid</w:t>
+      </w:r>
+      <w:r>
+        <w:rPr>
+          <w:rFonts w:ascii="Arial" w:hAnsi="Arial"/>
+          <w:color w:val="000000"/>
+          <w:sz w:val="19"/>
+        </w:rPr>
+        <w:t xml:space="preserve"> - </w:t>
+      </w:r>
+      <w:r>
+        <w:rPr>
+          <w:rFonts w:ascii="Arial" w:hAnsi="Arial"/>
+          <w:color w:val="000000"/>
+          <w:sz w:val="19"/>
+        </w:rPr>
+        <w:t>ASIC has articulated a dual commitment to reducing friction for compliant firms while intensifying enforcement against those breaching obligations, signalling a more risk-calibrated and…</w:t>
+      </w:r>
+      <w:r>
+        <w:rPr>
+          <w:rFonts w:ascii="Arial" w:hAnsi="Arial"/>
+          <w:color w:val="000000"/>
+          <w:sz w:val="19"/>
+        </w:rPr>
+        <w:t xml:space="preserve"> (</w:t>
+      </w:r>
+      <w:hyperlink r:id="rId29">
+        <w:r>
+          <w:rPr>
+            <w:rFonts w:ascii="Arial" w:hAnsi="Arial" w:cs="Arial"/>
+            <w:color w:val="0000FF"/>
+            <w:sz w:val="19"/>
+            <w:szCs w:val="19"/>
+            <w:u w:val="single"/>
+          </w:rPr>
+          <w:t xml:space="preserve">Read more</w:t>
+        </w:r>
+      </w:hyperlink>
+      <w:r>
+        <w:rPr>
+          <w:rFonts w:ascii="Arial" w:hAnsi="Arial"/>
+          <w:color w:val="000000"/>
+          <w:sz w:val="19"/>
+        </w:rPr>
+        <w:t>)</w:t>
       </w:r>
     </w:p>
     <w:p>
@@ -330,32 +1820,16 @@
     </w:p>
     <w:p>
       <w:pPr>
-        <w:pStyle w:val="ListBullet"/>
+        <w:pStyle w:val="body_letter"/>
       </w:pPr>
       <w:r>
         <w:rPr>
           <w:rFonts w:ascii="Arial" w:hAnsi="Arial"/>
-          <w:b/>
-          <w:color w:val="000000"/>
+          <w:i/>
+          <w:color w:val="666666"/>
           <w:sz w:val="19"/>
         </w:rPr>
-        <w:t>AHRI Public Sector L&amp;D Symposium</w:t>
-      </w:r>
-      <w:r>
-        <w:rPr>
-          <w:rFonts w:ascii="Arial" w:hAnsi="Arial"/>
-          <w:color w:val="000000"/>
-          <w:sz w:val="19"/>
-        </w:rPr>
-        <w:t xml:space="preserve"> - </w:t>
-      </w:r>
-      <w:r>
-        <w:rPr>
-          <w:rFonts w:ascii="Arial" w:hAnsi="Arial"/>
-          <w:color w:val="000000"/>
-          <w:sz w:val="19"/>
-        </w:rPr>
-        <w:t>20 Aug 2026 - AHRI · Sydney</w:t>
+        <w:t>No upcoming events in the next four weeks.</w:t>
       </w:r>
     </w:p>
     <w:p>
@@ -370,6 +1844,20 @@
           <w:sz w:val="21"/>
         </w:rPr>
         <w:t>Cross-sector synthesis (hub-wide)</w:t>
+      </w:r>
+    </w:p>
+    <w:p>
+      <w:pPr>
+        <w:pStyle w:val="body_letter"/>
+      </w:pPr>
+      <w:r>
+        <w:rPr>
+          <w:rFonts w:ascii="Arial" w:hAnsi="Arial"/>
+          <w:b w:val="0"/>
+          <w:color w:val="000000"/>
+          <w:sz w:val="19"/>
+        </w:rPr>
+        <w:t>Three regulator investment cycles are converging this fortnight and each carries a discrete advisory window: ASIC's declared strategic reset to 'easier to deal with, harder to avoid' under its incoming chair is simultaneously a client-recalibration event and a transformation advisory mandate for the regulator itself; the AER's published Strategic Plan signals sustained capability and technology uplift across the National Electricity and Gas Markets, creating a pre-tender runway for KPMG's energy-transition and regulatory-strategy practice; and AMSA's Annual Regulatory Program 2026-27 locks in enforcement campaigns across fatigue, cargo securing, and seafarer medical fitness that will generate compliance program demand from maritime operators before the inspection cycle opens. EPBC reform has moved from legislation to implementation with new National Environmental Standards now in force, compressing the compliance runway for mining, infrastructure, and major-property proponents, Q4 2026 is the live conversion window before project pipelines absorb the new approval framework under competitive pressure. Leadership transitions at Victoria's Department of Transport and Planning and the ATSB are classic first-100-days BD events: both appointments create demand for capability reviews and strategic reset advisory that KPMG can pursue without a formal competitive process if it moves in the next four weeks. The NHVR's public declaration of enforcement focus on deliberate avoidance behaviour and the concurrent commencement of HVNL reforms together mark the beginning of an active penalty cycle for heavy vehicle operators, freight clients without current compliance program maturity are immediately exposed. The overarching BD signal across the fortnight is enforcement cycle initiation: ASIC, NHVR, EPA Victoria, and AUSTRAC are all in declared or active enforcement uplift, and the advisory window is shortest for clients who have not yet commissioned independent assurance or compliance gap reviews.</w:t>
       </w:r>
     </w:p>
     <w:p>
@@ -396,7 +1884,7 @@
           <w:color w:val="000000"/>
           <w:sz w:val="19"/>
         </w:rPr>
-        <w:t>Brief the relevant sector partner this fortnight on the highest-signal regulator development above.</w:t>
+        <w:t>Deploy KPMG's environmental advisory and approvals team to mining and major infrastructure clients this week to position EPBC National Environmental Standards transition support ahead of Q4 project pipeline acceleration, the compliance gap is live and proponents are not yet resourced.</w:t>
       </w:r>
     </w:p>
     <w:p>
@@ -409,7 +1897,7 @@
           <w:color w:val="000000"/>
           <w:sz w:val="19"/>
         </w:rPr>
-        <w:t>Convene the capability bench for the next reg-tech / capability-review pursuit in pipeline.</w:t>
+        <w:t>Activate transport practice pursuit of first-100-days capability review mandates with the incoming Victoria DTP Secretary and new ATSB Commissioner before those appointments stabilise and discretionary advisory spend narrows to existing relationships.</w:t>
       </w:r>
     </w:p>
     <w:p>
@@ -422,7 +1910,112 @@
           <w:color w:val="000000"/>
           <w:sz w:val="19"/>
         </w:rPr>
-        <w:t>Pursue at least one tracked client on a near-term advisory hook before the next CoP cadence.</w:t>
+        <w:t>Pitch ASIC directly under its new 'easier to deal with, harder to avoid' posture on operational transformation and regulatory technology, the incoming chair's declared reset is a six-month window before the strategy embeds and procurement tightens.</w:t>
+      </w:r>
+    </w:p>
+    <w:p>
+      <w:pPr>
+        <w:pStyle w:val="ListBullet"/>
+      </w:pPr>
+      <w:r>
+        <w:rPr>
+          <w:rFonts w:ascii="Arial" w:hAnsi="Arial"/>
+          <w:color w:val="000000"/>
+          <w:sz w:val="19"/>
+        </w:rPr>
+        <w:t>Brief tier-1 NHVR-regulated freight operator clients on the enforcement posture shift toward deliberate avoidance behaviour and convert those conversations to risk framework and assurance mandates before the first penalty actions are published and clients are on the back foot.</w:t>
+      </w:r>
+    </w:p>
+    <w:p>
+      <w:pPr>
+        <w:pStyle w:val="ListBullet"/>
+      </w:pPr>
+      <w:r>
+        <w:rPr>
+          <w:rFonts w:ascii="Arial" w:hAnsi="Arial"/>
+          <w:color w:val="000000"/>
+          <w:sz w:val="19"/>
+        </w:rPr>
+        <w:t>Position KPMG's energy regulatory practice on AER Strategic Plan implementation streams, data governance, market monitoring, and technology uplift, before they translate into formal tender panels in H1 2027.</w:t>
+      </w:r>
+    </w:p>
+    <w:p>
+      <w:pPr>
+        <w:pStyle w:val="body_letter"/>
+      </w:pPr>
+      <w:r>
+        <w:rPr>
+          <w:rFonts w:ascii="Arial" w:hAnsi="Arial"/>
+          <w:b/>
+          <w:color w:val="000000"/>
+          <w:sz w:val="19"/>
+        </w:rPr>
+        <w:t>Implications for clients</w:t>
+      </w:r>
+    </w:p>
+    <w:p>
+      <w:pPr>
+        <w:pStyle w:val="ListBullet"/>
+      </w:pPr>
+      <w:r>
+        <w:rPr>
+          <w:rFonts w:ascii="Arial" w:hAnsi="Arial"/>
+          <w:color w:val="000000"/>
+          <w:sz w:val="19"/>
+        </w:rPr>
+        <w:t>Deploy KPMG's environmental advisory and approvals team to mining and major infrastructure clients this week to position EPBC National Environmental Standards transition support ahead of Q4 project pipeline acceleration, the compliance gap is live and proponents are not yet resourced.</w:t>
+      </w:r>
+    </w:p>
+    <w:p>
+      <w:pPr>
+        <w:pStyle w:val="ListBullet"/>
+      </w:pPr>
+      <w:r>
+        <w:rPr>
+          <w:rFonts w:ascii="Arial" w:hAnsi="Arial"/>
+          <w:color w:val="000000"/>
+          <w:sz w:val="19"/>
+        </w:rPr>
+        <w:t>Activate transport practice pursuit of first-100-days capability review mandates with the incoming Victoria DTP Secretary and new ATSB Commissioner before those appointments stabilise and discretionary advisory spend narrows to existing relationships.</w:t>
+      </w:r>
+    </w:p>
+    <w:p>
+      <w:pPr>
+        <w:pStyle w:val="ListBullet"/>
+      </w:pPr>
+      <w:r>
+        <w:rPr>
+          <w:rFonts w:ascii="Arial" w:hAnsi="Arial"/>
+          <w:color w:val="000000"/>
+          <w:sz w:val="19"/>
+        </w:rPr>
+        <w:t>Pitch ASIC directly under its new 'easier to deal with, harder to avoid' posture on operational transformation and regulatory technology, the incoming chair's declared reset is a six-month window before the strategy embeds and procurement tightens.</w:t>
+      </w:r>
+    </w:p>
+    <w:p>
+      <w:pPr>
+        <w:pStyle w:val="ListBullet"/>
+      </w:pPr>
+      <w:r>
+        <w:rPr>
+          <w:rFonts w:ascii="Arial" w:hAnsi="Arial"/>
+          <w:color w:val="000000"/>
+          <w:sz w:val="19"/>
+        </w:rPr>
+        <w:t>Brief tier-1 NHVR-regulated freight operator clients on the enforcement posture shift toward deliberate avoidance behaviour and convert those conversations to risk framework and assurance mandates before the first penalty actions are published and clients are on the back foot.</w:t>
+      </w:r>
+    </w:p>
+    <w:p>
+      <w:pPr>
+        <w:pStyle w:val="ListBullet"/>
+      </w:pPr>
+      <w:r>
+        <w:rPr>
+          <w:rFonts w:ascii="Arial" w:hAnsi="Arial"/>
+          <w:color w:val="000000"/>
+          <w:sz w:val="19"/>
+        </w:rPr>
+        <w:t>Position KPMG's energy regulatory practice on AER Strategic Plan implementation streams, data governance, market monitoring, and technology uplift, before they translate into formal tender panels in H1 2027.</w:t>
       </w:r>
     </w:p>
     <w:p>
@@ -446,11 +2039,221 @@
       <w:r>
         <w:rPr>
           <w:rFonts w:ascii="Arial" w:hAnsi="Arial"/>
-          <w:i/>
-          <w:color w:val="666666"/>
+          <w:b/>
+          <w:color w:val="000000"/>
           <w:sz w:val="19"/>
         </w:rPr>
-        <w:t>No sector-level synthesis available this fortnight.</w:t>
+        <w:t>Public Sector</w:t>
+      </w:r>
+    </w:p>
+    <w:p>
+      <w:pPr>
+        <w:pStyle w:val="body_letter"/>
+      </w:pPr>
+      <w:r>
+        <w:rPr>
+          <w:rFonts w:ascii="Arial" w:hAnsi="Arial"/>
+          <w:b w:val="0"/>
+          <w:color w:val="000000"/>
+          <w:sz w:val="19"/>
+        </w:rPr>
+        <w:t>The APSC Corporate Plan 2026-27 signals defined APS-wide investment priorities across capability, workforce effectiveness, and organisational performance, creating a direct pull-through for KPMG's public sector workforce transformation and L&amp;D offerings at the moment budget conversations are live. The Department of Finance's initiative to overcome data-sharing and integration barriers represents an active Commonwealth mandate for data governance, interoperability architecture, and cross-agency frameworks, an advisory lane KPMG's digital and data practice should be positioned on before tender windows open. NDIS mandatory registration reform and revised access rules introduce a near-term compliance burden on providers and the NDIA, while Fair Work's $5.3M aged-care underpayment recovery signals an enforcement cycle that will drive risk and compliance advisory demand in human services. The pending privacy 'right to erasure' reform compounds agency compliance pressure and provides a credible opener for cross-portfolio regulatory-readiness engagements.</w:t>
+      </w:r>
+    </w:p>
+    <w:p>
+      <w:pPr>
+        <w:pStyle w:val="body_letter"/>
+      </w:pPr>
+      <w:r>
+        <w:rPr>
+          <w:rFonts w:ascii="Arial" w:hAnsi="Arial"/>
+          <w:b/>
+          <w:color w:val="000000"/>
+          <w:sz w:val="19"/>
+        </w:rPr>
+        <w:t>Financial Services</w:t>
+      </w:r>
+    </w:p>
+    <w:p>
+      <w:pPr>
+        <w:pStyle w:val="body_letter"/>
+      </w:pPr>
+      <w:r>
+        <w:rPr>
+          <w:rFonts w:ascii="Arial" w:hAnsi="Arial"/>
+          <w:b w:val="0"/>
+          <w:color w:val="000000"/>
+          <w:sz w:val="19"/>
+        </w:rPr>
+        <w:t>ASIC's new strategic posture, 'easier to deal with, harder to avoid', signals a deliberate capability and operational reset under its incoming chair, creating a near-term window to position KPMG's regulatory advisory and transformation bench with ASIC as a client and with regulated entities needing to recalibrate their engagement models. Concurrently, ASIC's public warning on 'first significant cracks' in private credit elevates risk-framework and assurance demand across fund managers and lenders active in that market. The CSLR overhaul backed by banks and brokers, combined with Mulino's contested DBFO advice reform agenda, points to sustained legislative and operational redesign work in financial services through H2 2026. The ATO data-sharing signal following the AUSTRAC fraud probe adds a data-governance and financial crime compliance angle that bridges into KPMG's forensics and technology practices.</w:t>
+      </w:r>
+    </w:p>
+    <w:p>
+      <w:pPr>
+        <w:pStyle w:val="body_letter"/>
+      </w:pPr>
+      <w:r>
+        <w:rPr>
+          <w:rFonts w:ascii="Arial" w:hAnsi="Arial"/>
+          <w:b/>
+          <w:color w:val="000000"/>
+          <w:sz w:val="19"/>
+        </w:rPr>
+        <w:t>Health, Ageing &amp; Human Services</w:t>
+      </w:r>
+    </w:p>
+    <w:p>
+      <w:pPr>
+        <w:pStyle w:val="body_letter"/>
+      </w:pPr>
+      <w:r>
+        <w:rPr>
+          <w:rFonts w:ascii="Arial" w:hAnsi="Arial"/>
+          <w:b w:val="0"/>
+          <w:color w:val="000000"/>
+          <w:sz w:val="19"/>
+        </w:rPr>
+        <w:t>The NDIS reform package has cleared parliament on a Labor-Coalition deal, compressing the advisory window for state and territory governments that are not yet ready to deliver foundational supports at the pace the legislation mandates, a readiness gap the Minister has publicly declined to guarantee will be bridged before participants are exited from the scheme. Concurrently, the Department of Health, Disability and Ageing has opened formal consultation on proposed NDIS access changes, creating a direct engagement opportunity for organisations seeking to shape transition arrangements. The Aged Care Quality and Safety Commission's successful Federal Court action against a worker who breached a banning order signals a hardening enforcement posture across disability and aged care, driving compliance-uplift demand from providers facing tighter worker-screening obligations. The Ashurst automated-decision series on defensible decision-making maps directly onto NDIS eligibility and aged care assessment algorithms, anchoring a near-term digital-risk and regulatory-assurance pitch to Commonwealth and state agencies administering these tools.</w:t>
+      </w:r>
+    </w:p>
+    <w:p>
+      <w:pPr>
+        <w:pStyle w:val="body_letter"/>
+      </w:pPr>
+      <w:r>
+        <w:rPr>
+          <w:rFonts w:ascii="Arial" w:hAnsi="Arial"/>
+          <w:b/>
+          <w:color w:val="000000"/>
+          <w:sz w:val="19"/>
+        </w:rPr>
+        <w:t>Energy, Mining &amp; Property</w:t>
+      </w:r>
+    </w:p>
+    <w:p>
+      <w:pPr>
+        <w:pStyle w:val="body_letter"/>
+      </w:pPr>
+      <w:r>
+        <w:rPr>
+          <w:rFonts w:ascii="Arial" w:hAnsi="Arial"/>
+          <w:b w:val="0"/>
+          <w:color w:val="000000"/>
+          <w:sz w:val="19"/>
+        </w:rPr>
+        <w:t>The AER's published Strategic Plan signals sustained investment in regulatory capability and technology uplift across the National Electricity and Gas Markets, positioning the regulator for expanded data-driven oversight, a direct advisory entry point for KPMG's energy-transition and regulatory-strategy practice. A fatal mine incident in NSW has triggered a formal state safety investigation, opening near-term safety assurance and compliance program work with both the regulator and extractives sector clients. Commencement of new National Environmental Standards under the EPBC Act reform program materially raises the compliance bar for mining, infrastructure, and major-property proponents, with transition-support demand expected to accelerate through Q4 2026 as project pipelines absorb the new approval framework. Victoria EPA's 2026-27 Annual Delivery Plan and Statement of Expectations reinforce an enforcement-first posture in waste, energy recovery, and land-use compliance, consolidating a pattern that rewards early-mover clients who invest in compliance program design and independent assurance ahead of regulatory action.</w:t>
+      </w:r>
+    </w:p>
+    <w:p>
+      <w:pPr>
+        <w:pStyle w:val="body_letter"/>
+      </w:pPr>
+      <w:r>
+        <w:rPr>
+          <w:rFonts w:ascii="Arial" w:hAnsi="Arial"/>
+          <w:b/>
+          <w:color w:val="000000"/>
+          <w:sz w:val="19"/>
+        </w:rPr>
+        <w:t>National Security &amp; Justice</w:t>
+      </w:r>
+    </w:p>
+    <w:p>
+      <w:pPr>
+        <w:pStyle w:val="body_letter"/>
+      </w:pPr>
+      <w:r>
+        <w:rPr>
+          <w:rFonts w:ascii="Arial" w:hAnsi="Arial"/>
+          <w:b w:val="0"/>
+          <w:color w:val="000000"/>
+          <w:sz w:val="19"/>
+        </w:rPr>
+        <w:t>AUSTRAC's activation of section 167 compliance notices against non-enrolled Tranche 2 entities marks the enforcement phase of Australia's landmark AML/CTF expansion, generating immediate and time-pressured demand for compliance program design, ML/TF risk assessments, and implementation advisory across the legal, accounting, and real estate sectors. The agency is simultaneously investing in Pacific regional capability and intelligence infrastructure, signals of sustained organisational uplift that create a technology and capability advisory runway. AFSA's 13.1% rise in personal insolvencies and its PPSR data-integrity exercise indicate parallel regulatory activity in the financial security system, while ABF and AFP joint operations against illicit tobacco networks and a disrupted global cybercrime syndicate underscore a coordinated Home Affairs enforcement posture. Collectively, these signals position KPMG to pursue both urgent compliance uplift work with newly regulated Tranche 2 entities and longer-horizon capability and assurance engagements across the national security cluster.</w:t>
+      </w:r>
+    </w:p>
+    <w:p>
+      <w:pPr>
+        <w:pStyle w:val="body_letter"/>
+      </w:pPr>
+      <w:r>
+        <w:rPr>
+          <w:rFonts w:ascii="Arial" w:hAnsi="Arial"/>
+          <w:b/>
+          <w:color w:val="000000"/>
+          <w:sz w:val="19"/>
+        </w:rPr>
+        <w:t>Defence</w:t>
+      </w:r>
+    </w:p>
+    <w:p>
+      <w:pPr>
+        <w:pStyle w:val="body_letter"/>
+      </w:pPr>
+      <w:r>
+        <w:rPr>
+          <w:rFonts w:ascii="Arial" w:hAnsi="Arial"/>
+          <w:b w:val="0"/>
+          <w:color w:val="000000"/>
+          <w:sz w:val="19"/>
+        </w:rPr>
+        <w:t>The Department of Defence's announced shift to an 'enable, not gatekeep' posture on sensitive data and expertise guidelines represents a structural policy signal that will drive near-term demand for data governance frameworks, security classification advisory, and assurance programs across the industrial base. Simultaneously, Defence export compliance officials are publicly emphasising prevention over remediation, indicating unmet demand for compliance gap assessments, workforce uplift, and program-level controls, with enforcement risk making inaction costly for primes. A high-profile termination of a 26-year contract surfaces procurement governance and contract-management reform as a live pursuit angle, with affected suppliers likely requiring advisory on dispute resolution, transition planning, and re-competition positioning. Modern slavery criminal liability reforms add a compounding compliance obligation on Defence supply chains that KPMG's risk, legal, and operations advisory bench can package as a unified offering.</w:t>
+      </w:r>
+    </w:p>
+    <w:p>
+      <w:pPr>
+        <w:pStyle w:val="body_letter"/>
+      </w:pPr>
+      <w:r>
+        <w:rPr>
+          <w:rFonts w:ascii="Arial" w:hAnsi="Arial"/>
+          <w:b/>
+          <w:color w:val="000000"/>
+          <w:sz w:val="19"/>
+        </w:rPr>
+        <w:t>Transport</w:t>
+      </w:r>
+    </w:p>
+    <w:p>
+      <w:pPr>
+        <w:pStyle w:val="body_letter"/>
+      </w:pPr>
+      <w:r>
+        <w:rPr>
+          <w:rFonts w:ascii="Arial" w:hAnsi="Arial"/>
+          <w:b w:val="0"/>
+          <w:color w:val="000000"/>
+          <w:sz w:val="19"/>
+        </w:rPr>
+        <w:t>AMSA's Annual Regulatory Program 2026-27 signals structured regulator investment across maritime safety enforcement, seafarer medical fitness, and cargo securing compliance, each a proximate advisory engagement vector for KPMG's transport practice. Concurrent leadership transitions at Victoria's Department of Transport and Planning and the ATSB signal first-100-days demand for capability reviews and strategic resets that KPMG is positioned to lead. The NHVR's declared focus on deliberate avoidance behaviour in heavy vehicle operations marks an enforcement posture shift that will generate risk, assurance, and regulatory-relations mandates across freight operators. CASA's live consultation on new business and owner-transport operational classifications (PP 2610OS) adds a compliance advisory dimension for aviation clients exposed to reclassification risk.</w:t>
+      </w:r>
+    </w:p>
+    <w:p>
+      <w:pPr>
+        <w:pStyle w:val="body_letter"/>
+      </w:pPr>
+      <w:r>
+        <w:rPr>
+          <w:rFonts w:ascii="Arial" w:hAnsi="Arial"/>
+          <w:b/>
+          <w:color w:val="000000"/>
+          <w:sz w:val="19"/>
+        </w:rPr>
+        <w:t>Education</w:t>
+      </w:r>
+    </w:p>
+    <w:p>
+      <w:pPr>
+        <w:pStyle w:val="body_letter"/>
+      </w:pPr>
+      <w:r>
+        <w:rPr>
+          <w:rFonts w:ascii="Arial" w:hAnsi="Arial"/>
+          <w:b w:val="0"/>
+          <w:color w:val="000000"/>
+          <w:sz w:val="19"/>
+        </w:rPr>
+        <w:t>TEQSA's newly published 2026-30 Corporate Plan establishes a five-year regulatory investment agenda for higher education, signalling sustained demand for governance, compliance, and capability advisory across the university sector. Legislative proposals to expose institutions to $2m fines for governance failures and racism, combined with structural reforms to ANU's enabling legislation, indicate an enforcement posture shift that will accelerate board-level risk reviews and independent assurance mandates. The new TEQSA-ASQA MOU on dual-sector provider quality creates an immediate advisory opening for TAFEs and hybrid institutions navigating overlapping regulatory regimes, while time-bound accreditation reforms compress the compliance runway for providers yet to invest in readiness capability. KPMG's governance, risk, and transformation practices are well-positioned to lead engagements across all three vectors before TEQSA's new plan enters active implementation.</w:t>
       </w:r>
     </w:p>
     <w:p>
@@ -474,11 +2277,249 @@
       <w:r>
         <w:rPr>
           <w:rFonts w:ascii="Arial" w:hAnsi="Arial"/>
-          <w:i/>
-          <w:color w:val="666666"/>
+          <w:b/>
+          <w:color w:val="000000"/>
           <w:sz w:val="19"/>
         </w:rPr>
-        <w:t>No jurisdiction-level synthesis available this fortnight.</w:t>
+        <w:t>Commonwealth</w:t>
+      </w:r>
+    </w:p>
+    <w:p>
+      <w:pPr>
+        <w:pStyle w:val="body_letter"/>
+      </w:pPr>
+      <w:r>
+        <w:rPr>
+          <w:rFonts w:ascii="Arial" w:hAnsi="Arial"/>
+          <w:b w:val="0"/>
+          <w:color w:val="000000"/>
+          <w:sz w:val="19"/>
+        </w:rPr>
+        <w:t>ASIC has flagged a dual strategic posture, more accessible for compliant entities, harder to avoid for bad actors, backed by elevated FY25/26 enforcement outcomes driven by the Shield case fallout and a Melbourne AFSL suspension, signalling sustained regulatory pressure on financial services licensees. The Commonwealth's mandatory sustainability reporting regime is transitioning from policy to early reporting reality, with immediate compliance obligations for in-scope entities and advisory demand around assurance readiness. NDIS reform is progressing federally with the minister flagging further legislative amendments targeting fraud and parliamentary negotiation, while state-readiness concerns create cross-jurisdictional compliance complexity. A federal-NSW cost-shared gun buyback scheme has been formalised, and National Cabinet's data centre and AI infrastructure agenda is generating concurrent state planning and investment frameworks with regulatory implications across planning, environment and energy portfolios.</w:t>
+      </w:r>
+    </w:p>
+    <w:p>
+      <w:pPr>
+        <w:pStyle w:val="body_letter"/>
+      </w:pPr>
+      <w:r>
+        <w:rPr>
+          <w:rFonts w:ascii="Arial" w:hAnsi="Arial"/>
+          <w:b/>
+          <w:color w:val="000000"/>
+          <w:sz w:val="19"/>
+        </w:rPr>
+        <w:t>New South Wales</w:t>
+      </w:r>
+    </w:p>
+    <w:p>
+      <w:pPr>
+        <w:pStyle w:val="body_letter"/>
+      </w:pPr>
+      <w:r>
+        <w:rPr>
+          <w:rFonts w:ascii="Arial" w:hAnsi="Arial"/>
+          <w:b w:val="0"/>
+          <w:color w:val="000000"/>
+          <w:sz w:val="19"/>
+        </w:rPr>
+        <w:t>NSW regulators are intensifying enforcement across multiple sectors, with SafeWork NSW conducting an agribusiness safety blitz issuing dozens of breach notices, NSW Fair Trading imposing $200k fines on real estate agencies for trust account failures, and water regulators confronting prosecution gaps due to licensing doubts that may shield large-scale water theft from accountability. ICAC inquiries are running concurrently across building regulation (developer shakedowns of the former building commissioner), NSW Health (false qualifications and undisclosed conflicts), Catholic education leadership, and political conduct involving the Perrottet circle, sustaining strong demand for integrity and governance advisory work. The NSW Government has enacted major gambling reform with strengthened consumer protections, made Codes of Practice legally mandatory for businesses statewide, and released a nation-leading data centre policy framework governing planning approvals and infrastructure cost-sharing, all creating immediate compliance uplift obligations. KPMG advisory opportunities are concentrated in mandatory CoP gap analyses, gambling compliance program redesign, data centre planning navigation, and public-sector integrity frameworks.</w:t>
+      </w:r>
+    </w:p>
+    <w:p>
+      <w:pPr>
+        <w:pStyle w:val="body_letter"/>
+      </w:pPr>
+      <w:r>
+        <w:rPr>
+          <w:rFonts w:ascii="Arial" w:hAnsi="Arial"/>
+          <w:b/>
+          <w:color w:val="000000"/>
+          <w:sz w:val="19"/>
+        </w:rPr>
+        <w:t>Victoria</w:t>
+      </w:r>
+    </w:p>
+    <w:p>
+      <w:pPr>
+        <w:pStyle w:val="body_letter"/>
+      </w:pPr>
+      <w:r>
+        <w:rPr>
+          <w:rFonts w:ascii="Arial" w:hAnsi="Arial"/>
+          <w:b w:val="0"/>
+          <w:color w:val="000000"/>
+          <w:sz w:val="19"/>
+        </w:rPr>
+        <w:t>Victoria's regulatory landscape is dominated by the Big Build Royal Commission, which carries expansive terms of reference; Premier Carroll is simultaneously establishing a dedicated special prosecutor and expanding IBAC's powers, with the corruption probe explicitly placing former and current senior government figures in scope. Enforcement intensity is rising across multiple sectors: EPA Victoria has conducted a snap blitz on skip bin operators, WorkSafe is reviewing CFA fleet safety, and the state's residential rental taskforce has been made permanent, signalling durable compliance obligations for property managers and landlords. The government has foreshadowed tougher workplace surveillance legislation, creating an emerging advisory opportunity, while the mining sector is contesting significant exploration fee increases that may require regulatory engagement. VCAT continues to generate precedent-setting outcomes in building and property disputes, including a landmark decision clearing a building surveyor in a combustible cladding disciplinary action.</w:t>
+      </w:r>
+    </w:p>
+    <w:p>
+      <w:pPr>
+        <w:pStyle w:val="body_letter"/>
+      </w:pPr>
+      <w:r>
+        <w:rPr>
+          <w:rFonts w:ascii="Arial" w:hAnsi="Arial"/>
+          <w:b/>
+          <w:color w:val="000000"/>
+          <w:sz w:val="19"/>
+        </w:rPr>
+        <w:t>Queensland</w:t>
+      </w:r>
+    </w:p>
+    <w:p>
+      <w:pPr>
+        <w:pStyle w:val="body_letter"/>
+      </w:pPr>
+      <w:r>
+        <w:rPr>
+          <w:rFonts w:ascii="Arial" w:hAnsi="Arial"/>
+          <w:b w:val="0"/>
+          <w:color w:val="000000"/>
+          <w:sz w:val="19"/>
+        </w:rPr>
+        <w:t>Queensland's regulatory agenda is active across multiple sectors: the government has opened public consultation on bail law amendments, signalling forthcoming criminal justice legislation that warrants compliance mapping for affected service providers. A significant Facilitating Projects Scheme (FPS) overhaul is underway to attract global mining investment, restructuring approval pathways and creating advisory opportunities for resources clients navigating the new framework. On the enforcement front, Queensland Police have executed over 100 seizures under new e-mobility laws, demonstrating that recently enacted device-regulation legislation is now in active operational use. Separately, the government's formal response to child safety inquiry findings, coupled with new early learning sector safeguards aligned to national reforms, extends compliance obligations for ECEC providers, while a widening independent review of the Queensland DNA laboratory signals continued scrutiny of forensic public-sector services.</w:t>
+      </w:r>
+    </w:p>
+    <w:p>
+      <w:pPr>
+        <w:pStyle w:val="body_letter"/>
+      </w:pPr>
+      <w:r>
+        <w:rPr>
+          <w:rFonts w:ascii="Arial" w:hAnsi="Arial"/>
+          <w:b/>
+          <w:color w:val="000000"/>
+          <w:sz w:val="19"/>
+        </w:rPr>
+        <w:t>Western Australia</w:t>
+      </w:r>
+    </w:p>
+    <w:p>
+      <w:pPr>
+        <w:pStyle w:val="body_letter"/>
+      </w:pPr>
+      <w:r>
+        <w:rPr>
+          <w:rFonts w:ascii="Arial" w:hAnsi="Arial"/>
+          <w:b w:val="0"/>
+          <w:color w:val="000000"/>
+          <w:sz w:val="19"/>
+        </w:rPr>
+        <w:t>WA has moved into active enforcement mode on short-term rental accommodation, issuing its first infringement notice under the new STRA regime, signalling that the compliance window has closed and operators face real regulatory risk. Simultaneously, the state has announced planning reforms and transit precinct plans, opening advisory opportunities around development approvals and rezoning obligations. The Alternative Electricity Services (AES) framework introduces a new licensing and compliance structure for non-traditional electricity providers, requiring market participants to assess their obligations under the redrawn regime. The Productivity Commission's interim finding that WA's Morrison-era GST carve-up should be reversed adds a material federal-state fiscal dimension that will shape WA budget and infrastructure regulatory settings.</w:t>
+      </w:r>
+    </w:p>
+    <w:p>
+      <w:pPr>
+        <w:pStyle w:val="body_letter"/>
+      </w:pPr>
+      <w:r>
+        <w:rPr>
+          <w:rFonts w:ascii="Arial" w:hAnsi="Arial"/>
+          <w:b/>
+          <w:color w:val="000000"/>
+          <w:sz w:val="19"/>
+        </w:rPr>
+        <w:t>South Australia</w:t>
+      </w:r>
+    </w:p>
+    <w:p>
+      <w:pPr>
+        <w:pStyle w:val="body_letter"/>
+      </w:pPr>
+      <w:r>
+        <w:rPr>
+          <w:rFonts w:ascii="Arial" w:hAnsi="Arial"/>
+          <w:b w:val="0"/>
+          <w:color w:val="000000"/>
+          <w:sz w:val="19"/>
+        </w:rPr>
+        <w:t>SafeWork SA is executing an aggressive enforcement posture: South Australia's first-ever industrial manslaughter charges have been laid, multiple contractors have been fined for fatal and near-fatal workplace incidents (including a $140,000 runaway truck penalty), and a builder has been sanctioned for threatening a safety inspector. Simultaneously, SA has raised the regulatory bar on silica and asbestos exposure, imposing new compliance obligations on construction and mining sector clients that warrant urgent gap assessments. The SA government has formalised its DV royal commission five-year implementation plan, bundled with new alcohol delivery restrictions, opening advisory mandates across licensing, health services, and community sector compliance. The Integrity Care NDIS matter has concluded without legal action, but the case underscores ongoing provider-governance scrutiny relevant to disability sector clients.</w:t>
+      </w:r>
+    </w:p>
+    <w:p>
+      <w:pPr>
+        <w:pStyle w:val="body_letter"/>
+      </w:pPr>
+      <w:r>
+        <w:rPr>
+          <w:rFonts w:ascii="Arial" w:hAnsi="Arial"/>
+          <w:b/>
+          <w:color w:val="000000"/>
+          <w:sz w:val="19"/>
+        </w:rPr>
+        <w:t>Tasmania</w:t>
+      </w:r>
+    </w:p>
+    <w:p>
+      <w:pPr>
+        <w:pStyle w:val="body_letter"/>
+      </w:pPr>
+      <w:r>
+        <w:rPr>
+          <w:rFonts w:ascii="Arial" w:hAnsi="Arial"/>
+          <w:b w:val="0"/>
+          <w:color w:val="000000"/>
+          <w:sz w:val="19"/>
+        </w:rPr>
+        <w:t>Tasmania's regulatory environment is notably active across gambling, resources, and workplace safety. The Legislative Council has launched a formal inquiry into the abandoned cashless pokies card scheme, while the Gaming Commission is publicly warning that proposed new pokies policies will worsen outcomes for problem gamblers, together signalling a contested reform environment with strong advisory demand. Mineral Resources Tasmania is executing a digital overhaul of its mining approvals process in 2026, representing a material compliance transition for resources sector clients requiring regulatory mapping and readiness support. WorkSafe enforcement is escalating, with criminal charges laid against West Coast Council following a worker fatality in Zeehan, and annual enforcement results reveal 5.5 million illegal cigarettes and nearly 30,000 vapes seized, indicating sustained pressure on retail and hospitality compliance. The Residential Parks Bill has passed parliament (new compliance obligations for park operators), the Rushy Lagoon sale inquiry terms of reference have been released, and the Productivity Commission's red-tape-cutting stance is being resisted by CBOS, each opening distinct advisory angles.</w:t>
+      </w:r>
+    </w:p>
+    <w:p>
+      <w:pPr>
+        <w:pStyle w:val="body_letter"/>
+      </w:pPr>
+      <w:r>
+        <w:rPr>
+          <w:rFonts w:ascii="Arial" w:hAnsi="Arial"/>
+          <w:b/>
+          <w:color w:val="000000"/>
+          <w:sz w:val="19"/>
+        </w:rPr>
+        <w:t>Australian Capital Territory</w:t>
+      </w:r>
+    </w:p>
+    <w:p>
+      <w:pPr>
+        <w:pStyle w:val="body_letter"/>
+      </w:pPr>
+      <w:r>
+        <w:rPr>
+          <w:rFonts w:ascii="Arial" w:hAnsi="Arial"/>
+          <w:b w:val="0"/>
+          <w:color w:val="000000"/>
+          <w:sz w:val="19"/>
+        </w:rPr>
+        <w:t>An ACT directorate head and public servant have been referred to police following a five-year investigation into contract interference, marking a significant public sector integrity enforcement action that signals elevated scrutiny of procurement conduct across ACT agencies. A major review of Canberra's gaming sector recommends that clubs receive transition support before further pokies reductions are imposed, presenting compliance pathway and stakeholder advisory opportunities for entities navigating ACT gaming reform. Consultation is open on ACT mental health law reforms, adding to an active territory legislative reform agenda. AI-powered traffic enforcement is drawing public and administrative law scrutiny after a family was issued erroneous double fines, raising ACT government accountability questions around automated decision-making and technology procurement governance.</w:t>
+      </w:r>
+    </w:p>
+    <w:p>
+      <w:pPr>
+        <w:pStyle w:val="body_letter"/>
+      </w:pPr>
+      <w:r>
+        <w:rPr>
+          <w:rFonts w:ascii="Arial" w:hAnsi="Arial"/>
+          <w:b/>
+          <w:color w:val="000000"/>
+          <w:sz w:val="19"/>
+        </w:rPr>
+        <w:t>Northern Territory</w:t>
+      </w:r>
+    </w:p>
+    <w:p>
+      <w:pPr>
+        <w:pStyle w:val="body_letter"/>
+      </w:pPr>
+      <w:r>
+        <w:rPr>
+          <w:rFonts w:ascii="Arial" w:hAnsi="Arial"/>
+          <w:b w:val="0"/>
+          <w:color w:val="000000"/>
+          <w:sz w:val="19"/>
+        </w:rPr>
+        <w:t>The NT government has enacted a significant overhaul of its child protection legislation despite fierce opposition from Aboriginal leaders, the national children's commissioner, and federal intervention calls, creating immediate compliance, advocacy, and advisory mandates for organisations operating in the child and family services sector. The NT EPA is concurrently advancing stricter emissions regulations targeting Santos and Inpex at Darwin's LNG facilities, while Ichthys LNG faces prosecution for under-reporting toxic emissions and tightened harbour oversight, signalling a sustained enforcement uplift in the resources sector. The NT government declined formal investigations into Charles Darwin University and Batchelor Institute amid ongoing governance scandals, substituting KPI accountability frameworks, a decision that raises systemic governance and audit advisory considerations. NT's opposition to Commonwealth green data centre energy demand mandates adds a further regulatory tension with federal clean energy policy.</w:t>
       </w:r>
     </w:p>
     <w:tbl>
@@ -524,7 +2565,7 @@
                           <pic:cNvPicPr/>
                         </pic:nvPicPr>
                         <pic:blipFill>
-                          <a:blip r:embed="rId10"/>
+                          <a:blip r:embed="rId30"/>
                           <a:stretch>
                             <a:fillRect/>
                           </a:stretch>

</xml_diff>

<commit_message>
chore: update regulation hub 2026-09-01
</commit_message>
<xml_diff>
--- a/reg-hub/regulation_fortnightly_brief.docx
+++ b/reg-hub/regulation_fortnightly_brief.docx
@@ -46,7 +46,7 @@
         <w:pStyle w:val="Heading1"/>
       </w:pPr>
       <w:r>
-        <w:t>KPMG Regulatory Transformation Fortnightly Brief - 18-31 August 2026</w:t>
+        <w:t>KPMG Regulatory Transformation Fortnightly Brief - 20 August - 2 September 2026</w:t>
       </w:r>
     </w:p>
     <w:p>
@@ -73,7 +73,7 @@
           <w:color w:val="666666"/>
           <w:sz w:val="19"/>
         </w:rPr>
-        <w:t>31 August 2026</w:t>
+        <w:t>02 September 2026</w:t>
       </w:r>
     </w:p>
     <w:p>
@@ -97,11 +97,11 @@
       <w:r>
         <w:rPr>
           <w:rFonts w:ascii="Arial" w:hAnsi="Arial"/>
-          <w:b w:val="0"/>
-          <w:color w:val="000000"/>
+          <w:i/>
+          <w:color w:val="666666"/>
           <w:sz w:val="19"/>
         </w:rPr>
-        <w:t>This fortnight, transport safety regulators dominate Australia's regulatory landscape, with AMSA advancing cargo securing inspection campaigns, an updated GMDSS Handbook and an expanded medical provider network, CASA consulting on new operational classifications, a WA Rail Safety Bill attracting broad industry and community backing, and NSW Government analysis confirming that targeted enforcement outperforms mandatory insurance schemes on a cost-benefit basis. The standout opportunity for us is the emerging regulatory preference for enforcement prioritisation and risk-based compliance targeting over new legislative mandates, a shift that positions our regulatory intelligence, analytics and transformation capabilities directly where regulators are choosing to invest under fiscal pressure. Convene a cross-sector transport and safety briefing for partners and directors within the next fortnight to map live regulatory reform pipelines across maritime, aviation and rail, and identify which clients face the earliest compliance exposure from AMSA's inspection campaign and CASA's classification review.</w:t>
+        <w:t>[edit before send], Adam's 3-sentence key messages will prefill from the dashboard synthesis on the next fortnightly run. Type your replacement here.</w:t>
       </w:r>
     </w:p>
     <w:p>
@@ -120,670 +120,16 @@
     </w:p>
     <w:p>
       <w:pPr>
-        <w:pStyle w:val="ListBullet"/>
+        <w:pStyle w:val="body_letter"/>
       </w:pPr>
       <w:r>
         <w:rPr>
           <w:rFonts w:ascii="Arial" w:hAnsi="Arial"/>
-          <w:b/>
-          <w:color w:val="000000"/>
+          <w:i/>
+          <w:color w:val="666666"/>
           <w:sz w:val="19"/>
         </w:rPr>
-        <w:t>Australian Securities and Investments Commission</w:t>
-      </w:r>
-      <w:r>
-        <w:rPr>
-          <w:rFonts w:ascii="Arial" w:hAnsi="Arial"/>
-          <w:color w:val="000000"/>
-          <w:sz w:val="19"/>
-        </w:rPr>
-        <w:t xml:space="preserve"> - </w:t>
-      </w:r>
-      <w:r>
-        <w:rPr>
-          <w:rFonts w:ascii="Arial" w:hAnsi="Arial"/>
-          <w:color w:val="000000"/>
-          <w:sz w:val="19"/>
-        </w:rPr>
-        <w:t>ASIC warned home insurers that cash settlement practices must not short-change homeowners, flagging enforcement focus on reducing consumer harm in property insurance claims.</w:t>
-      </w:r>
-      <w:r>
-        <w:rPr>
-          <w:rFonts w:ascii="Arial" w:hAnsi="Arial"/>
-          <w:color w:val="000000"/>
-          <w:sz w:val="19"/>
-        </w:rPr>
-        <w:t xml:space="preserve"> (</w:t>
-      </w:r>
-      <w:hyperlink r:id="rId10">
-        <w:r>
-          <w:rPr>
-            <w:rFonts w:ascii="Arial" w:hAnsi="Arial" w:cs="Arial"/>
-            <w:color w:val="0000FF"/>
-            <w:sz w:val="19"/>
-            <w:szCs w:val="19"/>
-            <w:u w:val="single"/>
-          </w:rPr>
-          <w:t xml:space="preserve">Read more</w:t>
-        </w:r>
-      </w:hyperlink>
-      <w:r>
-        <w:rPr>
-          <w:rFonts w:ascii="Arial" w:hAnsi="Arial"/>
-          <w:color w:val="000000"/>
-          <w:sz w:val="19"/>
-        </w:rPr>
-        <w:t>)</w:t>
-      </w:r>
-    </w:p>
-    <w:p>
-      <w:pPr>
-        <w:pStyle w:val="ListBullet"/>
-      </w:pPr>
-      <w:r>
-        <w:rPr>
-          <w:rFonts w:ascii="Arial" w:hAnsi="Arial"/>
-          <w:b/>
-          <w:color w:val="000000"/>
-          <w:sz w:val="19"/>
-        </w:rPr>
-        <w:t>Australian Transaction Reports and Analysis Centre</w:t>
-      </w:r>
-      <w:r>
-        <w:rPr>
-          <w:rFonts w:ascii="Arial" w:hAnsi="Arial"/>
-          <w:color w:val="000000"/>
-          <w:sz w:val="19"/>
-        </w:rPr>
-        <w:t xml:space="preserve"> - </w:t>
-      </w:r>
-      <w:r>
-        <w:rPr>
-          <w:rFonts w:ascii="Arial" w:hAnsi="Arial"/>
-          <w:color w:val="000000"/>
-          <w:sz w:val="19"/>
-        </w:rPr>
-        <w:t>AUSTRAC commenced issuing compulsory section 167 notices to businesses not enrolled under AML/CTF obligations, escalating enforcement pressure on Tranche 2 entities ahead of the compliance deadline.</w:t>
-      </w:r>
-      <w:r>
-        <w:rPr>
-          <w:rFonts w:ascii="Arial" w:hAnsi="Arial"/>
-          <w:color w:val="000000"/>
-          <w:sz w:val="19"/>
-        </w:rPr>
-        <w:t xml:space="preserve"> (</w:t>
-      </w:r>
-      <w:hyperlink r:id="rId11">
-        <w:r>
-          <w:rPr>
-            <w:rFonts w:ascii="Arial" w:hAnsi="Arial" w:cs="Arial"/>
-            <w:color w:val="0000FF"/>
-            <w:sz w:val="19"/>
-            <w:szCs w:val="19"/>
-            <w:u w:val="single"/>
-          </w:rPr>
-          <w:t xml:space="preserve">Read more</w:t>
-        </w:r>
-      </w:hyperlink>
-      <w:r>
-        <w:rPr>
-          <w:rFonts w:ascii="Arial" w:hAnsi="Arial"/>
-          <w:color w:val="000000"/>
-          <w:sz w:val="19"/>
-        </w:rPr>
-        <w:t>)</w:t>
-      </w:r>
-    </w:p>
-    <w:p>
-      <w:pPr>
-        <w:pStyle w:val="ListBullet"/>
-      </w:pPr>
-      <w:r>
-        <w:rPr>
-          <w:rFonts w:ascii="Arial" w:hAnsi="Arial"/>
-          <w:b/>
-          <w:color w:val="000000"/>
-          <w:sz w:val="19"/>
-        </w:rPr>
-        <w:t>Tertiary Education Quality and Standards Agency</w:t>
-      </w:r>
-      <w:r>
-        <w:rPr>
-          <w:rFonts w:ascii="Arial" w:hAnsi="Arial"/>
-          <w:color w:val="000000"/>
-          <w:sz w:val="19"/>
-        </w:rPr>
-        <w:t xml:space="preserve"> - </w:t>
-      </w:r>
-      <w:r>
-        <w:rPr>
-          <w:rFonts w:ascii="Arial" w:hAnsi="Arial"/>
-          <w:color w:val="000000"/>
-          <w:sz w:val="19"/>
-        </w:rPr>
-        <w:t>TEQSA published its 2026-30 Corporate Plan, signalling its strategic priorities and regulatory focus areas for the higher education sector over the next four years.</w:t>
-      </w:r>
-      <w:r>
-        <w:rPr>
-          <w:rFonts w:ascii="Arial" w:hAnsi="Arial"/>
-          <w:color w:val="000000"/>
-          <w:sz w:val="19"/>
-        </w:rPr>
-        <w:t xml:space="preserve"> (</w:t>
-      </w:r>
-      <w:hyperlink r:id="rId12">
-        <w:r>
-          <w:rPr>
-            <w:rFonts w:ascii="Arial" w:hAnsi="Arial" w:cs="Arial"/>
-            <w:color w:val="0000FF"/>
-            <w:sz w:val="19"/>
-            <w:szCs w:val="19"/>
-            <w:u w:val="single"/>
-          </w:rPr>
-          <w:t xml:space="preserve">Read more</w:t>
-        </w:r>
-      </w:hyperlink>
-      <w:r>
-        <w:rPr>
-          <w:rFonts w:ascii="Arial" w:hAnsi="Arial"/>
-          <w:color w:val="000000"/>
-          <w:sz w:val="19"/>
-        </w:rPr>
-        <w:t>)</w:t>
-      </w:r>
-    </w:p>
-    <w:p>
-      <w:pPr>
-        <w:pStyle w:val="ListBullet"/>
-      </w:pPr>
-      <w:r>
-        <w:rPr>
-          <w:rFonts w:ascii="Arial" w:hAnsi="Arial"/>
-          <w:b/>
-          <w:color w:val="000000"/>
-          <w:sz w:val="19"/>
-        </w:rPr>
-        <w:t>Australian Public Service Commission</w:t>
-      </w:r>
-      <w:r>
-        <w:rPr>
-          <w:rFonts w:ascii="Arial" w:hAnsi="Arial"/>
-          <w:color w:val="000000"/>
-          <w:sz w:val="19"/>
-        </w:rPr>
-        <w:t xml:space="preserve"> - </w:t>
-      </w:r>
-      <w:r>
-        <w:rPr>
-          <w:rFonts w:ascii="Arial" w:hAnsi="Arial"/>
-          <w:color w:val="000000"/>
-          <w:sz w:val="19"/>
-        </w:rPr>
-        <w:t>APSC published its Corporate Plan 2026-27, setting out workforce capability and integrity priorities for the Australian Public Service in the coming year.</w:t>
-      </w:r>
-      <w:r>
-        <w:rPr>
-          <w:rFonts w:ascii="Arial" w:hAnsi="Arial"/>
-          <w:color w:val="000000"/>
-          <w:sz w:val="19"/>
-        </w:rPr>
-        <w:t xml:space="preserve"> (</w:t>
-      </w:r>
-      <w:hyperlink r:id="rId13">
-        <w:r>
-          <w:rPr>
-            <w:rFonts w:ascii="Arial" w:hAnsi="Arial" w:cs="Arial"/>
-            <w:color w:val="0000FF"/>
-            <w:sz w:val="19"/>
-            <w:szCs w:val="19"/>
-            <w:u w:val="single"/>
-          </w:rPr>
-          <w:t xml:space="preserve">Read more</w:t>
-        </w:r>
-      </w:hyperlink>
-      <w:r>
-        <w:rPr>
-          <w:rFonts w:ascii="Arial" w:hAnsi="Arial"/>
-          <w:color w:val="000000"/>
-          <w:sz w:val="19"/>
-        </w:rPr>
-        <w:t>)</w:t>
-      </w:r>
-    </w:p>
-    <w:p>
-      <w:pPr>
-        <w:pStyle w:val="ListBullet"/>
-      </w:pPr>
-      <w:r>
-        <w:rPr>
-          <w:rFonts w:ascii="Arial" w:hAnsi="Arial"/>
-          <w:b/>
-          <w:color w:val="000000"/>
-          <w:sz w:val="19"/>
-        </w:rPr>
-        <w:t>Department of Finance</w:t>
-      </w:r>
-      <w:r>
-        <w:rPr>
-          <w:rFonts w:ascii="Arial" w:hAnsi="Arial"/>
-          <w:color w:val="000000"/>
-          <w:sz w:val="19"/>
-        </w:rPr>
-        <w:t xml:space="preserve"> - </w:t>
-      </w:r>
-      <w:r>
-        <w:rPr>
-          <w:rFonts w:ascii="Arial" w:hAnsi="Arial"/>
-          <w:color w:val="000000"/>
-          <w:sz w:val="19"/>
-        </w:rPr>
-        <w:t>The Department of Finance convened the Australian Government Data Forum to address barriers to data sharing and integration across the public sector, signalling a renewed policy push on cross-agency…</w:t>
-      </w:r>
-      <w:r>
-        <w:rPr>
-          <w:rFonts w:ascii="Arial" w:hAnsi="Arial"/>
-          <w:color w:val="000000"/>
-          <w:sz w:val="19"/>
-        </w:rPr>
-        <w:t xml:space="preserve"> (</w:t>
-      </w:r>
-      <w:hyperlink r:id="rId14">
-        <w:r>
-          <w:rPr>
-            <w:rFonts w:ascii="Arial" w:hAnsi="Arial" w:cs="Arial"/>
-            <w:color w:val="0000FF"/>
-            <w:sz w:val="19"/>
-            <w:szCs w:val="19"/>
-            <w:u w:val="single"/>
-          </w:rPr>
-          <w:t xml:space="preserve">Read more</w:t>
-        </w:r>
-      </w:hyperlink>
-      <w:r>
-        <w:rPr>
-          <w:rFonts w:ascii="Arial" w:hAnsi="Arial"/>
-          <w:color w:val="000000"/>
-          <w:sz w:val="19"/>
-        </w:rPr>
-        <w:t>)</w:t>
-      </w:r>
-    </w:p>
-    <w:p>
-      <w:pPr>
-        <w:pStyle w:val="ListBullet"/>
-      </w:pPr>
-      <w:r>
-        <w:rPr>
-          <w:rFonts w:ascii="Arial" w:hAnsi="Arial"/>
-          <w:b/>
-          <w:color w:val="000000"/>
-          <w:sz w:val="19"/>
-        </w:rPr>
-        <w:t>Australian Financial Security Authority</w:t>
-      </w:r>
-      <w:r>
-        <w:rPr>
-          <w:rFonts w:ascii="Arial" w:hAnsi="Arial"/>
-          <w:color w:val="000000"/>
-          <w:sz w:val="19"/>
-        </w:rPr>
-        <w:t xml:space="preserve"> - </w:t>
-      </w:r>
-      <w:r>
-        <w:rPr>
-          <w:rFonts w:ascii="Arial" w:hAnsi="Arial"/>
-          <w:color w:val="000000"/>
-          <w:sz w:val="19"/>
-        </w:rPr>
-        <w:t>AFSA released its August 2026 Personal Insolvency Register newsletter, providing updated guidance and enforcement insights for practitioners operating in the personal insolvency space.</w:t>
-      </w:r>
-      <w:r>
-        <w:rPr>
-          <w:rFonts w:ascii="Arial" w:hAnsi="Arial"/>
-          <w:color w:val="000000"/>
-          <w:sz w:val="19"/>
-        </w:rPr>
-        <w:t xml:space="preserve"> (</w:t>
-      </w:r>
-      <w:hyperlink r:id="rId15">
-        <w:r>
-          <w:rPr>
-            <w:rFonts w:ascii="Arial" w:hAnsi="Arial" w:cs="Arial"/>
-            <w:color w:val="0000FF"/>
-            <w:sz w:val="19"/>
-            <w:szCs w:val="19"/>
-            <w:u w:val="single"/>
-          </w:rPr>
-          <w:t xml:space="preserve">Read more</w:t>
-        </w:r>
-      </w:hyperlink>
-      <w:r>
-        <w:rPr>
-          <w:rFonts w:ascii="Arial" w:hAnsi="Arial"/>
-          <w:color w:val="000000"/>
-          <w:sz w:val="19"/>
-        </w:rPr>
-        <w:t>)</w:t>
-      </w:r>
-    </w:p>
-    <w:p>
-      <w:pPr>
-        <w:pStyle w:val="ListBullet"/>
-      </w:pPr>
-      <w:r>
-        <w:rPr>
-          <w:rFonts w:ascii="Arial" w:hAnsi="Arial"/>
-          <w:b/>
-          <w:color w:val="000000"/>
-          <w:sz w:val="19"/>
-        </w:rPr>
-        <w:t>Australian Competition and Consumer Commission</w:t>
-      </w:r>
-      <w:r>
-        <w:rPr>
-          <w:rFonts w:ascii="Arial" w:hAnsi="Arial"/>
-          <w:color w:val="000000"/>
-          <w:sz w:val="19"/>
-        </w:rPr>
-        <w:t xml:space="preserve"> - </w:t>
-      </w:r>
-      <w:r>
-        <w:rPr>
-          <w:rFonts w:ascii="Arial" w:hAnsi="Arial"/>
-          <w:color w:val="000000"/>
-          <w:sz w:val="19"/>
-        </w:rPr>
-        <w:t>ACCC pursued right to repair enforcement action in the automotive sector, drawing support from the Motor Trades Association of Australia and intensifying scrutiny on manufacturers restricting repair…</w:t>
-      </w:r>
-    </w:p>
-    <w:p>
-      <w:pPr>
-        <w:pStyle w:val="ListBullet"/>
-      </w:pPr>
-      <w:r>
-        <w:rPr>
-          <w:rFonts w:ascii="Arial" w:hAnsi="Arial"/>
-          <w:b/>
-          <w:color w:val="000000"/>
-          <w:sz w:val="19"/>
-        </w:rPr>
-        <w:t>eSafety Commissioner</w:t>
-      </w:r>
-      <w:r>
-        <w:rPr>
-          <w:rFonts w:ascii="Arial" w:hAnsi="Arial"/>
-          <w:color w:val="000000"/>
-          <w:sz w:val="19"/>
-        </w:rPr>
-        <w:t xml:space="preserve"> - </w:t>
-      </w:r>
-      <w:r>
-        <w:rPr>
-          <w:rFonts w:ascii="Arial" w:hAnsi="Arial"/>
-          <w:color w:val="000000"/>
-          <w:sz w:val="19"/>
-        </w:rPr>
-        <w:t>eSafety Commissioner warned that AI-enabled smart glasses pose compounding online safety harms, flagging the need for proactive regulatory and industry responses to emerging surveillance risks.</w:t>
-      </w:r>
-      <w:r>
-        <w:rPr>
-          <w:rFonts w:ascii="Arial" w:hAnsi="Arial"/>
-          <w:color w:val="000000"/>
-          <w:sz w:val="19"/>
-        </w:rPr>
-        <w:t xml:space="preserve"> (</w:t>
-      </w:r>
-      <w:hyperlink r:id="rId16">
-        <w:r>
-          <w:rPr>
-            <w:rFonts w:ascii="Arial" w:hAnsi="Arial" w:cs="Arial"/>
-            <w:color w:val="0000FF"/>
-            <w:sz w:val="19"/>
-            <w:szCs w:val="19"/>
-            <w:u w:val="single"/>
-          </w:rPr>
-          <w:t xml:space="preserve">Read more</w:t>
-        </w:r>
-      </w:hyperlink>
-      <w:r>
-        <w:rPr>
-          <w:rFonts w:ascii="Arial" w:hAnsi="Arial"/>
-          <w:color w:val="000000"/>
-          <w:sz w:val="19"/>
-        </w:rPr>
-        <w:t>)</w:t>
-      </w:r>
-    </w:p>
-    <w:p>
-      <w:pPr>
-        <w:pStyle w:val="ListBullet"/>
-      </w:pPr>
-      <w:r>
-        <w:rPr>
-          <w:rFonts w:ascii="Arial" w:hAnsi="Arial"/>
-          <w:b/>
-          <w:color w:val="000000"/>
-          <w:sz w:val="19"/>
-        </w:rPr>
-        <w:t>Independent Commission Against Corruption</w:t>
-      </w:r>
-      <w:r>
-        <w:rPr>
-          <w:rFonts w:ascii="Arial" w:hAnsi="Arial"/>
-          <w:color w:val="000000"/>
-          <w:sz w:val="19"/>
-        </w:rPr>
-        <w:t xml:space="preserve"> - </w:t>
-      </w:r>
-      <w:r>
-        <w:rPr>
-          <w:rFonts w:ascii="Arial" w:hAnsi="Arial"/>
-          <w:color w:val="000000"/>
-          <w:sz w:val="19"/>
-        </w:rPr>
-        <w:t>ICAC found a NSW Health worker corrupt and heard evidence from the former NSW Building Commissioner detailing a year of alleged shakedowns, underscoring active integrity enforcement across…</w:t>
-      </w:r>
-      <w:r>
-        <w:rPr>
-          <w:rFonts w:ascii="Arial" w:hAnsi="Arial"/>
-          <w:color w:val="000000"/>
-          <w:sz w:val="19"/>
-        </w:rPr>
-        <w:t xml:space="preserve"> (</w:t>
-      </w:r>
-      <w:hyperlink r:id="rId17">
-        <w:r>
-          <w:rPr>
-            <w:rFonts w:ascii="Arial" w:hAnsi="Arial" w:cs="Arial"/>
-            <w:color w:val="0000FF"/>
-            <w:sz w:val="19"/>
-            <w:szCs w:val="19"/>
-            <w:u w:val="single"/>
-          </w:rPr>
-          <w:t xml:space="preserve">Read more</w:t>
-        </w:r>
-      </w:hyperlink>
-      <w:r>
-        <w:rPr>
-          <w:rFonts w:ascii="Arial" w:hAnsi="Arial"/>
-          <w:color w:val="000000"/>
-          <w:sz w:val="19"/>
-        </w:rPr>
-        <w:t>)</w:t>
-      </w:r>
-    </w:p>
-    <w:p>
-      <w:pPr>
-        <w:pStyle w:val="ListBullet"/>
-      </w:pPr>
-      <w:r>
-        <w:rPr>
-          <w:rFonts w:ascii="Arial" w:hAnsi="Arial"/>
-          <w:b/>
-          <w:color w:val="000000"/>
-          <w:sz w:val="19"/>
-        </w:rPr>
-        <w:t>Department of Health, Disability and Ageing</w:t>
-      </w:r>
-      <w:r>
-        <w:rPr>
-          <w:rFonts w:ascii="Arial" w:hAnsi="Arial"/>
-          <w:color w:val="000000"/>
-          <w:sz w:val="19"/>
-        </w:rPr>
-        <w:t xml:space="preserve"> - </w:t>
-      </w:r>
-      <w:r>
-        <w:rPr>
-          <w:rFonts w:ascii="Arial" w:hAnsi="Arial"/>
-          <w:color w:val="000000"/>
-          <w:sz w:val="19"/>
-        </w:rPr>
-        <w:t>The Department of Health, Disability and Ageing opened public consultation on proposed changes to NDIS access criteria, inviting stakeholder input on reforms that could affect eligibility for…</w:t>
-      </w:r>
-      <w:r>
-        <w:rPr>
-          <w:rFonts w:ascii="Arial" w:hAnsi="Arial"/>
-          <w:color w:val="000000"/>
-          <w:sz w:val="19"/>
-        </w:rPr>
-        <w:t xml:space="preserve"> (</w:t>
-      </w:r>
-      <w:hyperlink r:id="rId18">
-        <w:r>
-          <w:rPr>
-            <w:rFonts w:ascii="Arial" w:hAnsi="Arial" w:cs="Arial"/>
-            <w:color w:val="0000FF"/>
-            <w:sz w:val="19"/>
-            <w:szCs w:val="19"/>
-            <w:u w:val="single"/>
-          </w:rPr>
-          <w:t xml:space="preserve">Read more</w:t>
-        </w:r>
-      </w:hyperlink>
-      <w:r>
-        <w:rPr>
-          <w:rFonts w:ascii="Arial" w:hAnsi="Arial"/>
-          <w:color w:val="000000"/>
-          <w:sz w:val="19"/>
-        </w:rPr>
-        <w:t>)</w:t>
-      </w:r>
-    </w:p>
-    <w:p>
-      <w:pPr>
-        <w:pStyle w:val="ListBullet"/>
-      </w:pPr>
-      <w:r>
-        <w:rPr>
-          <w:rFonts w:ascii="Arial" w:hAnsi="Arial"/>
-          <w:b/>
-          <w:color w:val="000000"/>
-          <w:sz w:val="19"/>
-        </w:rPr>
-        <w:t>Australian Border Force</w:t>
-      </w:r>
-      <w:r>
-        <w:rPr>
-          <w:rFonts w:ascii="Arial" w:hAnsi="Arial"/>
-          <w:color w:val="000000"/>
-          <w:sz w:val="19"/>
-        </w:rPr>
-        <w:t xml:space="preserve"> - </w:t>
-      </w:r>
-      <w:r>
-        <w:rPr>
-          <w:rFonts w:ascii="Arial" w:hAnsi="Arial"/>
-          <w:color w:val="000000"/>
-          <w:sz w:val="19"/>
-        </w:rPr>
-        <w:t>Australian Border Force seized millions of dollars in illicit cigarettes and restrained criminal assets as part of a coordinated enforcement action targeting a transnational illicit tobacco network.</w:t>
-      </w:r>
-      <w:r>
-        <w:rPr>
-          <w:rFonts w:ascii="Arial" w:hAnsi="Arial"/>
-          <w:color w:val="000000"/>
-          <w:sz w:val="19"/>
-        </w:rPr>
-        <w:t xml:space="preserve"> (</w:t>
-      </w:r>
-      <w:hyperlink r:id="rId19">
-        <w:r>
-          <w:rPr>
-            <w:rFonts w:ascii="Arial" w:hAnsi="Arial" w:cs="Arial"/>
-            <w:color w:val="0000FF"/>
-            <w:sz w:val="19"/>
-            <w:szCs w:val="19"/>
-            <w:u w:val="single"/>
-          </w:rPr>
-          <w:t xml:space="preserve">Read more</w:t>
-        </w:r>
-      </w:hyperlink>
-      <w:r>
-        <w:rPr>
-          <w:rFonts w:ascii="Arial" w:hAnsi="Arial"/>
-          <w:color w:val="000000"/>
-          <w:sz w:val="19"/>
-        </w:rPr>
-        <w:t>)</w:t>
-      </w:r>
-    </w:p>
-    <w:p>
-      <w:pPr>
-        <w:pStyle w:val="ListBullet"/>
-      </w:pPr>
-      <w:r>
-        <w:rPr>
-          <w:rFonts w:ascii="Arial" w:hAnsi="Arial"/>
-          <w:b/>
-          <w:color w:val="000000"/>
-          <w:sz w:val="19"/>
-        </w:rPr>
-        <w:t>Australian Communications and Media Authority</w:t>
-      </w:r>
-      <w:r>
-        <w:rPr>
-          <w:rFonts w:ascii="Arial" w:hAnsi="Arial"/>
-          <w:color w:val="000000"/>
-          <w:sz w:val="19"/>
-        </w:rPr>
-        <w:t xml:space="preserve"> - </w:t>
-      </w:r>
-      <w:r>
-        <w:rPr>
-          <w:rFonts w:ascii="Arial" w:hAnsi="Arial"/>
-          <w:color w:val="000000"/>
-          <w:sz w:val="19"/>
-        </w:rPr>
-        <w:t>ACMA published new research segmenting Australian news consumers by habits and trust levels, informing the regulator's ongoing work on media diversity and misinformation policy.</w:t>
-      </w:r>
-      <w:r>
-        <w:rPr>
-          <w:rFonts w:ascii="Arial" w:hAnsi="Arial"/>
-          <w:color w:val="000000"/>
-          <w:sz w:val="19"/>
-        </w:rPr>
-        <w:t xml:space="preserve"> (</w:t>
-      </w:r>
-      <w:hyperlink r:id="rId20">
-        <w:r>
-          <w:rPr>
-            <w:rFonts w:ascii="Arial" w:hAnsi="Arial" w:cs="Arial"/>
-            <w:color w:val="0000FF"/>
-            <w:sz w:val="19"/>
-            <w:szCs w:val="19"/>
-            <w:u w:val="single"/>
-          </w:rPr>
-          <w:t xml:space="preserve">Read more</w:t>
-        </w:r>
-      </w:hyperlink>
-      <w:r>
-        <w:rPr>
-          <w:rFonts w:ascii="Arial" w:hAnsi="Arial"/>
-          <w:color w:val="000000"/>
-          <w:sz w:val="19"/>
-        </w:rPr>
-        <w:t>)</w:t>
+        <w:t>No regulator-in-news signal this fortnight, see Themes below.</w:t>
       </w:r>
     </w:p>
     <w:p>
@@ -807,337 +153,11 @@
       <w:r>
         <w:rPr>
           <w:rFonts w:ascii="Arial" w:hAnsi="Arial"/>
-          <w:b/>
-          <w:color w:val="000000"/>
+          <w:i/>
+          <w:color w:val="666666"/>
           <w:sz w:val="19"/>
         </w:rPr>
-        <w:t>Victoria</w:t>
-      </w:r>
-    </w:p>
-    <w:p>
-      <w:pPr>
-        <w:pStyle w:val="ListBullet"/>
-      </w:pPr>
-      <w:r>
-        <w:rPr>
-          <w:rFonts w:ascii="Arial" w:hAnsi="Arial"/>
-          <w:b/>
-          <w:color w:val="000000"/>
-          <w:sz w:val="19"/>
-        </w:rPr>
-        <w:t>Environment Protection Authority Victoria</w:t>
-      </w:r>
-      <w:r>
-        <w:rPr>
-          <w:rFonts w:ascii="Arial" w:hAnsi="Arial"/>
-          <w:color w:val="000000"/>
-          <w:sz w:val="19"/>
-        </w:rPr>
-        <w:t xml:space="preserve"> - </w:t>
-      </w:r>
-      <w:r>
-        <w:rPr>
-          <w:rFonts w:ascii="Arial" w:hAnsi="Arial"/>
-          <w:color w:val="000000"/>
-          <w:sz w:val="19"/>
-        </w:rPr>
-        <w:t>EPA Annual Delivery Plan 2026-27 Published</w:t>
-      </w:r>
-    </w:p>
-    <w:p>
-      <w:pPr>
-        <w:pStyle w:val="ListBullet"/>
-      </w:pPr>
-      <w:r>
-        <w:rPr>
-          <w:rFonts w:ascii="Arial" w:hAnsi="Arial"/>
-          <w:b/>
-          <w:color w:val="000000"/>
-          <w:sz w:val="19"/>
-        </w:rPr>
-        <w:t>Environment Protection Authority Victoria</w:t>
-      </w:r>
-      <w:r>
-        <w:rPr>
-          <w:rFonts w:ascii="Arial" w:hAnsi="Arial"/>
-          <w:color w:val="000000"/>
-          <w:sz w:val="19"/>
-        </w:rPr>
-        <w:t xml:space="preserve"> - </w:t>
-      </w:r>
-      <w:r>
-        <w:rPr>
-          <w:rFonts w:ascii="Arial" w:hAnsi="Arial"/>
-          <w:color w:val="000000"/>
-          <w:sz w:val="19"/>
-        </w:rPr>
-        <w:t>SenSen Wins EPA Acoustic Camera Contract</w:t>
-      </w:r>
-    </w:p>
-    <w:p>
-      <w:pPr>
-        <w:pStyle w:val="ListBullet"/>
-      </w:pPr>
-      <w:r>
-        <w:rPr>
-          <w:rFonts w:ascii="Arial" w:hAnsi="Arial"/>
-          <w:b/>
-          <w:color w:val="000000"/>
-          <w:sz w:val="19"/>
-        </w:rPr>
-        <w:t>Victorian WorkCover Authority (WorkSafe Victoria)</w:t>
-      </w:r>
-      <w:r>
-        <w:rPr>
-          <w:rFonts w:ascii="Arial" w:hAnsi="Arial"/>
-          <w:color w:val="000000"/>
-          <w:sz w:val="19"/>
-        </w:rPr>
-        <w:t xml:space="preserve"> - </w:t>
-      </w:r>
-      <w:r>
-        <w:rPr>
-          <w:rFonts w:ascii="Arial" w:hAnsi="Arial"/>
-          <w:color w:val="000000"/>
-          <w:sz w:val="19"/>
-        </w:rPr>
-        <w:t>WorkSafe Reviews CFA Fleet Safety</w:t>
-      </w:r>
-    </w:p>
-    <w:p>
-      <w:pPr>
-        <w:pStyle w:val="body_letter"/>
-      </w:pPr>
-      <w:r>
-        <w:rPr>
-          <w:rFonts w:ascii="Arial" w:hAnsi="Arial"/>
-          <w:b/>
-          <w:color w:val="000000"/>
-          <w:sz w:val="19"/>
-        </w:rPr>
-        <w:t>Commonwealth</w:t>
-      </w:r>
-    </w:p>
-    <w:p>
-      <w:pPr>
-        <w:pStyle w:val="ListBullet"/>
-      </w:pPr>
-      <w:r>
-        <w:rPr>
-          <w:rFonts w:ascii="Arial" w:hAnsi="Arial"/>
-          <w:b/>
-          <w:color w:val="000000"/>
-          <w:sz w:val="19"/>
-        </w:rPr>
-        <w:t>Australian Securities and Investments Commission</w:t>
-      </w:r>
-      <w:r>
-        <w:rPr>
-          <w:rFonts w:ascii="Arial" w:hAnsi="Arial"/>
-          <w:color w:val="000000"/>
-          <w:sz w:val="19"/>
-        </w:rPr>
-        <w:t xml:space="preserve"> - </w:t>
-      </w:r>
-      <w:r>
-        <w:rPr>
-          <w:rFonts w:ascii="Arial" w:hAnsi="Arial"/>
-          <w:color w:val="000000"/>
-          <w:sz w:val="19"/>
-        </w:rPr>
-        <w:t>ASIC Signals Recalibrated Enforcement Posture</w:t>
-      </w:r>
-    </w:p>
-    <w:p>
-      <w:pPr>
-        <w:pStyle w:val="ListBullet"/>
-      </w:pPr>
-      <w:r>
-        <w:rPr>
-          <w:rFonts w:ascii="Arial" w:hAnsi="Arial"/>
-          <w:b/>
-          <w:color w:val="000000"/>
-          <w:sz w:val="19"/>
-        </w:rPr>
-        <w:t>Australian Energy Regulator</w:t>
-      </w:r>
-      <w:r>
-        <w:rPr>
-          <w:rFonts w:ascii="Arial" w:hAnsi="Arial"/>
-          <w:color w:val="000000"/>
-          <w:sz w:val="19"/>
-        </w:rPr>
-        <w:t xml:space="preserve"> - </w:t>
-      </w:r>
-      <w:r>
-        <w:rPr>
-          <w:rFonts w:ascii="Arial" w:hAnsi="Arial"/>
-          <w:color w:val="000000"/>
-          <w:sz w:val="19"/>
-        </w:rPr>
-        <w:t>AER Publishes New Strategic Plan</w:t>
-      </w:r>
-    </w:p>
-    <w:p>
-      <w:pPr>
-        <w:pStyle w:val="ListBullet"/>
-      </w:pPr>
-      <w:r>
-        <w:rPr>
-          <w:rFonts w:ascii="Arial" w:hAnsi="Arial"/>
-          <w:b/>
-          <w:color w:val="000000"/>
-          <w:sz w:val="19"/>
-        </w:rPr>
-        <w:t>Department of Defence</w:t>
-      </w:r>
-      <w:r>
-        <w:rPr>
-          <w:rFonts w:ascii="Arial" w:hAnsi="Arial"/>
-          <w:color w:val="000000"/>
-          <w:sz w:val="19"/>
-        </w:rPr>
-        <w:t xml:space="preserve"> - </w:t>
-      </w:r>
-      <w:r>
-        <w:rPr>
-          <w:rFonts w:ascii="Arial" w:hAnsi="Arial"/>
-          <w:color w:val="000000"/>
-          <w:sz w:val="19"/>
-        </w:rPr>
-        <w:t>Defence Axes 26-Year Contract</w:t>
-      </w:r>
-    </w:p>
-    <w:p>
-      <w:pPr>
-        <w:pStyle w:val="body_letter"/>
-      </w:pPr>
-      <w:r>
-        <w:rPr>
-          <w:rFonts w:ascii="Arial" w:hAnsi="Arial"/>
-          <w:b/>
-          <w:color w:val="000000"/>
-          <w:sz w:val="19"/>
-        </w:rPr>
-        <w:t>New South Wales</w:t>
-      </w:r>
-    </w:p>
-    <w:p>
-      <w:pPr>
-        <w:pStyle w:val="ListBullet"/>
-      </w:pPr>
-      <w:r>
-        <w:rPr>
-          <w:rFonts w:ascii="Arial" w:hAnsi="Arial"/>
-          <w:b/>
-          <w:color w:val="000000"/>
-          <w:sz w:val="19"/>
-        </w:rPr>
-        <w:t>Independent Commission Against Corruption</w:t>
-      </w:r>
-      <w:r>
-        <w:rPr>
-          <w:rFonts w:ascii="Arial" w:hAnsi="Arial"/>
-          <w:color w:val="000000"/>
-          <w:sz w:val="19"/>
-        </w:rPr>
-        <w:t xml:space="preserve"> - </w:t>
-      </w:r>
-      <w:r>
-        <w:rPr>
-          <w:rFonts w:ascii="Arial" w:hAnsi="Arial"/>
-          <w:color w:val="000000"/>
-          <w:sz w:val="19"/>
-        </w:rPr>
-        <w:t>ICAC finds NSW Health worker corrupt</w:t>
-      </w:r>
-      <w:r>
-        <w:rPr>
-          <w:rFonts w:ascii="Arial" w:hAnsi="Arial"/>
-          <w:color w:val="000000"/>
-          <w:sz w:val="19"/>
-        </w:rPr>
-        <w:t xml:space="preserve"> (</w:t>
-      </w:r>
-      <w:hyperlink r:id="rId17">
-        <w:r>
-          <w:rPr>
-            <w:rFonts w:ascii="Arial" w:hAnsi="Arial" w:cs="Arial"/>
-            <w:color w:val="0000FF"/>
-            <w:sz w:val="19"/>
-            <w:szCs w:val="19"/>
-            <w:u w:val="single"/>
-          </w:rPr>
-          <w:t xml:space="preserve">Read more</w:t>
-        </w:r>
-      </w:hyperlink>
-      <w:r>
-        <w:rPr>
-          <w:rFonts w:ascii="Arial" w:hAnsi="Arial"/>
-          <w:color w:val="000000"/>
-          <w:sz w:val="19"/>
-        </w:rPr>
-        <w:t>)</w:t>
-      </w:r>
-    </w:p>
-    <w:p>
-      <w:pPr>
-        <w:pStyle w:val="ListBullet"/>
-      </w:pPr>
-      <w:r>
-        <w:rPr>
-          <w:rFonts w:ascii="Arial" w:hAnsi="Arial"/>
-          <w:b/>
-          <w:color w:val="000000"/>
-          <w:sz w:val="19"/>
-        </w:rPr>
-        <w:t>Independent Commission Against Corruption</w:t>
-      </w:r>
-      <w:r>
-        <w:rPr>
-          <w:rFonts w:ascii="Arial" w:hAnsi="Arial"/>
-          <w:color w:val="000000"/>
-          <w:sz w:val="19"/>
-        </w:rPr>
-        <w:t xml:space="preserve"> - </w:t>
-      </w:r>
-      <w:r>
-        <w:rPr>
-          <w:rFonts w:ascii="Arial" w:hAnsi="Arial"/>
-          <w:color w:val="000000"/>
-          <w:sz w:val="19"/>
-        </w:rPr>
-        <w:t>Building Commissioner Details Shakedown Claims</w:t>
-      </w:r>
-    </w:p>
-    <w:p>
-      <w:pPr>
-        <w:pStyle w:val="ListBullet"/>
-      </w:pPr>
-      <w:r>
-        <w:rPr>
-          <w:rFonts w:ascii="Arial" w:hAnsi="Arial"/>
-          <w:b/>
-          <w:color w:val="000000"/>
-          <w:sz w:val="19"/>
-        </w:rPr>
-        <w:t>Independent Commission Against Corruption</w:t>
-      </w:r>
-      <w:r>
-        <w:rPr>
-          <w:rFonts w:ascii="Arial" w:hAnsi="Arial"/>
-          <w:color w:val="000000"/>
-          <w:sz w:val="19"/>
-        </w:rPr>
-        <w:t xml:space="preserve"> - </w:t>
-      </w:r>
-      <w:r>
-        <w:rPr>
-          <w:rFonts w:ascii="Arial" w:hAnsi="Arial"/>
-          <w:color w:val="000000"/>
-          <w:sz w:val="19"/>
-        </w:rPr>
-        <w:t>Perrottet Texts Aired at ICAC Hearings</w:t>
+        <w:t>No client-in-news signal this fortnight across any jurisdiction.</w:t>
       </w:r>
     </w:p>
     <w:p>
@@ -1226,234 +246,16 @@
     </w:p>
     <w:p>
       <w:pPr>
-        <w:pStyle w:val="ListBullet"/>
+        <w:pStyle w:val="body_letter"/>
       </w:pPr>
       <w:r>
         <w:rPr>
           <w:rFonts w:ascii="Arial" w:hAnsi="Arial"/>
-          <w:b/>
-          <w:color w:val="000000"/>
+          <w:i/>
+          <w:color w:val="666666"/>
           <w:sz w:val="19"/>
         </w:rPr>
-        <w:t>AMSA Annual Regulatory Program 2026-27</w:t>
-      </w:r>
-      <w:r>
-        <w:rPr>
-          <w:rFonts w:ascii="Arial" w:hAnsi="Arial"/>
-          <w:color w:val="000000"/>
-          <w:sz w:val="19"/>
-        </w:rPr>
-        <w:t xml:space="preserve"> - </w:t>
-      </w:r>
-      <w:r>
-        <w:rPr>
-          <w:rFonts w:ascii="Arial" w:hAnsi="Arial"/>
-          <w:color w:val="000000"/>
-          <w:sz w:val="19"/>
-        </w:rPr>
-        <w:t>AMSA has published its Annual Regulatory Program for 2026-27, identifying maritime risk priorities and setting out the compliance and enforcement activities the authority will pursue across the…</w:t>
-      </w:r>
-      <w:r>
-        <w:rPr>
-          <w:rFonts w:ascii="Arial" w:hAnsi="Arial"/>
-          <w:color w:val="000000"/>
-          <w:sz w:val="19"/>
-        </w:rPr>
-        <w:t xml:space="preserve"> (</w:t>
-      </w:r>
-      <w:hyperlink r:id="rId21">
-        <w:r>
-          <w:rPr>
-            <w:rFonts w:ascii="Arial" w:hAnsi="Arial" w:cs="Arial"/>
-            <w:color w:val="0000FF"/>
-            <w:sz w:val="19"/>
-            <w:szCs w:val="19"/>
-            <w:u w:val="single"/>
-          </w:rPr>
-          <w:t xml:space="preserve">Read more</w:t>
-        </w:r>
-      </w:hyperlink>
-      <w:r>
-        <w:rPr>
-          <w:rFonts w:ascii="Arial" w:hAnsi="Arial"/>
-          <w:color w:val="000000"/>
-          <w:sz w:val="19"/>
-        </w:rPr>
-        <w:t>)</w:t>
-      </w:r>
-    </w:p>
-    <w:p>
-      <w:pPr>
-        <w:pStyle w:val="ListBullet"/>
-      </w:pPr>
-      <w:r>
-        <w:rPr>
-          <w:rFonts w:ascii="Arial" w:hAnsi="Arial"/>
-          <w:b/>
-          <w:color w:val="000000"/>
-          <w:sz w:val="19"/>
-        </w:rPr>
-        <w:t>Almost 60 vessels a year grounded or sunk on Great Barrier Reef</w:t>
-      </w:r>
-      <w:r>
-        <w:rPr>
-          <w:rFonts w:ascii="Arial" w:hAnsi="Arial"/>
-          <w:color w:val="000000"/>
-          <w:sz w:val="19"/>
-        </w:rPr>
-        <w:t xml:space="preserve"> - </w:t>
-      </w:r>
-      <w:r>
-        <w:rPr>
-          <w:rFonts w:ascii="Arial" w:hAnsi="Arial"/>
-          <w:color w:val="000000"/>
-          <w:sz w:val="19"/>
-        </w:rPr>
-        <w:t>The Reef Authority has revealed that almost 60 vessels a year are grounded or sunk on the Great Barrier Reef, underscoring persistent navigation and environmental risk in one of Australia's most…</w:t>
-      </w:r>
-      <w:r>
-        <w:rPr>
-          <w:rFonts w:ascii="Arial" w:hAnsi="Arial"/>
-          <w:color w:val="000000"/>
-          <w:sz w:val="19"/>
-        </w:rPr>
-        <w:t xml:space="preserve"> (</w:t>
-      </w:r>
-      <w:hyperlink r:id="rId22">
-        <w:r>
-          <w:rPr>
-            <w:rFonts w:ascii="Arial" w:hAnsi="Arial" w:cs="Arial"/>
-            <w:color w:val="0000FF"/>
-            <w:sz w:val="19"/>
-            <w:szCs w:val="19"/>
-            <w:u w:val="single"/>
-          </w:rPr>
-          <w:t xml:space="preserve">Read more</w:t>
-        </w:r>
-      </w:hyperlink>
-      <w:r>
-        <w:rPr>
-          <w:rFonts w:ascii="Arial" w:hAnsi="Arial"/>
-          <w:color w:val="000000"/>
-          <w:sz w:val="19"/>
-        </w:rPr>
-        <w:t>)</w:t>
-      </w:r>
-    </w:p>
-    <w:p>
-      <w:pPr>
-        <w:pStyle w:val="ListBullet"/>
-      </w:pPr>
-      <w:r>
-        <w:rPr>
-          <w:rFonts w:ascii="Arial" w:hAnsi="Arial"/>
-          <w:b/>
-          <w:color w:val="000000"/>
-          <w:sz w:val="19"/>
-        </w:rPr>
-        <w:t>Fatal Mine Incident Triggers Safety Probe in New South Wales</w:t>
-      </w:r>
-      <w:r>
-        <w:rPr>
-          <w:rFonts w:ascii="Arial" w:hAnsi="Arial"/>
-          <w:color w:val="000000"/>
-          <w:sz w:val="19"/>
-        </w:rPr>
-        <w:t xml:space="preserve"> - </w:t>
-      </w:r>
-      <w:r>
-        <w:rPr>
-          <w:rFonts w:ascii="Arial" w:hAnsi="Arial"/>
-          <w:color w:val="000000"/>
-          <w:sz w:val="19"/>
-        </w:rPr>
-        <w:t>The NSW resources regulator has initiated a formal safety investigation following a fatal mine incident, raising the risk profile of extractive industry operations and signalling heightened…</w:t>
-      </w:r>
-      <w:r>
-        <w:rPr>
-          <w:rFonts w:ascii="Arial" w:hAnsi="Arial"/>
-          <w:color w:val="000000"/>
-          <w:sz w:val="19"/>
-        </w:rPr>
-        <w:t xml:space="preserve"> (</w:t>
-      </w:r>
-      <w:hyperlink r:id="rId23">
-        <w:r>
-          <w:rPr>
-            <w:rFonts w:ascii="Arial" w:hAnsi="Arial" w:cs="Arial"/>
-            <w:color w:val="0000FF"/>
-            <w:sz w:val="19"/>
-            <w:szCs w:val="19"/>
-            <w:u w:val="single"/>
-          </w:rPr>
-          <w:t xml:space="preserve">Read more</w:t>
-        </w:r>
-      </w:hyperlink>
-      <w:r>
-        <w:rPr>
-          <w:rFonts w:ascii="Arial" w:hAnsi="Arial"/>
-          <w:color w:val="000000"/>
-          <w:sz w:val="19"/>
-        </w:rPr>
-        <w:t>)</w:t>
-      </w:r>
-    </w:p>
-    <w:p>
-      <w:pPr>
-        <w:pStyle w:val="ListBullet"/>
-      </w:pPr>
-      <w:r>
-        <w:rPr>
-          <w:rFonts w:ascii="Arial" w:hAnsi="Arial"/>
-          <w:b/>
-          <w:color w:val="000000"/>
-          <w:sz w:val="19"/>
-        </w:rPr>
-        <w:t>NHVR focuses on avoidance behaviour within industry</w:t>
-      </w:r>
-      <w:r>
-        <w:rPr>
-          <w:rFonts w:ascii="Arial" w:hAnsi="Arial"/>
-          <w:color w:val="000000"/>
-          <w:sz w:val="19"/>
-        </w:rPr>
-        <w:t xml:space="preserve"> - </w:t>
-      </w:r>
-      <w:r>
-        <w:rPr>
-          <w:rFonts w:ascii="Arial" w:hAnsi="Arial"/>
-          <w:color w:val="000000"/>
-          <w:sz w:val="19"/>
-        </w:rPr>
-        <w:t>The National Heavy Vehicle Regulator has flagged a targeted focus on avoidance behaviour, indicating stepped-up enforcement against operators who deliberately circumvent compliance obligations under…</w:t>
-      </w:r>
-      <w:r>
-        <w:rPr>
-          <w:rFonts w:ascii="Arial" w:hAnsi="Arial"/>
-          <w:color w:val="000000"/>
-          <w:sz w:val="19"/>
-        </w:rPr>
-        <w:t xml:space="preserve"> (</w:t>
-      </w:r>
-      <w:hyperlink r:id="rId24">
-        <w:r>
-          <w:rPr>
-            <w:rFonts w:ascii="Arial" w:hAnsi="Arial" w:cs="Arial"/>
-            <w:color w:val="0000FF"/>
-            <w:sz w:val="19"/>
-            <w:szCs w:val="19"/>
-            <w:u w:val="single"/>
-          </w:rPr>
-          <w:t xml:space="preserve">Read more</w:t>
-        </w:r>
-      </w:hyperlink>
-      <w:r>
-        <w:rPr>
-          <w:rFonts w:ascii="Arial" w:hAnsi="Arial"/>
-          <w:color w:val="000000"/>
-          <w:sz w:val="19"/>
-        </w:rPr>
-        <w:t>)</w:t>
+        <w:t>No emerging risks signal this fortnight.</w:t>
       </w:r>
     </w:p>
     <w:p>
@@ -1472,118 +274,16 @@
     </w:p>
     <w:p>
       <w:pPr>
-        <w:pStyle w:val="ListBullet"/>
+        <w:pStyle w:val="body_letter"/>
       </w:pPr>
       <w:r>
         <w:rPr>
           <w:rFonts w:ascii="Arial" w:hAnsi="Arial"/>
-          <w:b/>
-          <w:color w:val="000000"/>
+          <w:i/>
+          <w:color w:val="666666"/>
           <w:sz w:val="19"/>
         </w:rPr>
-        <w:t>Reform to data centre policy in NSW</w:t>
-      </w:r>
-      <w:r>
-        <w:rPr>
-          <w:rFonts w:ascii="Arial" w:hAnsi="Arial"/>
-          <w:color w:val="000000"/>
-          <w:sz w:val="19"/>
-        </w:rPr>
-        <w:t xml:space="preserve"> - </w:t>
-      </w:r>
-      <w:r>
-        <w:rPr>
-          <w:rFonts w:ascii="Arial" w:hAnsi="Arial"/>
-          <w:color w:val="000000"/>
-          <w:sz w:val="19"/>
-        </w:rPr>
-        <w:t>The NSW Government has introduced reformed data centre planning policy, streamlining approvals for digital infrastructure to support the rapid expansion of AI and cloud computing workloads across…</w:t>
-      </w:r>
-      <w:r>
-        <w:rPr>
-          <w:rFonts w:ascii="Arial" w:hAnsi="Arial"/>
-          <w:color w:val="000000"/>
-          <w:sz w:val="19"/>
-        </w:rPr>
-        <w:t xml:space="preserve"> (</w:t>
-      </w:r>
-      <w:hyperlink r:id="rId25">
-        <w:r>
-          <w:rPr>
-            <w:rFonts w:ascii="Arial" w:hAnsi="Arial" w:cs="Arial"/>
-            <w:color w:val="0000FF"/>
-            <w:sz w:val="19"/>
-            <w:szCs w:val="19"/>
-            <w:u w:val="single"/>
-          </w:rPr>
-          <w:t xml:space="preserve">Read more</w:t>
-        </w:r>
-      </w:hyperlink>
-      <w:r>
-        <w:rPr>
-          <w:rFonts w:ascii="Arial" w:hAnsi="Arial"/>
-          <w:color w:val="000000"/>
-          <w:sz w:val="19"/>
-        </w:rPr>
-        <w:t>)</w:t>
-      </w:r>
-    </w:p>
-    <w:p>
-      <w:pPr>
-        <w:pStyle w:val="ListBullet"/>
-      </w:pPr>
-      <w:r>
-        <w:rPr>
-          <w:rFonts w:ascii="Arial" w:hAnsi="Arial"/>
-          <w:b/>
-          <w:color w:val="000000"/>
-          <w:sz w:val="19"/>
-        </w:rPr>
-        <w:t>Australian Energy Regulator: Our Strategic Plan</w:t>
-      </w:r>
-      <w:r>
-        <w:rPr>
-          <w:rFonts w:ascii="Arial" w:hAnsi="Arial"/>
-          <w:color w:val="000000"/>
-          <w:sz w:val="19"/>
-        </w:rPr>
-        <w:t xml:space="preserve"> - </w:t>
-      </w:r>
-      <w:r>
-        <w:rPr>
-          <w:rFonts w:ascii="Arial" w:hAnsi="Arial"/>
-          <w:color w:val="000000"/>
-          <w:sz w:val="19"/>
-        </w:rPr>
-        <w:t>The Australian Energy Regulator has released its Strategic Plan, signalling investment in data and analytical capability to support evidence-based regulatory decision-making as Australia's energy…</w:t>
-      </w:r>
-      <w:r>
-        <w:rPr>
-          <w:rFonts w:ascii="Arial" w:hAnsi="Arial"/>
-          <w:color w:val="000000"/>
-          <w:sz w:val="19"/>
-        </w:rPr>
-        <w:t xml:space="preserve"> (</w:t>
-      </w:r>
-      <w:hyperlink r:id="rId26">
-        <w:r>
-          <w:rPr>
-            <w:rFonts w:ascii="Arial" w:hAnsi="Arial" w:cs="Arial"/>
-            <w:color w:val="0000FF"/>
-            <w:sz w:val="19"/>
-            <w:szCs w:val="19"/>
-            <w:u w:val="single"/>
-          </w:rPr>
-          <w:t xml:space="preserve">Read more</w:t>
-        </w:r>
-      </w:hyperlink>
-      <w:r>
-        <w:rPr>
-          <w:rFonts w:ascii="Arial" w:hAnsi="Arial"/>
-          <w:color w:val="000000"/>
-          <w:sz w:val="19"/>
-        </w:rPr>
-        <w:t>)</w:t>
+        <w:t>No ai adoption signal this fortnight.</w:t>
       </w:r>
     </w:p>
     <w:p>
@@ -1602,6 +302,34 @@
     </w:p>
     <w:p>
       <w:pPr>
+        <w:pStyle w:val="body_letter"/>
+      </w:pPr>
+      <w:r>
+        <w:rPr>
+          <w:rFonts w:ascii="Arial" w:hAnsi="Arial"/>
+          <w:i/>
+          <w:color w:val="666666"/>
+          <w:sz w:val="19"/>
+        </w:rPr>
+        <w:t>No regulatory burden signal this fortnight.</w:t>
+      </w:r>
+    </w:p>
+    <w:p>
+      <w:pPr>
+        <w:pStyle w:val="subheading_letter"/>
+      </w:pPr>
+      <w:r>
+        <w:rPr>
+          <w:rFonts w:ascii="Arial" w:hAnsi="Arial"/>
+          <w:b/>
+          <w:color w:val="76D2FF"/>
+          <w:sz w:val="21"/>
+        </w:rPr>
+        <w:t>Training, conferences, webinars &amp; in-person sessions</w:t>
+      </w:r>
+    </w:p>
+    <w:p>
+      <w:pPr>
         <w:pStyle w:val="ListBullet"/>
       </w:pPr>
       <w:r>
@@ -1611,7 +339,7 @@
           <w:color w:val="000000"/>
           <w:sz w:val="19"/>
         </w:rPr>
-        <w:t>$55 million better off: education and enforcement over mandatory e-bike insurance</w:t>
+        <w:t>Law Society of NSW In-House Lawyers Conference 2026</w:t>
       </w:r>
       <w:r>
         <w:rPr>
@@ -1627,7 +355,7 @@
           <w:color w:val="000000"/>
           <w:sz w:val="19"/>
         </w:rPr>
-        <w:t>The NSW Productivity and Equality Commission has quantified a $55 million net community benefit from choosing education and enforcement over mandatory e-bike insurance, providing a strong model for…</w:t>
+        <w:t>09 Sep 2026 - APRA · Online</w:t>
       </w:r>
       <w:r>
         <w:rPr>
@@ -1637,7 +365,7 @@
         </w:rPr>
         <w:t xml:space="preserve"> (</w:t>
       </w:r>
-      <w:hyperlink r:id="rId27">
+      <w:hyperlink r:id="rId10">
         <w:r>
           <w:rPr>
             <w:rFonts w:ascii="Arial" w:hAnsi="Arial" w:cs="Arial"/>
@@ -1646,153 +374,7 @@
             <w:szCs w:val="19"/>
             <w:u w:val="single"/>
           </w:rPr>
-          <w:t xml:space="preserve">Read more</w:t>
-        </w:r>
-      </w:hyperlink>
-      <w:r>
-        <w:rPr>
-          <w:rFonts w:ascii="Arial" w:hAnsi="Arial"/>
-          <w:color w:val="000000"/>
-          <w:sz w:val="19"/>
-        </w:rPr>
-        <w:t>)</w:t>
-      </w:r>
-    </w:p>
-    <w:p>
-      <w:pPr>
-        <w:pStyle w:val="ListBullet"/>
-      </w:pPr>
-      <w:r>
-        <w:rPr>
-          <w:rFonts w:ascii="Arial" w:hAnsi="Arial"/>
-          <w:b/>
-          <w:color w:val="000000"/>
-          <w:sz w:val="19"/>
-        </w:rPr>
-        <w:t>CASA proposes new business and owner transport classifications</w:t>
-      </w:r>
-      <w:r>
-        <w:rPr>
-          <w:rFonts w:ascii="Arial" w:hAnsi="Arial"/>
-          <w:color w:val="000000"/>
-          <w:sz w:val="19"/>
-        </w:rPr>
-        <w:t xml:space="preserve"> - </w:t>
-      </w:r>
-      <w:r>
-        <w:rPr>
-          <w:rFonts w:ascii="Arial" w:hAnsi="Arial"/>
-          <w:color w:val="000000"/>
-          <w:sz w:val="19"/>
-        </w:rPr>
-        <w:t>CASA is consulting on proposed new operational classifications for business and owner transport, a reform designed to simplify the regulatory framework and reduce compliance complexity for…</w:t>
-      </w:r>
-      <w:r>
-        <w:rPr>
-          <w:rFonts w:ascii="Arial" w:hAnsi="Arial"/>
-          <w:color w:val="000000"/>
-          <w:sz w:val="19"/>
-        </w:rPr>
-        <w:t xml:space="preserve"> (</w:t>
-      </w:r>
-      <w:hyperlink r:id="rId28">
-        <w:r>
-          <w:rPr>
-            <w:rFonts w:ascii="Arial" w:hAnsi="Arial" w:cs="Arial"/>
-            <w:color w:val="0000FF"/>
-            <w:sz w:val="19"/>
-            <w:szCs w:val="19"/>
-            <w:u w:val="single"/>
-          </w:rPr>
-          <w:t xml:space="preserve">Read more</w:t>
-        </w:r>
-      </w:hyperlink>
-      <w:r>
-        <w:rPr>
-          <w:rFonts w:ascii="Arial" w:hAnsi="Arial"/>
-          <w:color w:val="000000"/>
-          <w:sz w:val="19"/>
-        </w:rPr>
-        <w:t>)</w:t>
-      </w:r>
-    </w:p>
-    <w:p>
-      <w:pPr>
-        <w:pStyle w:val="ListBullet"/>
-      </w:pPr>
-      <w:r>
-        <w:rPr>
-          <w:rFonts w:ascii="Arial" w:hAnsi="Arial"/>
-          <w:b/>
-          <w:color w:val="000000"/>
-          <w:sz w:val="19"/>
-        </w:rPr>
-        <w:t>EPBC Act: New National Environmental Standards commence</w:t>
-      </w:r>
-      <w:r>
-        <w:rPr>
-          <w:rFonts w:ascii="Arial" w:hAnsi="Arial"/>
-          <w:color w:val="000000"/>
-          <w:sz w:val="19"/>
-        </w:rPr>
-        <w:t xml:space="preserve"> - </w:t>
-      </w:r>
-      <w:r>
-        <w:rPr>
-          <w:rFonts w:ascii="Arial" w:hAnsi="Arial"/>
-          <w:color w:val="000000"/>
-          <w:sz w:val="19"/>
-        </w:rPr>
-        <w:t>New National Environmental Standards have commenced under the EPBC Act, marking a significant milestone in Australia's environmental regulatory reform agenda and introducing updated compliance…</w:t>
-      </w:r>
-    </w:p>
-    <w:p>
-      <w:pPr>
-        <w:pStyle w:val="ListBullet"/>
-      </w:pPr>
-      <w:r>
-        <w:rPr>
-          <w:rFonts w:ascii="Arial" w:hAnsi="Arial"/>
-          <w:b/>
-          <w:color w:val="000000"/>
-          <w:sz w:val="19"/>
-        </w:rPr>
-        <w:t>ASIC: Easier to deal with, harder to avoid</w:t>
-      </w:r>
-      <w:r>
-        <w:rPr>
-          <w:rFonts w:ascii="Arial" w:hAnsi="Arial"/>
-          <w:color w:val="000000"/>
-          <w:sz w:val="19"/>
-        </w:rPr>
-        <w:t xml:space="preserve"> - </w:t>
-      </w:r>
-      <w:r>
-        <w:rPr>
-          <w:rFonts w:ascii="Arial" w:hAnsi="Arial"/>
-          <w:color w:val="000000"/>
-          <w:sz w:val="19"/>
-        </w:rPr>
-        <w:t>ASIC has articulated a dual commitment to reducing friction for compliant firms while intensifying enforcement against those breaching obligations, signalling a more risk-calibrated and…</w:t>
-      </w:r>
-      <w:r>
-        <w:rPr>
-          <w:rFonts w:ascii="Arial" w:hAnsi="Arial"/>
-          <w:color w:val="000000"/>
-          <w:sz w:val="19"/>
-        </w:rPr>
-        <w:t xml:space="preserve"> (</w:t>
-      </w:r>
-      <w:hyperlink r:id="rId29">
-        <w:r>
-          <w:rPr>
-            <w:rFonts w:ascii="Arial" w:hAnsi="Arial" w:cs="Arial"/>
-            <w:color w:val="0000FF"/>
-            <w:sz w:val="19"/>
-            <w:szCs w:val="19"/>
-            <w:u w:val="single"/>
-          </w:rPr>
-          <w:t xml:space="preserve">Read more</w:t>
+          <w:t xml:space="preserve">Register</w:t>
         </w:r>
       </w:hyperlink>
       <w:r>
@@ -1815,49 +397,7 @@
           <w:color w:val="76D2FF"/>
           <w:sz w:val="21"/>
         </w:rPr>
-        <w:t>Training, conferences, webinars &amp; in-person sessions</w:t>
-      </w:r>
-    </w:p>
-    <w:p>
-      <w:pPr>
-        <w:pStyle w:val="body_letter"/>
-      </w:pPr>
-      <w:r>
-        <w:rPr>
-          <w:rFonts w:ascii="Arial" w:hAnsi="Arial"/>
-          <w:i/>
-          <w:color w:val="666666"/>
-          <w:sz w:val="19"/>
-        </w:rPr>
-        <w:t>No upcoming events in the next four weeks.</w:t>
-      </w:r>
-    </w:p>
-    <w:p>
-      <w:pPr>
-        <w:pStyle w:val="subheading_letter"/>
-      </w:pPr>
-      <w:r>
-        <w:rPr>
-          <w:rFonts w:ascii="Arial" w:hAnsi="Arial"/>
-          <w:b/>
-          <w:color w:val="76D2FF"/>
-          <w:sz w:val="21"/>
-        </w:rPr>
         <w:t>Cross-sector synthesis (hub-wide)</w:t>
-      </w:r>
-    </w:p>
-    <w:p>
-      <w:pPr>
-        <w:pStyle w:val="body_letter"/>
-      </w:pPr>
-      <w:r>
-        <w:rPr>
-          <w:rFonts w:ascii="Arial" w:hAnsi="Arial"/>
-          <w:b w:val="0"/>
-          <w:color w:val="000000"/>
-          <w:sz w:val="19"/>
-        </w:rPr>
-        <w:t>Three regulator investment cycles are converging this fortnight and each carries a discrete advisory window: ASIC's declared strategic reset to 'easier to deal with, harder to avoid' under its incoming chair is simultaneously a client-recalibration event and a transformation advisory mandate for the regulator itself; the AER's published Strategic Plan signals sustained capability and technology uplift across the National Electricity and Gas Markets, creating a pre-tender runway for KPMG's energy-transition and regulatory-strategy practice; and AMSA's Annual Regulatory Program 2026-27 locks in enforcement campaigns across fatigue, cargo securing, and seafarer medical fitness that will generate compliance program demand from maritime operators before the inspection cycle opens. EPBC reform has moved from legislation to implementation with new National Environmental Standards now in force, compressing the compliance runway for mining, infrastructure, and major-property proponents, Q4 2026 is the live conversion window before project pipelines absorb the new approval framework under competitive pressure. Leadership transitions at Victoria's Department of Transport and Planning and the ATSB are classic first-100-days BD events: both appointments create demand for capability reviews and strategic reset advisory that KPMG can pursue without a formal competitive process if it moves in the next four weeks. The NHVR's public declaration of enforcement focus on deliberate avoidance behaviour and the concurrent commencement of HVNL reforms together mark the beginning of an active penalty cycle for heavy vehicle operators, freight clients without current compliance program maturity are immediately exposed. The overarching BD signal across the fortnight is enforcement cycle initiation: ASIC, NHVR, EPA Victoria, and AUSTRAC are all in declared or active enforcement uplift, and the advisory window is shortest for clients who have not yet commissioned independent assurance or compliance gap reviews.</w:t>
       </w:r>
     </w:p>
     <w:p>
@@ -1884,7 +424,7 @@
           <w:color w:val="000000"/>
           <w:sz w:val="19"/>
         </w:rPr>
-        <w:t>Deploy KPMG's environmental advisory and approvals team to mining and major infrastructure clients this week to position EPBC National Environmental Standards transition support ahead of Q4 project pipeline acceleration, the compliance gap is live and proponents are not yet resourced.</w:t>
+        <w:t>Brief the relevant sector partner this fortnight on the highest-signal regulator development above.</w:t>
       </w:r>
     </w:p>
     <w:p>
@@ -1897,7 +437,7 @@
           <w:color w:val="000000"/>
           <w:sz w:val="19"/>
         </w:rPr>
-        <w:t>Activate transport practice pursuit of first-100-days capability review mandates with the incoming Victoria DTP Secretary and new ATSB Commissioner before those appointments stabilise and discretionary advisory spend narrows to existing relationships.</w:t>
+        <w:t>Convene the capability bench for the next reg-tech / capability-review pursuit in pipeline.</w:t>
       </w:r>
     </w:p>
     <w:p>
@@ -1910,112 +450,7 @@
           <w:color w:val="000000"/>
           <w:sz w:val="19"/>
         </w:rPr>
-        <w:t>Pitch ASIC directly under its new 'easier to deal with, harder to avoid' posture on operational transformation and regulatory technology, the incoming chair's declared reset is a six-month window before the strategy embeds and procurement tightens.</w:t>
-      </w:r>
-    </w:p>
-    <w:p>
-      <w:pPr>
-        <w:pStyle w:val="ListBullet"/>
-      </w:pPr>
-      <w:r>
-        <w:rPr>
-          <w:rFonts w:ascii="Arial" w:hAnsi="Arial"/>
-          <w:color w:val="000000"/>
-          <w:sz w:val="19"/>
-        </w:rPr>
-        <w:t>Brief tier-1 NHVR-regulated freight operator clients on the enforcement posture shift toward deliberate avoidance behaviour and convert those conversations to risk framework and assurance mandates before the first penalty actions are published and clients are on the back foot.</w:t>
-      </w:r>
-    </w:p>
-    <w:p>
-      <w:pPr>
-        <w:pStyle w:val="ListBullet"/>
-      </w:pPr>
-      <w:r>
-        <w:rPr>
-          <w:rFonts w:ascii="Arial" w:hAnsi="Arial"/>
-          <w:color w:val="000000"/>
-          <w:sz w:val="19"/>
-        </w:rPr>
-        <w:t>Position KPMG's energy regulatory practice on AER Strategic Plan implementation streams, data governance, market monitoring, and technology uplift, before they translate into formal tender panels in H1 2027.</w:t>
-      </w:r>
-    </w:p>
-    <w:p>
-      <w:pPr>
-        <w:pStyle w:val="body_letter"/>
-      </w:pPr>
-      <w:r>
-        <w:rPr>
-          <w:rFonts w:ascii="Arial" w:hAnsi="Arial"/>
-          <w:b/>
-          <w:color w:val="000000"/>
-          <w:sz w:val="19"/>
-        </w:rPr>
-        <w:t>Implications for clients</w:t>
-      </w:r>
-    </w:p>
-    <w:p>
-      <w:pPr>
-        <w:pStyle w:val="ListBullet"/>
-      </w:pPr>
-      <w:r>
-        <w:rPr>
-          <w:rFonts w:ascii="Arial" w:hAnsi="Arial"/>
-          <w:color w:val="000000"/>
-          <w:sz w:val="19"/>
-        </w:rPr>
-        <w:t>Deploy KPMG's environmental advisory and approvals team to mining and major infrastructure clients this week to position EPBC National Environmental Standards transition support ahead of Q4 project pipeline acceleration, the compliance gap is live and proponents are not yet resourced.</w:t>
-      </w:r>
-    </w:p>
-    <w:p>
-      <w:pPr>
-        <w:pStyle w:val="ListBullet"/>
-      </w:pPr>
-      <w:r>
-        <w:rPr>
-          <w:rFonts w:ascii="Arial" w:hAnsi="Arial"/>
-          <w:color w:val="000000"/>
-          <w:sz w:val="19"/>
-        </w:rPr>
-        <w:t>Activate transport practice pursuit of first-100-days capability review mandates with the incoming Victoria DTP Secretary and new ATSB Commissioner before those appointments stabilise and discretionary advisory spend narrows to existing relationships.</w:t>
-      </w:r>
-    </w:p>
-    <w:p>
-      <w:pPr>
-        <w:pStyle w:val="ListBullet"/>
-      </w:pPr>
-      <w:r>
-        <w:rPr>
-          <w:rFonts w:ascii="Arial" w:hAnsi="Arial"/>
-          <w:color w:val="000000"/>
-          <w:sz w:val="19"/>
-        </w:rPr>
-        <w:t>Pitch ASIC directly under its new 'easier to deal with, harder to avoid' posture on operational transformation and regulatory technology, the incoming chair's declared reset is a six-month window before the strategy embeds and procurement tightens.</w:t>
-      </w:r>
-    </w:p>
-    <w:p>
-      <w:pPr>
-        <w:pStyle w:val="ListBullet"/>
-      </w:pPr>
-      <w:r>
-        <w:rPr>
-          <w:rFonts w:ascii="Arial" w:hAnsi="Arial"/>
-          <w:color w:val="000000"/>
-          <w:sz w:val="19"/>
-        </w:rPr>
-        <w:t>Brief tier-1 NHVR-regulated freight operator clients on the enforcement posture shift toward deliberate avoidance behaviour and convert those conversations to risk framework and assurance mandates before the first penalty actions are published and clients are on the back foot.</w:t>
-      </w:r>
-    </w:p>
-    <w:p>
-      <w:pPr>
-        <w:pStyle w:val="ListBullet"/>
-      </w:pPr>
-      <w:r>
-        <w:rPr>
-          <w:rFonts w:ascii="Arial" w:hAnsi="Arial"/>
-          <w:color w:val="000000"/>
-          <w:sz w:val="19"/>
-        </w:rPr>
-        <w:t>Position KPMG's energy regulatory practice on AER Strategic Plan implementation streams, data governance, market monitoring, and technology uplift, before they translate into formal tender panels in H1 2027.</w:t>
+        <w:t>Pursue at least one tracked client on a near-term advisory hook before the next CoP cadence.</w:t>
       </w:r>
     </w:p>
     <w:p>
@@ -2039,221 +474,11 @@
       <w:r>
         <w:rPr>
           <w:rFonts w:ascii="Arial" w:hAnsi="Arial"/>
-          <w:b/>
-          <w:color w:val="000000"/>
+          <w:i/>
+          <w:color w:val="666666"/>
           <w:sz w:val="19"/>
         </w:rPr>
-        <w:t>Public Sector</w:t>
-      </w:r>
-    </w:p>
-    <w:p>
-      <w:pPr>
-        <w:pStyle w:val="body_letter"/>
-      </w:pPr>
-      <w:r>
-        <w:rPr>
-          <w:rFonts w:ascii="Arial" w:hAnsi="Arial"/>
-          <w:b w:val="0"/>
-          <w:color w:val="000000"/>
-          <w:sz w:val="19"/>
-        </w:rPr>
-        <w:t>The APSC Corporate Plan 2026-27 signals defined APS-wide investment priorities across capability, workforce effectiveness, and organisational performance, creating a direct pull-through for KPMG's public sector workforce transformation and L&amp;D offerings at the moment budget conversations are live. The Department of Finance's initiative to overcome data-sharing and integration barriers represents an active Commonwealth mandate for data governance, interoperability architecture, and cross-agency frameworks, an advisory lane KPMG's digital and data practice should be positioned on before tender windows open. NDIS mandatory registration reform and revised access rules introduce a near-term compliance burden on providers and the NDIA, while Fair Work's $5.3M aged-care underpayment recovery signals an enforcement cycle that will drive risk and compliance advisory demand in human services. The pending privacy 'right to erasure' reform compounds agency compliance pressure and provides a credible opener for cross-portfolio regulatory-readiness engagements.</w:t>
-      </w:r>
-    </w:p>
-    <w:p>
-      <w:pPr>
-        <w:pStyle w:val="body_letter"/>
-      </w:pPr>
-      <w:r>
-        <w:rPr>
-          <w:rFonts w:ascii="Arial" w:hAnsi="Arial"/>
-          <w:b/>
-          <w:color w:val="000000"/>
-          <w:sz w:val="19"/>
-        </w:rPr>
-        <w:t>Financial Services</w:t>
-      </w:r>
-    </w:p>
-    <w:p>
-      <w:pPr>
-        <w:pStyle w:val="body_letter"/>
-      </w:pPr>
-      <w:r>
-        <w:rPr>
-          <w:rFonts w:ascii="Arial" w:hAnsi="Arial"/>
-          <w:b w:val="0"/>
-          <w:color w:val="000000"/>
-          <w:sz w:val="19"/>
-        </w:rPr>
-        <w:t>ASIC's new strategic posture, 'easier to deal with, harder to avoid', signals a deliberate capability and operational reset under its incoming chair, creating a near-term window to position KPMG's regulatory advisory and transformation bench with ASIC as a client and with regulated entities needing to recalibrate their engagement models. Concurrently, ASIC's public warning on 'first significant cracks' in private credit elevates risk-framework and assurance demand across fund managers and lenders active in that market. The CSLR overhaul backed by banks and brokers, combined with Mulino's contested DBFO advice reform agenda, points to sustained legislative and operational redesign work in financial services through H2 2026. The ATO data-sharing signal following the AUSTRAC fraud probe adds a data-governance and financial crime compliance angle that bridges into KPMG's forensics and technology practices.</w:t>
-      </w:r>
-    </w:p>
-    <w:p>
-      <w:pPr>
-        <w:pStyle w:val="body_letter"/>
-      </w:pPr>
-      <w:r>
-        <w:rPr>
-          <w:rFonts w:ascii="Arial" w:hAnsi="Arial"/>
-          <w:b/>
-          <w:color w:val="000000"/>
-          <w:sz w:val="19"/>
-        </w:rPr>
-        <w:t>Health, Ageing &amp; Human Services</w:t>
-      </w:r>
-    </w:p>
-    <w:p>
-      <w:pPr>
-        <w:pStyle w:val="body_letter"/>
-      </w:pPr>
-      <w:r>
-        <w:rPr>
-          <w:rFonts w:ascii="Arial" w:hAnsi="Arial"/>
-          <w:b w:val="0"/>
-          <w:color w:val="000000"/>
-          <w:sz w:val="19"/>
-        </w:rPr>
-        <w:t>The NDIS reform package has cleared parliament on a Labor-Coalition deal, compressing the advisory window for state and territory governments that are not yet ready to deliver foundational supports at the pace the legislation mandates, a readiness gap the Minister has publicly declined to guarantee will be bridged before participants are exited from the scheme. Concurrently, the Department of Health, Disability and Ageing has opened formal consultation on proposed NDIS access changes, creating a direct engagement opportunity for organisations seeking to shape transition arrangements. The Aged Care Quality and Safety Commission's successful Federal Court action against a worker who breached a banning order signals a hardening enforcement posture across disability and aged care, driving compliance-uplift demand from providers facing tighter worker-screening obligations. The Ashurst automated-decision series on defensible decision-making maps directly onto NDIS eligibility and aged care assessment algorithms, anchoring a near-term digital-risk and regulatory-assurance pitch to Commonwealth and state agencies administering these tools.</w:t>
-      </w:r>
-    </w:p>
-    <w:p>
-      <w:pPr>
-        <w:pStyle w:val="body_letter"/>
-      </w:pPr>
-      <w:r>
-        <w:rPr>
-          <w:rFonts w:ascii="Arial" w:hAnsi="Arial"/>
-          <w:b/>
-          <w:color w:val="000000"/>
-          <w:sz w:val="19"/>
-        </w:rPr>
-        <w:t>Energy, Mining &amp; Property</w:t>
-      </w:r>
-    </w:p>
-    <w:p>
-      <w:pPr>
-        <w:pStyle w:val="body_letter"/>
-      </w:pPr>
-      <w:r>
-        <w:rPr>
-          <w:rFonts w:ascii="Arial" w:hAnsi="Arial"/>
-          <w:b w:val="0"/>
-          <w:color w:val="000000"/>
-          <w:sz w:val="19"/>
-        </w:rPr>
-        <w:t>The AER's published Strategic Plan signals sustained investment in regulatory capability and technology uplift across the National Electricity and Gas Markets, positioning the regulator for expanded data-driven oversight, a direct advisory entry point for KPMG's energy-transition and regulatory-strategy practice. A fatal mine incident in NSW has triggered a formal state safety investigation, opening near-term safety assurance and compliance program work with both the regulator and extractives sector clients. Commencement of new National Environmental Standards under the EPBC Act reform program materially raises the compliance bar for mining, infrastructure, and major-property proponents, with transition-support demand expected to accelerate through Q4 2026 as project pipelines absorb the new approval framework. Victoria EPA's 2026-27 Annual Delivery Plan and Statement of Expectations reinforce an enforcement-first posture in waste, energy recovery, and land-use compliance, consolidating a pattern that rewards early-mover clients who invest in compliance program design and independent assurance ahead of regulatory action.</w:t>
-      </w:r>
-    </w:p>
-    <w:p>
-      <w:pPr>
-        <w:pStyle w:val="body_letter"/>
-      </w:pPr>
-      <w:r>
-        <w:rPr>
-          <w:rFonts w:ascii="Arial" w:hAnsi="Arial"/>
-          <w:b/>
-          <w:color w:val="000000"/>
-          <w:sz w:val="19"/>
-        </w:rPr>
-        <w:t>National Security &amp; Justice</w:t>
-      </w:r>
-    </w:p>
-    <w:p>
-      <w:pPr>
-        <w:pStyle w:val="body_letter"/>
-      </w:pPr>
-      <w:r>
-        <w:rPr>
-          <w:rFonts w:ascii="Arial" w:hAnsi="Arial"/>
-          <w:b w:val="0"/>
-          <w:color w:val="000000"/>
-          <w:sz w:val="19"/>
-        </w:rPr>
-        <w:t>AUSTRAC's activation of section 167 compliance notices against non-enrolled Tranche 2 entities marks the enforcement phase of Australia's landmark AML/CTF expansion, generating immediate and time-pressured demand for compliance program design, ML/TF risk assessments, and implementation advisory across the legal, accounting, and real estate sectors. The agency is simultaneously investing in Pacific regional capability and intelligence infrastructure, signals of sustained organisational uplift that create a technology and capability advisory runway. AFSA's 13.1% rise in personal insolvencies and its PPSR data-integrity exercise indicate parallel regulatory activity in the financial security system, while ABF and AFP joint operations against illicit tobacco networks and a disrupted global cybercrime syndicate underscore a coordinated Home Affairs enforcement posture. Collectively, these signals position KPMG to pursue both urgent compliance uplift work with newly regulated Tranche 2 entities and longer-horizon capability and assurance engagements across the national security cluster.</w:t>
-      </w:r>
-    </w:p>
-    <w:p>
-      <w:pPr>
-        <w:pStyle w:val="body_letter"/>
-      </w:pPr>
-      <w:r>
-        <w:rPr>
-          <w:rFonts w:ascii="Arial" w:hAnsi="Arial"/>
-          <w:b/>
-          <w:color w:val="000000"/>
-          <w:sz w:val="19"/>
-        </w:rPr>
-        <w:t>Defence</w:t>
-      </w:r>
-    </w:p>
-    <w:p>
-      <w:pPr>
-        <w:pStyle w:val="body_letter"/>
-      </w:pPr>
-      <w:r>
-        <w:rPr>
-          <w:rFonts w:ascii="Arial" w:hAnsi="Arial"/>
-          <w:b w:val="0"/>
-          <w:color w:val="000000"/>
-          <w:sz w:val="19"/>
-        </w:rPr>
-        <w:t>The Department of Defence's announced shift to an 'enable, not gatekeep' posture on sensitive data and expertise guidelines represents a structural policy signal that will drive near-term demand for data governance frameworks, security classification advisory, and assurance programs across the industrial base. Simultaneously, Defence export compliance officials are publicly emphasising prevention over remediation, indicating unmet demand for compliance gap assessments, workforce uplift, and program-level controls, with enforcement risk making inaction costly for primes. A high-profile termination of a 26-year contract surfaces procurement governance and contract-management reform as a live pursuit angle, with affected suppliers likely requiring advisory on dispute resolution, transition planning, and re-competition positioning. Modern slavery criminal liability reforms add a compounding compliance obligation on Defence supply chains that KPMG's risk, legal, and operations advisory bench can package as a unified offering.</w:t>
-      </w:r>
-    </w:p>
-    <w:p>
-      <w:pPr>
-        <w:pStyle w:val="body_letter"/>
-      </w:pPr>
-      <w:r>
-        <w:rPr>
-          <w:rFonts w:ascii="Arial" w:hAnsi="Arial"/>
-          <w:b/>
-          <w:color w:val="000000"/>
-          <w:sz w:val="19"/>
-        </w:rPr>
-        <w:t>Transport</w:t>
-      </w:r>
-    </w:p>
-    <w:p>
-      <w:pPr>
-        <w:pStyle w:val="body_letter"/>
-      </w:pPr>
-      <w:r>
-        <w:rPr>
-          <w:rFonts w:ascii="Arial" w:hAnsi="Arial"/>
-          <w:b w:val="0"/>
-          <w:color w:val="000000"/>
-          <w:sz w:val="19"/>
-        </w:rPr>
-        <w:t>AMSA's Annual Regulatory Program 2026-27 signals structured regulator investment across maritime safety enforcement, seafarer medical fitness, and cargo securing compliance, each a proximate advisory engagement vector for KPMG's transport practice. Concurrent leadership transitions at Victoria's Department of Transport and Planning and the ATSB signal first-100-days demand for capability reviews and strategic resets that KPMG is positioned to lead. The NHVR's declared focus on deliberate avoidance behaviour in heavy vehicle operations marks an enforcement posture shift that will generate risk, assurance, and regulatory-relations mandates across freight operators. CASA's live consultation on new business and owner-transport operational classifications (PP 2610OS) adds a compliance advisory dimension for aviation clients exposed to reclassification risk.</w:t>
-      </w:r>
-    </w:p>
-    <w:p>
-      <w:pPr>
-        <w:pStyle w:val="body_letter"/>
-      </w:pPr>
-      <w:r>
-        <w:rPr>
-          <w:rFonts w:ascii="Arial" w:hAnsi="Arial"/>
-          <w:b/>
-          <w:color w:val="000000"/>
-          <w:sz w:val="19"/>
-        </w:rPr>
-        <w:t>Education</w:t>
-      </w:r>
-    </w:p>
-    <w:p>
-      <w:pPr>
-        <w:pStyle w:val="body_letter"/>
-      </w:pPr>
-      <w:r>
-        <w:rPr>
-          <w:rFonts w:ascii="Arial" w:hAnsi="Arial"/>
-          <w:b w:val="0"/>
-          <w:color w:val="000000"/>
-          <w:sz w:val="19"/>
-        </w:rPr>
-        <w:t>TEQSA's newly published 2026-30 Corporate Plan establishes a five-year regulatory investment agenda for higher education, signalling sustained demand for governance, compliance, and capability advisory across the university sector. Legislative proposals to expose institutions to $2m fines for governance failures and racism, combined with structural reforms to ANU's enabling legislation, indicate an enforcement posture shift that will accelerate board-level risk reviews and independent assurance mandates. The new TEQSA-ASQA MOU on dual-sector provider quality creates an immediate advisory opening for TAFEs and hybrid institutions navigating overlapping regulatory regimes, while time-bound accreditation reforms compress the compliance runway for providers yet to invest in readiness capability. KPMG's governance, risk, and transformation practices are well-positioned to lead engagements across all three vectors before TEQSA's new plan enters active implementation.</w:t>
+        <w:t>No sector-level synthesis available this fortnight.</w:t>
       </w:r>
     </w:p>
     <w:p>
@@ -2277,249 +502,11 @@
       <w:r>
         <w:rPr>
           <w:rFonts w:ascii="Arial" w:hAnsi="Arial"/>
-          <w:b/>
-          <w:color w:val="000000"/>
+          <w:i/>
+          <w:color w:val="666666"/>
           <w:sz w:val="19"/>
         </w:rPr>
-        <w:t>Commonwealth</w:t>
-      </w:r>
-    </w:p>
-    <w:p>
-      <w:pPr>
-        <w:pStyle w:val="body_letter"/>
-      </w:pPr>
-      <w:r>
-        <w:rPr>
-          <w:rFonts w:ascii="Arial" w:hAnsi="Arial"/>
-          <w:b w:val="0"/>
-          <w:color w:val="000000"/>
-          <w:sz w:val="19"/>
-        </w:rPr>
-        <w:t>ASIC has flagged a dual strategic posture, more accessible for compliant entities, harder to avoid for bad actors, backed by elevated FY25/26 enforcement outcomes driven by the Shield case fallout and a Melbourne AFSL suspension, signalling sustained regulatory pressure on financial services licensees. The Commonwealth's mandatory sustainability reporting regime is transitioning from policy to early reporting reality, with immediate compliance obligations for in-scope entities and advisory demand around assurance readiness. NDIS reform is progressing federally with the minister flagging further legislative amendments targeting fraud and parliamentary negotiation, while state-readiness concerns create cross-jurisdictional compliance complexity. A federal-NSW cost-shared gun buyback scheme has been formalised, and National Cabinet's data centre and AI infrastructure agenda is generating concurrent state planning and investment frameworks with regulatory implications across planning, environment and energy portfolios.</w:t>
-      </w:r>
-    </w:p>
-    <w:p>
-      <w:pPr>
-        <w:pStyle w:val="body_letter"/>
-      </w:pPr>
-      <w:r>
-        <w:rPr>
-          <w:rFonts w:ascii="Arial" w:hAnsi="Arial"/>
-          <w:b/>
-          <w:color w:val="000000"/>
-          <w:sz w:val="19"/>
-        </w:rPr>
-        <w:t>New South Wales</w:t>
-      </w:r>
-    </w:p>
-    <w:p>
-      <w:pPr>
-        <w:pStyle w:val="body_letter"/>
-      </w:pPr>
-      <w:r>
-        <w:rPr>
-          <w:rFonts w:ascii="Arial" w:hAnsi="Arial"/>
-          <w:b w:val="0"/>
-          <w:color w:val="000000"/>
-          <w:sz w:val="19"/>
-        </w:rPr>
-        <w:t>NSW regulators are intensifying enforcement across multiple sectors, with SafeWork NSW conducting an agribusiness safety blitz issuing dozens of breach notices, NSW Fair Trading imposing $200k fines on real estate agencies for trust account failures, and water regulators confronting prosecution gaps due to licensing doubts that may shield large-scale water theft from accountability. ICAC inquiries are running concurrently across building regulation (developer shakedowns of the former building commissioner), NSW Health (false qualifications and undisclosed conflicts), Catholic education leadership, and political conduct involving the Perrottet circle, sustaining strong demand for integrity and governance advisory work. The NSW Government has enacted major gambling reform with strengthened consumer protections, made Codes of Practice legally mandatory for businesses statewide, and released a nation-leading data centre policy framework governing planning approvals and infrastructure cost-sharing, all creating immediate compliance uplift obligations. KPMG advisory opportunities are concentrated in mandatory CoP gap analyses, gambling compliance program redesign, data centre planning navigation, and public-sector integrity frameworks.</w:t>
-      </w:r>
-    </w:p>
-    <w:p>
-      <w:pPr>
-        <w:pStyle w:val="body_letter"/>
-      </w:pPr>
-      <w:r>
-        <w:rPr>
-          <w:rFonts w:ascii="Arial" w:hAnsi="Arial"/>
-          <w:b/>
-          <w:color w:val="000000"/>
-          <w:sz w:val="19"/>
-        </w:rPr>
-        <w:t>Victoria</w:t>
-      </w:r>
-    </w:p>
-    <w:p>
-      <w:pPr>
-        <w:pStyle w:val="body_letter"/>
-      </w:pPr>
-      <w:r>
-        <w:rPr>
-          <w:rFonts w:ascii="Arial" w:hAnsi="Arial"/>
-          <w:b w:val="0"/>
-          <w:color w:val="000000"/>
-          <w:sz w:val="19"/>
-        </w:rPr>
-        <w:t>Victoria's regulatory landscape is dominated by the Big Build Royal Commission, which carries expansive terms of reference; Premier Carroll is simultaneously establishing a dedicated special prosecutor and expanding IBAC's powers, with the corruption probe explicitly placing former and current senior government figures in scope. Enforcement intensity is rising across multiple sectors: EPA Victoria has conducted a snap blitz on skip bin operators, WorkSafe is reviewing CFA fleet safety, and the state's residential rental taskforce has been made permanent, signalling durable compliance obligations for property managers and landlords. The government has foreshadowed tougher workplace surveillance legislation, creating an emerging advisory opportunity, while the mining sector is contesting significant exploration fee increases that may require regulatory engagement. VCAT continues to generate precedent-setting outcomes in building and property disputes, including a landmark decision clearing a building surveyor in a combustible cladding disciplinary action.</w:t>
-      </w:r>
-    </w:p>
-    <w:p>
-      <w:pPr>
-        <w:pStyle w:val="body_letter"/>
-      </w:pPr>
-      <w:r>
-        <w:rPr>
-          <w:rFonts w:ascii="Arial" w:hAnsi="Arial"/>
-          <w:b/>
-          <w:color w:val="000000"/>
-          <w:sz w:val="19"/>
-        </w:rPr>
-        <w:t>Queensland</w:t>
-      </w:r>
-    </w:p>
-    <w:p>
-      <w:pPr>
-        <w:pStyle w:val="body_letter"/>
-      </w:pPr>
-      <w:r>
-        <w:rPr>
-          <w:rFonts w:ascii="Arial" w:hAnsi="Arial"/>
-          <w:b w:val="0"/>
-          <w:color w:val="000000"/>
-          <w:sz w:val="19"/>
-        </w:rPr>
-        <w:t>Queensland's regulatory agenda is active across multiple sectors: the government has opened public consultation on bail law amendments, signalling forthcoming criminal justice legislation that warrants compliance mapping for affected service providers. A significant Facilitating Projects Scheme (FPS) overhaul is underway to attract global mining investment, restructuring approval pathways and creating advisory opportunities for resources clients navigating the new framework. On the enforcement front, Queensland Police have executed over 100 seizures under new e-mobility laws, demonstrating that recently enacted device-regulation legislation is now in active operational use. Separately, the government's formal response to child safety inquiry findings, coupled with new early learning sector safeguards aligned to national reforms, extends compliance obligations for ECEC providers, while a widening independent review of the Queensland DNA laboratory signals continued scrutiny of forensic public-sector services.</w:t>
-      </w:r>
-    </w:p>
-    <w:p>
-      <w:pPr>
-        <w:pStyle w:val="body_letter"/>
-      </w:pPr>
-      <w:r>
-        <w:rPr>
-          <w:rFonts w:ascii="Arial" w:hAnsi="Arial"/>
-          <w:b/>
-          <w:color w:val="000000"/>
-          <w:sz w:val="19"/>
-        </w:rPr>
-        <w:t>Western Australia</w:t>
-      </w:r>
-    </w:p>
-    <w:p>
-      <w:pPr>
-        <w:pStyle w:val="body_letter"/>
-      </w:pPr>
-      <w:r>
-        <w:rPr>
-          <w:rFonts w:ascii="Arial" w:hAnsi="Arial"/>
-          <w:b w:val="0"/>
-          <w:color w:val="000000"/>
-          <w:sz w:val="19"/>
-        </w:rPr>
-        <w:t>WA has moved into active enforcement mode on short-term rental accommodation, issuing its first infringement notice under the new STRA regime, signalling that the compliance window has closed and operators face real regulatory risk. Simultaneously, the state has announced planning reforms and transit precinct plans, opening advisory opportunities around development approvals and rezoning obligations. The Alternative Electricity Services (AES) framework introduces a new licensing and compliance structure for non-traditional electricity providers, requiring market participants to assess their obligations under the redrawn regime. The Productivity Commission's interim finding that WA's Morrison-era GST carve-up should be reversed adds a material federal-state fiscal dimension that will shape WA budget and infrastructure regulatory settings.</w:t>
-      </w:r>
-    </w:p>
-    <w:p>
-      <w:pPr>
-        <w:pStyle w:val="body_letter"/>
-      </w:pPr>
-      <w:r>
-        <w:rPr>
-          <w:rFonts w:ascii="Arial" w:hAnsi="Arial"/>
-          <w:b/>
-          <w:color w:val="000000"/>
-          <w:sz w:val="19"/>
-        </w:rPr>
-        <w:t>South Australia</w:t>
-      </w:r>
-    </w:p>
-    <w:p>
-      <w:pPr>
-        <w:pStyle w:val="body_letter"/>
-      </w:pPr>
-      <w:r>
-        <w:rPr>
-          <w:rFonts w:ascii="Arial" w:hAnsi="Arial"/>
-          <w:b w:val="0"/>
-          <w:color w:val="000000"/>
-          <w:sz w:val="19"/>
-        </w:rPr>
-        <w:t>SafeWork SA is executing an aggressive enforcement posture: South Australia's first-ever industrial manslaughter charges have been laid, multiple contractors have been fined for fatal and near-fatal workplace incidents (including a $140,000 runaway truck penalty), and a builder has been sanctioned for threatening a safety inspector. Simultaneously, SA has raised the regulatory bar on silica and asbestos exposure, imposing new compliance obligations on construction and mining sector clients that warrant urgent gap assessments. The SA government has formalised its DV royal commission five-year implementation plan, bundled with new alcohol delivery restrictions, opening advisory mandates across licensing, health services, and community sector compliance. The Integrity Care NDIS matter has concluded without legal action, but the case underscores ongoing provider-governance scrutiny relevant to disability sector clients.</w:t>
-      </w:r>
-    </w:p>
-    <w:p>
-      <w:pPr>
-        <w:pStyle w:val="body_letter"/>
-      </w:pPr>
-      <w:r>
-        <w:rPr>
-          <w:rFonts w:ascii="Arial" w:hAnsi="Arial"/>
-          <w:b/>
-          <w:color w:val="000000"/>
-          <w:sz w:val="19"/>
-        </w:rPr>
-        <w:t>Tasmania</w:t>
-      </w:r>
-    </w:p>
-    <w:p>
-      <w:pPr>
-        <w:pStyle w:val="body_letter"/>
-      </w:pPr>
-      <w:r>
-        <w:rPr>
-          <w:rFonts w:ascii="Arial" w:hAnsi="Arial"/>
-          <w:b w:val="0"/>
-          <w:color w:val="000000"/>
-          <w:sz w:val="19"/>
-        </w:rPr>
-        <w:t>Tasmania's regulatory environment is notably active across gambling, resources, and workplace safety. The Legislative Council has launched a formal inquiry into the abandoned cashless pokies card scheme, while the Gaming Commission is publicly warning that proposed new pokies policies will worsen outcomes for problem gamblers, together signalling a contested reform environment with strong advisory demand. Mineral Resources Tasmania is executing a digital overhaul of its mining approvals process in 2026, representing a material compliance transition for resources sector clients requiring regulatory mapping and readiness support. WorkSafe enforcement is escalating, with criminal charges laid against West Coast Council following a worker fatality in Zeehan, and annual enforcement results reveal 5.5 million illegal cigarettes and nearly 30,000 vapes seized, indicating sustained pressure on retail and hospitality compliance. The Residential Parks Bill has passed parliament (new compliance obligations for park operators), the Rushy Lagoon sale inquiry terms of reference have been released, and the Productivity Commission's red-tape-cutting stance is being resisted by CBOS, each opening distinct advisory angles.</w:t>
-      </w:r>
-    </w:p>
-    <w:p>
-      <w:pPr>
-        <w:pStyle w:val="body_letter"/>
-      </w:pPr>
-      <w:r>
-        <w:rPr>
-          <w:rFonts w:ascii="Arial" w:hAnsi="Arial"/>
-          <w:b/>
-          <w:color w:val="000000"/>
-          <w:sz w:val="19"/>
-        </w:rPr>
-        <w:t>Australian Capital Territory</w:t>
-      </w:r>
-    </w:p>
-    <w:p>
-      <w:pPr>
-        <w:pStyle w:val="body_letter"/>
-      </w:pPr>
-      <w:r>
-        <w:rPr>
-          <w:rFonts w:ascii="Arial" w:hAnsi="Arial"/>
-          <w:b w:val="0"/>
-          <w:color w:val="000000"/>
-          <w:sz w:val="19"/>
-        </w:rPr>
-        <w:t>An ACT directorate head and public servant have been referred to police following a five-year investigation into contract interference, marking a significant public sector integrity enforcement action that signals elevated scrutiny of procurement conduct across ACT agencies. A major review of Canberra's gaming sector recommends that clubs receive transition support before further pokies reductions are imposed, presenting compliance pathway and stakeholder advisory opportunities for entities navigating ACT gaming reform. Consultation is open on ACT mental health law reforms, adding to an active territory legislative reform agenda. AI-powered traffic enforcement is drawing public and administrative law scrutiny after a family was issued erroneous double fines, raising ACT government accountability questions around automated decision-making and technology procurement governance.</w:t>
-      </w:r>
-    </w:p>
-    <w:p>
-      <w:pPr>
-        <w:pStyle w:val="body_letter"/>
-      </w:pPr>
-      <w:r>
-        <w:rPr>
-          <w:rFonts w:ascii="Arial" w:hAnsi="Arial"/>
-          <w:b/>
-          <w:color w:val="000000"/>
-          <w:sz w:val="19"/>
-        </w:rPr>
-        <w:t>Northern Territory</w:t>
-      </w:r>
-    </w:p>
-    <w:p>
-      <w:pPr>
-        <w:pStyle w:val="body_letter"/>
-      </w:pPr>
-      <w:r>
-        <w:rPr>
-          <w:rFonts w:ascii="Arial" w:hAnsi="Arial"/>
-          <w:b w:val="0"/>
-          <w:color w:val="000000"/>
-          <w:sz w:val="19"/>
-        </w:rPr>
-        <w:t>The NT government has enacted a significant overhaul of its child protection legislation despite fierce opposition from Aboriginal leaders, the national children's commissioner, and federal intervention calls, creating immediate compliance, advocacy, and advisory mandates for organisations operating in the child and family services sector. The NT EPA is concurrently advancing stricter emissions regulations targeting Santos and Inpex at Darwin's LNG facilities, while Ichthys LNG faces prosecution for under-reporting toxic emissions and tightened harbour oversight, signalling a sustained enforcement uplift in the resources sector. The NT government declined formal investigations into Charles Darwin University and Batchelor Institute amid ongoing governance scandals, substituting KPI accountability frameworks, a decision that raises systemic governance and audit advisory considerations. NT's opposition to Commonwealth green data centre energy demand mandates adds a further regulatory tension with federal clean energy policy.</w:t>
+        <w:t>No jurisdiction-level synthesis available this fortnight.</w:t>
       </w:r>
     </w:p>
     <w:tbl>
@@ -2565,7 +552,7 @@
                           <pic:cNvPicPr/>
                         </pic:nvPicPr>
                         <pic:blipFill>
-                          <a:blip r:embed="rId30"/>
+                          <a:blip r:embed="rId11"/>
                           <a:stretch>
                             <a:fillRect/>
                           </a:stretch>

</xml_diff>